<commit_message>
Tabela 17 com calibração sobre o posto e teste da datação da RJ
- Script 14: métricas de probabilidade com calibração logística sobre o
  posto, nos dois horizontes, com especificidade, VPN e decisão líquida
- Script 15: RJ antecipada em um ano para as 22 firmas com primeiro
  documento de andamento; reconstrução verificada contra os painéis
- Artigo revisado: Tabela 17, §5.7, §5.9, §5.5 e conclusão atualizados
  (103 alterações controladas); planilha com a Tabela 17 completa
- executar.sh roda os 15 scripts e limita threads do OpenMP

Co-Authored-By: Claude Opus 5.5 <noreply@anthropic.com>
Claude-Session: https://claude.ai/code/session_01V4LwoZDLWB9PeJtPghPCix
</commit_message>
<xml_diff>
--- a/projeto/artigo/Artigo_Fragilidade_Financeira_revisado.docx
+++ b/projeto/artigo/Artigo_Fragilidade_Financeira_revisado.docx
@@ -73,7 +73,7 @@
         </w:rPr>
         <w:t xml:space="preserve">Examina-se se a agregação de indicadores contábeis em um escore sintético de fragilidade financeira se justifica frente aos seus melhores componentes isolados, em painel de 7.419 observações firma-ano de 730 companhias abertas não financeiras brasileiras entre 2010 e 2025. Sobre o agregado dos eventos a agregação não se justifica: a área sob a curva ROC do escore é de 0,764, contra 0,894 da cobertura de juros e 0,874 do retorno sobre ativos, em conclusão que se mantém sob validação cruzada agrupada por firma e sob avaliação temporal. Uma análise diagnóstica posterior decompõe o evento pelo critério que o define e mostra que o resultado agregado é produzido por uma das rotas de deterioração. </w:t>
       </w:r>
-      <w:del w:id="9087" w:author="Revisão" w:date="2026-09-28T12:00:00Z">
+      <w:del w:id="9135" w:author="Revisão" w:date="2026-09-28T12:00:00Z">
         <w:r>
           <w:rPr>
             <w:rFonts w:ascii="Times New Roman" w:cs="Times New Roman" w:eastAsia="Times New Roman" w:hAnsi="Times New Roman"/>
@@ -87,7 +87,7 @@
           <w:delText xml:space="preserve">Nas entradas por prejuízo operacional persistente o escore fica 0,32 ponto atrás da cobertura de juros;</w:delText>
         </w:r>
       </w:del>
-      <w:ins w:id="9088" w:author="Revisão" w:date="2026-09-28T12:00:00Z">
+      <w:ins w:id="9136" w:author="Revisão" w:date="2026-09-28T12:00:00Z">
         <w:r>
           <w:rPr>
             <w:rFonts w:ascii="Times New Roman" w:cs="Times New Roman" w:eastAsia="Times New Roman" w:hAnsi="Times New Roman"/>
@@ -113,7 +113,7 @@
         </w:rPr>
         <w:t xml:space="preserve"> nas entradas por patrimônio líquido negativo e por recuperação judicial as diferenças não são estatisticamente distinguíveis. </w:t>
       </w:r>
-      <w:del w:id="9085" w:author="Revisão" w:date="2026-09-28T12:00:00Z">
+      <w:del w:id="9133" w:author="Revisão" w:date="2026-09-28T12:00:00Z">
         <w:r>
           <w:rPr>
             <w:rFonts w:ascii="Times New Roman" w:cs="Times New Roman" w:eastAsia="Times New Roman" w:hAnsi="Times New Roman"/>
@@ -127,7 +127,7 @@
           <w:delText xml:space="preserve">A razão é de composição:</w:delText>
         </w:r>
       </w:del>
-      <w:ins w:id="9086" w:author="Revisão" w:date="2026-09-28T12:00:00Z">
+      <w:ins w:id="9134" w:author="Revisão" w:date="2026-09-28T12:00:00Z">
         <w:r>
           <w:rPr>
             <w:rFonts w:ascii="Times New Roman" w:cs="Times New Roman" w:eastAsia="Times New Roman" w:hAnsi="Times New Roman"/>
@@ -375,7 +375,7 @@
         </w:rPr>
         <w:t xml:space="preserve">A contribuição está na decomposição desse resultado agregado. A definição de vulnerabilidade reúne três critérios, que correspondem a rotas distintas de deterioração. Separando as entradas por critério, </w:t>
       </w:r>
-      <w:del w:id="9105" w:author="Revisão" w:date="2026-09-28T12:00:00Z">
+      <w:del w:id="9153" w:author="Revisão" w:date="2026-09-28T12:00:00Z">
         <w:r>
           <w:rPr>
             <w:rFonts w:ascii="Times New Roman" w:cs="Times New Roman" w:eastAsia="Times New Roman" w:hAnsi="Times New Roman"/>
@@ -389,7 +389,7 @@
           <w:delText xml:space="preserve">a desvantagem do escore concentra-se inteiramente naquelas definidas por prejuízo operacional persistente: ali o escore alcança 0,649 contra 0,973 da cobertura de juros, diferença de 0,324 ponto</w:delText>
         </w:r>
       </w:del>
-      <w:ins w:id="9106" w:author="Revisão" w:date="2026-09-28T12:00:00Z">
+      <w:ins w:id="9154" w:author="Revisão" w:date="2026-09-28T12:00:00Z">
         <w:r>
           <w:rPr>
             <w:rFonts w:ascii="Times New Roman" w:cs="Times New Roman" w:eastAsia="Times New Roman" w:hAnsi="Times New Roman"/>
@@ -415,7 +415,7 @@
         </w:rPr>
         <w:t xml:space="preserve">. Nas entradas por patrimônio líquido negativo e nas entradas por recuperação judicial, nenhuma diferença contra as razões isoladas é estatisticamente distinguível. </w:t>
       </w:r>
-      <w:del w:id="9089" w:author="Revisão" w:date="2026-09-28T12:00:00Z">
+      <w:del w:id="9137" w:author="Revisão" w:date="2026-09-28T12:00:00Z">
         <w:r>
           <w:rPr>
             <w:rFonts w:ascii="Times New Roman" w:cs="Times New Roman" w:eastAsia="Times New Roman" w:hAnsi="Times New Roman"/>
@@ -429,7 +429,7 @@
           <w:delText xml:space="preserve">O escore não é, portanto, uniformemente inferior: ele é cego a uma das rotas.</w:delText>
         </w:r>
       </w:del>
-      <w:ins w:id="9090" w:author="Revisão" w:date="2026-09-28T12:00:00Z">
+      <w:ins w:id="9138" w:author="Revisão" w:date="2026-09-28T12:00:00Z">
         <w:r>
           <w:rPr>
             <w:rFonts w:ascii="Times New Roman" w:cs="Times New Roman" w:eastAsia="Times New Roman" w:hAnsi="Times New Roman"/>
@@ -450,7 +450,7 @@
         <w:ind w:firstLine="708"/>
         <w:jc w:val="both"/>
       </w:pPr>
-      <w:del w:id="9091" w:author="Revisão" w:date="2026-09-28T12:00:00Z">
+      <w:del w:id="9139" w:author="Revisão" w:date="2026-09-28T12:00:00Z">
         <w:r>
           <w:rPr>
             <w:rFonts w:ascii="Times New Roman" w:cs="Times New Roman" w:eastAsia="Times New Roman" w:hAnsi="Times New Roman"/>
@@ -464,7 +464,7 @@
           <w:delText xml:space="preserve">A razão dessa cegueira é de composição, e é verificável nos dados.</w:delText>
         </w:r>
       </w:del>
-      <w:ins w:id="9092" w:author="Revisão" w:date="2026-09-28T12:00:00Z">
+      <w:ins w:id="9140" w:author="Revisão" w:date="2026-09-28T12:00:00Z">
         <w:r>
           <w:rPr>
             <w:rFonts w:ascii="Times New Roman" w:cs="Times New Roman" w:eastAsia="Times New Roman" w:hAnsi="Times New Roman"/>
@@ -896,10 +896,10 @@
         <w:ind w:firstLine="708"/>
         <w:jc w:val="both"/>
         <w:rPr>
-          <w:del w:id="9156" w:author="Revisão" w:date="2026-09-28T12:00:00Z"/>
+          <w:del w:id="9206" w:author="Revisão" w:date="2026-09-28T12:00:00Z"/>
         </w:rPr>
       </w:pPr>
-      <w:del w:id="9155" w:author="Revisão" w:date="2026-09-28T12:00:00Z">
+      <w:del w:id="9205" w:author="Revisão" w:date="2026-09-28T12:00:00Z">
         <w:r>
           <w:rPr>
             <w:rFonts w:ascii="Times New Roman" w:cs="Times New Roman" w:eastAsia="Times New Roman" w:hAnsi="Times New Roman"/>
@@ -998,10 +998,10 @@
         <w:ind w:firstLine="708"/>
         <w:jc w:val="both"/>
         <w:rPr>
-          <w:ins w:id="9157" w:author="Revisão" w:date="2026-09-28T12:00:00Z"/>
+          <w:ins w:id="9207" w:author="Revisão" w:date="2026-09-28T12:00:00Z"/>
         </w:rPr>
       </w:pPr>
-      <w:ins w:id="9158" w:author="Revisão" w:date="2026-09-28T12:00:00Z">
+      <w:ins w:id="9208" w:author="Revisão" w:date="2026-09-28T12:00:00Z">
         <w:r>
           <w:rPr>
             <w:rFonts w:ascii="Times New Roman" w:cs="Times New Roman" w:eastAsia="Times New Roman" w:hAnsi="Times New Roman"/>
@@ -3402,7 +3402,7 @@
         </w:rPr>
         <w:t xml:space="preserve">O desempenho preditivo é medido pela área sob a curva ROC </w:t>
       </w:r>
-      <w:del w:id="9129" w:author="Revisão" w:date="2026-09-28T12:00:00Z">
+      <w:del w:id="9177" w:author="Revisão" w:date="2026-09-28T12:00:00Z">
         <w:r>
           <w:rPr>
             <w:rFonts w:ascii="Times New Roman" w:cs="Times New Roman" w:eastAsia="Times New Roman" w:hAnsi="Times New Roman"/>
@@ -3416,7 +3416,7 @@
           <w:delText xml:space="preserve">(HANLEY; MCNEIL, 1982)</w:delText>
         </w:r>
       </w:del>
-      <w:ins w:id="9130" w:author="Revisão" w:date="2026-09-28T12:00:00Z">
+      <w:ins w:id="9178" w:author="Revisão" w:date="2026-09-28T12:00:00Z">
         <w:r>
           <w:rPr>
             <w:rFonts w:ascii="Times New Roman" w:cs="Times New Roman" w:eastAsia="Times New Roman" w:hAnsi="Times New Roman"/>
@@ -3482,7 +3482,7 @@
         </w:rPr>
         <w:t xml:space="preserve">, a área sob a curva é complementada na subseção 5.7 por métricas sensíveis à prevalência e à qualidade das probabilidades: </w:t>
       </w:r>
-      <w:del w:id="9117" w:author="Revisão" w:date="2026-09-28T12:00:00Z">
+      <w:del w:id="9165" w:author="Revisão" w:date="2026-09-28T12:00:00Z">
         <w:r>
           <w:rPr>
             <w:rFonts w:ascii="Times New Roman" w:cs="Times New Roman" w:eastAsia="Times New Roman" w:hAnsi="Times New Roman"/>
@@ -3496,7 +3496,7 @@
           <w:delText xml:space="preserve">a área sob a curva de precisão e revocação, o escore de Brier, a inclinação e o intercepto de calibração</w:delText>
         </w:r>
       </w:del>
-      <w:ins w:id="9118" w:author="Revisão" w:date="2026-09-28T12:00:00Z">
+      <w:ins w:id="9166" w:author="Revisão" w:date="2026-09-28T12:00:00Z">
         <w:r>
           <w:rPr>
             <w:rFonts w:ascii="Times New Roman" w:cs="Times New Roman" w:eastAsia="Times New Roman" w:hAnsi="Times New Roman"/>
@@ -3522,7 +3522,7 @@
         </w:rPr>
         <w:t xml:space="preserve">, a sensibilidade, a especificidade e os valores preditivos em limiares fixados na amostra de treino, </w:t>
       </w:r>
-      <w:del w:id="9119" w:author="Revisão" w:date="2026-09-28T12:00:00Z">
+      <w:del w:id="9167" w:author="Revisão" w:date="2026-09-28T12:00:00Z">
         <w:r>
           <w:rPr>
             <w:rFonts w:ascii="Times New Roman" w:cs="Times New Roman" w:eastAsia="Times New Roman" w:hAnsi="Times New Roman"/>
@@ -3536,7 +3536,7 @@
           <w:delText xml:space="preserve">e a decisão líquida sob diferentes razões de custo</w:delText>
         </w:r>
       </w:del>
-      <w:ins w:id="9120" w:author="Revisão" w:date="2026-09-28T12:00:00Z">
+      <w:ins w:id="9168" w:author="Revisão" w:date="2026-09-28T12:00:00Z">
         <w:r>
           <w:rPr>
             <w:rFonts w:ascii="Times New Roman" w:cs="Times New Roman" w:eastAsia="Times New Roman" w:hAnsi="Times New Roman"/>
@@ -3581,7 +3581,7 @@
         </w:rPr>
         <w:t xml:space="preserve">A inferência principal sobre as diferenças de área sob a curva </w:t>
       </w:r>
-      <w:del w:id="9121" w:author="Revisão" w:date="2026-09-28T12:00:00Z">
+      <w:del w:id="9169" w:author="Revisão" w:date="2026-09-28T12:00:00Z">
         <w:r>
           <w:rPr>
             <w:rFonts w:ascii="Times New Roman" w:cs="Times New Roman" w:eastAsia="Times New Roman" w:hAnsi="Times New Roman"/>
@@ -3595,7 +3595,7 @@
           <w:delText xml:space="preserve">é conduzida por bootstrap agrupado por firma, com 2.000 reamostragens</w:delText>
         </w:r>
       </w:del>
-      <w:ins w:id="9122" w:author="Revisão" w:date="2026-09-28T12:00:00Z">
+      <w:ins w:id="9170" w:author="Revisão" w:date="2026-09-28T12:00:00Z">
         <w:r>
           <w:rPr>
             <w:rFonts w:ascii="Times New Roman" w:cs="Times New Roman" w:eastAsia="Times New Roman" w:hAnsi="Times New Roman"/>
@@ -3621,7 +3621,7 @@
         </w:rPr>
         <w:t xml:space="preserve">: firmas inteiras são reamostradas com reposição, de modo que a dependência entre as observações de uma mesma companhia seja preservada em cada réplica. O teste de DeLong, DeLong e Clarke-Pearson (1988) pressupõe independência entre observações, hipótese não satisfeita quando cada firma contribui com diversos firma-anos, e é reportado apenas como análise convencional complementar. </w:t>
       </w:r>
-      <w:del w:id="9123" w:author="Revisão" w:date="2026-09-28T12:00:00Z">
+      <w:del w:id="9171" w:author="Revisão" w:date="2026-09-28T12:00:00Z">
         <w:r>
           <w:rPr>
             <w:rFonts w:ascii="Times New Roman" w:cs="Times New Roman" w:eastAsia="Times New Roman" w:hAnsi="Times New Roman"/>
@@ -3635,7 +3635,7 @@
           <w:delText xml:space="preserve">A correção de Bonferroni é aplicada</w:delText>
         </w:r>
       </w:del>
-      <w:ins w:id="9124" w:author="Revisão" w:date="2026-09-28T12:00:00Z">
+      <w:ins w:id="9172" w:author="Revisão" w:date="2026-09-28T12:00:00Z">
         <w:r>
           <w:rPr>
             <w:rFonts w:ascii="Times New Roman" w:cs="Times New Roman" w:eastAsia="Times New Roman" w:hAnsi="Times New Roman"/>
@@ -3758,7 +3758,7 @@
         </w:rPr>
         <w:t xml:space="preserve">A adoção da amostra de risco impõe restrição sobre a parcimônia da especificação probit com controles. Com 153 entradas na amostra de estimação no horizonte de um ano, </w:t>
       </w:r>
-      <w:del w:id="9125" w:author="Revisão" w:date="2026-09-28T12:00:00Z">
+      <w:del w:id="9173" w:author="Revisão" w:date="2026-09-28T12:00:00Z">
         <w:r>
           <w:rPr>
             <w:rFonts w:ascii="Times New Roman" w:cs="Times New Roman" w:eastAsia="Times New Roman" w:hAnsi="Times New Roman"/>
@@ -3772,7 +3772,7 @@
           <w:delText xml:space="preserve">a referência usual de ao menos dez eventos por parâmetro estimado</w:delText>
         </w:r>
       </w:del>
-      <w:ins w:id="9126" w:author="Revisão" w:date="2026-09-28T12:00:00Z">
+      <w:ins w:id="9174" w:author="Revisão" w:date="2026-09-28T12:00:00Z">
         <w:r>
           <w:rPr>
             <w:rFonts w:ascii="Times New Roman" w:cs="Times New Roman" w:eastAsia="Times New Roman" w:hAnsi="Times New Roman"/>
@@ -3912,7 +3912,7 @@
         </w:rPr>
         <w:t xml:space="preserve">A estratégia empírica envolve três hipóteses formuladas antes da estimação e uma análise diagnóstica posterior. A primeira hipótese (H1) postula a existência de um fator latente único de fragilidade e compreende duas afirmações distintas, avaliadas separadamente: a existência de um eixo comum interpretável, verificada pela coerência de sinal das cargas fatoriais após a pré-orientação, e a unidimensionalidade, verificada </w:t>
       </w:r>
-      <w:del w:id="9113" w:author="Revisão" w:date="2026-09-28T12:00:00Z">
+      <w:del w:id="9161" w:author="Revisão" w:date="2026-09-28T12:00:00Z">
         <w:r>
           <w:rPr>
             <w:rFonts w:ascii="Times New Roman" w:cs="Times New Roman" w:eastAsia="Times New Roman" w:hAnsi="Times New Roman"/>
@@ -3926,7 +3926,7 @@
           <w:delText xml:space="preserve">pelo número de componentes retidos pelo critério de Kaiser</w:delText>
         </w:r>
       </w:del>
-      <w:ins w:id="9114" w:author="Revisão" w:date="2026-09-28T12:00:00Z">
+      <w:ins w:id="9162" w:author="Revisão" w:date="2026-09-28T12:00:00Z">
         <w:r>
           <w:rPr>
             <w:rFonts w:ascii="Times New Roman" w:cs="Times New Roman" w:eastAsia="Times New Roman" w:hAnsi="Times New Roman"/>
@@ -3990,7 +3990,7 @@
         </w:rPr>
         <w:t xml:space="preserve">A quarta hipótese (H4) tem estatuto distinto das anteriores e assim deve ser lida. Ela não integrava o desenho original e foi formulada após a observação dos resultados de H1 e H2, como explicação para o desempenho inferior do escore. Trata-se, portanto, de investigação explicativa posterior ao resultado, avaliada em seguida fora da amostra, e não de hipótese confirmatória pré-especificada. Ela postula que a diferença de desempenho entre o escore não supervisionado e os melhores benchmarks decorre do critério de agregação, e não do conjunto informacional. A análise consiste em construir um segundo escore por mínimos quadrados parciais aplicados a resposta binária, mantendo constantes as oito variáveis, a amostra, o pré-processamento e o procedimento de avaliação, de modo que a diferença de desempenho reflita apenas a substituição do critério de agregação. O critério de avaliação, fixado antes da estimação do escore supervisionado, é que ele supere o não supervisionado fora da amostra. Acrescenta-se um terceiro escore, </w:t>
       </w:r>
-      <w:del w:id="9127" w:author="Revisão" w:date="2026-09-28T12:00:00Z">
+      <w:del w:id="9175" w:author="Revisão" w:date="2026-09-28T12:00:00Z">
         <w:r>
           <w:rPr>
             <w:rFonts w:ascii="Times New Roman" w:cs="Times New Roman" w:eastAsia="Times New Roman" w:hAnsi="Times New Roman"/>
@@ -4004,7 +4004,7 @@
           <w:delText xml:space="preserve">obtido por árvores impulsionadas com gradiente sobre as mesmas oito variáveis</w:delText>
         </w:r>
       </w:del>
-      <w:ins w:id="9128" w:author="Revisão" w:date="2026-09-28T12:00:00Z">
+      <w:ins w:id="9176" w:author="Revisão" w:date="2026-09-28T12:00:00Z">
         <w:r>
           <w:rPr>
             <w:rFonts w:ascii="Times New Roman" w:cs="Times New Roman" w:eastAsia="Times New Roman" w:hAnsi="Times New Roman"/>
@@ -11846,7 +11846,7 @@
         </w:rPr>
         <w:t xml:space="preserve">O primeiro componente responde por 26,92% da variância total, </w:t>
       </w:r>
-      <w:del w:id="9115" w:author="Revisão" w:date="2026-09-28T12:00:00Z">
+      <w:del w:id="9163" w:author="Revisão" w:date="2026-09-28T12:00:00Z">
         <w:r>
           <w:rPr>
             <w:rFonts w:ascii="Times New Roman" w:cs="Times New Roman" w:eastAsia="Times New Roman" w:hAnsi="Times New Roman"/>
@@ -11860,7 +11860,7 @@
           <w:delText xml:space="preserve">e o critério de Kaiser retém 3 componentes, que juntos explicam 56,80%.</w:delText>
         </w:r>
       </w:del>
-      <w:ins w:id="9116" w:author="Revisão" w:date="2026-09-28T12:00:00Z">
+      <w:ins w:id="9164" w:author="Revisão" w:date="2026-09-28T12:00:00Z">
         <w:r>
           <w:rPr>
             <w:rFonts w:ascii="Times New Roman" w:cs="Times New Roman" w:eastAsia="Times New Roman" w:hAnsi="Times New Roman"/>
@@ -13073,7 +13073,7 @@
         </w:rPr>
         <w:t xml:space="preserve">A evidência sobre H1 deve ser separada em suas duas afirmações. A existência de um eixo comum interpretável é sustentada. A unidimensionalidade não é: o primeiro componente responde por 26,92% da variância e são necessários 3 componentes para resumir pouco mais da metade do sistema. O que o primeiro componente capta não é a fragilidade em sua totalidade, e sim uma de suas dimensões. H1 é, portanto, parcialmente sustentada quanto à coerência do eixo e rejeitada quanto à unidimensionalidade. A subseção 5.5 mostra a que rota de deterioração essa dimensão corresponde, </w:t>
       </w:r>
-      <w:del w:id="9107" w:author="Revisão" w:date="2026-09-28T12:00:00Z">
+      <w:del w:id="9155" w:author="Revisão" w:date="2026-09-28T12:00:00Z">
         <w:r>
           <w:rPr>
             <w:rFonts w:ascii="Times New Roman" w:cs="Times New Roman" w:eastAsia="Times New Roman" w:hAnsi="Times New Roman"/>
@@ -13087,7 +13087,7 @@
           <w:delText xml:space="preserve">e a qual delas o escore é cego</w:delText>
         </w:r>
       </w:del>
-      <w:ins w:id="9108" w:author="Revisão" w:date="2026-09-28T12:00:00Z">
+      <w:ins w:id="9156" w:author="Revisão" w:date="2026-09-28T12:00:00Z">
         <w:r>
           <w:rPr>
             <w:rFonts w:ascii="Times New Roman" w:cs="Times New Roman" w:eastAsia="Times New Roman" w:hAnsi="Times New Roman"/>
@@ -20168,7 +20168,7 @@
         </w:rPr>
         <w:t xml:space="preserve">O esquema temporal reproduz a ordenação da validação cruzada no horizonte de um ano, com 40 entradas no período de teste e todas as diferenças significativas. A conclusão sobre H2, portanto, não depende do esquema de avaliação. </w:t>
       </w:r>
-      <w:del w:id="9083" w:author="Revisão" w:date="2026-09-28T12:00:00Z">
+      <w:del w:id="9131" w:author="Revisão" w:date="2026-09-28T12:00:00Z">
         <w:r>
           <w:rPr>
             <w:rFonts w:ascii="Times New Roman" w:cs="Times New Roman" w:eastAsia="Times New Roman" w:hAnsi="Times New Roman"/>
@@ -20182,7 +20182,7 @@
           <w:delText xml:space="preserve">No horizonte de dois anos, com 34 entradas, nenhuma diferença alcança significância, e o esquema temporal é informativo apenas quanto à direção.</w:delText>
         </w:r>
       </w:del>
-      <w:ins w:id="9084" w:author="Revisão" w:date="2026-09-28T12:00:00Z">
+      <w:ins w:id="9132" w:author="Revisão" w:date="2026-09-28T12:00:00Z">
         <w:r>
           <w:rPr>
             <w:rFonts w:ascii="Times New Roman" w:cs="Times New Roman" w:eastAsia="Times New Roman" w:hAnsi="Times New Roman"/>
@@ -24133,7 +24133,7 @@
         </w:rPr>
         <w:t xml:space="preserve">O padrão é nítido e se repete nos dois horizontes, mas exige precisão na leitura. Nas entradas definidas exclusivamente pelo critério de prejuízo operacional, </w:t>
       </w:r>
-      <w:del w:id="9075" w:author="Revisão" w:date="2026-09-28T12:00:00Z">
+      <w:del w:id="9119" w:author="Revisão" w:date="2026-09-28T12:00:00Z">
         <w:r>
           <w:rPr>
             <w:rFonts w:ascii="Times New Roman" w:cs="Times New Roman" w:eastAsia="Times New Roman" w:hAnsi="Times New Roman"/>
@@ -24147,7 +24147,7 @@
           <w:delText xml:space="preserve">o escore sintético fica muito atrás: 0,649 em um ano</w:delText>
         </w:r>
       </w:del>
-      <w:ins w:id="9076" w:author="Revisão" w:date="2026-09-28T12:00:00Z">
+      <w:ins w:id="9120" w:author="Revisão" w:date="2026-09-28T12:00:00Z">
         <w:r>
           <w:rPr>
             <w:rFonts w:ascii="Times New Roman" w:cs="Times New Roman" w:eastAsia="Times New Roman" w:hAnsi="Times New Roman"/>
@@ -24173,7 +24173,7 @@
         </w:rPr>
         <w:t xml:space="preserve">, contra 0,973 da cobertura de juros, diferença de 0,324 ponto com intervalo que exclui o zero com folga. </w:t>
       </w:r>
-      <w:del w:id="9077" w:author="Revisão" w:date="2026-09-28T12:00:00Z">
+      <w:del w:id="9121" w:author="Revisão" w:date="2026-09-28T12:00:00Z">
         <w:r>
           <w:rPr>
             <w:rFonts w:ascii="Times New Roman" w:cs="Times New Roman" w:eastAsia="Times New Roman" w:hAnsi="Times New Roman"/>
@@ -24187,7 +24187,7 @@
           <w:delText xml:space="preserve">Nas entradas por patrimônio líquido negativo, o escore alcança 0,816</w:delText>
         </w:r>
       </w:del>
-      <w:ins w:id="9078" w:author="Revisão" w:date="2026-09-28T12:00:00Z">
+      <w:ins w:id="9122" w:author="Revisão" w:date="2026-09-28T12:00:00Z">
         <w:r>
           <w:rPr>
             <w:rFonts w:ascii="Times New Roman" w:cs="Times New Roman" w:eastAsia="Times New Roman" w:hAnsi="Times New Roman"/>
@@ -24211,7 +24211,47 @@
           <w:sz w:val="24"/>
           <w:szCs w:val="24"/>
         </w:rPr>
-        <w:t xml:space="preserve"> e fica nominalmente à frente da cobertura de juros e do retorno sobre ativos, por 0,030 e 0,032 ponto, mas os intervalos contêm o zero: o que se observa é empate, e não superioridade. A única diferença significativa nesse tipo de entrada é contra o escore supervisionado, que o escore sintético supera por 0,066 ponto. Nas entradas por recuperação judicial nenhuma diferença é distinguível, com a ressalva de poder registrada adiante.</w:t>
+        <w:t xml:space="preserve"> e fica nominalmente à frente da cobertura de juros e do retorno sobre ativos, por 0,030 e 0,032 ponto, mas os intervalos contêm o zero: o que se observa é empate, e não superioridade. </w:t>
+      </w:r>
+      <w:del w:id="9127" w:author="Revisão" w:date="2026-09-28T12:00:00Z">
+        <w:r>
+          <w:rPr>
+            <w:rFonts w:ascii="Times New Roman" w:cs="Times New Roman" w:eastAsia="Times New Roman" w:hAnsi="Times New Roman"/>
+            <w:b w:val="false"/>
+            <w:bCs w:val="false"/>
+            <w:i w:val="false"/>
+            <w:iCs w:val="false"/>
+            <w:sz w:val="24"/>
+            <w:szCs w:val="24"/>
+          </w:rPr>
+          <w:delText xml:space="preserve">A única diferença significativa nesse tipo de entrada é contra o escore supervisionado, que o escore sintético supera por 0,066 ponto.</w:delText>
+        </w:r>
+      </w:del>
+      <w:ins w:id="9128" w:author="Revisão" w:date="2026-09-28T12:00:00Z">
+        <w:r>
+          <w:rPr>
+            <w:rFonts w:ascii="Times New Roman" w:cs="Times New Roman" w:eastAsia="Times New Roman" w:hAnsi="Times New Roman"/>
+            <w:b w:val="false"/>
+            <w:bCs w:val="false"/>
+            <w:i w:val="false"/>
+            <w:iCs w:val="false"/>
+            <w:sz w:val="24"/>
+            <w:szCs w:val="24"/>
+          </w:rPr>
+          <w:t xml:space="preserve">A única diferença significativa nesse tipo de entrada é contra o escore supervisionado, que o escore sintético supera por 0,066 ponto, resultado que não resiste à antecipação das datas de recuperação judicial examinada na subseção 5.9.</w:t>
+        </w:r>
+      </w:ins>
+      <w:r>
+        <w:rPr>
+          <w:rFonts w:ascii="Times New Roman" w:cs="Times New Roman" w:eastAsia="Times New Roman" w:hAnsi="Times New Roman"/>
+          <w:b w:val="false"/>
+          <w:bCs w:val="false"/>
+          <w:i w:val="false"/>
+          <w:iCs w:val="false"/>
+          <w:sz w:val="24"/>
+          <w:szCs w:val="24"/>
+        </w:rPr>
+        <w:t xml:space="preserve"> Nas entradas por recuperação judicial nenhuma diferença é distinguível, com a ressalva de poder registrada adiante.</w:t>
       </w:r>
     </w:p>
     <w:p>
@@ -25894,7 +25934,7 @@
         </w:rPr>
         <w:t xml:space="preserve">Duas explicações poderiam ser aventadas para o desempenho inferior nesse tipo de entrada, e os dados permitem distingui-las. A primeira é mecânica: o critério de prejuízo operacional exige resultado negativo também no exercício da previsão, de modo que metade da condição já é observada. </w:t>
       </w:r>
-      <w:del w:id="9079" w:author="Revisão" w:date="2026-09-28T12:00:00Z">
+      <w:del w:id="9123" w:author="Revisão" w:date="2026-09-28T12:00:00Z">
         <w:r>
           <w:rPr>
             <w:rFonts w:ascii="Times New Roman" w:cs="Times New Roman" w:eastAsia="Times New Roman" w:hAnsi="Times New Roman"/>
@@ -25908,7 +25948,7 @@
           <w:delText xml:space="preserve">Ela não basta, porém, porque no horizonte de dois anos</w:delText>
         </w:r>
       </w:del>
-      <w:ins w:id="9080" w:author="Revisão" w:date="2026-09-28T12:00:00Z">
+      <w:ins w:id="9124" w:author="Revisão" w:date="2026-09-28T12:00:00Z">
         <w:r>
           <w:rPr>
             <w:rFonts w:ascii="Times New Roman" w:cs="Times New Roman" w:eastAsia="Times New Roman" w:hAnsi="Times New Roman"/>
@@ -25934,7 +25974,7 @@
         </w:rPr>
         <w:t xml:space="preserve">, em que essa condição se refere a exercícios posteriores ao da previsão, o escore alcança 0,377, valor abaixo de 0,500 que indica ordenação invertida. </w:t>
       </w:r>
-      <w:del w:id="9093" w:author="Revisão" w:date="2026-09-28T12:00:00Z">
+      <w:del w:id="9141" w:author="Revisão" w:date="2026-09-28T12:00:00Z">
         <w:r>
           <w:rPr>
             <w:rFonts w:ascii="Times New Roman" w:cs="Times New Roman" w:eastAsia="Times New Roman" w:hAnsi="Times New Roman"/>
@@ -25948,7 +25988,7 @@
           <w:delText xml:space="preserve">A segunda explicação é de composição, e é a que os dados sustentam:</w:delText>
         </w:r>
       </w:del>
-      <w:ins w:id="9094" w:author="Revisão" w:date="2026-09-28T12:00:00Z">
+      <w:ins w:id="9142" w:author="Revisão" w:date="2026-09-28T12:00:00Z">
         <w:r>
           <w:rPr>
             <w:rFonts w:ascii="Times New Roman" w:cs="Times New Roman" w:eastAsia="Times New Roman" w:hAnsi="Times New Roman"/>
@@ -27123,7 +27163,7 @@
         </w:rPr>
         <w:t xml:space="preserve">Fonte: elaboração própria. Medianas no exercício da previsão, horizonte de dois anos, sobre a amostra de risco. </w:t>
       </w:r>
-      <w:del w:id="9071" w:author="Revisão" w:date="2026-09-28T12:00:00Z">
+      <w:del w:id="9115" w:author="Revisão" w:date="2026-09-28T12:00:00Z">
         <w:r>
           <w:rPr>
             <w:rFonts w:ascii="Times New Roman" w:cs="Times New Roman" w:eastAsia="Times New Roman" w:hAnsi="Times New Roman"/>
@@ -27137,7 +27177,7 @@
           <w:delText xml:space="preserve">As duas primeiras colunas referem-se a entradas que satisfazem apenas o critério indicado.</w:delText>
         </w:r>
       </w:del>
-      <w:ins w:id="9072" w:author="Revisão" w:date="2026-09-28T12:00:00Z">
+      <w:ins w:id="9116" w:author="Revisão" w:date="2026-09-28T12:00:00Z">
         <w:r>
           <w:rPr>
             <w:rFonts w:ascii="Times New Roman" w:cs="Times New Roman" w:eastAsia="Times New Roman" w:hAnsi="Times New Roman"/>
@@ -27170,7 +27210,7 @@
         </w:rPr>
         <w:t xml:space="preserve">As firmas que caminham para o prejuízo operacional persistente apresentam, no momento da previsão, alavancagem mediana de 0,213 contra 0,326 das que não entram, liquidez corrente de 1,998 contra 1,430 e capital de giro superior. São menores e apresentam rentabilidade mais baixa, mas seu balanço é, nas dimensões de estrutura, melhor que o da firma mediana. Como o primeiro componente carrega sobretudo capital de giro, com 0,532, alavancagem, com 0,415, e liquidez corrente, com 0,373, o escore lê essas firmas como robustas. As que entram por patrimônio líquido negativo apresentam o perfil oposto, com alavancagem de 0,425 e liquidez de 0,944, e ali o escore acompanha as melhores alternativas. </w:t>
       </w:r>
-      <w:del w:id="9095" w:author="Revisão" w:date="2026-09-28T12:00:00Z">
+      <w:del w:id="9143" w:author="Revisão" w:date="2026-09-28T12:00:00Z">
         <w:r>
           <w:rPr>
             <w:rFonts w:ascii="Times New Roman" w:cs="Times New Roman" w:eastAsia="Times New Roman" w:hAnsi="Times New Roman"/>
@@ -27184,7 +27224,7 @@
           <w:delText xml:space="preserve">A limitação não é de agregação em geral, e sim da composição deste escore: ele mede deterioração patrimonial e é cego à rota que começa no resultado operacional de firmas pouco endividadas.</w:delText>
         </w:r>
       </w:del>
-      <w:ins w:id="9096" w:author="Revisão" w:date="2026-09-28T12:00:00Z">
+      <w:ins w:id="9144" w:author="Revisão" w:date="2026-09-28T12:00:00Z">
         <w:r>
           <w:rPr>
             <w:rFonts w:ascii="Times New Roman" w:cs="Times New Roman" w:eastAsia="Times New Roman" w:hAnsi="Times New Roman"/>
@@ -27749,7 +27789,7 @@
               <w:spacing w:after="0" w:before="0" w:line="240"/>
               <w:jc w:val="left"/>
             </w:pPr>
-            <w:del w:id="9073" w:author="Revisão" w:date="2026-09-28T12:00:00Z">
+            <w:del w:id="9117" w:author="Revisão" w:date="2026-09-28T12:00:00Z">
               <w:r>
                 <w:rPr>
                   <w:rFonts w:ascii="Times New Roman" w:cs="Times New Roman" w:eastAsia="Times New Roman" w:hAnsi="Times New Roman"/>
@@ -27763,7 +27803,7 @@
                 <w:delText xml:space="preserve">EBITDA</w:delText>
               </w:r>
             </w:del>
-            <w:ins w:id="9074" w:author="Revisão" w:date="2026-09-28T12:00:00Z">
+            <w:ins w:id="9118" w:author="Revisão" w:date="2026-09-28T12:00:00Z">
               <w:r>
                 <w:rPr>
                   <w:rFonts w:ascii="Times New Roman" w:cs="Times New Roman" w:eastAsia="Times New Roman" w:hAnsi="Times New Roman"/>
@@ -28721,7 +28761,7 @@
         </w:rPr>
         <w:t xml:space="preserve">Para avaliar H4, construiu-se um segundo escore alterando exclusivamente o critério de agregação, por mínimos quadrados parciais aplicados a resposta binária (WOLD; SJÖSTRÖM; ERIKSSON, 2001; BARKER; RAYENS, 2003), mantidos o conjunto de variáveis, o pré-processamento, a amostra e o procedimento de avaliação. Sobre o agregado, a substituição eleva a área sob a curva de 0,764 para 0,875, e a análise diagnóstica fornece evidência consistente com H4. As duas leituras não se contradizem, e convém explicitar como se articulam: H4 procura explicar a diferença entre o escore não supervisionado e os melhores benchmarks, e a decomposição mostra que essa diferença existe em uma única rota de deterioração. A supervisão recupera desempenho onde há diferença a recuperar, e nada onde não há. A decomposição qualifica, portanto, o alcance de H4 sem invalidá-la: </w:t>
       </w:r>
-      <w:del w:id="9097" w:author="Revisão" w:date="2026-09-28T12:00:00Z">
+      <w:del w:id="9145" w:author="Revisão" w:date="2026-09-28T12:00:00Z">
         <w:r>
           <w:rPr>
             <w:rFonts w:ascii="Times New Roman" w:cs="Times New Roman" w:eastAsia="Times New Roman" w:hAnsi="Times New Roman"/>
@@ -28735,7 +28775,7 @@
           <w:delText xml:space="preserve">o ganho concentra-se inteiramente nas entradas pelo critério de EBITDA e desaparece quando os modelos são reestimados sem elas</w:delText>
         </w:r>
       </w:del>
-      <w:ins w:id="9098" w:author="Revisão" w:date="2026-09-28T12:00:00Z">
+      <w:ins w:id="9146" w:author="Revisão" w:date="2026-09-28T12:00:00Z">
         <w:r>
           <w:rPr>
             <w:rFonts w:ascii="Times New Roman" w:cs="Times New Roman" w:eastAsia="Times New Roman" w:hAnsi="Times New Roman"/>
@@ -28816,7 +28856,47 @@
           <w:sz w:val="24"/>
           <w:szCs w:val="24"/>
         </w:rPr>
-        <w:t xml:space="preserve">Com prevalência de 2,95%, a área sob a curva mede a qualidade da ordenação, mas não informa se os modelos produzem probabilidades utilizáveis. Cada escore é convertido em probabilidade por calibração logística estimada nas firmas de treino, sobre predições obtidas fora de partições internas ao treino no caso dos modelos supervisionados.</w:t>
+        <w:t xml:space="preserve">Com prevalência de 2,95%, a área sob a curva mede a qualidade da ordenação, mas não informa se os modelos produzem probabilidades utilizáveis. </w:t>
+      </w:r>
+      <w:del w:id="9065" w:author="Revisão" w:date="2026-09-28T12:00:00Z">
+        <w:r>
+          <w:rPr>
+            <w:rFonts w:ascii="Times New Roman" w:cs="Times New Roman" w:eastAsia="Times New Roman" w:hAnsi="Times New Roman"/>
+            <w:b w:val="false"/>
+            <w:bCs w:val="false"/>
+            <w:i w:val="false"/>
+            <w:iCs w:val="false"/>
+            <w:sz w:val="24"/>
+            <w:szCs w:val="24"/>
+          </w:rPr>
+          <w:delText xml:space="preserve">Cada escore é convertido em probabilidade por calibração logística estimada nas firmas de treino</w:delText>
+        </w:r>
+      </w:del>
+      <w:ins w:id="9066" w:author="Revisão" w:date="2026-09-28T12:00:00Z">
+        <w:r>
+          <w:rPr>
+            <w:rFonts w:ascii="Times New Roman" w:cs="Times New Roman" w:eastAsia="Times New Roman" w:hAnsi="Times New Roman"/>
+            <w:b w:val="false"/>
+            <w:bCs w:val="false"/>
+            <w:i w:val="false"/>
+            <w:iCs w:val="false"/>
+            <w:sz w:val="24"/>
+            <w:szCs w:val="24"/>
+          </w:rPr>
+          <w:t xml:space="preserve">Cada escore é convertido em probabilidade por regressão logística sobre o seu posto na distribuição do treino (NICULESCU-MIZIL; CARUANA, 2005), estimada nas firmas de treino</w:t>
+        </w:r>
+      </w:ins>
+      <w:r>
+        <w:rPr>
+          <w:rFonts w:ascii="Times New Roman" w:cs="Times New Roman" w:eastAsia="Times New Roman" w:hAnsi="Times New Roman"/>
+          <w:b w:val="false"/>
+          <w:bCs w:val="false"/>
+          <w:i w:val="false"/>
+          <w:iCs w:val="false"/>
+          <w:sz w:val="24"/>
+          <w:szCs w:val="24"/>
+        </w:rPr>
+        <w:t xml:space="preserve">, sobre predições obtidas fora de partições internas ao treino no caso dos modelos supervisionados.</w:t>
       </w:r>
     </w:p>
     <w:p>
@@ -28998,7 +29078,7 @@
               <w:spacing w:after="0" w:before="0" w:line="240"/>
               <w:jc w:val="center"/>
             </w:pPr>
-            <w:del w:id="9069" w:author="Revisão" w:date="2026-09-28T12:00:00Z">
+            <w:del w:id="9113" w:author="Revisão" w:date="2026-09-28T12:00:00Z">
               <w:r>
                 <w:rPr>
                   <w:rFonts w:ascii="Times New Roman" w:cs="Times New Roman" w:eastAsia="Times New Roman" w:hAnsi="Times New Roman"/>
@@ -29012,7 +29092,7 @@
                 <w:delText xml:space="preserve">Firmas sinalizadas</w:delText>
               </w:r>
             </w:del>
-            <w:ins w:id="9070" w:author="Revisão" w:date="2026-09-28T12:00:00Z">
+            <w:ins w:id="9114" w:author="Revisão" w:date="2026-09-28T12:00:00Z">
               <w:r>
                 <w:rPr>
                   <w:rFonts w:ascii="Times New Roman" w:cs="Times New Roman" w:eastAsia="Times New Roman" w:hAnsi="Times New Roman"/>
@@ -29107,18 +29187,34 @@
               <w:spacing w:after="0" w:before="0" w:line="240"/>
               <w:jc w:val="center"/>
             </w:pPr>
-            <w:r>
-              <w:rPr>
-                <w:rFonts w:ascii="Times New Roman" w:cs="Times New Roman" w:eastAsia="Times New Roman" w:hAnsi="Times New Roman"/>
-                <w:b w:val="false"/>
-                <w:bCs w:val="false"/>
-                <w:i w:val="false"/>
-                <w:iCs w:val="false"/>
-                <w:sz w:val="20"/>
-                <w:szCs w:val="20"/>
-              </w:rPr>
-              <w:t xml:space="preserve">0,234</w:t>
-            </w:r>
+            <w:del w:id="9071" w:author="Revisão" w:date="2026-09-28T12:00:00Z">
+              <w:r>
+                <w:rPr>
+                  <w:rFonts w:ascii="Times New Roman" w:cs="Times New Roman" w:eastAsia="Times New Roman" w:hAnsi="Times New Roman"/>
+                  <w:b w:val="false"/>
+                  <w:bCs w:val="false"/>
+                  <w:i w:val="false"/>
+                  <w:iCs w:val="false"/>
+                  <w:sz w:val="20"/>
+                  <w:szCs w:val="20"/>
+                </w:rPr>
+                <w:delText xml:space="preserve">0,234</w:delText>
+              </w:r>
+            </w:del>
+            <w:ins w:id="9072" w:author="Revisão" w:date="2026-09-28T12:00:00Z">
+              <w:r>
+                <w:rPr>
+                  <w:rFonts w:ascii="Times New Roman" w:cs="Times New Roman" w:eastAsia="Times New Roman" w:hAnsi="Times New Roman"/>
+                  <w:b w:val="false"/>
+                  <w:bCs w:val="false"/>
+                  <w:i w:val="false"/>
+                  <w:iCs w:val="false"/>
+                  <w:sz w:val="20"/>
+                  <w:szCs w:val="20"/>
+                </w:rPr>
+                <w:t xml:space="preserve">0,230</w:t>
+              </w:r>
+            </w:ins>
           </w:p>
         </w:tc>
         <w:tc>
@@ -29136,18 +29232,34 @@
               <w:spacing w:after="0" w:before="0" w:line="240"/>
               <w:jc w:val="center"/>
             </w:pPr>
-            <w:r>
-              <w:rPr>
-                <w:rFonts w:ascii="Times New Roman" w:cs="Times New Roman" w:eastAsia="Times New Roman" w:hAnsi="Times New Roman"/>
-                <w:b w:val="false"/>
-                <w:bCs w:val="false"/>
-                <w:i w:val="false"/>
-                <w:iCs w:val="false"/>
-                <w:sz w:val="20"/>
-                <w:szCs w:val="20"/>
-              </w:rPr>
-              <w:t xml:space="preserve">0,0265</w:t>
-            </w:r>
+            <w:del w:id="9073" w:author="Revisão" w:date="2026-09-28T12:00:00Z">
+              <w:r>
+                <w:rPr>
+                  <w:rFonts w:ascii="Times New Roman" w:cs="Times New Roman" w:eastAsia="Times New Roman" w:hAnsi="Times New Roman"/>
+                  <w:b w:val="false"/>
+                  <w:bCs w:val="false"/>
+                  <w:i w:val="false"/>
+                  <w:iCs w:val="false"/>
+                  <w:sz w:val="20"/>
+                  <w:szCs w:val="20"/>
+                </w:rPr>
+                <w:delText xml:space="preserve">0,0265</w:delText>
+              </w:r>
+            </w:del>
+            <w:ins w:id="9074" w:author="Revisão" w:date="2026-09-28T12:00:00Z">
+              <w:r>
+                <w:rPr>
+                  <w:rFonts w:ascii="Times New Roman" w:cs="Times New Roman" w:eastAsia="Times New Roman" w:hAnsi="Times New Roman"/>
+                  <w:b w:val="false"/>
+                  <w:bCs w:val="false"/>
+                  <w:i w:val="false"/>
+                  <w:iCs w:val="false"/>
+                  <w:sz w:val="20"/>
+                  <w:szCs w:val="20"/>
+                </w:rPr>
+                <w:t xml:space="preserve">0,0251</w:t>
+              </w:r>
+            </w:ins>
           </w:p>
         </w:tc>
         <w:tc>
@@ -29165,18 +29277,34 @@
               <w:spacing w:after="0" w:before="0" w:line="240"/>
               <w:jc w:val="center"/>
             </w:pPr>
-            <w:r>
-              <w:rPr>
-                <w:rFonts w:ascii="Times New Roman" w:cs="Times New Roman" w:eastAsia="Times New Roman" w:hAnsi="Times New Roman"/>
-                <w:b w:val="false"/>
-                <w:bCs w:val="false"/>
-                <w:i w:val="false"/>
-                <w:iCs w:val="false"/>
-                <w:sz w:val="20"/>
-                <w:szCs w:val="20"/>
-              </w:rPr>
-              <w:t xml:space="preserve">1,016</w:t>
-            </w:r>
+            <w:del w:id="9075" w:author="Revisão" w:date="2026-09-28T12:00:00Z">
+              <w:r>
+                <w:rPr>
+                  <w:rFonts w:ascii="Times New Roman" w:cs="Times New Roman" w:eastAsia="Times New Roman" w:hAnsi="Times New Roman"/>
+                  <w:b w:val="false"/>
+                  <w:bCs w:val="false"/>
+                  <w:i w:val="false"/>
+                  <w:iCs w:val="false"/>
+                  <w:sz w:val="20"/>
+                  <w:szCs w:val="20"/>
+                </w:rPr>
+                <w:delText xml:space="preserve">1,016</w:delText>
+              </w:r>
+            </w:del>
+            <w:ins w:id="9076" w:author="Revisão" w:date="2026-09-28T12:00:00Z">
+              <w:r>
+                <w:rPr>
+                  <w:rFonts w:ascii="Times New Roman" w:cs="Times New Roman" w:eastAsia="Times New Roman" w:hAnsi="Times New Roman"/>
+                  <w:b w:val="false"/>
+                  <w:bCs w:val="false"/>
+                  <w:i w:val="false"/>
+                  <w:iCs w:val="false"/>
+                  <w:sz w:val="20"/>
+                  <w:szCs w:val="20"/>
+                </w:rPr>
+                <w:t xml:space="preserve">1,087</w:t>
+              </w:r>
+            </w:ins>
           </w:p>
         </w:tc>
         <w:tc>
@@ -29223,18 +29351,34 @@
               <w:spacing w:after="0" w:before="0" w:line="240"/>
               <w:jc w:val="center"/>
             </w:pPr>
-            <w:r>
-              <w:rPr>
-                <w:rFonts w:ascii="Times New Roman" w:cs="Times New Roman" w:eastAsia="Times New Roman" w:hAnsi="Times New Roman"/>
-                <w:b w:val="false"/>
-                <w:bCs w:val="false"/>
-                <w:i w:val="false"/>
-                <w:iCs w:val="false"/>
-                <w:sz w:val="20"/>
-                <w:szCs w:val="20"/>
-              </w:rPr>
-              <w:t xml:space="preserve">0,136</w:t>
-            </w:r>
+            <w:del w:id="9077" w:author="Revisão" w:date="2026-09-28T12:00:00Z">
+              <w:r>
+                <w:rPr>
+                  <w:rFonts w:ascii="Times New Roman" w:cs="Times New Roman" w:eastAsia="Times New Roman" w:hAnsi="Times New Roman"/>
+                  <w:b w:val="false"/>
+                  <w:bCs w:val="false"/>
+                  <w:i w:val="false"/>
+                  <w:iCs w:val="false"/>
+                  <w:sz w:val="20"/>
+                  <w:szCs w:val="20"/>
+                </w:rPr>
+                <w:delText xml:space="preserve">0,136</w:delText>
+              </w:r>
+            </w:del>
+            <w:ins w:id="9078" w:author="Revisão" w:date="2026-09-28T12:00:00Z">
+              <w:r>
+                <w:rPr>
+                  <w:rFonts w:ascii="Times New Roman" w:cs="Times New Roman" w:eastAsia="Times New Roman" w:hAnsi="Times New Roman"/>
+                  <w:b w:val="false"/>
+                  <w:bCs w:val="false"/>
+                  <w:i w:val="false"/>
+                  <w:iCs w:val="false"/>
+                  <w:sz w:val="20"/>
+                  <w:szCs w:val="20"/>
+                </w:rPr>
+                <w:t xml:space="preserve">0,134</w:t>
+              </w:r>
+            </w:ins>
           </w:p>
         </w:tc>
       </w:tr>
@@ -29286,18 +29430,34 @@
               <w:spacing w:after="0" w:before="0" w:line="240"/>
               <w:jc w:val="center"/>
             </w:pPr>
-            <w:r>
-              <w:rPr>
-                <w:rFonts w:ascii="Times New Roman" w:cs="Times New Roman" w:eastAsia="Times New Roman" w:hAnsi="Times New Roman"/>
-                <w:b w:val="false"/>
-                <w:bCs w:val="false"/>
-                <w:i w:val="false"/>
-                <w:iCs w:val="false"/>
-                <w:sz w:val="20"/>
-                <w:szCs w:val="20"/>
-              </w:rPr>
-              <w:t xml:space="preserve">0,215</w:t>
-            </w:r>
+            <w:del w:id="9079" w:author="Revisão" w:date="2026-09-28T12:00:00Z">
+              <w:r>
+                <w:rPr>
+                  <w:rFonts w:ascii="Times New Roman" w:cs="Times New Roman" w:eastAsia="Times New Roman" w:hAnsi="Times New Roman"/>
+                  <w:b w:val="false"/>
+                  <w:bCs w:val="false"/>
+                  <w:i w:val="false"/>
+                  <w:iCs w:val="false"/>
+                  <w:sz w:val="20"/>
+                  <w:szCs w:val="20"/>
+                </w:rPr>
+                <w:delText xml:space="preserve">0,215</w:delText>
+              </w:r>
+            </w:del>
+            <w:ins w:id="9080" w:author="Revisão" w:date="2026-09-28T12:00:00Z">
+              <w:r>
+                <w:rPr>
+                  <w:rFonts w:ascii="Times New Roman" w:cs="Times New Roman" w:eastAsia="Times New Roman" w:hAnsi="Times New Roman"/>
+                  <w:b w:val="false"/>
+                  <w:bCs w:val="false"/>
+                  <w:i w:val="false"/>
+                  <w:iCs w:val="false"/>
+                  <w:sz w:val="20"/>
+                  <w:szCs w:val="20"/>
+                </w:rPr>
+                <w:t xml:space="preserve">0,184</w:t>
+              </w:r>
+            </w:ins>
           </w:p>
         </w:tc>
         <w:tc>
@@ -29315,18 +29475,34 @@
               <w:spacing w:after="0" w:before="0" w:line="240"/>
               <w:jc w:val="center"/>
             </w:pPr>
-            <w:r>
-              <w:rPr>
-                <w:rFonts w:ascii="Times New Roman" w:cs="Times New Roman" w:eastAsia="Times New Roman" w:hAnsi="Times New Roman"/>
-                <w:b w:val="false"/>
-                <w:bCs w:val="false"/>
-                <w:i w:val="false"/>
-                <w:iCs w:val="false"/>
-                <w:sz w:val="20"/>
-                <w:szCs w:val="20"/>
-              </w:rPr>
-              <w:t xml:space="preserve">0,0280</w:t>
-            </w:r>
+            <w:del w:id="9081" w:author="Revisão" w:date="2026-09-28T12:00:00Z">
+              <w:r>
+                <w:rPr>
+                  <w:rFonts w:ascii="Times New Roman" w:cs="Times New Roman" w:eastAsia="Times New Roman" w:hAnsi="Times New Roman"/>
+                  <w:b w:val="false"/>
+                  <w:bCs w:val="false"/>
+                  <w:i w:val="false"/>
+                  <w:iCs w:val="false"/>
+                  <w:sz w:val="20"/>
+                  <w:szCs w:val="20"/>
+                </w:rPr>
+                <w:delText xml:space="preserve">0,0280</w:delText>
+              </w:r>
+            </w:del>
+            <w:ins w:id="9082" w:author="Revisão" w:date="2026-09-28T12:00:00Z">
+              <w:r>
+                <w:rPr>
+                  <w:rFonts w:ascii="Times New Roman" w:cs="Times New Roman" w:eastAsia="Times New Roman" w:hAnsi="Times New Roman"/>
+                  <w:b w:val="false"/>
+                  <w:bCs w:val="false"/>
+                  <w:i w:val="false"/>
+                  <w:iCs w:val="false"/>
+                  <w:sz w:val="20"/>
+                  <w:szCs w:val="20"/>
+                </w:rPr>
+                <w:t xml:space="preserve">0,0256</w:t>
+              </w:r>
+            </w:ins>
           </w:p>
         </w:tc>
         <w:tc>
@@ -29344,18 +29520,34 @@
               <w:spacing w:after="0" w:before="0" w:line="240"/>
               <w:jc w:val="center"/>
             </w:pPr>
-            <w:r>
-              <w:rPr>
-                <w:rFonts w:ascii="Times New Roman" w:cs="Times New Roman" w:eastAsia="Times New Roman" w:hAnsi="Times New Roman"/>
-                <w:b w:val="false"/>
-                <w:bCs w:val="false"/>
-                <w:i w:val="false"/>
-                <w:iCs w:val="false"/>
-                <w:sz w:val="20"/>
-                <w:szCs w:val="20"/>
-              </w:rPr>
-              <w:t xml:space="preserve">0,970</w:t>
-            </w:r>
+            <w:del w:id="9083" w:author="Revisão" w:date="2026-09-28T12:00:00Z">
+              <w:r>
+                <w:rPr>
+                  <w:rFonts w:ascii="Times New Roman" w:cs="Times New Roman" w:eastAsia="Times New Roman" w:hAnsi="Times New Roman"/>
+                  <w:b w:val="false"/>
+                  <w:bCs w:val="false"/>
+                  <w:i w:val="false"/>
+                  <w:iCs w:val="false"/>
+                  <w:sz w:val="20"/>
+                  <w:szCs w:val="20"/>
+                </w:rPr>
+                <w:delText xml:space="preserve">0,970</w:delText>
+              </w:r>
+            </w:del>
+            <w:ins w:id="9084" w:author="Revisão" w:date="2026-09-28T12:00:00Z">
+              <w:r>
+                <w:rPr>
+                  <w:rFonts w:ascii="Times New Roman" w:cs="Times New Roman" w:eastAsia="Times New Roman" w:hAnsi="Times New Roman"/>
+                  <w:b w:val="false"/>
+                  <w:bCs w:val="false"/>
+                  <w:i w:val="false"/>
+                  <w:iCs w:val="false"/>
+                  <w:sz w:val="20"/>
+                  <w:szCs w:val="20"/>
+                </w:rPr>
+                <w:t xml:space="preserve">0,988</w:t>
+              </w:r>
+            </w:ins>
           </w:p>
         </w:tc>
         <w:tc>
@@ -29494,18 +29686,34 @@
               <w:spacing w:after="0" w:before="0" w:line="240"/>
               <w:jc w:val="center"/>
             </w:pPr>
-            <w:r>
-              <w:rPr>
-                <w:rFonts w:ascii="Times New Roman" w:cs="Times New Roman" w:eastAsia="Times New Roman" w:hAnsi="Times New Roman"/>
-                <w:b w:val="false"/>
-                <w:bCs w:val="false"/>
-                <w:i w:val="false"/>
-                <w:iCs w:val="false"/>
-                <w:sz w:val="20"/>
-                <w:szCs w:val="20"/>
-              </w:rPr>
-              <w:t xml:space="preserve">0,0288</w:t>
-            </w:r>
+            <w:del w:id="9085" w:author="Revisão" w:date="2026-09-28T12:00:00Z">
+              <w:r>
+                <w:rPr>
+                  <w:rFonts w:ascii="Times New Roman" w:cs="Times New Roman" w:eastAsia="Times New Roman" w:hAnsi="Times New Roman"/>
+                  <w:b w:val="false"/>
+                  <w:bCs w:val="false"/>
+                  <w:i w:val="false"/>
+                  <w:iCs w:val="false"/>
+                  <w:sz w:val="20"/>
+                  <w:szCs w:val="20"/>
+                </w:rPr>
+                <w:delText xml:space="preserve">0,0288</w:delText>
+              </w:r>
+            </w:del>
+            <w:ins w:id="9086" w:author="Revisão" w:date="2026-09-28T12:00:00Z">
+              <w:r>
+                <w:rPr>
+                  <w:rFonts w:ascii="Times New Roman" w:cs="Times New Roman" w:eastAsia="Times New Roman" w:hAnsi="Times New Roman"/>
+                  <w:b w:val="false"/>
+                  <w:bCs w:val="false"/>
+                  <w:i w:val="false"/>
+                  <w:iCs w:val="false"/>
+                  <w:sz w:val="20"/>
+                  <w:szCs w:val="20"/>
+                </w:rPr>
+                <w:t xml:space="preserve">0,0260</w:t>
+              </w:r>
+            </w:ins>
           </w:p>
         </w:tc>
         <w:tc>
@@ -29523,18 +29731,34 @@
               <w:spacing w:after="0" w:before="0" w:line="240"/>
               <w:jc w:val="center"/>
             </w:pPr>
-            <w:r>
-              <w:rPr>
-                <w:rFonts w:ascii="Times New Roman" w:cs="Times New Roman" w:eastAsia="Times New Roman" w:hAnsi="Times New Roman"/>
-                <w:b w:val="false"/>
-                <w:bCs w:val="false"/>
-                <w:i w:val="false"/>
-                <w:iCs w:val="false"/>
-                <w:sz w:val="20"/>
-                <w:szCs w:val="20"/>
-              </w:rPr>
-              <w:t xml:space="preserve">1,005</w:t>
-            </w:r>
+            <w:del w:id="9087" w:author="Revisão" w:date="2026-09-28T12:00:00Z">
+              <w:r>
+                <w:rPr>
+                  <w:rFonts w:ascii="Times New Roman" w:cs="Times New Roman" w:eastAsia="Times New Roman" w:hAnsi="Times New Roman"/>
+                  <w:b w:val="false"/>
+                  <w:bCs w:val="false"/>
+                  <w:i w:val="false"/>
+                  <w:iCs w:val="false"/>
+                  <w:sz w:val="20"/>
+                  <w:szCs w:val="20"/>
+                </w:rPr>
+                <w:delText xml:space="preserve">1,005</w:delText>
+              </w:r>
+            </w:del>
+            <w:ins w:id="9088" w:author="Revisão" w:date="2026-09-28T12:00:00Z">
+              <w:r>
+                <w:rPr>
+                  <w:rFonts w:ascii="Times New Roman" w:cs="Times New Roman" w:eastAsia="Times New Roman" w:hAnsi="Times New Roman"/>
+                  <w:b w:val="false"/>
+                  <w:bCs w:val="false"/>
+                  <w:i w:val="false"/>
+                  <w:iCs w:val="false"/>
+                  <w:sz w:val="20"/>
+                  <w:szCs w:val="20"/>
+                </w:rPr>
+                <w:t xml:space="preserve">1,072</w:t>
+              </w:r>
+            </w:ins>
           </w:p>
         </w:tc>
         <w:tc>
@@ -29644,18 +29868,34 @@
               <w:spacing w:after="0" w:before="0" w:line="240"/>
               <w:jc w:val="center"/>
             </w:pPr>
-            <w:r>
-              <w:rPr>
-                <w:rFonts w:ascii="Times New Roman" w:cs="Times New Roman" w:eastAsia="Times New Roman" w:hAnsi="Times New Roman"/>
-                <w:b w:val="false"/>
-                <w:bCs w:val="false"/>
-                <w:i w:val="false"/>
-                <w:iCs w:val="false"/>
-                <w:sz w:val="20"/>
-                <w:szCs w:val="20"/>
-              </w:rPr>
-              <w:t xml:space="preserve">0,171</w:t>
-            </w:r>
+            <w:del w:id="9089" w:author="Revisão" w:date="2026-09-28T12:00:00Z">
+              <w:r>
+                <w:rPr>
+                  <w:rFonts w:ascii="Times New Roman" w:cs="Times New Roman" w:eastAsia="Times New Roman" w:hAnsi="Times New Roman"/>
+                  <w:b w:val="false"/>
+                  <w:bCs w:val="false"/>
+                  <w:i w:val="false"/>
+                  <w:iCs w:val="false"/>
+                  <w:sz w:val="20"/>
+                  <w:szCs w:val="20"/>
+                </w:rPr>
+                <w:delText xml:space="preserve">0,171</w:delText>
+              </w:r>
+            </w:del>
+            <w:ins w:id="9090" w:author="Revisão" w:date="2026-09-28T12:00:00Z">
+              <w:r>
+                <w:rPr>
+                  <w:rFonts w:ascii="Times New Roman" w:cs="Times New Roman" w:eastAsia="Times New Roman" w:hAnsi="Times New Roman"/>
+                  <w:b w:val="false"/>
+                  <w:bCs w:val="false"/>
+                  <w:i w:val="false"/>
+                  <w:iCs w:val="false"/>
+                  <w:sz w:val="20"/>
+                  <w:szCs w:val="20"/>
+                </w:rPr>
+                <w:t xml:space="preserve">0,175</w:t>
+              </w:r>
+            </w:ins>
           </w:p>
         </w:tc>
         <w:tc>
@@ -29673,18 +29913,34 @@
               <w:spacing w:after="0" w:before="0" w:line="240"/>
               <w:jc w:val="center"/>
             </w:pPr>
-            <w:r>
-              <w:rPr>
-                <w:rFonts w:ascii="Times New Roman" w:cs="Times New Roman" w:eastAsia="Times New Roman" w:hAnsi="Times New Roman"/>
-                <w:b w:val="false"/>
-                <w:bCs w:val="false"/>
-                <w:i w:val="false"/>
-                <w:iCs w:val="false"/>
-                <w:sz w:val="20"/>
-                <w:szCs w:val="20"/>
-              </w:rPr>
-              <w:t xml:space="preserve">0,0289</w:t>
-            </w:r>
+            <w:del w:id="9091" w:author="Revisão" w:date="2026-09-28T12:00:00Z">
+              <w:r>
+                <w:rPr>
+                  <w:rFonts w:ascii="Times New Roman" w:cs="Times New Roman" w:eastAsia="Times New Roman" w:hAnsi="Times New Roman"/>
+                  <w:b w:val="false"/>
+                  <w:bCs w:val="false"/>
+                  <w:i w:val="false"/>
+                  <w:iCs w:val="false"/>
+                  <w:sz w:val="20"/>
+                  <w:szCs w:val="20"/>
+                </w:rPr>
+                <w:delText xml:space="preserve">0,0289</w:delText>
+              </w:r>
+            </w:del>
+            <w:ins w:id="9092" w:author="Revisão" w:date="2026-09-28T12:00:00Z">
+              <w:r>
+                <w:rPr>
+                  <w:rFonts w:ascii="Times New Roman" w:cs="Times New Roman" w:eastAsia="Times New Roman" w:hAnsi="Times New Roman"/>
+                  <w:b w:val="false"/>
+                  <w:bCs w:val="false"/>
+                  <w:i w:val="false"/>
+                  <w:iCs w:val="false"/>
+                  <w:sz w:val="20"/>
+                  <w:szCs w:val="20"/>
+                </w:rPr>
+                <w:t xml:space="preserve">0,0260</w:t>
+              </w:r>
+            </w:ins>
           </w:p>
         </w:tc>
         <w:tc>
@@ -29702,18 +29958,34 @@
               <w:spacing w:after="0" w:before="0" w:line="240"/>
               <w:jc w:val="center"/>
             </w:pPr>
-            <w:r>
-              <w:rPr>
-                <w:rFonts w:ascii="Times New Roman" w:cs="Times New Roman" w:eastAsia="Times New Roman" w:hAnsi="Times New Roman"/>
-                <w:b w:val="false"/>
-                <w:bCs w:val="false"/>
-                <w:i w:val="false"/>
-                <w:iCs w:val="false"/>
-                <w:sz w:val="20"/>
-                <w:szCs w:val="20"/>
-              </w:rPr>
-              <w:t xml:space="preserve">0,968</w:t>
-            </w:r>
+            <w:del w:id="9093" w:author="Revisão" w:date="2026-09-28T12:00:00Z">
+              <w:r>
+                <w:rPr>
+                  <w:rFonts w:ascii="Times New Roman" w:cs="Times New Roman" w:eastAsia="Times New Roman" w:hAnsi="Times New Roman"/>
+                  <w:b w:val="false"/>
+                  <w:bCs w:val="false"/>
+                  <w:i w:val="false"/>
+                  <w:iCs w:val="false"/>
+                  <w:sz w:val="20"/>
+                  <w:szCs w:val="20"/>
+                </w:rPr>
+                <w:delText xml:space="preserve">0,968</w:delText>
+              </w:r>
+            </w:del>
+            <w:ins w:id="9094" w:author="Revisão" w:date="2026-09-28T12:00:00Z">
+              <w:r>
+                <w:rPr>
+                  <w:rFonts w:ascii="Times New Roman" w:cs="Times New Roman" w:eastAsia="Times New Roman" w:hAnsi="Times New Roman"/>
+                  <w:b w:val="false"/>
+                  <w:bCs w:val="false"/>
+                  <w:i w:val="false"/>
+                  <w:iCs w:val="false"/>
+                  <w:sz w:val="20"/>
+                  <w:szCs w:val="20"/>
+                </w:rPr>
+                <w:t xml:space="preserve">0,993</w:t>
+              </w:r>
+            </w:ins>
           </w:p>
         </w:tc>
         <w:tc>
@@ -29823,18 +30095,34 @@
               <w:spacing w:after="0" w:before="0" w:line="240"/>
               <w:jc w:val="center"/>
             </w:pPr>
-            <w:r>
-              <w:rPr>
-                <w:rFonts w:ascii="Times New Roman" w:cs="Times New Roman" w:eastAsia="Times New Roman" w:hAnsi="Times New Roman"/>
-                <w:b w:val="false"/>
-                <w:bCs w:val="false"/>
-                <w:i w:val="false"/>
-                <w:iCs w:val="false"/>
-                <w:sz w:val="20"/>
-                <w:szCs w:val="20"/>
-              </w:rPr>
-              <w:t xml:space="preserve">0,110</w:t>
-            </w:r>
+            <w:del w:id="9095" w:author="Revisão" w:date="2026-09-28T12:00:00Z">
+              <w:r>
+                <w:rPr>
+                  <w:rFonts w:ascii="Times New Roman" w:cs="Times New Roman" w:eastAsia="Times New Roman" w:hAnsi="Times New Roman"/>
+                  <w:b w:val="false"/>
+                  <w:bCs w:val="false"/>
+                  <w:i w:val="false"/>
+                  <w:iCs w:val="false"/>
+                  <w:sz w:val="20"/>
+                  <w:szCs w:val="20"/>
+                </w:rPr>
+                <w:delText xml:space="preserve">0,110</w:delText>
+              </w:r>
+            </w:del>
+            <w:ins w:id="9096" w:author="Revisão" w:date="2026-09-28T12:00:00Z">
+              <w:r>
+                <w:rPr>
+                  <w:rFonts w:ascii="Times New Roman" w:cs="Times New Roman" w:eastAsia="Times New Roman" w:hAnsi="Times New Roman"/>
+                  <w:b w:val="false"/>
+                  <w:bCs w:val="false"/>
+                  <w:i w:val="false"/>
+                  <w:iCs w:val="false"/>
+                  <w:sz w:val="20"/>
+                  <w:szCs w:val="20"/>
+                </w:rPr>
+                <w:t xml:space="preserve">0,111</w:t>
+              </w:r>
+            </w:ins>
           </w:p>
         </w:tc>
         <w:tc>
@@ -29852,18 +30140,34 @@
               <w:spacing w:after="0" w:before="0" w:line="240"/>
               <w:jc w:val="center"/>
             </w:pPr>
-            <w:r>
-              <w:rPr>
-                <w:rFonts w:ascii="Times New Roman" w:cs="Times New Roman" w:eastAsia="Times New Roman" w:hAnsi="Times New Roman"/>
-                <w:b w:val="false"/>
-                <w:bCs w:val="false"/>
-                <w:i w:val="false"/>
-                <w:iCs w:val="false"/>
-                <w:sz w:val="20"/>
-                <w:szCs w:val="20"/>
-              </w:rPr>
-              <w:t xml:space="preserve">0,0285</w:t>
-            </w:r>
+            <w:del w:id="9097" w:author="Revisão" w:date="2026-09-28T12:00:00Z">
+              <w:r>
+                <w:rPr>
+                  <w:rFonts w:ascii="Times New Roman" w:cs="Times New Roman" w:eastAsia="Times New Roman" w:hAnsi="Times New Roman"/>
+                  <w:b w:val="false"/>
+                  <w:bCs w:val="false"/>
+                  <w:i w:val="false"/>
+                  <w:iCs w:val="false"/>
+                  <w:sz w:val="20"/>
+                  <w:szCs w:val="20"/>
+                </w:rPr>
+                <w:delText xml:space="preserve">0,0285</w:delText>
+              </w:r>
+            </w:del>
+            <w:ins w:id="9098" w:author="Revisão" w:date="2026-09-28T12:00:00Z">
+              <w:r>
+                <w:rPr>
+                  <w:rFonts w:ascii="Times New Roman" w:cs="Times New Roman" w:eastAsia="Times New Roman" w:hAnsi="Times New Roman"/>
+                  <w:b w:val="false"/>
+                  <w:bCs w:val="false"/>
+                  <w:i w:val="false"/>
+                  <w:iCs w:val="false"/>
+                  <w:sz w:val="20"/>
+                  <w:szCs w:val="20"/>
+                </w:rPr>
+                <w:t xml:space="preserve">0,0275</w:t>
+              </w:r>
+            </w:ins>
           </w:p>
         </w:tc>
         <w:tc>
@@ -29881,18 +30185,34 @@
               <w:spacing w:after="0" w:before="0" w:line="240"/>
               <w:jc w:val="center"/>
             </w:pPr>
-            <w:r>
-              <w:rPr>
-                <w:rFonts w:ascii="Times New Roman" w:cs="Times New Roman" w:eastAsia="Times New Roman" w:hAnsi="Times New Roman"/>
-                <w:b w:val="false"/>
-                <w:bCs w:val="false"/>
-                <w:i w:val="false"/>
-                <w:iCs w:val="false"/>
-                <w:sz w:val="20"/>
-                <w:szCs w:val="20"/>
-              </w:rPr>
-              <w:t xml:space="preserve">0,973</w:t>
-            </w:r>
+            <w:del w:id="9099" w:author="Revisão" w:date="2026-09-28T12:00:00Z">
+              <w:r>
+                <w:rPr>
+                  <w:rFonts w:ascii="Times New Roman" w:cs="Times New Roman" w:eastAsia="Times New Roman" w:hAnsi="Times New Roman"/>
+                  <w:b w:val="false"/>
+                  <w:bCs w:val="false"/>
+                  <w:i w:val="false"/>
+                  <w:iCs w:val="false"/>
+                  <w:sz w:val="20"/>
+                  <w:szCs w:val="20"/>
+                </w:rPr>
+                <w:delText xml:space="preserve">0,973</w:delText>
+              </w:r>
+            </w:del>
+            <w:ins w:id="9100" w:author="Revisão" w:date="2026-09-28T12:00:00Z">
+              <w:r>
+                <w:rPr>
+                  <w:rFonts w:ascii="Times New Roman" w:cs="Times New Roman" w:eastAsia="Times New Roman" w:hAnsi="Times New Roman"/>
+                  <w:b w:val="false"/>
+                  <w:bCs w:val="false"/>
+                  <w:i w:val="false"/>
+                  <w:iCs w:val="false"/>
+                  <w:sz w:val="20"/>
+                  <w:szCs w:val="20"/>
+                </w:rPr>
+                <w:t xml:space="preserve">0,991</w:t>
+              </w:r>
+            </w:ins>
           </w:p>
         </w:tc>
         <w:tc>
@@ -30002,18 +30322,34 @@
               <w:spacing w:after="0" w:before="0" w:line="240"/>
               <w:jc w:val="center"/>
             </w:pPr>
-            <w:r>
-              <w:rPr>
-                <w:rFonts w:ascii="Times New Roman" w:cs="Times New Roman" w:eastAsia="Times New Roman" w:hAnsi="Times New Roman"/>
-                <w:b w:val="false"/>
-                <w:bCs w:val="false"/>
-                <w:i w:val="false"/>
-                <w:iCs w:val="false"/>
-                <w:sz w:val="20"/>
-                <w:szCs w:val="20"/>
-              </w:rPr>
-              <w:t xml:space="preserve">0,077</w:t>
-            </w:r>
+            <w:del w:id="9101" w:author="Revisão" w:date="2026-09-28T12:00:00Z">
+              <w:r>
+                <w:rPr>
+                  <w:rFonts w:ascii="Times New Roman" w:cs="Times New Roman" w:eastAsia="Times New Roman" w:hAnsi="Times New Roman"/>
+                  <w:b w:val="false"/>
+                  <w:bCs w:val="false"/>
+                  <w:i w:val="false"/>
+                  <w:iCs w:val="false"/>
+                  <w:sz w:val="20"/>
+                  <w:szCs w:val="20"/>
+                </w:rPr>
+                <w:delText xml:space="preserve">0,077</w:delText>
+              </w:r>
+            </w:del>
+            <w:ins w:id="9102" w:author="Revisão" w:date="2026-09-28T12:00:00Z">
+              <w:r>
+                <w:rPr>
+                  <w:rFonts w:ascii="Times New Roman" w:cs="Times New Roman" w:eastAsia="Times New Roman" w:hAnsi="Times New Roman"/>
+                  <w:b w:val="false"/>
+                  <w:bCs w:val="false"/>
+                  <w:i w:val="false"/>
+                  <w:iCs w:val="false"/>
+                  <w:sz w:val="20"/>
+                  <w:szCs w:val="20"/>
+                </w:rPr>
+                <w:t xml:space="preserve">0,095</w:t>
+              </w:r>
+            </w:ins>
           </w:p>
         </w:tc>
         <w:tc>
@@ -30031,18 +30367,34 @@
               <w:spacing w:after="0" w:before="0" w:line="240"/>
               <w:jc w:val="center"/>
             </w:pPr>
-            <w:r>
-              <w:rPr>
-                <w:rFonts w:ascii="Times New Roman" w:cs="Times New Roman" w:eastAsia="Times New Roman" w:hAnsi="Times New Roman"/>
-                <w:b w:val="false"/>
-                <w:bCs w:val="false"/>
-                <w:i w:val="false"/>
-                <w:iCs w:val="false"/>
-                <w:sz w:val="20"/>
-                <w:szCs w:val="20"/>
-              </w:rPr>
-              <w:t xml:space="preserve">0,0290</w:t>
-            </w:r>
+            <w:del w:id="9103" w:author="Revisão" w:date="2026-09-28T12:00:00Z">
+              <w:r>
+                <w:rPr>
+                  <w:rFonts w:ascii="Times New Roman" w:cs="Times New Roman" w:eastAsia="Times New Roman" w:hAnsi="Times New Roman"/>
+                  <w:b w:val="false"/>
+                  <w:bCs w:val="false"/>
+                  <w:i w:val="false"/>
+                  <w:iCs w:val="false"/>
+                  <w:sz w:val="20"/>
+                  <w:szCs w:val="20"/>
+                </w:rPr>
+                <w:delText xml:space="preserve">0,0290</w:delText>
+              </w:r>
+            </w:del>
+            <w:ins w:id="9104" w:author="Revisão" w:date="2026-09-28T12:00:00Z">
+              <w:r>
+                <w:rPr>
+                  <w:rFonts w:ascii="Times New Roman" w:cs="Times New Roman" w:eastAsia="Times New Roman" w:hAnsi="Times New Roman"/>
+                  <w:b w:val="false"/>
+                  <w:bCs w:val="false"/>
+                  <w:i w:val="false"/>
+                  <w:iCs w:val="false"/>
+                  <w:sz w:val="20"/>
+                  <w:szCs w:val="20"/>
+                </w:rPr>
+                <w:t xml:space="preserve">0,0278</w:t>
+              </w:r>
+            </w:ins>
           </w:p>
         </w:tc>
         <w:tc>
@@ -30060,18 +30412,34 @@
               <w:spacing w:after="0" w:before="0" w:line="240"/>
               <w:jc w:val="center"/>
             </w:pPr>
-            <w:r>
-              <w:rPr>
-                <w:rFonts w:ascii="Times New Roman" w:cs="Times New Roman" w:eastAsia="Times New Roman" w:hAnsi="Times New Roman"/>
-                <w:b w:val="false"/>
-                <w:bCs w:val="false"/>
-                <w:i w:val="false"/>
-                <w:iCs w:val="false"/>
-                <w:sz w:val="20"/>
-                <w:szCs w:val="20"/>
-              </w:rPr>
-              <w:t xml:space="preserve">0,738</w:t>
-            </w:r>
+            <w:del w:id="9105" w:author="Revisão" w:date="2026-09-28T12:00:00Z">
+              <w:r>
+                <w:rPr>
+                  <w:rFonts w:ascii="Times New Roman" w:cs="Times New Roman" w:eastAsia="Times New Roman" w:hAnsi="Times New Roman"/>
+                  <w:b w:val="false"/>
+                  <w:bCs w:val="false"/>
+                  <w:i w:val="false"/>
+                  <w:iCs w:val="false"/>
+                  <w:sz w:val="20"/>
+                  <w:szCs w:val="20"/>
+                </w:rPr>
+                <w:delText xml:space="preserve">0,738</w:delText>
+              </w:r>
+            </w:del>
+            <w:ins w:id="9106" w:author="Revisão" w:date="2026-09-28T12:00:00Z">
+              <w:r>
+                <w:rPr>
+                  <w:rFonts w:ascii="Times New Roman" w:cs="Times New Roman" w:eastAsia="Times New Roman" w:hAnsi="Times New Roman"/>
+                  <w:b w:val="false"/>
+                  <w:bCs w:val="false"/>
+                  <w:i w:val="false"/>
+                  <w:iCs w:val="false"/>
+                  <w:sz w:val="20"/>
+                  <w:szCs w:val="20"/>
+                </w:rPr>
+                <w:t xml:space="preserve">1,075</w:t>
+              </w:r>
+            </w:ins>
           </w:p>
         </w:tc>
         <w:tc>
@@ -30089,18 +30457,34 @@
               <w:spacing w:after="0" w:before="0" w:line="240"/>
               <w:jc w:val="center"/>
             </w:pPr>
-            <w:r>
-              <w:rPr>
-                <w:rFonts w:ascii="Times New Roman" w:cs="Times New Roman" w:eastAsia="Times New Roman" w:hAnsi="Times New Roman"/>
-                <w:b w:val="false"/>
-                <w:bCs w:val="false"/>
-                <w:i w:val="false"/>
-                <w:iCs w:val="false"/>
-                <w:sz w:val="20"/>
-                <w:szCs w:val="20"/>
-              </w:rPr>
-              <w:t xml:space="preserve">54,6%</w:t>
-            </w:r>
+            <w:del w:id="9107" w:author="Revisão" w:date="2026-09-28T12:00:00Z">
+              <w:r>
+                <w:rPr>
+                  <w:rFonts w:ascii="Times New Roman" w:cs="Times New Roman" w:eastAsia="Times New Roman" w:hAnsi="Times New Roman"/>
+                  <w:b w:val="false"/>
+                  <w:bCs w:val="false"/>
+                  <w:i w:val="false"/>
+                  <w:iCs w:val="false"/>
+                  <w:sz w:val="20"/>
+                  <w:szCs w:val="20"/>
+                </w:rPr>
+                <w:delText xml:space="preserve">54,6%</w:delText>
+              </w:r>
+            </w:del>
+            <w:ins w:id="9108" w:author="Revisão" w:date="2026-09-28T12:00:00Z">
+              <w:r>
+                <w:rPr>
+                  <w:rFonts w:ascii="Times New Roman" w:cs="Times New Roman" w:eastAsia="Times New Roman" w:hAnsi="Times New Roman"/>
+                  <w:b w:val="false"/>
+                  <w:bCs w:val="false"/>
+                  <w:i w:val="false"/>
+                  <w:iCs w:val="false"/>
+                  <w:sz w:val="20"/>
+                  <w:szCs w:val="20"/>
+                </w:rPr>
+                <w:t xml:space="preserve">54,7%</w:t>
+              </w:r>
+            </w:ins>
           </w:p>
         </w:tc>
         <w:tc>
@@ -30330,7 +30714,7 @@
         </w:rPr>
         <w:t xml:space="preserve">Fonte: elaboração própria. </w:t>
       </w:r>
-      <w:del w:id="9067" w:author="Revisão" w:date="2026-09-28T12:00:00Z">
+      <w:del w:id="9111" w:author="Revisão" w:date="2026-09-28T12:00:00Z">
         <w:r>
           <w:rPr>
             <w:rFonts w:ascii="Times New Roman" w:cs="Times New Roman" w:eastAsia="Times New Roman" w:hAnsi="Times New Roman"/>
@@ -30344,7 +30728,7 @@
           <w:delText xml:space="preserve">Firmas sinalizadas e valor preditivo positivo referem-se</w:delText>
         </w:r>
       </w:del>
-      <w:ins w:id="9068" w:author="Revisão" w:date="2026-09-28T12:00:00Z">
+      <w:ins w:id="9112" w:author="Revisão" w:date="2026-09-28T12:00:00Z">
         <w:r>
           <w:rPr>
             <w:rFonts w:ascii="Times New Roman" w:cs="Times New Roman" w:eastAsia="Times New Roman" w:hAnsi="Times New Roman"/>
@@ -30368,8 +30752,36 @@
           <w:sz w:val="20"/>
           <w:szCs w:val="20"/>
         </w:rPr>
-        <w:t xml:space="preserve"> ao limiar que atinge sensibilidade de 80% nas firmas de treino, aplicado às de teste. A área sob a curva de precisão e revocação de um classificador sem informação iguala a prevalência; o Brier de referência corresponde à previsão constante igual à prevalência. Inclinação de calibração com valor ideal unitário.</w:t>
+        <w:t xml:space="preserve"> ao limiar que atinge sensibilidade de 80% nas firmas de treino, aplicado às de teste. A área sob a curva de precisão e revocação de um classificador sem informação iguala a prevalência; o Brier de referência corresponde à previsão constante igual à prevalência. </w:t>
       </w:r>
+      <w:del w:id="9069" w:author="Revisão" w:date="2026-09-28T12:00:00Z">
+        <w:r>
+          <w:rPr>
+            <w:rFonts w:ascii="Times New Roman" w:cs="Times New Roman" w:eastAsia="Times New Roman" w:hAnsi="Times New Roman"/>
+            <w:b w:val="false"/>
+            <w:bCs w:val="false"/>
+            <w:i w:val="false"/>
+            <w:iCs w:val="false"/>
+            <w:sz w:val="20"/>
+            <w:szCs w:val="20"/>
+          </w:rPr>
+          <w:delText xml:space="preserve">Inclinação de calibração com valor ideal unitário.</w:delText>
+        </w:r>
+      </w:del>
+      <w:ins w:id="9070" w:author="Revisão" w:date="2026-09-28T12:00:00Z">
+        <w:r>
+          <w:rPr>
+            <w:rFonts w:ascii="Times New Roman" w:cs="Times New Roman" w:eastAsia="Times New Roman" w:hAnsi="Times New Roman"/>
+            <w:b w:val="false"/>
+            <w:bCs w:val="false"/>
+            <w:i w:val="false"/>
+            <w:iCs w:val="false"/>
+            <w:sz w:val="20"/>
+            <w:szCs w:val="20"/>
+          </w:rPr>
+          <w:t xml:space="preserve">Inclinação de calibração com valor ideal unitário. Probabilidades obtidas por regressão logística sobre o posto do escore na distribuição do treino.</w:t>
+        </w:r>
+      </w:ins>
     </w:p>
     <w:p>
       <w:pPr>
@@ -30414,7 +30826,7 @@
             <w:sz w:val="24"/>
             <w:szCs w:val="24"/>
           </w:rPr>
-          <w:t xml:space="preserve">as inclinações de calibração ficam entre 0,968 e 1,016 e os interceptos próximos de zero, à exceção do modelo de Brito e Assaf Neto, com inclinação de 0,738. O escore de Brier não acompanha essa leitura: nos modelos por mínimos quadrados parciais, retorno sobre ativos e Brito e Assaf Neto ele fica ligeiramente acima do da previsão constante, efeito de poucas probabilidades extremas que a calibração logística produz sobre escores de caudas longas.</w:t>
+          <w:t xml:space="preserve">a calibração é adequada em todos os modelos, com inclinações entre 0,988 e 1,087 e interceptos próximos de zero, e todos superam a previsão constante no escore de Brier. A conversão é feita sobre o posto do escore, e não sobre o seu valor bruto, porque a regressão logística aplicada a indicadores de caudas longas, como o retorno sobre ativos e a cobertura de juros, atribui probabilidades extremas a poucas observações e degrada o escore de Brier: sobre os valores brutos, três dos seis modelos têm escore de Brier pior que o da previsão constante.</w:t>
         </w:r>
       </w:ins>
       <w:r>
@@ -30429,7 +30841,7 @@
         </w:rPr>
         <w:t xml:space="preserve"> A tradução operacional é mais informativa: para capturar cerca de 80% das entradas, </w:t>
       </w:r>
-      <w:del w:id="9065" w:author="Revisão" w:date="2026-09-28T12:00:00Z">
+      <w:del w:id="9109" w:author="Revisão" w:date="2026-09-28T12:00:00Z">
         <w:r>
           <w:rPr>
             <w:rFonts w:ascii="Times New Roman" w:cs="Times New Roman" w:eastAsia="Times New Roman" w:hAnsi="Times New Roman"/>
@@ -30443,7 +30855,7 @@
           <w:delText xml:space="preserve">a regra baseada no escore sintético sinaliza 44,1% das firmas</w:delText>
         </w:r>
       </w:del>
-      <w:ins w:id="9066" w:author="Revisão" w:date="2026-09-28T12:00:00Z">
+      <w:ins w:id="9110" w:author="Revisão" w:date="2026-09-28T12:00:00Z">
         <w:r>
           <w:rPr>
             <w:rFonts w:ascii="Times New Roman" w:cs="Times New Roman" w:eastAsia="Times New Roman" w:hAnsi="Times New Roman"/>
@@ -30467,8 +30879,36 @@
           <w:sz w:val="24"/>
           <w:szCs w:val="24"/>
         </w:rPr>
-        <w:t xml:space="preserve">, contra 18,7% da cobertura de juros, com valor preditivo positivo de 0,053 contra 0,124.</w:t>
+        <w:t xml:space="preserve">, contra 18,7% da cobertura de juros, </w:t>
       </w:r>
+      <w:del w:id="9067" w:author="Revisão" w:date="2026-09-28T12:00:00Z">
+        <w:r>
+          <w:rPr>
+            <w:rFonts w:ascii="Times New Roman" w:cs="Times New Roman" w:eastAsia="Times New Roman" w:hAnsi="Times New Roman"/>
+            <w:b w:val="false"/>
+            <w:bCs w:val="false"/>
+            <w:i w:val="false"/>
+            <w:iCs w:val="false"/>
+            <w:sz w:val="24"/>
+            <w:szCs w:val="24"/>
+          </w:rPr>
+          <w:delText xml:space="preserve">com valor preditivo positivo de 0,053 contra 0,124.</w:delText>
+        </w:r>
+      </w:del>
+      <w:ins w:id="9068" w:author="Revisão" w:date="2026-09-28T12:00:00Z">
+        <w:r>
+          <w:rPr>
+            <w:rFonts w:ascii="Times New Roman" w:cs="Times New Roman" w:eastAsia="Times New Roman" w:hAnsi="Times New Roman"/>
+            <w:b w:val="false"/>
+            <w:bCs w:val="false"/>
+            <w:i w:val="false"/>
+            <w:iCs w:val="false"/>
+            <w:sz w:val="24"/>
+            <w:szCs w:val="24"/>
+          </w:rPr>
+          <w:t xml:space="preserve">com valor preditivo positivo de 0,053 contra 0,124. No mesmo limiar, a especificidade é de 0,570 para o escore sintético e de 0,831 para a cobertura de juros, e a decisão líquida sob razão de custo de dez para um é positiva em todos os modelos, de 0,003 para o escore sintético a 0,011 para a referência não linear. No horizonte de dois anos, as métricas de probabilidade aproximam-se das da previsão constante e a decisão líquida é praticamente nula em todos os modelos, o que limita a utilidade operacional da previsão nesse horizonte.</w:t>
+        </w:r>
+      </w:ins>
     </w:p>
     <w:p>
       <w:pPr>
@@ -33889,7 +34329,7 @@
         </w:rPr>
         <w:t xml:space="preserve">A segunda diz respeito ao calendário informacional. O painel registra o ano de divulgação da recuperação judicial, e não a data do ajuizamento, que pode antecedê-la quando o primeiro documento disponível trata do andamento do processo. </w:t>
       </w:r>
-      <w:del w:id="9081" w:author="Revisão" w:date="2026-09-28T12:00:00Z">
+      <w:del w:id="9125" w:author="Revisão" w:date="2026-09-28T12:00:00Z">
         <w:r>
           <w:rPr>
             <w:rFonts w:ascii="Times New Roman" w:cs="Times New Roman" w:eastAsia="Times New Roman" w:hAnsi="Times New Roman"/>
@@ -33903,7 +34343,7 @@
           <w:delText xml:space="preserve">O tratamento conservador da subseção 5.8 mostra que a limitação não afeta as conclusões.</w:delText>
         </w:r>
       </w:del>
-      <w:ins w:id="9082" w:author="Revisão" w:date="2026-09-28T12:00:00Z">
+      <w:ins w:id="9126" w:author="Revisão" w:date="2026-09-28T12:00:00Z">
         <w:r>
           <w:rPr>
             <w:rFonts w:ascii="Times New Roman" w:cs="Times New Roman" w:eastAsia="Times New Roman" w:hAnsi="Times New Roman"/>
@@ -33914,7 +34354,7 @@
             <w:sz w:val="24"/>
             <w:szCs w:val="24"/>
           </w:rPr>
-          <w:t xml:space="preserve">O tratamento da subseção 5.8 cobre a antecipação por divulgação anterior às demonstrações de t, mas não o eventual atraso da data registrada em relação ao ajuizamento, cuja sensibilidade não foi estimada.</w:t>
+          <w:t xml:space="preserve">O tratamento da subseção 5.8 cobre a antecipação por divulgação anterior às demonstrações de t. Para o eventual atraso da data registrada em relação ao ajuizamento, a recuperação judicial das 22 firmas do painel cujo primeiro documento trata do andamento do processo foi antecipada em um ano e os modelos foram reestimados. A área sob a curva passa a 0,765 para o escore sintético e a 0,887 para a cobertura de juros, e as conclusões agregadas e por rota de deterioração se mantêm, com duas qualificações: nas entradas exclusivamente por patrimônio líquido negativo, a vantagem do escore sintético sobre o supervisionado deixa de ser distinguível, e no horizonte de dois anos a diferença entre a cobertura de juros e o escore sintético passa a resistir à correção de Bonferroni.</w:t>
         </w:r>
       </w:ins>
     </w:p>
@@ -34057,9 +34497,49 @@
           <w:sz w:val="24"/>
           <w:szCs w:val="24"/>
         </w:rPr>
-        <w:t xml:space="preserve">A contribuição está em mostrar que essa conclusão agregada é produzida por uma das rotas de deterioração. Decomposto o evento pelo critério que o define, o escore fica muito atrás apenas nas entradas por prejuízo operacional persistente, com 0,649 contra 0,973 da cobertura de juros. Nas entradas por patrimônio líquido negativo e por recuperação judicial, nenhuma diferença contra as razões isoladas é estatisticamente distinguível, e o escore supera o escore supervisionado nas primeiras. No caso da recuperação judicial, com onze entradas puras, essa ausência de diferença reflete também a baixa precisão da comparação, e não sustenta afirmação forte em nenhuma direção. </w:t>
+        <w:t xml:space="preserve">A contribuição está em mostrar que essa conclusão agregada é produzida por uma das rotas de deterioração. Decomposto o evento pelo critério que o define, o escore fica muito atrás apenas nas entradas por prejuízo operacional persistente, com 0,649 contra 0,973 da cobertura de juros. Nas entradas por patrimônio líquido negativo e por recuperação judicial, nenhuma diferença contra as razões isoladas é estatisticamente distinguível, </w:t>
       </w:r>
-      <w:del w:id="9099" w:author="Revisão" w:date="2026-09-28T12:00:00Z">
+      <w:del w:id="9129" w:author="Revisão" w:date="2026-09-28T12:00:00Z">
+        <w:r>
+          <w:rPr>
+            <w:rFonts w:ascii="Times New Roman" w:cs="Times New Roman" w:eastAsia="Times New Roman" w:hAnsi="Times New Roman"/>
+            <w:b w:val="false"/>
+            <w:bCs w:val="false"/>
+            <w:i w:val="false"/>
+            <w:iCs w:val="false"/>
+            <w:sz w:val="24"/>
+            <w:szCs w:val="24"/>
+          </w:rPr>
+          <w:delText xml:space="preserve">e o escore supera o escore supervisionado nas primeiras.</w:delText>
+        </w:r>
+      </w:del>
+      <w:ins w:id="9130" w:author="Revisão" w:date="2026-09-28T12:00:00Z">
+        <w:r>
+          <w:rPr>
+            <w:rFonts w:ascii="Times New Roman" w:cs="Times New Roman" w:eastAsia="Times New Roman" w:hAnsi="Times New Roman"/>
+            <w:b w:val="false"/>
+            <w:bCs w:val="false"/>
+            <w:i w:val="false"/>
+            <w:iCs w:val="false"/>
+            <w:sz w:val="24"/>
+            <w:szCs w:val="24"/>
+          </w:rPr>
+          <w:t xml:space="preserve">e o escore supera nominalmente o escore supervisionado nas primeiras, com diferença sensível à datação da recuperação judicial.</w:t>
+        </w:r>
+      </w:ins>
+      <w:r>
+        <w:rPr>
+          <w:rFonts w:ascii="Times New Roman" w:cs="Times New Roman" w:eastAsia="Times New Roman" w:hAnsi="Times New Roman"/>
+          <w:b w:val="false"/>
+          <w:bCs w:val="false"/>
+          <w:i w:val="false"/>
+          <w:iCs w:val="false"/>
+          <w:sz w:val="24"/>
+          <w:szCs w:val="24"/>
+        </w:rPr>
+        <w:t xml:space="preserve"> No caso da recuperação judicial, com onze entradas puras, essa ausência de diferença reflete também a baixa precisão da comparação, e não sustenta afirmação forte em nenhuma direção. </w:t>
+      </w:r>
+      <w:del w:id="9147" w:author="Revisão" w:date="2026-09-28T12:00:00Z">
         <w:r>
           <w:rPr>
             <w:rFonts w:ascii="Times New Roman" w:cs="Times New Roman" w:eastAsia="Times New Roman" w:hAnsi="Times New Roman"/>
@@ -34073,7 +34553,7 @@
           <w:delText xml:space="preserve">Retiradas as entradas por prejuízo operacional, a vantagem da agregação supervisionada desaparece por completo.</w:delText>
         </w:r>
       </w:del>
-      <w:ins w:id="9100" w:author="Revisão" w:date="2026-09-28T12:00:00Z">
+      <w:ins w:id="9148" w:author="Revisão" w:date="2026-09-28T12:00:00Z">
         <w:r>
           <w:rPr>
             <w:rFonts w:ascii="Times New Roman" w:cs="Times New Roman" w:eastAsia="Times New Roman" w:hAnsi="Times New Roman"/>
@@ -34094,7 +34574,7 @@
         <w:ind w:firstLine="708"/>
         <w:jc w:val="both"/>
       </w:pPr>
-      <w:del w:id="9101" w:author="Revisão" w:date="2026-09-28T12:00:00Z">
+      <w:del w:id="9149" w:author="Revisão" w:date="2026-09-28T12:00:00Z">
         <w:r>
           <w:rPr>
             <w:rFonts w:ascii="Times New Roman" w:cs="Times New Roman" w:eastAsia="Times New Roman" w:hAnsi="Times New Roman"/>
@@ -34108,7 +34588,7 @@
           <w:delText xml:space="preserve">A explicação é de composição e está nos dados.</w:delText>
         </w:r>
       </w:del>
-      <w:ins w:id="9102" w:author="Revisão" w:date="2026-09-28T12:00:00Z">
+      <w:ins w:id="9150" w:author="Revisão" w:date="2026-09-28T12:00:00Z">
         <w:r>
           <w:rPr>
             <w:rFonts w:ascii="Times New Roman" w:cs="Times New Roman" w:eastAsia="Times New Roman" w:hAnsi="Times New Roman"/>
@@ -34134,7 +34614,7 @@
         </w:rPr>
         <w:t xml:space="preserve"> As firmas que caminham para o prejuízo operacional apresentam, no momento da previsão, alavancagem mediana de 0,213 contra 0,326 das que não entram e liquidez corrente de 1,998 contra 1,430: seu balanço é, nas dimensões de estrutura, melhor que o da firma mediana. Um escore cujas maiores cargas são capital de giro, alavancagem e liquidez as classifica como robustas, a ponto de a ordenação se inverter no horizonte de dois anos. </w:t>
       </w:r>
-      <w:del w:id="9103" w:author="Revisão" w:date="2026-09-28T12:00:00Z">
+      <w:del w:id="9151" w:author="Revisão" w:date="2026-09-28T12:00:00Z">
         <w:r>
           <w:rPr>
             <w:rFonts w:ascii="Times New Roman" w:cs="Times New Roman" w:eastAsia="Times New Roman" w:hAnsi="Times New Roman"/>
@@ -34148,7 +34628,7 @@
           <w:delText xml:space="preserve">A limitação não é da agregação em geral, e sim da composição deste escore, que mede deterioração patrimonial e é cego à rota que começa no resultado operacional de firmas pouco endividadas.</w:delText>
         </w:r>
       </w:del>
-      <w:ins w:id="9104" w:author="Revisão" w:date="2026-09-28T12:00:00Z">
+      <w:ins w:id="9152" w:author="Revisão" w:date="2026-09-28T12:00:00Z">
         <w:r>
           <w:rPr>
             <w:rFonts w:ascii="Times New Roman" w:cs="Times New Roman" w:eastAsia="Times New Roman" w:hAnsi="Times New Roman"/>
@@ -34174,7 +34654,7 @@
         </w:rPr>
         <w:t xml:space="preserve"> A multidimensionalidade documentada na avaliação de H1 e o desempenho agregado inferior documentado na de H2 </w:t>
       </w:r>
-      <w:del w:id="9111" w:author="Revisão" w:date="2026-09-28T12:00:00Z">
+      <w:del w:id="9159" w:author="Revisão" w:date="2026-09-28T12:00:00Z">
         <w:r>
           <w:rPr>
             <w:rFonts w:ascii="Times New Roman" w:cs="Times New Roman" w:eastAsia="Times New Roman" w:hAnsi="Times New Roman"/>
@@ -34188,7 +34668,7 @@
           <w:delText xml:space="preserve">são, assim, o mesmo fato observado de dois ângulos</w:delText>
         </w:r>
       </w:del>
-      <w:ins w:id="9112" w:author="Revisão" w:date="2026-09-28T12:00:00Z">
+      <w:ins w:id="9160" w:author="Revisão" w:date="2026-09-28T12:00:00Z">
         <w:r>
           <w:rPr>
             <w:rFonts w:ascii="Times New Roman" w:cs="Times New Roman" w:eastAsia="Times New Roman" w:hAnsi="Times New Roman"/>
@@ -34233,7 +34713,7 @@
         </w:rPr>
         <w:t xml:space="preserve">O achado tem implicação metodológica que excede o indicador avaliado. Medidas sintéticas de risco são avaliadas contra eventos definidos por critérios heterogêneos, que correspondem a rotas distintas de deterioração, e o desempenho é reportado sobre o agregado. A decomposição por critério é barata e </w:t>
       </w:r>
-      <w:del w:id="9109" w:author="Revisão" w:date="2026-09-28T12:00:00Z">
+      <w:del w:id="9157" w:author="Revisão" w:date="2026-09-28T12:00:00Z">
         <w:r>
           <w:rPr>
             <w:rFonts w:ascii="Times New Roman" w:cs="Times New Roman" w:eastAsia="Times New Roman" w:hAnsi="Times New Roman"/>
@@ -34247,7 +34727,7 @@
           <w:delText xml:space="preserve">revela se o indicador é uniformemente inferior ou apenas cego a uma das rotas</w:delText>
         </w:r>
       </w:del>
-      <w:ins w:id="9110" w:author="Revisão" w:date="2026-09-28T12:00:00Z">
+      <w:ins w:id="9158" w:author="Revisão" w:date="2026-09-28T12:00:00Z">
         <w:r>
           <w:rPr>
             <w:rFonts w:ascii="Times New Roman" w:cs="Times New Roman" w:eastAsia="Times New Roman" w:hAnsi="Times New Roman"/>
@@ -34513,7 +34993,7 @@
         </w:rPr>
         <w:t xml:space="preserve">BRASIL. Ministério da Fazenda. Secretaria do Tesouro Nacional. Portaria n. 882, de 18 de dezembro de 2018. Define os conceitos das variáveis utilizadas e os procedimentos a serem adotados na análise da capacidade de pagamento e na apuração da suficiência das contragarantias oferecidas. </w:t>
       </w:r>
-      <w:del w:id="9131" w:author="Revisão" w:date="2026-09-28T12:00:00Z">
+      <w:del w:id="9179" w:author="Revisão" w:date="2026-09-28T12:00:00Z">
         <w:r>
           <w:rPr>
             <w:rFonts w:ascii="Times New Roman" w:cs="Times New Roman" w:eastAsia="Times New Roman" w:hAnsi="Times New Roman"/>
@@ -34527,7 +35007,7 @@
           <w:delText xml:space="preserve">Diário Oficial da União, Brasília, DF, 20 dez. 2018.</w:delText>
         </w:r>
       </w:del>
-      <w:ins w:id="9132" w:author="Revisão" w:date="2026-09-28T12:00:00Z">
+      <w:ins w:id="9180" w:author="Revisão" w:date="2026-09-28T12:00:00Z">
         <w:r>
           <w:rPr>
             <w:rFonts w:ascii="Times New Roman" w:cs="Times New Roman" w:eastAsia="Times New Roman" w:hAnsi="Times New Roman"/>
@@ -34547,10 +35027,10 @@
         <w:spacing w:after="180" w:before="0" w:line="240"/>
         <w:jc w:val="left"/>
         <w:rPr>
-          <w:ins w:id="9133" w:author="Revisão" w:date="2026-09-28T12:00:00Z"/>
+          <w:ins w:id="9181" w:author="Revisão" w:date="2026-09-28T12:00:00Z"/>
         </w:rPr>
       </w:pPr>
-      <w:ins w:id="9134" w:author="Revisão" w:date="2026-09-28T12:00:00Z">
+      <w:ins w:id="9182" w:author="Revisão" w:date="2026-09-28T12:00:00Z">
         <w:r>
           <w:rPr>
             <w:rFonts w:ascii="Times New Roman" w:cs="Times New Roman" w:eastAsia="Times New Roman" w:hAnsi="Times New Roman"/>
@@ -34606,10 +35086,10 @@
         <w:spacing w:after="180" w:before="0" w:line="240"/>
         <w:jc w:val="left"/>
         <w:rPr>
-          <w:ins w:id="9135" w:author="Revisão" w:date="2026-09-28T12:00:00Z"/>
+          <w:ins w:id="9183" w:author="Revisão" w:date="2026-09-28T12:00:00Z"/>
         </w:rPr>
       </w:pPr>
-      <w:ins w:id="9136" w:author="Revisão" w:date="2026-09-28T12:00:00Z">
+      <w:ins w:id="9184" w:author="Revisão" w:date="2026-09-28T12:00:00Z">
         <w:r>
           <w:rPr>
             <w:rFonts w:ascii="Times New Roman" w:cs="Times New Roman" w:eastAsia="Times New Roman" w:hAnsi="Times New Roman"/>
@@ -34683,10 +35163,10 @@
         <w:spacing w:after="180" w:before="0" w:line="240"/>
         <w:jc w:val="left"/>
         <w:rPr>
-          <w:ins w:id="9137" w:author="Revisão" w:date="2026-09-28T12:00:00Z"/>
+          <w:ins w:id="9185" w:author="Revisão" w:date="2026-09-28T12:00:00Z"/>
         </w:rPr>
       </w:pPr>
-      <w:ins w:id="9138" w:author="Revisão" w:date="2026-09-28T12:00:00Z">
+      <w:ins w:id="9186" w:author="Revisão" w:date="2026-09-28T12:00:00Z">
         <w:r>
           <w:rPr>
             <w:rFonts w:ascii="Times New Roman" w:cs="Times New Roman" w:eastAsia="Times New Roman" w:hAnsi="Times New Roman"/>
@@ -34706,10 +35186,10 @@
         <w:spacing w:after="180" w:before="0" w:line="240"/>
         <w:jc w:val="left"/>
         <w:rPr>
-          <w:ins w:id="9139" w:author="Revisão" w:date="2026-09-28T12:00:00Z"/>
+          <w:ins w:id="9187" w:author="Revisão" w:date="2026-09-28T12:00:00Z"/>
         </w:rPr>
       </w:pPr>
-      <w:ins w:id="9140" w:author="Revisão" w:date="2026-09-28T12:00:00Z">
+      <w:ins w:id="9188" w:author="Revisão" w:date="2026-09-28T12:00:00Z">
         <w:r>
           <w:rPr>
             <w:rFonts w:ascii="Times New Roman" w:cs="Times New Roman" w:eastAsia="Times New Roman" w:hAnsi="Times New Roman"/>
@@ -34729,10 +35209,10 @@
         <w:spacing w:after="180" w:before="0" w:line="240"/>
         <w:jc w:val="left"/>
         <w:rPr>
-          <w:ins w:id="9141" w:author="Revisão" w:date="2026-09-28T12:00:00Z"/>
+          <w:ins w:id="9189" w:author="Revisão" w:date="2026-09-28T12:00:00Z"/>
         </w:rPr>
       </w:pPr>
-      <w:ins w:id="9142" w:author="Revisão" w:date="2026-09-28T12:00:00Z">
+      <w:ins w:id="9190" w:author="Revisão" w:date="2026-09-28T12:00:00Z">
         <w:r>
           <w:rPr>
             <w:rFonts w:ascii="Times New Roman" w:cs="Times New Roman" w:eastAsia="Times New Roman" w:hAnsi="Times New Roman"/>
@@ -34788,10 +35268,10 @@
         <w:spacing w:after="180" w:before="0" w:line="240"/>
         <w:jc w:val="left"/>
         <w:rPr>
-          <w:ins w:id="9143" w:author="Revisão" w:date="2026-09-28T12:00:00Z"/>
+          <w:ins w:id="9191" w:author="Revisão" w:date="2026-09-28T12:00:00Z"/>
         </w:rPr>
       </w:pPr>
-      <w:ins w:id="9144" w:author="Revisão" w:date="2026-09-28T12:00:00Z">
+      <w:ins w:id="9192" w:author="Revisão" w:date="2026-09-28T12:00:00Z">
         <w:r>
           <w:rPr>
             <w:rFonts w:ascii="Times New Roman" w:cs="Times New Roman" w:eastAsia="Times New Roman" w:hAnsi="Times New Roman"/>
@@ -34829,10 +35309,10 @@
         <w:spacing w:after="180" w:before="0" w:line="240"/>
         <w:jc w:val="left"/>
         <w:rPr>
-          <w:ins w:id="9145" w:author="Revisão" w:date="2026-09-28T12:00:00Z"/>
+          <w:ins w:id="9193" w:author="Revisão" w:date="2026-09-28T12:00:00Z"/>
         </w:rPr>
       </w:pPr>
-      <w:ins w:id="9146" w:author="Revisão" w:date="2026-09-28T12:00:00Z">
+      <w:ins w:id="9194" w:author="Revisão" w:date="2026-09-28T12:00:00Z">
         <w:r>
           <w:rPr>
             <w:rFonts w:ascii="Times New Roman" w:cs="Times New Roman" w:eastAsia="Times New Roman" w:hAnsi="Times New Roman"/>
@@ -35013,6 +35493,29 @@
       <w:pPr>
         <w:spacing w:after="180" w:before="0" w:line="240"/>
         <w:jc w:val="left"/>
+        <w:rPr>
+          <w:ins w:id="9195" w:author="Revisão" w:date="2026-09-28T12:00:00Z"/>
+        </w:rPr>
+      </w:pPr>
+      <w:ins w:id="9196" w:author="Revisão" w:date="2026-09-28T12:00:00Z">
+        <w:r>
+          <w:rPr>
+            <w:rFonts w:ascii="Times New Roman" w:cs="Times New Roman" w:eastAsia="Times New Roman" w:hAnsi="Times New Roman"/>
+            <w:b w:val="false"/>
+            <w:bCs w:val="false"/>
+            <w:i w:val="false"/>
+            <w:iCs w:val="false"/>
+            <w:sz w:val="24"/>
+            <w:szCs w:val="24"/>
+          </w:rPr>
+          <w:t xml:space="preserve">NICULESCU-MIZIL, A.; CARUANA, R. Predicting good probabilities with supervised learning. In: INTERNATIONAL CONFERENCE ON MACHINE LEARNING, 22., 2005, Bonn. Proceedings [...]. New York: ACM, 2005. p. 625-632.</w:t>
+        </w:r>
+      </w:ins>
+    </w:p>
+    <w:p>
+      <w:pPr>
+        <w:spacing w:after="180" w:before="0" w:line="240"/>
+        <w:jc w:val="left"/>
       </w:pPr>
       <w:r>
         <w:rPr>
@@ -35050,10 +35553,10 @@
         <w:spacing w:after="180" w:before="0" w:line="240"/>
         <w:jc w:val="left"/>
         <w:rPr>
-          <w:ins w:id="9147" w:author="Revisão" w:date="2026-09-28T12:00:00Z"/>
+          <w:ins w:id="9197" w:author="Revisão" w:date="2026-09-28T12:00:00Z"/>
         </w:rPr>
       </w:pPr>
-      <w:ins w:id="9148" w:author="Revisão" w:date="2026-09-28T12:00:00Z">
+      <w:ins w:id="9198" w:author="Revisão" w:date="2026-09-28T12:00:00Z">
         <w:r>
           <w:rPr>
             <w:rFonts w:ascii="Times New Roman" w:cs="Times New Roman" w:eastAsia="Times New Roman" w:hAnsi="Times New Roman"/>
@@ -35073,10 +35576,10 @@
         <w:spacing w:after="180" w:before="0" w:line="240"/>
         <w:jc w:val="left"/>
         <w:rPr>
-          <w:ins w:id="9149" w:author="Revisão" w:date="2026-09-28T12:00:00Z"/>
+          <w:ins w:id="9199" w:author="Revisão" w:date="2026-09-28T12:00:00Z"/>
         </w:rPr>
       </w:pPr>
-      <w:ins w:id="9150" w:author="Revisão" w:date="2026-09-28T12:00:00Z">
+      <w:ins w:id="9200" w:author="Revisão" w:date="2026-09-28T12:00:00Z">
         <w:r>
           <w:rPr>
             <w:rFonts w:ascii="Times New Roman" w:cs="Times New Roman" w:eastAsia="Times New Roman" w:hAnsi="Times New Roman"/>
@@ -35168,10 +35671,10 @@
         <w:spacing w:after="180" w:before="0" w:line="240"/>
         <w:jc w:val="left"/>
         <w:rPr>
-          <w:ins w:id="9151" w:author="Revisão" w:date="2026-09-28T12:00:00Z"/>
+          <w:ins w:id="9201" w:author="Revisão" w:date="2026-09-28T12:00:00Z"/>
         </w:rPr>
       </w:pPr>
-      <w:ins w:id="9152" w:author="Revisão" w:date="2026-09-28T12:00:00Z">
+      <w:ins w:id="9202" w:author="Revisão" w:date="2026-09-28T12:00:00Z">
         <w:r>
           <w:rPr>
             <w:rFonts w:ascii="Times New Roman" w:cs="Times New Roman" w:eastAsia="Times New Roman" w:hAnsi="Times New Roman"/>
@@ -35191,10 +35694,10 @@
         <w:spacing w:after="180" w:before="0" w:line="240"/>
         <w:jc w:val="left"/>
         <w:rPr>
-          <w:ins w:id="9153" w:author="Revisão" w:date="2026-09-28T12:00:00Z"/>
+          <w:ins w:id="9203" w:author="Revisão" w:date="2026-09-28T12:00:00Z"/>
         </w:rPr>
       </w:pPr>
-      <w:ins w:id="9154" w:author="Revisão" w:date="2026-09-28T12:00:00Z">
+      <w:ins w:id="9204" w:author="Revisão" w:date="2026-09-28T12:00:00Z">
         <w:r>
           <w:rPr>
             <w:rFonts w:ascii="Times New Roman" w:cs="Times New Roman" w:eastAsia="Times New Roman" w:hAnsi="Times New Roman"/>

</xml_diff>

<commit_message>
Rodada de fechamento: ajustes menores, versoes limpas em PDF e carta ao orientador
- Artigo revisado: estatuto exploratorio no resumo, p < 0,001, terminologia do
  criterio (b), conclusao com os dois horizontes, literatura recente (3 refs,
  lista com 48), JEL/abstract/keywords, disponibilidade de dados, larguras das
  Tabelas 13, 14 e 19 (170 alteracoes, 0 falhas)
- Versoes limpas (docx e PDF) do artigo e da nota; aceitar_alteracoes.py
- CARTA_EDUARDO.md com resposta item a item e decisoes pendentes
- ESCRUTINIO secao 12, LEIAME e registro bibliografico atualizados

Co-Authored-By: Claude Opus 5.5 <noreply@anthropic.com>
Claude-Session: https://claude.ai/code/session_01V4LwoZDLWB9PeJtPghPCix
</commit_message>
<xml_diff>
--- a/projeto/artigo/Artigo_Fragilidade_Financeira_revisado.docx
+++ b/projeto/artigo/Artigo_Fragilidade_Financeira_revisado.docx
@@ -71,7 +71,47 @@
           <w:sz w:val="24"/>
           <w:szCs w:val="24"/>
         </w:rPr>
-        <w:t xml:space="preserve">Examina-se se a agregação de indicadores contábeis em um escore sintético de fragilidade financeira se justifica frente aos seus melhores componentes isolados, em painel de 7.419 observações firma-ano de 730 companhias abertas não financeiras brasileiras entre 2010 e 2025. Sobre o agregado dos eventos a agregação não se justifica: a área sob a curva ROC do escore é de 0,764, contra 0,894 da cobertura de juros e 0,874 do retorno sobre ativos, em conclusão que se mantém sob validação cruzada agrupada por firma e sob avaliação temporal. Uma análise diagnóstica posterior decompõe o evento pelo critério que o define e mostra que o resultado agregado é produzido por uma das rotas de deterioração. </w:t>
+        <w:t xml:space="preserve">Examina-se se a agregação de indicadores contábeis em um escore sintético de fragilidade financeira se justifica frente aos seus melhores componentes isolados, em painel de 7.419 observações firma-ano de 730 companhias abertas não financeiras brasileiras entre 2010 e 2025. Sobre o agregado dos eventos a agregação não se justifica: a área sob a curva ROC do escore é de 0,764, contra 0,894 da cobertura de juros e 0,874 do retorno sobre ativos, em conclusão que se mantém sob validação cruzada agrupada por firma e sob avaliação temporal. </w:t>
+      </w:r>
+      <w:del w:id="9287" w:author="Revisão" w:date="2026-09-28T12:00:00Z">
+        <w:r>
+          <w:rPr>
+            <w:rFonts w:ascii="Times New Roman" w:cs="Times New Roman" w:eastAsia="Times New Roman" w:hAnsi="Times New Roman"/>
+            <w:b w:val="false"/>
+            <w:bCs w:val="false"/>
+            <w:i w:val="false"/>
+            <w:iCs w:val="false"/>
+            <w:sz w:val="24"/>
+            <w:szCs w:val="24"/>
+          </w:rPr>
+          <w:delText xml:space="preserve">Uma análise diagnóstica posterior decompõe o evento pelo critério que o define</w:delText>
+        </w:r>
+      </w:del>
+      <w:ins w:id="9288" w:author="Revisão" w:date="2026-09-28T12:00:00Z">
+        <w:r>
+          <w:rPr>
+            <w:rFonts w:ascii="Times New Roman" w:cs="Times New Roman" w:eastAsia="Times New Roman" w:hAnsi="Times New Roman"/>
+            <w:b w:val="false"/>
+            <w:bCs w:val="false"/>
+            <w:i w:val="false"/>
+            <w:iCs w:val="false"/>
+            <w:sz w:val="24"/>
+            <w:szCs w:val="24"/>
+          </w:rPr>
+          <w:t xml:space="preserve">Uma análise diagnóstica posterior, de caráter exploratório, decompõe o evento pelo critério que o define</w:t>
+        </w:r>
+      </w:ins>
+      <w:r>
+        <w:rPr>
+          <w:rFonts w:ascii="Times New Roman" w:cs="Times New Roman" w:eastAsia="Times New Roman" w:hAnsi="Times New Roman"/>
+          <w:b w:val="false"/>
+          <w:bCs w:val="false"/>
+          <w:i w:val="false"/>
+          <w:iCs w:val="false"/>
+          <w:sz w:val="24"/>
+          <w:szCs w:val="24"/>
+        </w:rPr>
+        <w:t xml:space="preserve"> e mostra que o resultado agregado é produzido por uma das rotas de deterioração. </w:t>
       </w:r>
       <w:del w:id="9145" w:author="Revisão" w:date="2026-09-28T12:00:00Z">
         <w:r>
@@ -183,6 +223,126 @@
         </w:rPr>
         <w:t xml:space="preserve">Fragilidade financeira; Indicador sintético; Componentes principais; Vulnerabilidade financeira; Companhias abertas.</w:t>
       </w:r>
+    </w:p>
+    <w:p>
+      <w:pPr>
+        <w:spacing w:after="240" w:before="180" w:line="360"/>
+        <w:jc w:val="both"/>
+        <w:rPr>
+          <w:ins w:id="9358" w:author="Revisão" w:date="2026-09-28T12:00:00Z"/>
+        </w:rPr>
+      </w:pPr>
+      <w:ins w:id="9359" w:author="Revisão" w:date="2026-09-28T12:00:00Z">
+        <w:r>
+          <w:rPr>
+            <w:rFonts w:ascii="Times New Roman" w:cs="Times New Roman" w:eastAsia="Times New Roman" w:hAnsi="Times New Roman"/>
+            <w:b/>
+            <w:bCs/>
+            <w:i w:val="false"/>
+            <w:iCs w:val="false"/>
+            <w:sz w:val="24"/>
+            <w:szCs w:val="24"/>
+          </w:rPr>
+          <w:t xml:space="preserve">Classificação JEL: </w:t>
+        </w:r>
+      </w:ins>
+      <w:ins w:id="9360" w:author="Revisão" w:date="2026-09-28T12:00:00Z">
+        <w:r>
+          <w:rPr>
+            <w:rFonts w:ascii="Times New Roman" w:cs="Times New Roman" w:eastAsia="Times New Roman" w:hAnsi="Times New Roman"/>
+            <w:b w:val="false"/>
+            <w:bCs w:val="false"/>
+            <w:i w:val="false"/>
+            <w:iCs w:val="false"/>
+            <w:sz w:val="24"/>
+            <w:szCs w:val="24"/>
+          </w:rPr>
+          <w:t xml:space="preserve">G33; G32; C38; C53; E12.</w:t>
+        </w:r>
+      </w:ins>
+    </w:p>
+    <w:p>
+      <w:pPr>
+        <w:spacing w:after="120" w:before="0" w:line="360"/>
+        <w:jc w:val="left"/>
+        <w:rPr>
+          <w:ins w:id="9356" w:author="Revisão" w:date="2026-09-28T12:00:00Z"/>
+        </w:rPr>
+      </w:pPr>
+      <w:ins w:id="9357" w:author="Revisão" w:date="2026-09-28T12:00:00Z">
+        <w:r>
+          <w:rPr>
+            <w:rFonts w:ascii="Times New Roman" w:cs="Times New Roman" w:eastAsia="Times New Roman" w:hAnsi="Times New Roman"/>
+            <w:b/>
+            <w:bCs/>
+            <w:i w:val="false"/>
+            <w:iCs w:val="false"/>
+            <w:sz w:val="24"/>
+            <w:szCs w:val="24"/>
+          </w:rPr>
+          <w:t xml:space="preserve">Abstract</w:t>
+        </w:r>
+      </w:ins>
+    </w:p>
+    <w:p>
+      <w:pPr>
+        <w:spacing w:after="0" w:before="0" w:line="360"/>
+        <w:jc w:val="both"/>
+        <w:rPr>
+          <w:ins w:id="9354" w:author="Revisão" w:date="2026-09-28T12:00:00Z"/>
+        </w:rPr>
+      </w:pPr>
+      <w:ins w:id="9355" w:author="Revisão" w:date="2026-09-28T12:00:00Z">
+        <w:r>
+          <w:rPr>
+            <w:rFonts w:ascii="Times New Roman" w:cs="Times New Roman" w:eastAsia="Times New Roman" w:hAnsi="Times New Roman"/>
+            <w:b w:val="false"/>
+            <w:bCs w:val="false"/>
+            <w:i w:val="false"/>
+            <w:iCs w:val="false"/>
+            <w:sz w:val="24"/>
+            <w:szCs w:val="24"/>
+          </w:rPr>
+          <w:t xml:space="preserve">This paper examines whether aggregating accounting indicators into a synthetic financial fragility score is justified relative to its best individual components, using a panel of 7,419 firm-year observations from 730 Brazilian non-financial listed companies between 2010 and 2025. Over the pooled set of events, aggregation is not justified: the area under the ROC curve of the score is 0.764, against 0.894 for interest coverage and 0.874 for return on assets, a conclusion that holds under firm-clustered cross-validation and under temporal evaluation. A subsequent, exploratory diagnostic analysis decomposes the event by the criterion that defines it and shows that the aggregate result is produced by one of the deterioration routes. For entries through persistent operating losses, the score trails interest coverage by 0.32 points at one year, a contrast in which the mechanical overlap between the event and the predictors weighs, and by 0.15 points at two years; for entries through negative equity and judicial reorganization, the differences are not statistically distinguishable. The data are consistent with a composition explanation: firms heading toward operating losses show, at the time of prediction, lower leverage and higher liquidity than average, and a score dominated by balance-sheet structure classifies them as robust. The conclusion about aggregation therefore depends on the deterioration route one seeks to anticipate.</w:t>
+        </w:r>
+      </w:ins>
+    </w:p>
+    <w:p>
+      <w:pPr>
+        <w:spacing w:after="240" w:before="180" w:line="360"/>
+        <w:jc w:val="both"/>
+        <w:rPr>
+          <w:ins w:id="9351" w:author="Revisão" w:date="2026-09-28T12:00:00Z"/>
+        </w:rPr>
+      </w:pPr>
+      <w:ins w:id="9352" w:author="Revisão" w:date="2026-09-28T12:00:00Z">
+        <w:r>
+          <w:rPr>
+            <w:rFonts w:ascii="Times New Roman" w:cs="Times New Roman" w:eastAsia="Times New Roman" w:hAnsi="Times New Roman"/>
+            <w:b/>
+            <w:bCs/>
+            <w:i w:val="false"/>
+            <w:iCs w:val="false"/>
+            <w:sz w:val="24"/>
+            <w:szCs w:val="24"/>
+          </w:rPr>
+          <w:t xml:space="preserve">Keywords: </w:t>
+        </w:r>
+      </w:ins>
+      <w:ins w:id="9353" w:author="Revisão" w:date="2026-09-28T12:00:00Z">
+        <w:r>
+          <w:rPr>
+            <w:rFonts w:ascii="Times New Roman" w:cs="Times New Roman" w:eastAsia="Times New Roman" w:hAnsi="Times New Roman"/>
+            <w:b w:val="false"/>
+            <w:bCs w:val="false"/>
+            <w:i w:val="false"/>
+            <w:iCs w:val="false"/>
+            <w:sz w:val="24"/>
+            <w:szCs w:val="24"/>
+          </w:rPr>
+          <w:t xml:space="preserve">Financial fragility; Synthetic indicator; Principal components; Financial vulnerability; Listed companies.</w:t>
+        </w:r>
+      </w:ins>
     </w:p>
     <w:p>
       <w:pPr>
@@ -394,8 +554,36 @@
           <w:sz w:val="24"/>
           <w:szCs w:val="24"/>
         </w:rPr>
-        <w:t xml:space="preserve"> o indicador que define essa posição; e conteúdo preditivo, antecipando a entrada com significância inferior a um por mil.</w:t>
+        <w:t xml:space="preserve"> o indicador que define essa posição; e conteúdo preditivo, </w:t>
       </w:r>
+      <w:del w:id="9289" w:author="Revisão" w:date="2026-09-28T12:00:00Z">
+        <w:r>
+          <w:rPr>
+            <w:rFonts w:ascii="Times New Roman" w:cs="Times New Roman" w:eastAsia="Times New Roman" w:hAnsi="Times New Roman"/>
+            <w:b w:val="false"/>
+            <w:bCs w:val="false"/>
+            <w:i w:val="false"/>
+            <w:iCs w:val="false"/>
+            <w:sz w:val="24"/>
+            <w:szCs w:val="24"/>
+          </w:rPr>
+          <w:delText xml:space="preserve">antecipando a entrada com significância inferior a um por mil.</w:delText>
+        </w:r>
+      </w:del>
+      <w:ins w:id="9290" w:author="Revisão" w:date="2026-09-28T12:00:00Z">
+        <w:r>
+          <w:rPr>
+            <w:rFonts w:ascii="Times New Roman" w:cs="Times New Roman" w:eastAsia="Times New Roman" w:hAnsi="Times New Roman"/>
+            <w:b w:val="false"/>
+            <w:bCs w:val="false"/>
+            <w:i w:val="false"/>
+            <w:iCs w:val="false"/>
+            <w:sz w:val="24"/>
+            <w:szCs w:val="24"/>
+          </w:rPr>
+          <w:t xml:space="preserve">antecipando a entrada com p &lt; 0,001.</w:t>
+        </w:r>
+      </w:ins>
     </w:p>
     <w:p>
       <w:pPr>
@@ -1208,7 +1396,47 @@
           <w:sz w:val="24"/>
           <w:szCs w:val="24"/>
         </w:rPr>
-        <w:t xml:space="preserve">, e Mai et al. (2019) incorporam informação textual das divulgações corporativas. Todos partilham o mesmo pressuposto: o desfecho orienta a construção do preditor.</w:t>
+        <w:t xml:space="preserve">, </w:t>
+      </w:r>
+      <w:del w:id="9349" w:author="Revisão" w:date="2026-09-28T12:00:00Z">
+        <w:r>
+          <w:rPr>
+            <w:rFonts w:ascii="Times New Roman" w:cs="Times New Roman" w:eastAsia="Times New Roman" w:hAnsi="Times New Roman"/>
+            <w:b w:val="false"/>
+            <w:bCs w:val="false"/>
+            <w:i w:val="false"/>
+            <w:iCs w:val="false"/>
+            <w:sz w:val="24"/>
+            <w:szCs w:val="24"/>
+          </w:rPr>
+          <w:delText xml:space="preserve">e Mai et al. (2019) incorporam informação textual das divulgações corporativas.</w:delText>
+        </w:r>
+      </w:del>
+      <w:ins w:id="9350" w:author="Revisão" w:date="2026-09-28T12:00:00Z">
+        <w:r>
+          <w:rPr>
+            <w:rFonts w:ascii="Times New Roman" w:cs="Times New Roman" w:eastAsia="Times New Roman" w:hAnsi="Times New Roman"/>
+            <w:b w:val="false"/>
+            <w:bCs w:val="false"/>
+            <w:i w:val="false"/>
+            <w:iCs w:val="false"/>
+            <w:sz w:val="24"/>
+            <w:szCs w:val="24"/>
+          </w:rPr>
+          <w:t xml:space="preserve">e Mai et al. (2019) incorporam informação textual das divulgações corporativas. Jones, Johnstone e Wilson (2017), comparando dezesseis classificadores, concluem que modelos simples como o logit têm desempenho razoável, mas que métodos de conjunto como boosting e florestas aleatórias os superam; Tian, Yu e Guo (2015) mostram, por seleção de variáveis, que razões construídas apenas com dados contábeis carregam informação incremental sobre o risco de falência; e Veganzones e Séverin (2018) documentam que o forte desbalanceamento entre firmas em dificuldade e saudáveis degrada o desempenho dos classificadores, ponto que motiva as métricas sensíveis à prevalência da subseção 5.7.</w:t>
+        </w:r>
+      </w:ins>
+      <w:r>
+        <w:rPr>
+          <w:rFonts w:ascii="Times New Roman" w:cs="Times New Roman" w:eastAsia="Times New Roman" w:hAnsi="Times New Roman"/>
+          <w:b w:val="false"/>
+          <w:bCs w:val="false"/>
+          <w:i w:val="false"/>
+          <w:iCs w:val="false"/>
+          <w:sz w:val="24"/>
+          <w:szCs w:val="24"/>
+        </w:rPr>
+        <w:t xml:space="preserve"> Todos partilham o mesmo pressuposto: o desfecho orienta a construção do preditor.</w:t>
       </w:r>
     </w:p>
     <w:p>
@@ -1392,10 +1620,10 @@
         <w:ind w:firstLine="708"/>
         <w:jc w:val="both"/>
         <w:rPr>
-          <w:del w:id="9332" w:author="Revisão" w:date="2026-09-28T12:00:00Z"/>
+          <w:del w:id="9366" w:author="Revisão" w:date="2026-09-28T12:00:00Z"/>
         </w:rPr>
       </w:pPr>
-      <w:del w:id="9331" w:author="Revisão" w:date="2026-09-28T12:00:00Z">
+      <w:del w:id="9365" w:author="Revisão" w:date="2026-09-28T12:00:00Z">
         <w:r>
           <w:rPr>
             <w:rFonts w:ascii="Times New Roman" w:cs="Times New Roman" w:eastAsia="Times New Roman" w:hAnsi="Times New Roman"/>
@@ -1534,10 +1762,10 @@
         <w:ind w:firstLine="708"/>
         <w:jc w:val="both"/>
         <w:rPr>
-          <w:ins w:id="9333" w:author="Revisão" w:date="2026-09-28T12:00:00Z"/>
+          <w:ins w:id="9367" w:author="Revisão" w:date="2026-09-28T12:00:00Z"/>
         </w:rPr>
       </w:pPr>
-      <w:ins w:id="9334" w:author="Revisão" w:date="2026-09-28T12:00:00Z">
+      <w:ins w:id="9368" w:author="Revisão" w:date="2026-09-28T12:00:00Z">
         <w:r>
           <w:rPr>
             <w:rFonts w:ascii="Times New Roman" w:cs="Times New Roman" w:eastAsia="Times New Roman" w:hAnsi="Times New Roman"/>
@@ -3786,8 +4014,36 @@
           <w:sz w:val="24"/>
           <w:szCs w:val="24"/>
         </w:rPr>
-        <w:t xml:space="preserve">A proporção de 15,0% refere-se à presença no estado de vulnerabilidade, e não à incidência de entradas. A conversão de uma medida na outra é tratada na subseção 4.3, onde se apresenta a decomposição dos eventos e a construção da amostra de risco.</w:t>
+        <w:t xml:space="preserve">A proporção de 15,0% refere-se à presença no estado de vulnerabilidade, e não à incidência de entradas. </w:t>
       </w:r>
+      <w:del w:id="9295" w:author="Revisão" w:date="2026-09-28T12:00:00Z">
+        <w:r>
+          <w:rPr>
+            <w:rFonts w:ascii="Times New Roman" w:cs="Times New Roman" w:eastAsia="Times New Roman" w:hAnsi="Times New Roman"/>
+            <w:b w:val="false"/>
+            <w:bCs w:val="false"/>
+            <w:i w:val="false"/>
+            <w:iCs w:val="false"/>
+            <w:sz w:val="24"/>
+            <w:szCs w:val="24"/>
+          </w:rPr>
+          <w:delText xml:space="preserve">A conversão de uma medida na outra é tratada na subseção 4.3, onde se apresenta a decomposição dos eventos e a construção da amostra de risco.</w:delText>
+        </w:r>
+      </w:del>
+      <w:ins w:id="9296" w:author="Revisão" w:date="2026-09-28T12:00:00Z">
+        <w:r>
+          <w:rPr>
+            <w:rFonts w:ascii="Times New Roman" w:cs="Times New Roman" w:eastAsia="Times New Roman" w:hAnsi="Times New Roman"/>
+            <w:b w:val="false"/>
+            <w:bCs w:val="false"/>
+            <w:i w:val="false"/>
+            <w:iCs w:val="false"/>
+            <w:sz w:val="24"/>
+            <w:szCs w:val="24"/>
+          </w:rPr>
+          <w:t xml:space="preserve">A conversão de uma medida na outra é tratada na subseção 4.3, onde se apresenta a decomposição dos eventos e a construção da amostra de risco. No restante do texto, o critério (b) é também designado como prejuízo operacional persistente, e as entradas que o satisfazem, como entradas por prejuízo operacional; a denominação refere-se ao resultado antes de juros, impostos, depreciação e amortização, e não ao lucro operacional contábil.</w:t>
+        </w:r>
+      </w:ins>
     </w:p>
     <w:p>
       <w:pPr>
@@ -3978,7 +4234,7 @@
         </w:rPr>
         <w:t xml:space="preserve">O desempenho preditivo é medido pela área sob a curva ROC </w:t>
       </w:r>
-      <w:del w:id="9303" w:author="Revisão" w:date="2026-09-28T12:00:00Z">
+      <w:del w:id="9313" w:author="Revisão" w:date="2026-09-28T12:00:00Z">
         <w:r>
           <w:rPr>
             <w:rFonts w:ascii="Times New Roman" w:cs="Times New Roman" w:eastAsia="Times New Roman" w:hAnsi="Times New Roman"/>
@@ -3992,7 +4248,7 @@
           <w:delText xml:space="preserve">(HANLEY; MCNEIL, 1982)</w:delText>
         </w:r>
       </w:del>
-      <w:ins w:id="9304" w:author="Revisão" w:date="2026-09-28T12:00:00Z">
+      <w:ins w:id="9314" w:author="Revisão" w:date="2026-09-28T12:00:00Z">
         <w:r>
           <w:rPr>
             <w:rFonts w:ascii="Times New Roman" w:cs="Times New Roman" w:eastAsia="Times New Roman" w:hAnsi="Times New Roman"/>
@@ -4058,7 +4314,7 @@
         </w:rPr>
         <w:t xml:space="preserve">, a área sob a curva é complementada na subseção 5.7 por métricas sensíveis à prevalência e à qualidade das probabilidades: </w:t>
       </w:r>
-      <w:del w:id="9291" w:author="Revisão" w:date="2026-09-28T12:00:00Z">
+      <w:del w:id="9301" w:author="Revisão" w:date="2026-09-28T12:00:00Z">
         <w:r>
           <w:rPr>
             <w:rFonts w:ascii="Times New Roman" w:cs="Times New Roman" w:eastAsia="Times New Roman" w:hAnsi="Times New Roman"/>
@@ -4072,7 +4328,7 @@
           <w:delText xml:space="preserve">a área sob a curva de precisão e revocação, o escore de Brier, a inclinação e o intercepto de calibração</w:delText>
         </w:r>
       </w:del>
-      <w:ins w:id="9292" w:author="Revisão" w:date="2026-09-28T12:00:00Z">
+      <w:ins w:id="9302" w:author="Revisão" w:date="2026-09-28T12:00:00Z">
         <w:r>
           <w:rPr>
             <w:rFonts w:ascii="Times New Roman" w:cs="Times New Roman" w:eastAsia="Times New Roman" w:hAnsi="Times New Roman"/>
@@ -4098,7 +4354,7 @@
         </w:rPr>
         <w:t xml:space="preserve">, a sensibilidade, a especificidade e os valores preditivos em limiares fixados na amostra de treino, </w:t>
       </w:r>
-      <w:del w:id="9293" w:author="Revisão" w:date="2026-09-28T12:00:00Z">
+      <w:del w:id="9303" w:author="Revisão" w:date="2026-09-28T12:00:00Z">
         <w:r>
           <w:rPr>
             <w:rFonts w:ascii="Times New Roman" w:cs="Times New Roman" w:eastAsia="Times New Roman" w:hAnsi="Times New Roman"/>
@@ -4112,7 +4368,7 @@
           <w:delText xml:space="preserve">e a decisão líquida sob diferentes razões de custo</w:delText>
         </w:r>
       </w:del>
-      <w:ins w:id="9294" w:author="Revisão" w:date="2026-09-28T12:00:00Z">
+      <w:ins w:id="9304" w:author="Revisão" w:date="2026-09-28T12:00:00Z">
         <w:r>
           <w:rPr>
             <w:rFonts w:ascii="Times New Roman" w:cs="Times New Roman" w:eastAsia="Times New Roman" w:hAnsi="Times New Roman"/>
@@ -4157,7 +4413,7 @@
         </w:rPr>
         <w:t xml:space="preserve">A inferência principal sobre as diferenças de área sob a curva </w:t>
       </w:r>
-      <w:del w:id="9295" w:author="Revisão" w:date="2026-09-28T12:00:00Z">
+      <w:del w:id="9305" w:author="Revisão" w:date="2026-09-28T12:00:00Z">
         <w:r>
           <w:rPr>
             <w:rFonts w:ascii="Times New Roman" w:cs="Times New Roman" w:eastAsia="Times New Roman" w:hAnsi="Times New Roman"/>
@@ -4171,7 +4427,7 @@
           <w:delText xml:space="preserve">é conduzida por bootstrap agrupado por firma, com 2.000 reamostragens</w:delText>
         </w:r>
       </w:del>
-      <w:ins w:id="9296" w:author="Revisão" w:date="2026-09-28T12:00:00Z">
+      <w:ins w:id="9306" w:author="Revisão" w:date="2026-09-28T12:00:00Z">
         <w:r>
           <w:rPr>
             <w:rFonts w:ascii="Times New Roman" w:cs="Times New Roman" w:eastAsia="Times New Roman" w:hAnsi="Times New Roman"/>
@@ -4197,7 +4453,7 @@
         </w:rPr>
         <w:t xml:space="preserve">: firmas inteiras são reamostradas com reposição, de modo que a dependência entre as observações de uma mesma companhia seja preservada em cada réplica. O teste de DeLong, DeLong e Clarke-Pearson (1988) pressupõe independência entre observações, hipótese não satisfeita quando cada firma contribui com diversos firma-anos, e é reportado apenas como análise convencional complementar. </w:t>
       </w:r>
-      <w:del w:id="9297" w:author="Revisão" w:date="2026-09-28T12:00:00Z">
+      <w:del w:id="9307" w:author="Revisão" w:date="2026-09-28T12:00:00Z">
         <w:r>
           <w:rPr>
             <w:rFonts w:ascii="Times New Roman" w:cs="Times New Roman" w:eastAsia="Times New Roman" w:hAnsi="Times New Roman"/>
@@ -4211,7 +4467,7 @@
           <w:delText xml:space="preserve">A correção de Bonferroni é aplicada</w:delText>
         </w:r>
       </w:del>
-      <w:ins w:id="9298" w:author="Revisão" w:date="2026-09-28T12:00:00Z">
+      <w:ins w:id="9308" w:author="Revisão" w:date="2026-09-28T12:00:00Z">
         <w:r>
           <w:rPr>
             <w:rFonts w:ascii="Times New Roman" w:cs="Times New Roman" w:eastAsia="Times New Roman" w:hAnsi="Times New Roman"/>
@@ -4374,7 +4630,7 @@
         </w:rPr>
         <w:t xml:space="preserve">A adoção da amostra de risco impõe restrição sobre a parcimônia da especificação probit com controles. Com 153 entradas na amostra de estimação no horizonte de um ano, </w:t>
       </w:r>
-      <w:del w:id="9299" w:author="Revisão" w:date="2026-09-28T12:00:00Z">
+      <w:del w:id="9309" w:author="Revisão" w:date="2026-09-28T12:00:00Z">
         <w:r>
           <w:rPr>
             <w:rFonts w:ascii="Times New Roman" w:cs="Times New Roman" w:eastAsia="Times New Roman" w:hAnsi="Times New Roman"/>
@@ -4388,7 +4644,7 @@
           <w:delText xml:space="preserve">a referência usual de ao menos dez eventos por parâmetro estimado</w:delText>
         </w:r>
       </w:del>
-      <w:ins w:id="9300" w:author="Revisão" w:date="2026-09-28T12:00:00Z">
+      <w:ins w:id="9310" w:author="Revisão" w:date="2026-09-28T12:00:00Z">
         <w:r>
           <w:rPr>
             <w:rFonts w:ascii="Times New Roman" w:cs="Times New Roman" w:eastAsia="Times New Roman" w:hAnsi="Times New Roman"/>
@@ -4568,7 +4824,7 @@
         </w:rPr>
         <w:t xml:space="preserve">A estratégia empírica envolve três hipóteses formuladas antes da estimação e uma análise diagnóstica posterior. A primeira hipótese (H1) postula a existência de um fator latente único de fragilidade e compreende duas afirmações distintas, avaliadas separadamente: a existência de um eixo comum interpretável, verificada pela coerência de sinal das cargas fatoriais após a pré-orientação, e a unidimensionalidade, verificada </w:t>
       </w:r>
-      <w:del w:id="9287" w:author="Revisão" w:date="2026-09-28T12:00:00Z">
+      <w:del w:id="9297" w:author="Revisão" w:date="2026-09-28T12:00:00Z">
         <w:r>
           <w:rPr>
             <w:rFonts w:ascii="Times New Roman" w:cs="Times New Roman" w:eastAsia="Times New Roman" w:hAnsi="Times New Roman"/>
@@ -4582,7 +4838,7 @@
           <w:delText xml:space="preserve">pelo número de componentes retidos pelo critério de Kaiser</w:delText>
         </w:r>
       </w:del>
-      <w:ins w:id="9288" w:author="Revisão" w:date="2026-09-28T12:00:00Z">
+      <w:ins w:id="9298" w:author="Revisão" w:date="2026-09-28T12:00:00Z">
         <w:r>
           <w:rPr>
             <w:rFonts w:ascii="Times New Roman" w:cs="Times New Roman" w:eastAsia="Times New Roman" w:hAnsi="Times New Roman"/>
@@ -4646,7 +4902,7 @@
         </w:rPr>
         <w:t xml:space="preserve">A quarta hipótese (H4) tem estatuto distinto das anteriores e assim deve ser lida. Ela não integrava o desenho original e foi formulada após a observação dos resultados de H1 e H2, como explicação para o desempenho inferior do escore. Trata-se, portanto, de investigação explicativa posterior ao resultado, avaliada em seguida fora da amostra, e não de hipótese confirmatória pré-especificada. Ela postula que a diferença de desempenho entre o escore não supervisionado e os melhores benchmarks decorre do critério de agregação, e não do conjunto informacional. A análise consiste em construir um segundo escore por mínimos quadrados parciais aplicados a resposta binária, mantendo constantes as oito variáveis, a amostra, o pré-processamento e o procedimento de avaliação, de modo que a diferença de desempenho reflita apenas a substituição do critério de agregação. O critério de avaliação, fixado antes da estimação do escore supervisionado, é que ele supere o não supervisionado fora da amostra. Acrescenta-se um terceiro escore, </w:t>
       </w:r>
-      <w:del w:id="9301" w:author="Revisão" w:date="2026-09-28T12:00:00Z">
+      <w:del w:id="9311" w:author="Revisão" w:date="2026-09-28T12:00:00Z">
         <w:r>
           <w:rPr>
             <w:rFonts w:ascii="Times New Roman" w:cs="Times New Roman" w:eastAsia="Times New Roman" w:hAnsi="Times New Roman"/>
@@ -4660,7 +4916,7 @@
           <w:delText xml:space="preserve">obtido por árvores impulsionadas com gradiente sobre as mesmas oito variáveis</w:delText>
         </w:r>
       </w:del>
-      <w:ins w:id="9302" w:author="Revisão" w:date="2026-09-28T12:00:00Z">
+      <w:ins w:id="9312" w:author="Revisão" w:date="2026-09-28T12:00:00Z">
         <w:r>
           <w:rPr>
             <w:rFonts w:ascii="Times New Roman" w:cs="Times New Roman" w:eastAsia="Times New Roman" w:hAnsi="Times New Roman"/>
@@ -12502,7 +12758,7 @@
         </w:rPr>
         <w:t xml:space="preserve">O primeiro componente responde por 26,92% da variância total, </w:t>
       </w:r>
-      <w:del w:id="9289" w:author="Revisão" w:date="2026-09-28T12:00:00Z">
+      <w:del w:id="9299" w:author="Revisão" w:date="2026-09-28T12:00:00Z">
         <w:r>
           <w:rPr>
             <w:rFonts w:ascii="Times New Roman" w:cs="Times New Roman" w:eastAsia="Times New Roman" w:hAnsi="Times New Roman"/>
@@ -12516,7 +12772,7 @@
           <w:delText xml:space="preserve">e o critério de Kaiser retém 3 componentes, que juntos explicam 56,80%.</w:delText>
         </w:r>
       </w:del>
-      <w:ins w:id="9290" w:author="Revisão" w:date="2026-09-28T12:00:00Z">
+      <w:ins w:id="9300" w:author="Revisão" w:date="2026-09-28T12:00:00Z">
         <w:r>
           <w:rPr>
             <w:rFonts w:ascii="Times New Roman" w:cs="Times New Roman" w:eastAsia="Times New Roman" w:hAnsi="Times New Roman"/>
@@ -22717,6 +22973,34 @@
         <w:ind w:firstLine="708"/>
         <w:jc w:val="both"/>
       </w:pPr>
+      <w:del w:id="9291" w:author="Revisão" w:date="2026-09-28T12:00:00Z">
+        <w:r>
+          <w:rPr>
+            <w:rFonts w:ascii="Times New Roman" w:cs="Times New Roman" w:eastAsia="Times New Roman" w:hAnsi="Times New Roman"/>
+            <w:b w:val="false"/>
+            <w:bCs w:val="false"/>
+            <w:i w:val="false"/>
+            <w:iCs w:val="false"/>
+            <w:sz w:val="24"/>
+            <w:szCs w:val="24"/>
+          </w:rPr>
+          <w:delText xml:space="preserve">O coeficiente é positivo e significativo a menos de um por mil nos quatro modelos.</w:delText>
+        </w:r>
+      </w:del>
+      <w:ins w:id="9292" w:author="Revisão" w:date="2026-09-28T12:00:00Z">
+        <w:r>
+          <w:rPr>
+            <w:rFonts w:ascii="Times New Roman" w:cs="Times New Roman" w:eastAsia="Times New Roman" w:hAnsi="Times New Roman"/>
+            <w:b w:val="false"/>
+            <w:bCs w:val="false"/>
+            <w:i w:val="false"/>
+            <w:iCs w:val="false"/>
+            <w:sz w:val="24"/>
+            <w:szCs w:val="24"/>
+          </w:rPr>
+          <w:t xml:space="preserve">O coeficiente é positivo e significativo, com p &lt; 0,001, nos quatro modelos.</w:t>
+        </w:r>
+      </w:ins>
       <w:r>
         <w:rPr>
           <w:rFonts w:ascii="Times New Roman" w:cs="Times New Roman" w:eastAsia="Times New Roman" w:hAnsi="Times New Roman"/>
@@ -22727,7 +23011,7 @@
           <w:sz w:val="24"/>
           <w:szCs w:val="24"/>
         </w:rPr>
-        <w:t xml:space="preserve">O coeficiente é positivo e significativo a menos de um por mil nos quatro modelos. Sob a especificação principal, o escore antecipa a entrada em vulnerabilidade tanto em um ano quanto em dois, com coeficientes de 0,344 e 0,216. A evidência sustenta H3, e o horizonte de dois anos é o que a sustenta de forma mais estrita: pelas razões expostas na subseção 3.6, ele não está exposto à possibilidade de antecipação informacional associada à data de divulgação.</w:t>
+        <w:t xml:space="preserve"> Sob a especificação principal, o escore antecipa a entrada em vulnerabilidade tanto em um ano quanto em dois, com coeficientes de 0,344 e 0,216. A evidência sustenta H3, e o horizonte de dois anos é o que a sustenta de forma mais estrita: pelas razões expostas na subseção 3.6, ele não está exposto à possibilidade de antecipação informacional associada à data de divulgação.</w:t>
       </w:r>
     </w:p>
     <w:p>
@@ -22765,7 +23049,47 @@
           <w:sz w:val="24"/>
           <w:szCs w:val="24"/>
         </w:rPr>
-        <w:t xml:space="preserve">A parcimônia da especificação merece registro. Com 153 entradas e 24 parâmetros, a especificação com efeitos fixos opera em 6,38 eventos por parâmetro, abaixo da referência usual de dez discutida na subseção 3.4. A verificação pertinente é se o resultado depende disso, e não depende: na especificação com controle apenas de porte, que opera em 51,00 eventos por parâmetro, o coeficiente é de 0,332; sem controles, em 76,50 eventos por parâmetro, é de 0,348; e na especificação completa, de 0,344. Os três são significativos a menos de um por mil, de modo que a restrição de graus de liberdade afeta a precisão, e não o sinal nem a magnitude do conteúdo preditivo.</w:t>
+        <w:t xml:space="preserve">A parcimônia da especificação merece registro. Com 153 entradas e 24 parâmetros, a especificação com efeitos fixos opera em 6,38 eventos por parâmetro, abaixo da referência usual de dez discutida na subseção 3.4. A verificação pertinente é se o resultado depende disso, e não depende: na especificação com controle apenas de porte, que opera em 51,00 eventos por parâmetro, o coeficiente é de 0,332; sem controles, em 76,50 eventos por parâmetro, é de 0,348; e na especificação completa, de 0,344. </w:t>
+      </w:r>
+      <w:del w:id="9293" w:author="Revisão" w:date="2026-09-28T12:00:00Z">
+        <w:r>
+          <w:rPr>
+            <w:rFonts w:ascii="Times New Roman" w:cs="Times New Roman" w:eastAsia="Times New Roman" w:hAnsi="Times New Roman"/>
+            <w:b w:val="false"/>
+            <w:bCs w:val="false"/>
+            <w:i w:val="false"/>
+            <w:iCs w:val="false"/>
+            <w:sz w:val="24"/>
+            <w:szCs w:val="24"/>
+          </w:rPr>
+          <w:delText xml:space="preserve">Os três são significativos a menos de um por mil,</w:delText>
+        </w:r>
+      </w:del>
+      <w:ins w:id="9294" w:author="Revisão" w:date="2026-09-28T12:00:00Z">
+        <w:r>
+          <w:rPr>
+            <w:rFonts w:ascii="Times New Roman" w:cs="Times New Roman" w:eastAsia="Times New Roman" w:hAnsi="Times New Roman"/>
+            <w:b w:val="false"/>
+            <w:bCs w:val="false"/>
+            <w:i w:val="false"/>
+            <w:iCs w:val="false"/>
+            <w:sz w:val="24"/>
+            <w:szCs w:val="24"/>
+          </w:rPr>
+          <w:t xml:space="preserve">Os três são significativos, com p &lt; 0,001,</w:t>
+        </w:r>
+      </w:ins>
+      <w:r>
+        <w:rPr>
+          <w:rFonts w:ascii="Times New Roman" w:cs="Times New Roman" w:eastAsia="Times New Roman" w:hAnsi="Times New Roman"/>
+          <w:b w:val="false"/>
+          <w:bCs w:val="false"/>
+          <w:i w:val="false"/>
+          <w:iCs w:val="false"/>
+          <w:sz w:val="24"/>
+          <w:szCs w:val="24"/>
+        </w:rPr>
+        <w:t xml:space="preserve"> de modo que a restrição de graus de liberdade afeta a precisão, e não o sinal nem a magnitude do conteúdo preditivo.</w:t>
       </w:r>
     </w:p>
     <w:p>
@@ -22857,14 +23181,14 @@
         </w:tblBorders>
       </w:tblPr>
       <w:tblGrid>
-        <w:gridCol w:w="2287"/>
-        <w:gridCol w:w="889"/>
-        <w:gridCol w:w="978"/>
-        <w:gridCol w:w="978"/>
-        <w:gridCol w:w="978"/>
-        <w:gridCol w:w="978"/>
-        <w:gridCol w:w="978"/>
+        <w:gridCol w:w="2071"/>
         <w:gridCol w:w="1000"/>
+        <w:gridCol w:w="1000"/>
+        <w:gridCol w:w="1000"/>
+        <w:gridCol w:w="1100"/>
+        <w:gridCol w:w="1000"/>
+        <w:gridCol w:w="1000"/>
+        <w:gridCol w:w="900"/>
       </w:tblGrid>
       <w:tr>
         <w:trPr>
@@ -22872,7 +23196,7 @@
         </w:trPr>
         <w:tc>
           <w:tcPr>
-            <w:tcW w:type="dxa" w:w="2287"/>
+            <w:tcW w:type="dxa" w:w="2071"/>
             <w:shd w:fill="F2F2F2" w:val="clear"/>
             <w:tcMar>
               <w:top w:type="dxa" w:w="60"/>
@@ -22902,7 +23226,7 @@
         </w:tc>
         <w:tc>
           <w:tcPr>
-            <w:tcW w:type="dxa" w:w="889"/>
+            <w:tcW w:type="dxa" w:w="1000"/>
             <w:shd w:fill="F2F2F2" w:val="clear"/>
             <w:tcMar>
               <w:top w:type="dxa" w:w="60"/>
@@ -22932,7 +23256,7 @@
         </w:tc>
         <w:tc>
           <w:tcPr>
-            <w:tcW w:type="dxa" w:w="978"/>
+            <w:tcW w:type="dxa" w:w="1000"/>
             <w:shd w:fill="F2F2F2" w:val="clear"/>
             <w:tcMar>
               <w:top w:type="dxa" w:w="60"/>
@@ -22962,7 +23286,7 @@
         </w:tc>
         <w:tc>
           <w:tcPr>
-            <w:tcW w:type="dxa" w:w="978"/>
+            <w:tcW w:type="dxa" w:w="1000"/>
             <w:shd w:fill="F2F2F2" w:val="clear"/>
             <w:tcMar>
               <w:top w:type="dxa" w:w="60"/>
@@ -22992,7 +23316,7 @@
         </w:tc>
         <w:tc>
           <w:tcPr>
-            <w:tcW w:type="dxa" w:w="978"/>
+            <w:tcW w:type="dxa" w:w="1100"/>
             <w:shd w:fill="F2F2F2" w:val="clear"/>
             <w:tcMar>
               <w:top w:type="dxa" w:w="60"/>
@@ -23022,7 +23346,7 @@
         </w:tc>
         <w:tc>
           <w:tcPr>
-            <w:tcW w:type="dxa" w:w="978"/>
+            <w:tcW w:type="dxa" w:w="1000"/>
             <w:shd w:fill="F2F2F2" w:val="clear"/>
             <w:tcMar>
               <w:top w:type="dxa" w:w="60"/>
@@ -23052,7 +23376,7 @@
         </w:tc>
         <w:tc>
           <w:tcPr>
-            <w:tcW w:type="dxa" w:w="978"/>
+            <w:tcW w:type="dxa" w:w="1000"/>
             <w:shd w:fill="F2F2F2" w:val="clear"/>
             <w:tcMar>
               <w:top w:type="dxa" w:w="60"/>
@@ -23082,7 +23406,7 @@
         </w:tc>
         <w:tc>
           <w:tcPr>
-            <w:tcW w:type="dxa" w:w="1000"/>
+            <w:tcW w:type="dxa" w:w="900"/>
             <w:shd w:fill="F2F2F2" w:val="clear"/>
             <w:tcMar>
               <w:top w:type="dxa" w:w="60"/>
@@ -23120,7 +23444,7 @@
         </w:trPr>
         <w:tc>
           <w:tcPr>
-            <w:tcW w:type="dxa" w:w="2287"/>
+            <w:tcW w:type="dxa" w:w="2071"/>
             <w:tcMar>
               <w:top w:type="dxa" w:w="60"/>
               <w:left w:type="dxa" w:w="80"/>
@@ -23149,7 +23473,7 @@
         </w:tc>
         <w:tc>
           <w:tcPr>
-            <w:tcW w:type="dxa" w:w="889"/>
+            <w:tcW w:type="dxa" w:w="1000"/>
             <w:tcMar>
               <w:top w:type="dxa" w:w="60"/>
               <w:left w:type="dxa" w:w="80"/>
@@ -23178,7 +23502,7 @@
         </w:tc>
         <w:tc>
           <w:tcPr>
-            <w:tcW w:type="dxa" w:w="978"/>
+            <w:tcW w:type="dxa" w:w="1000"/>
             <w:tcMar>
               <w:top w:type="dxa" w:w="60"/>
               <w:left w:type="dxa" w:w="80"/>
@@ -23207,7 +23531,7 @@
         </w:tc>
         <w:tc>
           <w:tcPr>
-            <w:tcW w:type="dxa" w:w="978"/>
+            <w:tcW w:type="dxa" w:w="1000"/>
             <w:tcMar>
               <w:top w:type="dxa" w:w="60"/>
               <w:left w:type="dxa" w:w="80"/>
@@ -23236,7 +23560,7 @@
         </w:tc>
         <w:tc>
           <w:tcPr>
-            <w:tcW w:type="dxa" w:w="978"/>
+            <w:tcW w:type="dxa" w:w="1100"/>
             <w:tcMar>
               <w:top w:type="dxa" w:w="60"/>
               <w:left w:type="dxa" w:w="80"/>
@@ -23265,7 +23589,7 @@
         </w:tc>
         <w:tc>
           <w:tcPr>
-            <w:tcW w:type="dxa" w:w="978"/>
+            <w:tcW w:type="dxa" w:w="1000"/>
             <w:tcMar>
               <w:top w:type="dxa" w:w="60"/>
               <w:left w:type="dxa" w:w="80"/>
@@ -23294,7 +23618,7 @@
         </w:tc>
         <w:tc>
           <w:tcPr>
-            <w:tcW w:type="dxa" w:w="978"/>
+            <w:tcW w:type="dxa" w:w="1000"/>
             <w:tcMar>
               <w:top w:type="dxa" w:w="60"/>
               <w:left w:type="dxa" w:w="80"/>
@@ -23323,7 +23647,7 @@
         </w:tc>
         <w:tc>
           <w:tcPr>
-            <w:tcW w:type="dxa" w:w="1000"/>
+            <w:tcW w:type="dxa" w:w="900"/>
             <w:tcMar>
               <w:top w:type="dxa" w:w="60"/>
               <w:left w:type="dxa" w:w="80"/>
@@ -23346,7 +23670,7 @@
         </w:trPr>
         <w:tc>
           <w:tcPr>
-            <w:tcW w:type="dxa" w:w="2287"/>
+            <w:tcW w:type="dxa" w:w="2071"/>
             <w:tcMar>
               <w:top w:type="dxa" w:w="60"/>
               <w:left w:type="dxa" w:w="80"/>
@@ -23375,7 +23699,7 @@
         </w:tc>
         <w:tc>
           <w:tcPr>
-            <w:tcW w:type="dxa" w:w="889"/>
+            <w:tcW w:type="dxa" w:w="1000"/>
             <w:tcMar>
               <w:top w:type="dxa" w:w="60"/>
               <w:left w:type="dxa" w:w="80"/>
@@ -23404,7 +23728,7 @@
         </w:tc>
         <w:tc>
           <w:tcPr>
-            <w:tcW w:type="dxa" w:w="978"/>
+            <w:tcW w:type="dxa" w:w="1000"/>
             <w:tcMar>
               <w:top w:type="dxa" w:w="60"/>
               <w:left w:type="dxa" w:w="80"/>
@@ -23433,7 +23757,7 @@
         </w:tc>
         <w:tc>
           <w:tcPr>
-            <w:tcW w:type="dxa" w:w="978"/>
+            <w:tcW w:type="dxa" w:w="1000"/>
             <w:tcMar>
               <w:top w:type="dxa" w:w="60"/>
               <w:left w:type="dxa" w:w="80"/>
@@ -23462,7 +23786,7 @@
         </w:tc>
         <w:tc>
           <w:tcPr>
-            <w:tcW w:type="dxa" w:w="978"/>
+            <w:tcW w:type="dxa" w:w="1100"/>
             <w:tcMar>
               <w:top w:type="dxa" w:w="60"/>
               <w:left w:type="dxa" w:w="80"/>
@@ -23491,7 +23815,7 @@
         </w:tc>
         <w:tc>
           <w:tcPr>
-            <w:tcW w:type="dxa" w:w="978"/>
+            <w:tcW w:type="dxa" w:w="1000"/>
             <w:tcMar>
               <w:top w:type="dxa" w:w="60"/>
               <w:left w:type="dxa" w:w="80"/>
@@ -23520,7 +23844,7 @@
         </w:tc>
         <w:tc>
           <w:tcPr>
-            <w:tcW w:type="dxa" w:w="978"/>
+            <w:tcW w:type="dxa" w:w="1000"/>
             <w:tcMar>
               <w:top w:type="dxa" w:w="60"/>
               <w:left w:type="dxa" w:w="80"/>
@@ -23549,7 +23873,7 @@
         </w:tc>
         <w:tc>
           <w:tcPr>
-            <w:tcW w:type="dxa" w:w="1000"/>
+            <w:tcW w:type="dxa" w:w="900"/>
             <w:tcMar>
               <w:top w:type="dxa" w:w="60"/>
               <w:left w:type="dxa" w:w="80"/>
@@ -23586,7 +23910,7 @@
         </w:trPr>
         <w:tc>
           <w:tcPr>
-            <w:tcW w:type="dxa" w:w="2287"/>
+            <w:tcW w:type="dxa" w:w="2071"/>
             <w:tcMar>
               <w:top w:type="dxa" w:w="60"/>
               <w:left w:type="dxa" w:w="80"/>
@@ -23615,7 +23939,7 @@
         </w:tc>
         <w:tc>
           <w:tcPr>
-            <w:tcW w:type="dxa" w:w="889"/>
+            <w:tcW w:type="dxa" w:w="1000"/>
             <w:tcMar>
               <w:top w:type="dxa" w:w="60"/>
               <w:left w:type="dxa" w:w="80"/>
@@ -23644,7 +23968,7 @@
         </w:tc>
         <w:tc>
           <w:tcPr>
-            <w:tcW w:type="dxa" w:w="978"/>
+            <w:tcW w:type="dxa" w:w="1000"/>
             <w:tcMar>
               <w:top w:type="dxa" w:w="60"/>
               <w:left w:type="dxa" w:w="80"/>
@@ -23673,7 +23997,7 @@
         </w:tc>
         <w:tc>
           <w:tcPr>
-            <w:tcW w:type="dxa" w:w="978"/>
+            <w:tcW w:type="dxa" w:w="1000"/>
             <w:tcMar>
               <w:top w:type="dxa" w:w="60"/>
               <w:left w:type="dxa" w:w="80"/>
@@ -23702,7 +24026,7 @@
         </w:tc>
         <w:tc>
           <w:tcPr>
-            <w:tcW w:type="dxa" w:w="978"/>
+            <w:tcW w:type="dxa" w:w="1100"/>
             <w:tcMar>
               <w:top w:type="dxa" w:w="60"/>
               <w:left w:type="dxa" w:w="80"/>
@@ -23731,7 +24055,7 @@
         </w:tc>
         <w:tc>
           <w:tcPr>
-            <w:tcW w:type="dxa" w:w="978"/>
+            <w:tcW w:type="dxa" w:w="1000"/>
             <w:tcMar>
               <w:top w:type="dxa" w:w="60"/>
               <w:left w:type="dxa" w:w="80"/>
@@ -23760,7 +24084,7 @@
         </w:tc>
         <w:tc>
           <w:tcPr>
-            <w:tcW w:type="dxa" w:w="978"/>
+            <w:tcW w:type="dxa" w:w="1000"/>
             <w:tcMar>
               <w:top w:type="dxa" w:w="60"/>
               <w:left w:type="dxa" w:w="80"/>
@@ -23789,7 +24113,7 @@
         </w:tc>
         <w:tc>
           <w:tcPr>
-            <w:tcW w:type="dxa" w:w="1000"/>
+            <w:tcW w:type="dxa" w:w="900"/>
             <w:tcMar>
               <w:top w:type="dxa" w:w="60"/>
               <w:left w:type="dxa" w:w="80"/>
@@ -23826,7 +24150,7 @@
         </w:trPr>
         <w:tc>
           <w:tcPr>
-            <w:tcW w:type="dxa" w:w="2287"/>
+            <w:tcW w:type="dxa" w:w="2071"/>
             <w:tcMar>
               <w:top w:type="dxa" w:w="60"/>
               <w:left w:type="dxa" w:w="80"/>
@@ -23855,7 +24179,7 @@
         </w:tc>
         <w:tc>
           <w:tcPr>
-            <w:tcW w:type="dxa" w:w="889"/>
+            <w:tcW w:type="dxa" w:w="1000"/>
             <w:tcMar>
               <w:top w:type="dxa" w:w="60"/>
               <w:left w:type="dxa" w:w="80"/>
@@ -23884,7 +24208,7 @@
         </w:tc>
         <w:tc>
           <w:tcPr>
-            <w:tcW w:type="dxa" w:w="978"/>
+            <w:tcW w:type="dxa" w:w="1000"/>
             <w:tcMar>
               <w:top w:type="dxa" w:w="60"/>
               <w:left w:type="dxa" w:w="80"/>
@@ -23913,7 +24237,7 @@
         </w:tc>
         <w:tc>
           <w:tcPr>
-            <w:tcW w:type="dxa" w:w="978"/>
+            <w:tcW w:type="dxa" w:w="1000"/>
             <w:tcMar>
               <w:top w:type="dxa" w:w="60"/>
               <w:left w:type="dxa" w:w="80"/>
@@ -23942,7 +24266,7 @@
         </w:tc>
         <w:tc>
           <w:tcPr>
-            <w:tcW w:type="dxa" w:w="978"/>
+            <w:tcW w:type="dxa" w:w="1100"/>
             <w:tcMar>
               <w:top w:type="dxa" w:w="60"/>
               <w:left w:type="dxa" w:w="80"/>
@@ -23971,7 +24295,7 @@
         </w:tc>
         <w:tc>
           <w:tcPr>
-            <w:tcW w:type="dxa" w:w="978"/>
+            <w:tcW w:type="dxa" w:w="1000"/>
             <w:tcMar>
               <w:top w:type="dxa" w:w="60"/>
               <w:left w:type="dxa" w:w="80"/>
@@ -24000,7 +24324,7 @@
         </w:tc>
         <w:tc>
           <w:tcPr>
-            <w:tcW w:type="dxa" w:w="978"/>
+            <w:tcW w:type="dxa" w:w="1000"/>
             <w:tcMar>
               <w:top w:type="dxa" w:w="60"/>
               <w:left w:type="dxa" w:w="80"/>
@@ -24029,7 +24353,7 @@
         </w:tc>
         <w:tc>
           <w:tcPr>
-            <w:tcW w:type="dxa" w:w="1000"/>
+            <w:tcW w:type="dxa" w:w="900"/>
             <w:tcMar>
               <w:top w:type="dxa" w:w="60"/>
               <w:left w:type="dxa" w:w="80"/>
@@ -24066,7 +24390,7 @@
         </w:trPr>
         <w:tc>
           <w:tcPr>
-            <w:tcW w:type="dxa" w:w="2287"/>
+            <w:tcW w:type="dxa" w:w="2071"/>
             <w:tcMar>
               <w:top w:type="dxa" w:w="60"/>
               <w:left w:type="dxa" w:w="80"/>
@@ -24095,7 +24419,7 @@
         </w:tc>
         <w:tc>
           <w:tcPr>
-            <w:tcW w:type="dxa" w:w="889"/>
+            <w:tcW w:type="dxa" w:w="1000"/>
             <w:tcMar>
               <w:top w:type="dxa" w:w="60"/>
               <w:left w:type="dxa" w:w="80"/>
@@ -24124,7 +24448,7 @@
         </w:tc>
         <w:tc>
           <w:tcPr>
-            <w:tcW w:type="dxa" w:w="978"/>
+            <w:tcW w:type="dxa" w:w="1000"/>
             <w:tcMar>
               <w:top w:type="dxa" w:w="60"/>
               <w:left w:type="dxa" w:w="80"/>
@@ -24153,7 +24477,7 @@
         </w:tc>
         <w:tc>
           <w:tcPr>
-            <w:tcW w:type="dxa" w:w="978"/>
+            <w:tcW w:type="dxa" w:w="1000"/>
             <w:tcMar>
               <w:top w:type="dxa" w:w="60"/>
               <w:left w:type="dxa" w:w="80"/>
@@ -24182,7 +24506,7 @@
         </w:tc>
         <w:tc>
           <w:tcPr>
-            <w:tcW w:type="dxa" w:w="978"/>
+            <w:tcW w:type="dxa" w:w="1100"/>
             <w:tcMar>
               <w:top w:type="dxa" w:w="60"/>
               <w:left w:type="dxa" w:w="80"/>
@@ -24211,7 +24535,7 @@
         </w:tc>
         <w:tc>
           <w:tcPr>
-            <w:tcW w:type="dxa" w:w="978"/>
+            <w:tcW w:type="dxa" w:w="1000"/>
             <w:tcMar>
               <w:top w:type="dxa" w:w="60"/>
               <w:left w:type="dxa" w:w="80"/>
@@ -24240,7 +24564,7 @@
         </w:tc>
         <w:tc>
           <w:tcPr>
-            <w:tcW w:type="dxa" w:w="978"/>
+            <w:tcW w:type="dxa" w:w="1000"/>
             <w:tcMar>
               <w:top w:type="dxa" w:w="60"/>
               <w:left w:type="dxa" w:w="80"/>
@@ -24269,7 +24593,7 @@
         </w:tc>
         <w:tc>
           <w:tcPr>
-            <w:tcW w:type="dxa" w:w="1000"/>
+            <w:tcW w:type="dxa" w:w="900"/>
             <w:tcMar>
               <w:top w:type="dxa" w:w="60"/>
               <w:left w:type="dxa" w:w="80"/>
@@ -24306,7 +24630,7 @@
         </w:trPr>
         <w:tc>
           <w:tcPr>
-            <w:tcW w:type="dxa" w:w="2287"/>
+            <w:tcW w:type="dxa" w:w="2071"/>
             <w:tcMar>
               <w:top w:type="dxa" w:w="60"/>
               <w:left w:type="dxa" w:w="80"/>
@@ -24335,7 +24659,7 @@
         </w:tc>
         <w:tc>
           <w:tcPr>
-            <w:tcW w:type="dxa" w:w="889"/>
+            <w:tcW w:type="dxa" w:w="1000"/>
             <w:tcMar>
               <w:top w:type="dxa" w:w="60"/>
               <w:left w:type="dxa" w:w="80"/>
@@ -24364,7 +24688,7 @@
         </w:tc>
         <w:tc>
           <w:tcPr>
-            <w:tcW w:type="dxa" w:w="978"/>
+            <w:tcW w:type="dxa" w:w="1000"/>
             <w:tcMar>
               <w:top w:type="dxa" w:w="60"/>
               <w:left w:type="dxa" w:w="80"/>
@@ -24393,7 +24717,7 @@
         </w:tc>
         <w:tc>
           <w:tcPr>
-            <w:tcW w:type="dxa" w:w="978"/>
+            <w:tcW w:type="dxa" w:w="1000"/>
             <w:tcMar>
               <w:top w:type="dxa" w:w="60"/>
               <w:left w:type="dxa" w:w="80"/>
@@ -24422,7 +24746,7 @@
         </w:tc>
         <w:tc>
           <w:tcPr>
-            <w:tcW w:type="dxa" w:w="978"/>
+            <w:tcW w:type="dxa" w:w="1100"/>
             <w:tcMar>
               <w:top w:type="dxa" w:w="60"/>
               <w:left w:type="dxa" w:w="80"/>
@@ -24451,7 +24775,7 @@
         </w:tc>
         <w:tc>
           <w:tcPr>
-            <w:tcW w:type="dxa" w:w="978"/>
+            <w:tcW w:type="dxa" w:w="1000"/>
             <w:tcMar>
               <w:top w:type="dxa" w:w="60"/>
               <w:left w:type="dxa" w:w="80"/>
@@ -24480,7 +24804,7 @@
         </w:tc>
         <w:tc>
           <w:tcPr>
-            <w:tcW w:type="dxa" w:w="978"/>
+            <w:tcW w:type="dxa" w:w="1000"/>
             <w:tcMar>
               <w:top w:type="dxa" w:w="60"/>
               <w:left w:type="dxa" w:w="80"/>
@@ -24509,7 +24833,7 @@
         </w:tc>
         <w:tc>
           <w:tcPr>
-            <w:tcW w:type="dxa" w:w="1000"/>
+            <w:tcW w:type="dxa" w:w="900"/>
             <w:tcMar>
               <w:top w:type="dxa" w:w="60"/>
               <w:left w:type="dxa" w:w="80"/>
@@ -24532,7 +24856,7 @@
         </w:trPr>
         <w:tc>
           <w:tcPr>
-            <w:tcW w:type="dxa" w:w="2287"/>
+            <w:tcW w:type="dxa" w:w="2071"/>
             <w:tcMar>
               <w:top w:type="dxa" w:w="60"/>
               <w:left w:type="dxa" w:w="80"/>
@@ -24561,7 +24885,7 @@
         </w:tc>
         <w:tc>
           <w:tcPr>
-            <w:tcW w:type="dxa" w:w="889"/>
+            <w:tcW w:type="dxa" w:w="1000"/>
             <w:tcMar>
               <w:top w:type="dxa" w:w="60"/>
               <w:left w:type="dxa" w:w="80"/>
@@ -24590,7 +24914,7 @@
         </w:tc>
         <w:tc>
           <w:tcPr>
-            <w:tcW w:type="dxa" w:w="978"/>
+            <w:tcW w:type="dxa" w:w="1000"/>
             <w:tcMar>
               <w:top w:type="dxa" w:w="60"/>
               <w:left w:type="dxa" w:w="80"/>
@@ -24619,7 +24943,7 @@
         </w:tc>
         <w:tc>
           <w:tcPr>
-            <w:tcW w:type="dxa" w:w="978"/>
+            <w:tcW w:type="dxa" w:w="1000"/>
             <w:tcMar>
               <w:top w:type="dxa" w:w="60"/>
               <w:left w:type="dxa" w:w="80"/>
@@ -24664,7 +24988,7 @@
         </w:tc>
         <w:tc>
           <w:tcPr>
-            <w:tcW w:type="dxa" w:w="978"/>
+            <w:tcW w:type="dxa" w:w="1100"/>
             <w:tcMar>
               <w:top w:type="dxa" w:w="60"/>
               <w:left w:type="dxa" w:w="80"/>
@@ -24693,7 +25017,7 @@
         </w:tc>
         <w:tc>
           <w:tcPr>
-            <w:tcW w:type="dxa" w:w="978"/>
+            <w:tcW w:type="dxa" w:w="1000"/>
             <w:tcMar>
               <w:top w:type="dxa" w:w="60"/>
               <w:left w:type="dxa" w:w="80"/>
@@ -24722,7 +25046,7 @@
         </w:tc>
         <w:tc>
           <w:tcPr>
-            <w:tcW w:type="dxa" w:w="978"/>
+            <w:tcW w:type="dxa" w:w="1000"/>
             <w:tcMar>
               <w:top w:type="dxa" w:w="60"/>
               <w:left w:type="dxa" w:w="80"/>
@@ -24751,7 +25075,7 @@
         </w:tc>
         <w:tc>
           <w:tcPr>
-            <w:tcW w:type="dxa" w:w="1000"/>
+            <w:tcW w:type="dxa" w:w="900"/>
             <w:tcMar>
               <w:top w:type="dxa" w:w="60"/>
               <w:left w:type="dxa" w:w="80"/>
@@ -24788,7 +25112,7 @@
         </w:trPr>
         <w:tc>
           <w:tcPr>
-            <w:tcW w:type="dxa" w:w="2287"/>
+            <w:tcW w:type="dxa" w:w="2071"/>
             <w:tcMar>
               <w:top w:type="dxa" w:w="60"/>
               <w:left w:type="dxa" w:w="80"/>
@@ -24817,7 +25141,7 @@
         </w:tc>
         <w:tc>
           <w:tcPr>
-            <w:tcW w:type="dxa" w:w="889"/>
+            <w:tcW w:type="dxa" w:w="1000"/>
             <w:tcMar>
               <w:top w:type="dxa" w:w="60"/>
               <w:left w:type="dxa" w:w="80"/>
@@ -24846,7 +25170,7 @@
         </w:tc>
         <w:tc>
           <w:tcPr>
-            <w:tcW w:type="dxa" w:w="978"/>
+            <w:tcW w:type="dxa" w:w="1000"/>
             <w:tcMar>
               <w:top w:type="dxa" w:w="60"/>
               <w:left w:type="dxa" w:w="80"/>
@@ -24875,7 +25199,7 @@
         </w:tc>
         <w:tc>
           <w:tcPr>
-            <w:tcW w:type="dxa" w:w="978"/>
+            <w:tcW w:type="dxa" w:w="1000"/>
             <w:tcMar>
               <w:top w:type="dxa" w:w="60"/>
               <w:left w:type="dxa" w:w="80"/>
@@ -24920,7 +25244,7 @@
         </w:tc>
         <w:tc>
           <w:tcPr>
-            <w:tcW w:type="dxa" w:w="978"/>
+            <w:tcW w:type="dxa" w:w="1100"/>
             <w:tcMar>
               <w:top w:type="dxa" w:w="60"/>
               <w:left w:type="dxa" w:w="80"/>
@@ -24949,7 +25273,7 @@
         </w:tc>
         <w:tc>
           <w:tcPr>
-            <w:tcW w:type="dxa" w:w="978"/>
+            <w:tcW w:type="dxa" w:w="1000"/>
             <w:tcMar>
               <w:top w:type="dxa" w:w="60"/>
               <w:left w:type="dxa" w:w="80"/>
@@ -24978,7 +25302,7 @@
         </w:tc>
         <w:tc>
           <w:tcPr>
-            <w:tcW w:type="dxa" w:w="978"/>
+            <w:tcW w:type="dxa" w:w="1000"/>
             <w:tcMar>
               <w:top w:type="dxa" w:w="60"/>
               <w:left w:type="dxa" w:w="80"/>
@@ -25007,7 +25331,7 @@
         </w:tc>
         <w:tc>
           <w:tcPr>
-            <w:tcW w:type="dxa" w:w="1000"/>
+            <w:tcW w:type="dxa" w:w="900"/>
             <w:tcMar>
               <w:top w:type="dxa" w:w="60"/>
               <w:left w:type="dxa" w:w="80"/>
@@ -25044,7 +25368,7 @@
         </w:trPr>
         <w:tc>
           <w:tcPr>
-            <w:tcW w:type="dxa" w:w="2287"/>
+            <w:tcW w:type="dxa" w:w="2071"/>
             <w:tcMar>
               <w:top w:type="dxa" w:w="60"/>
               <w:left w:type="dxa" w:w="80"/>
@@ -25073,7 +25397,7 @@
         </w:tc>
         <w:tc>
           <w:tcPr>
-            <w:tcW w:type="dxa" w:w="889"/>
+            <w:tcW w:type="dxa" w:w="1000"/>
             <w:tcMar>
               <w:top w:type="dxa" w:w="60"/>
               <w:left w:type="dxa" w:w="80"/>
@@ -25102,7 +25426,7 @@
         </w:tc>
         <w:tc>
           <w:tcPr>
-            <w:tcW w:type="dxa" w:w="978"/>
+            <w:tcW w:type="dxa" w:w="1000"/>
             <w:tcMar>
               <w:top w:type="dxa" w:w="60"/>
               <w:left w:type="dxa" w:w="80"/>
@@ -25131,7 +25455,7 @@
         </w:tc>
         <w:tc>
           <w:tcPr>
-            <w:tcW w:type="dxa" w:w="978"/>
+            <w:tcW w:type="dxa" w:w="1000"/>
             <w:tcMar>
               <w:top w:type="dxa" w:w="60"/>
               <w:left w:type="dxa" w:w="80"/>
@@ -25176,7 +25500,7 @@
         </w:tc>
         <w:tc>
           <w:tcPr>
-            <w:tcW w:type="dxa" w:w="978"/>
+            <w:tcW w:type="dxa" w:w="1100"/>
             <w:tcMar>
               <w:top w:type="dxa" w:w="60"/>
               <w:left w:type="dxa" w:w="80"/>
@@ -25205,7 +25529,7 @@
         </w:tc>
         <w:tc>
           <w:tcPr>
-            <w:tcW w:type="dxa" w:w="978"/>
+            <w:tcW w:type="dxa" w:w="1000"/>
             <w:tcMar>
               <w:top w:type="dxa" w:w="60"/>
               <w:left w:type="dxa" w:w="80"/>
@@ -25234,7 +25558,7 @@
         </w:tc>
         <w:tc>
           <w:tcPr>
-            <w:tcW w:type="dxa" w:w="978"/>
+            <w:tcW w:type="dxa" w:w="1000"/>
             <w:tcMar>
               <w:top w:type="dxa" w:w="60"/>
               <w:left w:type="dxa" w:w="80"/>
@@ -25263,7 +25587,7 @@
         </w:tc>
         <w:tc>
           <w:tcPr>
-            <w:tcW w:type="dxa" w:w="1000"/>
+            <w:tcW w:type="dxa" w:w="900"/>
             <w:tcMar>
               <w:top w:type="dxa" w:w="60"/>
               <w:left w:type="dxa" w:w="80"/>
@@ -25300,7 +25624,7 @@
         </w:trPr>
         <w:tc>
           <w:tcPr>
-            <w:tcW w:type="dxa" w:w="2287"/>
+            <w:tcW w:type="dxa" w:w="2071"/>
             <w:tcMar>
               <w:top w:type="dxa" w:w="60"/>
               <w:left w:type="dxa" w:w="80"/>
@@ -25329,7 +25653,7 @@
         </w:tc>
         <w:tc>
           <w:tcPr>
-            <w:tcW w:type="dxa" w:w="889"/>
+            <w:tcW w:type="dxa" w:w="1000"/>
             <w:tcMar>
               <w:top w:type="dxa" w:w="60"/>
               <w:left w:type="dxa" w:w="80"/>
@@ -25358,7 +25682,7 @@
         </w:tc>
         <w:tc>
           <w:tcPr>
-            <w:tcW w:type="dxa" w:w="978"/>
+            <w:tcW w:type="dxa" w:w="1000"/>
             <w:tcMar>
               <w:top w:type="dxa" w:w="60"/>
               <w:left w:type="dxa" w:w="80"/>
@@ -25387,7 +25711,7 @@
         </w:tc>
         <w:tc>
           <w:tcPr>
-            <w:tcW w:type="dxa" w:w="978"/>
+            <w:tcW w:type="dxa" w:w="1000"/>
             <w:tcMar>
               <w:top w:type="dxa" w:w="60"/>
               <w:left w:type="dxa" w:w="80"/>
@@ -25432,7 +25756,7 @@
         </w:tc>
         <w:tc>
           <w:tcPr>
-            <w:tcW w:type="dxa" w:w="978"/>
+            <w:tcW w:type="dxa" w:w="1100"/>
             <w:tcMar>
               <w:top w:type="dxa" w:w="60"/>
               <w:left w:type="dxa" w:w="80"/>
@@ -25461,7 +25785,7 @@
         </w:tc>
         <w:tc>
           <w:tcPr>
-            <w:tcW w:type="dxa" w:w="978"/>
+            <w:tcW w:type="dxa" w:w="1000"/>
             <w:tcMar>
               <w:top w:type="dxa" w:w="60"/>
               <w:left w:type="dxa" w:w="80"/>
@@ -25490,7 +25814,7 @@
         </w:tc>
         <w:tc>
           <w:tcPr>
-            <w:tcW w:type="dxa" w:w="978"/>
+            <w:tcW w:type="dxa" w:w="1000"/>
             <w:tcMar>
               <w:top w:type="dxa" w:w="60"/>
               <w:left w:type="dxa" w:w="80"/>
@@ -25519,7 +25843,7 @@
         </w:tc>
         <w:tc>
           <w:tcPr>
-            <w:tcW w:type="dxa" w:w="1000"/>
+            <w:tcW w:type="dxa" w:w="900"/>
             <w:tcMar>
               <w:top w:type="dxa" w:w="60"/>
               <w:left w:type="dxa" w:w="80"/>
@@ -25787,13 +26111,13 @@
         </w:tblBorders>
       </w:tblPr>
       <w:tblGrid>
-        <w:gridCol w:w="2371"/>
-        <w:gridCol w:w="900"/>
+        <w:gridCol w:w="1771"/>
+        <w:gridCol w:w="1000"/>
+        <w:gridCol w:w="850"/>
         <w:gridCol w:w="1100"/>
-        <w:gridCol w:w="1400"/>
-        <w:gridCol w:w="1100"/>
-        <w:gridCol w:w="1400"/>
-        <w:gridCol w:w="800"/>
+        <w:gridCol w:w="1650"/>
+        <w:gridCol w:w="1050"/>
+        <w:gridCol w:w="1650"/>
       </w:tblGrid>
       <w:tr>
         <w:trPr>
@@ -25801,7 +26125,7 @@
         </w:trPr>
         <w:tc>
           <w:tcPr>
-            <w:tcW w:type="dxa" w:w="2371"/>
+            <w:tcW w:type="dxa" w:w="1771"/>
             <w:shd w:fill="F2F2F2" w:val="clear"/>
             <w:tcMar>
               <w:top w:type="dxa" w:w="60"/>
@@ -25831,7 +26155,7 @@
         </w:tc>
         <w:tc>
           <w:tcPr>
-            <w:tcW w:type="dxa" w:w="900"/>
+            <w:tcW w:type="dxa" w:w="1000"/>
             <w:shd w:fill="F2F2F2" w:val="clear"/>
             <w:tcMar>
               <w:top w:type="dxa" w:w="60"/>
@@ -25861,6 +26185,36 @@
         </w:tc>
         <w:tc>
           <w:tcPr>
+            <w:tcW w:type="dxa" w:w="850"/>
+            <w:shd w:fill="F2F2F2" w:val="clear"/>
+            <w:tcMar>
+              <w:top w:type="dxa" w:w="60"/>
+              <w:left w:type="dxa" w:w="80"/>
+              <w:bottom w:type="dxa" w:w="60"/>
+              <w:right w:type="dxa" w:w="80"/>
+            </w:tcMar>
+          </w:tcPr>
+          <w:p>
+            <w:pPr>
+              <w:spacing w:after="0" w:before="0" w:line="240"/>
+              <w:jc w:val="center"/>
+            </w:pPr>
+            <w:r>
+              <w:rPr>
+                <w:rFonts w:ascii="Times New Roman" w:cs="Times New Roman" w:eastAsia="Times New Roman" w:hAnsi="Times New Roman"/>
+                <w:b/>
+                <w:bCs/>
+                <w:i w:val="false"/>
+                <w:iCs w:val="false"/>
+                <w:sz w:val="20"/>
+                <w:szCs w:val="20"/>
+              </w:rPr>
+              <w:t xml:space="preserve">Escore F</w:t>
+            </w:r>
+          </w:p>
+        </w:tc>
+        <w:tc>
+          <w:tcPr>
             <w:tcW w:type="dxa" w:w="1100"/>
             <w:shd w:fill="F2F2F2" w:val="clear"/>
             <w:tcMar>
@@ -25885,13 +26239,13 @@
                 <w:sz w:val="20"/>
                 <w:szCs w:val="20"/>
               </w:rPr>
-              <w:t xml:space="preserve">Escore F</w:t>
-            </w:r>
-          </w:p>
-        </w:tc>
-        <w:tc>
-          <w:tcPr>
-            <w:tcW w:type="dxa" w:w="1400"/>
+              <w:t xml:space="preserve">Cobertura menos F</w:t>
+            </w:r>
+          </w:p>
+        </w:tc>
+        <w:tc>
+          <w:tcPr>
+            <w:tcW w:type="dxa" w:w="1650"/>
             <w:shd w:fill="F2F2F2" w:val="clear"/>
             <w:tcMar>
               <w:top w:type="dxa" w:w="60"/>
@@ -25915,13 +26269,13 @@
                 <w:sz w:val="20"/>
                 <w:szCs w:val="20"/>
               </w:rPr>
-              <w:t xml:space="preserve">Cobertura menos F</w:t>
-            </w:r>
-          </w:p>
-        </w:tc>
-        <w:tc>
-          <w:tcPr>
-            <w:tcW w:type="dxa" w:w="1100"/>
+              <w:t xml:space="preserve">IC 95%</w:t>
+            </w:r>
+          </w:p>
+        </w:tc>
+        <w:tc>
+          <w:tcPr>
+            <w:tcW w:type="dxa" w:w="1050"/>
             <w:shd w:fill="F2F2F2" w:val="clear"/>
             <w:tcMar>
               <w:top w:type="dxa" w:w="60"/>
@@ -25945,43 +26299,13 @@
                 <w:sz w:val="20"/>
                 <w:szCs w:val="20"/>
               </w:rPr>
-              <w:t xml:space="preserve">IC 95%</w:t>
-            </w:r>
-          </w:p>
-        </w:tc>
-        <w:tc>
-          <w:tcPr>
-            <w:tcW w:type="dxa" w:w="1400"/>
-            <w:shd w:fill="F2F2F2" w:val="clear"/>
-            <w:tcMar>
-              <w:top w:type="dxa" w:w="60"/>
-              <w:left w:type="dxa" w:w="80"/>
-              <w:bottom w:type="dxa" w:w="60"/>
-              <w:right w:type="dxa" w:w="80"/>
-            </w:tcMar>
-          </w:tcPr>
-          <w:p>
-            <w:pPr>
-              <w:spacing w:after="0" w:before="0" w:line="240"/>
-              <w:jc w:val="center"/>
-            </w:pPr>
-            <w:r>
-              <w:rPr>
-                <w:rFonts w:ascii="Times New Roman" w:cs="Times New Roman" w:eastAsia="Times New Roman" w:hAnsi="Times New Roman"/>
-                <w:b/>
-                <w:bCs/>
-                <w:i w:val="false"/>
-                <w:iCs w:val="false"/>
-                <w:sz w:val="20"/>
-                <w:szCs w:val="20"/>
-              </w:rPr>
               <w:t xml:space="preserve">PLS menos F</w:t>
             </w:r>
           </w:p>
         </w:tc>
         <w:tc>
           <w:tcPr>
-            <w:tcW w:type="dxa" w:w="800"/>
+            <w:tcW w:type="dxa" w:w="1650"/>
             <w:shd w:fill="F2F2F2" w:val="clear"/>
             <w:tcMar>
               <w:top w:type="dxa" w:w="60"/>
@@ -26016,7 +26340,7 @@
         </w:trPr>
         <w:tc>
           <w:tcPr>
-            <w:tcW w:type="dxa" w:w="2371"/>
+            <w:tcW w:type="dxa" w:w="1771"/>
             <w:tcMar>
               <w:top w:type="dxa" w:w="60"/>
               <w:left w:type="dxa" w:w="80"/>
@@ -26045,7 +26369,7 @@
         </w:tc>
         <w:tc>
           <w:tcPr>
-            <w:tcW w:type="dxa" w:w="900"/>
+            <w:tcW w:type="dxa" w:w="1000"/>
             <w:tcMar>
               <w:top w:type="dxa" w:w="60"/>
               <w:left w:type="dxa" w:w="80"/>
@@ -26074,6 +26398,35 @@
         </w:tc>
         <w:tc>
           <w:tcPr>
+            <w:tcW w:type="dxa" w:w="850"/>
+            <w:tcMar>
+              <w:top w:type="dxa" w:w="60"/>
+              <w:left w:type="dxa" w:w="80"/>
+              <w:bottom w:type="dxa" w:w="60"/>
+              <w:right w:type="dxa" w:w="80"/>
+            </w:tcMar>
+          </w:tcPr>
+          <w:p>
+            <w:pPr>
+              <w:spacing w:after="0" w:before="0" w:line="240"/>
+              <w:jc w:val="center"/>
+            </w:pPr>
+            <w:r>
+              <w:rPr>
+                <w:rFonts w:ascii="Times New Roman" w:cs="Times New Roman" w:eastAsia="Times New Roman" w:hAnsi="Times New Roman"/>
+                <w:b w:val="false"/>
+                <w:bCs w:val="false"/>
+                <w:i w:val="false"/>
+                <w:iCs w:val="false"/>
+                <w:sz w:val="20"/>
+                <w:szCs w:val="20"/>
+              </w:rPr>
+              <w:t xml:space="preserve">0,649</w:t>
+            </w:r>
+          </w:p>
+        </w:tc>
+        <w:tc>
+          <w:tcPr>
             <w:tcW w:type="dxa" w:w="1100"/>
             <w:tcMar>
               <w:top w:type="dxa" w:w="60"/>
@@ -26097,42 +26450,13 @@
                 <w:sz w:val="20"/>
                 <w:szCs w:val="20"/>
               </w:rPr>
-              <w:t xml:space="preserve">0,649</w:t>
-            </w:r>
-          </w:p>
-        </w:tc>
-        <w:tc>
-          <w:tcPr>
-            <w:tcW w:type="dxa" w:w="1400"/>
-            <w:tcMar>
-              <w:top w:type="dxa" w:w="60"/>
-              <w:left w:type="dxa" w:w="80"/>
-              <w:bottom w:type="dxa" w:w="60"/>
-              <w:right w:type="dxa" w:w="80"/>
-            </w:tcMar>
-          </w:tcPr>
-          <w:p>
-            <w:pPr>
-              <w:spacing w:after="0" w:before="0" w:line="240"/>
-              <w:jc w:val="center"/>
-            </w:pPr>
-            <w:r>
-              <w:rPr>
-                <w:rFonts w:ascii="Times New Roman" w:cs="Times New Roman" w:eastAsia="Times New Roman" w:hAnsi="Times New Roman"/>
-                <w:b w:val="false"/>
-                <w:bCs w:val="false"/>
-                <w:i w:val="false"/>
-                <w:iCs w:val="false"/>
-                <w:sz w:val="20"/>
-                <w:szCs w:val="20"/>
-              </w:rPr>
               <w:t xml:space="preserve">+0,324</w:t>
             </w:r>
           </w:p>
         </w:tc>
         <w:tc>
           <w:tcPr>
-            <w:tcW w:type="dxa" w:w="1100"/>
+            <w:tcW w:type="dxa" w:w="1650"/>
             <w:tcMar>
               <w:top w:type="dxa" w:w="60"/>
               <w:left w:type="dxa" w:w="80"/>
@@ -26161,7 +26485,7 @@
         </w:tc>
         <w:tc>
           <w:tcPr>
-            <w:tcW w:type="dxa" w:w="1400"/>
+            <w:tcW w:type="dxa" w:w="1050"/>
             <w:tcMar>
               <w:top w:type="dxa" w:w="60"/>
               <w:left w:type="dxa" w:w="80"/>
@@ -26190,7 +26514,7 @@
         </w:tc>
         <w:tc>
           <w:tcPr>
-            <w:tcW w:type="dxa" w:w="800"/>
+            <w:tcW w:type="dxa" w:w="1650"/>
             <w:tcMar>
               <w:top w:type="dxa" w:w="60"/>
               <w:left w:type="dxa" w:w="80"/>
@@ -26224,7 +26548,7 @@
         </w:trPr>
         <w:tc>
           <w:tcPr>
-            <w:tcW w:type="dxa" w:w="2371"/>
+            <w:tcW w:type="dxa" w:w="1771"/>
             <w:tcMar>
               <w:top w:type="dxa" w:w="60"/>
               <w:left w:type="dxa" w:w="80"/>
@@ -26253,7 +26577,7 @@
         </w:tc>
         <w:tc>
           <w:tcPr>
-            <w:tcW w:type="dxa" w:w="900"/>
+            <w:tcW w:type="dxa" w:w="1000"/>
             <w:tcMar>
               <w:top w:type="dxa" w:w="60"/>
               <w:left w:type="dxa" w:w="80"/>
@@ -26282,6 +26606,35 @@
         </w:tc>
         <w:tc>
           <w:tcPr>
+            <w:tcW w:type="dxa" w:w="850"/>
+            <w:tcMar>
+              <w:top w:type="dxa" w:w="60"/>
+              <w:left w:type="dxa" w:w="80"/>
+              <w:bottom w:type="dxa" w:w="60"/>
+              <w:right w:type="dxa" w:w="80"/>
+            </w:tcMar>
+          </w:tcPr>
+          <w:p>
+            <w:pPr>
+              <w:spacing w:after="0" w:before="0" w:line="240"/>
+              <w:jc w:val="center"/>
+            </w:pPr>
+            <w:r>
+              <w:rPr>
+                <w:rFonts w:ascii="Times New Roman" w:cs="Times New Roman" w:eastAsia="Times New Roman" w:hAnsi="Times New Roman"/>
+                <w:b w:val="false"/>
+                <w:bCs w:val="false"/>
+                <w:i w:val="false"/>
+                <w:iCs w:val="false"/>
+                <w:sz w:val="20"/>
+                <w:szCs w:val="20"/>
+              </w:rPr>
+              <w:t xml:space="preserve">0,816</w:t>
+            </w:r>
+          </w:p>
+        </w:tc>
+        <w:tc>
+          <w:tcPr>
             <w:tcW w:type="dxa" w:w="1100"/>
             <w:tcMar>
               <w:top w:type="dxa" w:w="60"/>
@@ -26305,42 +26658,13 @@
                 <w:sz w:val="20"/>
                 <w:szCs w:val="20"/>
               </w:rPr>
-              <w:t xml:space="preserve">0,816</w:t>
-            </w:r>
-          </w:p>
-        </w:tc>
-        <w:tc>
-          <w:tcPr>
-            <w:tcW w:type="dxa" w:w="1400"/>
-            <w:tcMar>
-              <w:top w:type="dxa" w:w="60"/>
-              <w:left w:type="dxa" w:w="80"/>
-              <w:bottom w:type="dxa" w:w="60"/>
-              <w:right w:type="dxa" w:w="80"/>
-            </w:tcMar>
-          </w:tcPr>
-          <w:p>
-            <w:pPr>
-              <w:spacing w:after="0" w:before="0" w:line="240"/>
-              <w:jc w:val="center"/>
-            </w:pPr>
-            <w:r>
-              <w:rPr>
-                <w:rFonts w:ascii="Times New Roman" w:cs="Times New Roman" w:eastAsia="Times New Roman" w:hAnsi="Times New Roman"/>
-                <w:b w:val="false"/>
-                <w:bCs w:val="false"/>
-                <w:i w:val="false"/>
-                <w:iCs w:val="false"/>
-                <w:sz w:val="20"/>
-                <w:szCs w:val="20"/>
-              </w:rPr>
               <w:t xml:space="preserve">−0,030</w:t>
             </w:r>
           </w:p>
         </w:tc>
         <w:tc>
           <w:tcPr>
-            <w:tcW w:type="dxa" w:w="1100"/>
+            <w:tcW w:type="dxa" w:w="1650"/>
             <w:tcMar>
               <w:top w:type="dxa" w:w="60"/>
               <w:left w:type="dxa" w:w="80"/>
@@ -26369,7 +26693,7 @@
         </w:tc>
         <w:tc>
           <w:tcPr>
-            <w:tcW w:type="dxa" w:w="1400"/>
+            <w:tcW w:type="dxa" w:w="1050"/>
             <w:tcMar>
               <w:top w:type="dxa" w:w="60"/>
               <w:left w:type="dxa" w:w="80"/>
@@ -26398,7 +26722,7 @@
         </w:tc>
         <w:tc>
           <w:tcPr>
-            <w:tcW w:type="dxa" w:w="800"/>
+            <w:tcW w:type="dxa" w:w="1650"/>
             <w:tcMar>
               <w:top w:type="dxa" w:w="60"/>
               <w:left w:type="dxa" w:w="80"/>
@@ -26432,7 +26756,7 @@
         </w:trPr>
         <w:tc>
           <w:tcPr>
-            <w:tcW w:type="dxa" w:w="2371"/>
+            <w:tcW w:type="dxa" w:w="1771"/>
             <w:tcMar>
               <w:top w:type="dxa" w:w="60"/>
               <w:left w:type="dxa" w:w="80"/>
@@ -26461,7 +26785,7 @@
         </w:tc>
         <w:tc>
           <w:tcPr>
-            <w:tcW w:type="dxa" w:w="900"/>
+            <w:tcW w:type="dxa" w:w="1000"/>
             <w:tcMar>
               <w:top w:type="dxa" w:w="60"/>
               <w:left w:type="dxa" w:w="80"/>
@@ -26490,6 +26814,35 @@
         </w:tc>
         <w:tc>
           <w:tcPr>
+            <w:tcW w:type="dxa" w:w="850"/>
+            <w:tcMar>
+              <w:top w:type="dxa" w:w="60"/>
+              <w:left w:type="dxa" w:w="80"/>
+              <w:bottom w:type="dxa" w:w="60"/>
+              <w:right w:type="dxa" w:w="80"/>
+            </w:tcMar>
+          </w:tcPr>
+          <w:p>
+            <w:pPr>
+              <w:spacing w:after="0" w:before="0" w:line="240"/>
+              <w:jc w:val="center"/>
+            </w:pPr>
+            <w:r>
+              <w:rPr>
+                <w:rFonts w:ascii="Times New Roman" w:cs="Times New Roman" w:eastAsia="Times New Roman" w:hAnsi="Times New Roman"/>
+                <w:b w:val="false"/>
+                <w:bCs w:val="false"/>
+                <w:i w:val="false"/>
+                <w:iCs w:val="false"/>
+                <w:sz w:val="20"/>
+                <w:szCs w:val="20"/>
+              </w:rPr>
+              <w:t xml:space="preserve">0,828</w:t>
+            </w:r>
+          </w:p>
+        </w:tc>
+        <w:tc>
+          <w:tcPr>
             <w:tcW w:type="dxa" w:w="1100"/>
             <w:tcMar>
               <w:top w:type="dxa" w:w="60"/>
@@ -26513,42 +26866,13 @@
                 <w:sz w:val="20"/>
                 <w:szCs w:val="20"/>
               </w:rPr>
-              <w:t xml:space="preserve">0,828</w:t>
-            </w:r>
-          </w:p>
-        </w:tc>
-        <w:tc>
-          <w:tcPr>
-            <w:tcW w:type="dxa" w:w="1400"/>
-            <w:tcMar>
-              <w:top w:type="dxa" w:w="60"/>
-              <w:left w:type="dxa" w:w="80"/>
-              <w:bottom w:type="dxa" w:w="60"/>
-              <w:right w:type="dxa" w:w="80"/>
-            </w:tcMar>
-          </w:tcPr>
-          <w:p>
-            <w:pPr>
-              <w:spacing w:after="0" w:before="0" w:line="240"/>
-              <w:jc w:val="center"/>
-            </w:pPr>
-            <w:r>
-              <w:rPr>
-                <w:rFonts w:ascii="Times New Roman" w:cs="Times New Roman" w:eastAsia="Times New Roman" w:hAnsi="Times New Roman"/>
-                <w:b w:val="false"/>
-                <w:bCs w:val="false"/>
-                <w:i w:val="false"/>
-                <w:iCs w:val="false"/>
-                <w:sz w:val="20"/>
-                <w:szCs w:val="20"/>
-              </w:rPr>
               <w:t xml:space="preserve">+0,012</w:t>
             </w:r>
           </w:p>
         </w:tc>
         <w:tc>
           <w:tcPr>
-            <w:tcW w:type="dxa" w:w="1100"/>
+            <w:tcW w:type="dxa" w:w="1650"/>
             <w:tcMar>
               <w:top w:type="dxa" w:w="60"/>
               <w:left w:type="dxa" w:w="80"/>
@@ -26577,7 +26901,7 @@
         </w:tc>
         <w:tc>
           <w:tcPr>
-            <w:tcW w:type="dxa" w:w="1400"/>
+            <w:tcW w:type="dxa" w:w="1050"/>
             <w:tcMar>
               <w:top w:type="dxa" w:w="60"/>
               <w:left w:type="dxa" w:w="80"/>
@@ -26606,7 +26930,7 @@
         </w:tc>
         <w:tc>
           <w:tcPr>
-            <w:tcW w:type="dxa" w:w="800"/>
+            <w:tcW w:type="dxa" w:w="1650"/>
             <w:tcMar>
               <w:top w:type="dxa" w:w="60"/>
               <w:left w:type="dxa" w:w="80"/>
@@ -26640,7 +26964,7 @@
         </w:trPr>
         <w:tc>
           <w:tcPr>
-            <w:tcW w:type="dxa" w:w="2371"/>
+            <w:tcW w:type="dxa" w:w="1771"/>
             <w:tcMar>
               <w:top w:type="dxa" w:w="60"/>
               <w:left w:type="dxa" w:w="80"/>
@@ -26669,7 +26993,7 @@
         </w:tc>
         <w:tc>
           <w:tcPr>
-            <w:tcW w:type="dxa" w:w="900"/>
+            <w:tcW w:type="dxa" w:w="1000"/>
             <w:tcMar>
               <w:top w:type="dxa" w:w="60"/>
               <w:left w:type="dxa" w:w="80"/>
@@ -26698,6 +27022,35 @@
         </w:tc>
         <w:tc>
           <w:tcPr>
+            <w:tcW w:type="dxa" w:w="850"/>
+            <w:tcMar>
+              <w:top w:type="dxa" w:w="60"/>
+              <w:left w:type="dxa" w:w="80"/>
+              <w:bottom w:type="dxa" w:w="60"/>
+              <w:right w:type="dxa" w:w="80"/>
+            </w:tcMar>
+          </w:tcPr>
+          <w:p>
+            <w:pPr>
+              <w:spacing w:after="0" w:before="0" w:line="240"/>
+              <w:jc w:val="center"/>
+            </w:pPr>
+            <w:r>
+              <w:rPr>
+                <w:rFonts w:ascii="Times New Roman" w:cs="Times New Roman" w:eastAsia="Times New Roman" w:hAnsi="Times New Roman"/>
+                <w:b w:val="false"/>
+                <w:bCs w:val="false"/>
+                <w:i w:val="false"/>
+                <w:iCs w:val="false"/>
+                <w:sz w:val="20"/>
+                <w:szCs w:val="20"/>
+              </w:rPr>
+              <w:t xml:space="preserve">0,377</w:t>
+            </w:r>
+          </w:p>
+        </w:tc>
+        <w:tc>
+          <w:tcPr>
             <w:tcW w:type="dxa" w:w="1100"/>
             <w:tcMar>
               <w:top w:type="dxa" w:w="60"/>
@@ -26721,42 +27074,13 @@
                 <w:sz w:val="20"/>
                 <w:szCs w:val="20"/>
               </w:rPr>
-              <w:t xml:space="preserve">0,377</w:t>
-            </w:r>
-          </w:p>
-        </w:tc>
-        <w:tc>
-          <w:tcPr>
-            <w:tcW w:type="dxa" w:w="1400"/>
-            <w:tcMar>
-              <w:top w:type="dxa" w:w="60"/>
-              <w:left w:type="dxa" w:w="80"/>
-              <w:bottom w:type="dxa" w:w="60"/>
-              <w:right w:type="dxa" w:w="80"/>
-            </w:tcMar>
-          </w:tcPr>
-          <w:p>
-            <w:pPr>
-              <w:spacing w:after="0" w:before="0" w:line="240"/>
-              <w:jc w:val="center"/>
-            </w:pPr>
-            <w:r>
-              <w:rPr>
-                <w:rFonts w:ascii="Times New Roman" w:cs="Times New Roman" w:eastAsia="Times New Roman" w:hAnsi="Times New Roman"/>
-                <w:b w:val="false"/>
-                <w:bCs w:val="false"/>
-                <w:i w:val="false"/>
-                <w:iCs w:val="false"/>
-                <w:sz w:val="20"/>
-                <w:szCs w:val="20"/>
-              </w:rPr>
               <w:t xml:space="preserve">+0,145</w:t>
             </w:r>
           </w:p>
         </w:tc>
         <w:tc>
           <w:tcPr>
-            <w:tcW w:type="dxa" w:w="1100"/>
+            <w:tcW w:type="dxa" w:w="1650"/>
             <w:tcMar>
               <w:top w:type="dxa" w:w="60"/>
               <w:left w:type="dxa" w:w="80"/>
@@ -26785,7 +27109,7 @@
         </w:tc>
         <w:tc>
           <w:tcPr>
-            <w:tcW w:type="dxa" w:w="1400"/>
+            <w:tcW w:type="dxa" w:w="1050"/>
             <w:tcMar>
               <w:top w:type="dxa" w:w="60"/>
               <w:left w:type="dxa" w:w="80"/>
@@ -26814,7 +27138,7 @@
         </w:tc>
         <w:tc>
           <w:tcPr>
-            <w:tcW w:type="dxa" w:w="800"/>
+            <w:tcW w:type="dxa" w:w="1650"/>
             <w:tcMar>
               <w:top w:type="dxa" w:w="60"/>
               <w:left w:type="dxa" w:w="80"/>
@@ -26848,7 +27172,7 @@
         </w:trPr>
         <w:tc>
           <w:tcPr>
-            <w:tcW w:type="dxa" w:w="2371"/>
+            <w:tcW w:type="dxa" w:w="1771"/>
             <w:tcMar>
               <w:top w:type="dxa" w:w="60"/>
               <w:left w:type="dxa" w:w="80"/>
@@ -26877,7 +27201,7 @@
         </w:tc>
         <w:tc>
           <w:tcPr>
-            <w:tcW w:type="dxa" w:w="900"/>
+            <w:tcW w:type="dxa" w:w="1000"/>
             <w:tcMar>
               <w:top w:type="dxa" w:w="60"/>
               <w:left w:type="dxa" w:w="80"/>
@@ -26906,6 +27230,35 @@
         </w:tc>
         <w:tc>
           <w:tcPr>
+            <w:tcW w:type="dxa" w:w="850"/>
+            <w:tcMar>
+              <w:top w:type="dxa" w:w="60"/>
+              <w:left w:type="dxa" w:w="80"/>
+              <w:bottom w:type="dxa" w:w="60"/>
+              <w:right w:type="dxa" w:w="80"/>
+            </w:tcMar>
+          </w:tcPr>
+          <w:p>
+            <w:pPr>
+              <w:spacing w:after="0" w:before="0" w:line="240"/>
+              <w:jc w:val="center"/>
+            </w:pPr>
+            <w:r>
+              <w:rPr>
+                <w:rFonts w:ascii="Times New Roman" w:cs="Times New Roman" w:eastAsia="Times New Roman" w:hAnsi="Times New Roman"/>
+                <w:b w:val="false"/>
+                <w:bCs w:val="false"/>
+                <w:i w:val="false"/>
+                <w:iCs w:val="false"/>
+                <w:sz w:val="20"/>
+                <w:szCs w:val="20"/>
+              </w:rPr>
+              <w:t xml:space="preserve">0,796</w:t>
+            </w:r>
+          </w:p>
+        </w:tc>
+        <w:tc>
+          <w:tcPr>
             <w:tcW w:type="dxa" w:w="1100"/>
             <w:tcMar>
               <w:top w:type="dxa" w:w="60"/>
@@ -26929,42 +27282,13 @@
                 <w:sz w:val="20"/>
                 <w:szCs w:val="20"/>
               </w:rPr>
-              <w:t xml:space="preserve">0,796</w:t>
-            </w:r>
-          </w:p>
-        </w:tc>
-        <w:tc>
-          <w:tcPr>
-            <w:tcW w:type="dxa" w:w="1400"/>
-            <w:tcMar>
-              <w:top w:type="dxa" w:w="60"/>
-              <w:left w:type="dxa" w:w="80"/>
-              <w:bottom w:type="dxa" w:w="60"/>
-              <w:right w:type="dxa" w:w="80"/>
-            </w:tcMar>
-          </w:tcPr>
-          <w:p>
-            <w:pPr>
-              <w:spacing w:after="0" w:before="0" w:line="240"/>
-              <w:jc w:val="center"/>
-            </w:pPr>
-            <w:r>
-              <w:rPr>
-                <w:rFonts w:ascii="Times New Roman" w:cs="Times New Roman" w:eastAsia="Times New Roman" w:hAnsi="Times New Roman"/>
-                <w:b w:val="false"/>
-                <w:bCs w:val="false"/>
-                <w:i w:val="false"/>
-                <w:iCs w:val="false"/>
-                <w:sz w:val="20"/>
-                <w:szCs w:val="20"/>
-              </w:rPr>
               <w:t xml:space="preserve">−0,005</w:t>
             </w:r>
           </w:p>
         </w:tc>
         <w:tc>
           <w:tcPr>
-            <w:tcW w:type="dxa" w:w="1100"/>
+            <w:tcW w:type="dxa" w:w="1650"/>
             <w:tcMar>
               <w:top w:type="dxa" w:w="60"/>
               <w:left w:type="dxa" w:w="80"/>
@@ -26993,7 +27317,7 @@
         </w:tc>
         <w:tc>
           <w:tcPr>
-            <w:tcW w:type="dxa" w:w="1400"/>
+            <w:tcW w:type="dxa" w:w="1050"/>
             <w:tcMar>
               <w:top w:type="dxa" w:w="60"/>
               <w:left w:type="dxa" w:w="80"/>
@@ -27022,7 +27346,7 @@
         </w:tc>
         <w:tc>
           <w:tcPr>
-            <w:tcW w:type="dxa" w:w="800"/>
+            <w:tcW w:type="dxa" w:w="1650"/>
             <w:tcMar>
               <w:top w:type="dxa" w:w="60"/>
               <w:left w:type="dxa" w:w="80"/>
@@ -27056,7 +27380,7 @@
         </w:trPr>
         <w:tc>
           <w:tcPr>
-            <w:tcW w:type="dxa" w:w="2371"/>
+            <w:tcW w:type="dxa" w:w="1771"/>
             <w:tcMar>
               <w:top w:type="dxa" w:w="60"/>
               <w:left w:type="dxa" w:w="80"/>
@@ -27085,7 +27409,7 @@
         </w:tc>
         <w:tc>
           <w:tcPr>
-            <w:tcW w:type="dxa" w:w="900"/>
+            <w:tcW w:type="dxa" w:w="1000"/>
             <w:tcMar>
               <w:top w:type="dxa" w:w="60"/>
               <w:left w:type="dxa" w:w="80"/>
@@ -27114,6 +27438,35 @@
         </w:tc>
         <w:tc>
           <w:tcPr>
+            <w:tcW w:type="dxa" w:w="850"/>
+            <w:tcMar>
+              <w:top w:type="dxa" w:w="60"/>
+              <w:left w:type="dxa" w:w="80"/>
+              <w:bottom w:type="dxa" w:w="60"/>
+              <w:right w:type="dxa" w:w="80"/>
+            </w:tcMar>
+          </w:tcPr>
+          <w:p>
+            <w:pPr>
+              <w:spacing w:after="0" w:before="0" w:line="240"/>
+              <w:jc w:val="center"/>
+            </w:pPr>
+            <w:r>
+              <w:rPr>
+                <w:rFonts w:ascii="Times New Roman" w:cs="Times New Roman" w:eastAsia="Times New Roman" w:hAnsi="Times New Roman"/>
+                <w:b w:val="false"/>
+                <w:bCs w:val="false"/>
+                <w:i w:val="false"/>
+                <w:iCs w:val="false"/>
+                <w:sz w:val="20"/>
+                <w:szCs w:val="20"/>
+              </w:rPr>
+              <w:t xml:space="preserve">0,801</w:t>
+            </w:r>
+          </w:p>
+        </w:tc>
+        <w:tc>
+          <w:tcPr>
             <w:tcW w:type="dxa" w:w="1100"/>
             <w:tcMar>
               <w:top w:type="dxa" w:w="60"/>
@@ -27137,42 +27490,13 @@
                 <w:sz w:val="20"/>
                 <w:szCs w:val="20"/>
               </w:rPr>
-              <w:t xml:space="preserve">0,801</w:t>
-            </w:r>
-          </w:p>
-        </w:tc>
-        <w:tc>
-          <w:tcPr>
-            <w:tcW w:type="dxa" w:w="1400"/>
-            <w:tcMar>
-              <w:top w:type="dxa" w:w="60"/>
-              <w:left w:type="dxa" w:w="80"/>
-              <w:bottom w:type="dxa" w:w="60"/>
-              <w:right w:type="dxa" w:w="80"/>
-            </w:tcMar>
-          </w:tcPr>
-          <w:p>
-            <w:pPr>
-              <w:spacing w:after="0" w:before="0" w:line="240"/>
-              <w:jc w:val="center"/>
-            </w:pPr>
-            <w:r>
-              <w:rPr>
-                <w:rFonts w:ascii="Times New Roman" w:cs="Times New Roman" w:eastAsia="Times New Roman" w:hAnsi="Times New Roman"/>
-                <w:b w:val="false"/>
-                <w:bCs w:val="false"/>
-                <w:i w:val="false"/>
-                <w:iCs w:val="false"/>
-                <w:sz w:val="20"/>
-                <w:szCs w:val="20"/>
-              </w:rPr>
               <w:t xml:space="preserve">−0,088</w:t>
             </w:r>
           </w:p>
         </w:tc>
         <w:tc>
           <w:tcPr>
-            <w:tcW w:type="dxa" w:w="1100"/>
+            <w:tcW w:type="dxa" w:w="1650"/>
             <w:tcMar>
               <w:top w:type="dxa" w:w="60"/>
               <w:left w:type="dxa" w:w="80"/>
@@ -27201,7 +27525,7 @@
         </w:tc>
         <w:tc>
           <w:tcPr>
-            <w:tcW w:type="dxa" w:w="1400"/>
+            <w:tcW w:type="dxa" w:w="1050"/>
             <w:tcMar>
               <w:top w:type="dxa" w:w="60"/>
               <w:left w:type="dxa" w:w="80"/>
@@ -27230,7 +27554,7 @@
         </w:tc>
         <w:tc>
           <w:tcPr>
-            <w:tcW w:type="dxa" w:w="800"/>
+            <w:tcW w:type="dxa" w:w="1650"/>
             <w:tcMar>
               <w:top w:type="dxa" w:w="60"/>
               <w:left w:type="dxa" w:w="80"/>
@@ -32341,7 +32665,7 @@
             <w:sz w:val="20"/>
             <w:szCs w:val="20"/>
           </w:rPr>
-          <w:t xml:space="preserve">Inclinação de calibração com valor ideal unitário. Probabilidades obtidas por regressão logística sobre o posto do escore na distribuição do treino.</w:t>
+          <w:t xml:space="preserve">Inclinação de calibração com valor ideal unitário. Probabilidades obtidas por regressão logística sobre o posto do escore na distribuição do treino. Modelos na ordem da área sob a curva ROC da Tabela 10.</w:t>
         </w:r>
       </w:ins>
     </w:p>
@@ -33510,12 +33834,12 @@
         </w:tblBorders>
       </w:tblPr>
       <w:tblGrid>
-        <w:gridCol w:w="3171"/>
+        <w:gridCol w:w="2971"/>
         <w:gridCol w:w="900"/>
         <w:gridCol w:w="1000"/>
         <w:gridCol w:w="1000"/>
         <w:gridCol w:w="1000"/>
-        <w:gridCol w:w="1000"/>
+        <w:gridCol w:w="1200"/>
         <w:gridCol w:w="1000"/>
       </w:tblGrid>
       <w:tr>
@@ -33524,7 +33848,7 @@
         </w:trPr>
         <w:tc>
           <w:tcPr>
-            <w:tcW w:type="dxa" w:w="3171"/>
+            <w:tcW w:type="dxa" w:w="2971"/>
             <w:shd w:fill="F2F2F2" w:val="clear"/>
             <w:tcMar>
               <w:top w:type="dxa" w:w="60"/>
@@ -33674,7 +33998,7 @@
         </w:tc>
         <w:tc>
           <w:tcPr>
-            <w:tcW w:type="dxa" w:w="1000"/>
+            <w:tcW w:type="dxa" w:w="1200"/>
             <w:shd w:fill="F2F2F2" w:val="clear"/>
             <w:tcMar>
               <w:top w:type="dxa" w:w="60"/>
@@ -33739,7 +34063,7 @@
         </w:trPr>
         <w:tc>
           <w:tcPr>
-            <w:tcW w:type="dxa" w:w="3171"/>
+            <w:tcW w:type="dxa" w:w="2971"/>
             <w:tcMar>
               <w:top w:type="dxa" w:w="60"/>
               <w:left w:type="dxa" w:w="80"/>
@@ -33884,7 +34208,7 @@
         </w:tc>
         <w:tc>
           <w:tcPr>
-            <w:tcW w:type="dxa" w:w="1000"/>
+            <w:tcW w:type="dxa" w:w="1200"/>
             <w:tcMar>
               <w:top w:type="dxa" w:w="60"/>
               <w:left w:type="dxa" w:w="80"/>
@@ -33947,7 +34271,7 @@
         </w:trPr>
         <w:tc>
           <w:tcPr>
-            <w:tcW w:type="dxa" w:w="3171"/>
+            <w:tcW w:type="dxa" w:w="2971"/>
             <w:tcMar>
               <w:top w:type="dxa" w:w="60"/>
               <w:left w:type="dxa" w:w="80"/>
@@ -34092,7 +34416,7 @@
         </w:tc>
         <w:tc>
           <w:tcPr>
-            <w:tcW w:type="dxa" w:w="1000"/>
+            <w:tcW w:type="dxa" w:w="1200"/>
             <w:tcMar>
               <w:top w:type="dxa" w:w="60"/>
               <w:left w:type="dxa" w:w="80"/>
@@ -34155,7 +34479,7 @@
         </w:trPr>
         <w:tc>
           <w:tcPr>
-            <w:tcW w:type="dxa" w:w="3171"/>
+            <w:tcW w:type="dxa" w:w="2971"/>
             <w:tcMar>
               <w:top w:type="dxa" w:w="60"/>
               <w:left w:type="dxa" w:w="80"/>
@@ -34300,7 +34624,7 @@
         </w:tc>
         <w:tc>
           <w:tcPr>
-            <w:tcW w:type="dxa" w:w="1000"/>
+            <w:tcW w:type="dxa" w:w="1200"/>
             <w:tcMar>
               <w:top w:type="dxa" w:w="60"/>
               <w:left w:type="dxa" w:w="80"/>
@@ -34363,7 +34687,7 @@
         </w:trPr>
         <w:tc>
           <w:tcPr>
-            <w:tcW w:type="dxa" w:w="3171"/>
+            <w:tcW w:type="dxa" w:w="2971"/>
             <w:tcMar>
               <w:top w:type="dxa" w:w="60"/>
               <w:left w:type="dxa" w:w="80"/>
@@ -34572,7 +34896,7 @@
         </w:tc>
         <w:tc>
           <w:tcPr>
-            <w:tcW w:type="dxa" w:w="1000"/>
+            <w:tcW w:type="dxa" w:w="1200"/>
             <w:tcMar>
               <w:top w:type="dxa" w:w="60"/>
               <w:left w:type="dxa" w:w="80"/>
@@ -34668,7 +34992,7 @@
         </w:trPr>
         <w:tc>
           <w:tcPr>
-            <w:tcW w:type="dxa" w:w="3171"/>
+            <w:tcW w:type="dxa" w:w="2971"/>
             <w:tcMar>
               <w:top w:type="dxa" w:w="60"/>
               <w:left w:type="dxa" w:w="80"/>
@@ -34823,7 +35147,7 @@
         </w:tc>
         <w:tc>
           <w:tcPr>
-            <w:tcW w:type="dxa" w:w="1000"/>
+            <w:tcW w:type="dxa" w:w="1200"/>
             <w:tcMar>
               <w:top w:type="dxa" w:w="60"/>
               <w:left w:type="dxa" w:w="80"/>
@@ -34890,7 +35214,7 @@
         </w:trPr>
         <w:tc>
           <w:tcPr>
-            <w:tcW w:type="dxa" w:w="3171"/>
+            <w:tcW w:type="dxa" w:w="2971"/>
             <w:tcMar>
               <w:top w:type="dxa" w:w="60"/>
               <w:left w:type="dxa" w:w="80"/>
@@ -35035,7 +35359,7 @@
         </w:tc>
         <w:tc>
           <w:tcPr>
-            <w:tcW w:type="dxa" w:w="1000"/>
+            <w:tcW w:type="dxa" w:w="1200"/>
             <w:tcMar>
               <w:top w:type="dxa" w:w="60"/>
               <w:left w:type="dxa" w:w="80"/>
@@ -36330,7 +36654,47 @@
           <w:sz w:val="24"/>
           <w:szCs w:val="24"/>
         </w:rPr>
-        <w:t xml:space="preserve">A contribuição está em mostrar que essa conclusão agregada é produzida por uma das rotas de deterioração. Decomposto o evento pelo critério que o define, o escore fica muito atrás apenas nas entradas por prejuízo operacional persistente, com 0,649 contra 0,973 da cobertura de juros. Nas entradas por patrimônio líquido negativo e por recuperação judicial, nenhuma diferença contra as razões isoladas é estatisticamente distinguível, </w:t>
+        <w:t xml:space="preserve">A contribuição está em mostrar que essa conclusão agregada é produzida por uma das rotas de deterioração. Decomposto o evento pelo critério que o define, o escore fica muito atrás apenas nas entradas por prejuízo operacional persistente, </w:t>
+      </w:r>
+      <w:del w:id="9347" w:author="Revisão" w:date="2026-09-28T12:00:00Z">
+        <w:r>
+          <w:rPr>
+            <w:rFonts w:ascii="Times New Roman" w:cs="Times New Roman" w:eastAsia="Times New Roman" w:hAnsi="Times New Roman"/>
+            <w:b w:val="false"/>
+            <w:bCs w:val="false"/>
+            <w:i w:val="false"/>
+            <w:iCs w:val="false"/>
+            <w:sz w:val="24"/>
+            <w:szCs w:val="24"/>
+          </w:rPr>
+          <w:delText xml:space="preserve">com 0,649 contra 0,973 da cobertura de juros.</w:delText>
+        </w:r>
+      </w:del>
+      <w:ins w:id="9348" w:author="Revisão" w:date="2026-09-28T12:00:00Z">
+        <w:r>
+          <w:rPr>
+            <w:rFonts w:ascii="Times New Roman" w:cs="Times New Roman" w:eastAsia="Times New Roman" w:hAnsi="Times New Roman"/>
+            <w:b w:val="false"/>
+            <w:bCs w:val="false"/>
+            <w:i w:val="false"/>
+            <w:iCs w:val="false"/>
+            <w:sz w:val="24"/>
+            <w:szCs w:val="24"/>
+          </w:rPr>
+          <w:t xml:space="preserve">com 0,649 contra 0,973 da cobertura de juros em um ano, contraste em boa parte mecânico, e 0,377 contra 0,522 em dois anos, horizonte em que a ordenação do escore se inverte.</w:t>
+        </w:r>
+      </w:ins>
+      <w:r>
+        <w:rPr>
+          <w:rFonts w:ascii="Times New Roman" w:cs="Times New Roman" w:eastAsia="Times New Roman" w:hAnsi="Times New Roman"/>
+          <w:b w:val="false"/>
+          <w:bCs w:val="false"/>
+          <w:i w:val="false"/>
+          <w:iCs w:val="false"/>
+          <w:sz w:val="24"/>
+          <w:szCs w:val="24"/>
+        </w:rPr>
+        <w:t xml:space="preserve"> Nas entradas por patrimônio líquido negativo e por recuperação judicial, nenhuma diferença contra as razões isoladas é estatisticamente distinguível, </w:t>
       </w:r>
       <w:del w:id="9139" w:author="Revisão" w:date="2026-09-28T12:00:00Z">
         <w:r>
@@ -36715,6 +37079,54 @@
         <w:keepNext/>
         <w:spacing w:after="180" w:before="360" w:line="360"/>
         <w:jc w:val="left"/>
+        <w:rPr>
+          <w:ins w:id="9363" w:author="Revisão" w:date="2026-09-28T12:00:00Z"/>
+        </w:rPr>
+      </w:pPr>
+      <w:ins w:id="9364" w:author="Revisão" w:date="2026-09-28T12:00:00Z">
+        <w:r>
+          <w:rPr>
+            <w:rFonts w:ascii="Times New Roman" w:cs="Times New Roman" w:eastAsia="Times New Roman" w:hAnsi="Times New Roman"/>
+            <w:b/>
+            <w:bCs/>
+            <w:i w:val="false"/>
+            <w:iCs w:val="false"/>
+            <w:sz w:val="24"/>
+            <w:szCs w:val="24"/>
+          </w:rPr>
+          <w:t xml:space="preserve">Disponibilidade de dados e código</w:t>
+        </w:r>
+      </w:ins>
+    </w:p>
+    <w:p>
+      <w:pPr>
+        <w:spacing w:after="0" w:before="0" w:line="360"/>
+        <w:ind w:firstLine="708"/>
+        <w:jc w:val="both"/>
+        <w:rPr>
+          <w:ins w:id="9361" w:author="Revisão" w:date="2026-09-28T12:00:00Z"/>
+        </w:rPr>
+      </w:pPr>
+      <w:ins w:id="9362" w:author="Revisão" w:date="2026-09-28T12:00:00Z">
+        <w:r>
+          <w:rPr>
+            <w:rFonts w:ascii="Times New Roman" w:cs="Times New Roman" w:eastAsia="Times New Roman" w:hAnsi="Times New Roman"/>
+            <w:b w:val="false"/>
+            <w:bCs w:val="false"/>
+            <w:i w:val="false"/>
+            <w:iCs w:val="false"/>
+            <w:sz w:val="24"/>
+            <w:szCs w:val="24"/>
+          </w:rPr>
+          <w:t xml:space="preserve">Os painéis foram construídos a partir dos dados abertos da Comissão de Valores Mobiliários: Demonstrações Financeiras Padronizadas, documentos periódicos e eventuais e cadastro de companhias abertas. Os painéis construídos, o código que reproduz todas as tabelas e figuras e a lista das versões das bibliotecas utilizadas estão disponíveis com o autor.</w:t>
+        </w:r>
+      </w:ins>
+    </w:p>
+    <w:p>
+      <w:pPr>
+        <w:keepNext/>
+        <w:spacing w:after="180" w:before="360" w:line="360"/>
+        <w:jc w:val="left"/>
       </w:pPr>
       <w:r>
         <w:rPr>
@@ -36854,7 +37266,7 @@
         </w:rPr>
         <w:t xml:space="preserve">BRASIL. Ministério da Fazenda. Secretaria do Tesouro Nacional. Portaria n. 882, de 18 de dezembro de 2018. Define os conceitos das variáveis utilizadas e os procedimentos a serem adotados na análise da capacidade de pagamento e na apuração da suficiência das contragarantias oferecidas. </w:t>
       </w:r>
-      <w:del w:id="9305" w:author="Revisão" w:date="2026-09-28T12:00:00Z">
+      <w:del w:id="9315" w:author="Revisão" w:date="2026-09-28T12:00:00Z">
         <w:r>
           <w:rPr>
             <w:rFonts w:ascii="Times New Roman" w:cs="Times New Roman" w:eastAsia="Times New Roman" w:hAnsi="Times New Roman"/>
@@ -36868,7 +37280,7 @@
           <w:delText xml:space="preserve">Diário Oficial da União, Brasília, DF, 20 dez. 2018.</w:delText>
         </w:r>
       </w:del>
-      <w:ins w:id="9306" w:author="Revisão" w:date="2026-09-28T12:00:00Z">
+      <w:ins w:id="9316" w:author="Revisão" w:date="2026-09-28T12:00:00Z">
         <w:r>
           <w:rPr>
             <w:rFonts w:ascii="Times New Roman" w:cs="Times New Roman" w:eastAsia="Times New Roman" w:hAnsi="Times New Roman"/>
@@ -36888,10 +37300,10 @@
         <w:spacing w:after="180" w:before="0" w:line="240"/>
         <w:jc w:val="left"/>
         <w:rPr>
-          <w:ins w:id="9307" w:author="Revisão" w:date="2026-09-28T12:00:00Z"/>
+          <w:ins w:id="9317" w:author="Revisão" w:date="2026-09-28T12:00:00Z"/>
         </w:rPr>
       </w:pPr>
-      <w:ins w:id="9308" w:author="Revisão" w:date="2026-09-28T12:00:00Z">
+      <w:ins w:id="9318" w:author="Revisão" w:date="2026-09-28T12:00:00Z">
         <w:r>
           <w:rPr>
             <w:rFonts w:ascii="Times New Roman" w:cs="Times New Roman" w:eastAsia="Times New Roman" w:hAnsi="Times New Roman"/>
@@ -36947,10 +37359,10 @@
         <w:spacing w:after="180" w:before="0" w:line="240"/>
         <w:jc w:val="left"/>
         <w:rPr>
-          <w:ins w:id="9309" w:author="Revisão" w:date="2026-09-28T12:00:00Z"/>
+          <w:ins w:id="9319" w:author="Revisão" w:date="2026-09-28T12:00:00Z"/>
         </w:rPr>
       </w:pPr>
-      <w:ins w:id="9310" w:author="Revisão" w:date="2026-09-28T12:00:00Z">
+      <w:ins w:id="9320" w:author="Revisão" w:date="2026-09-28T12:00:00Z">
         <w:r>
           <w:rPr>
             <w:rFonts w:ascii="Times New Roman" w:cs="Times New Roman" w:eastAsia="Times New Roman" w:hAnsi="Times New Roman"/>
@@ -37024,10 +37436,10 @@
         <w:spacing w:after="180" w:before="0" w:line="240"/>
         <w:jc w:val="left"/>
         <w:rPr>
-          <w:ins w:id="9311" w:author="Revisão" w:date="2026-09-28T12:00:00Z"/>
+          <w:ins w:id="9321" w:author="Revisão" w:date="2026-09-28T12:00:00Z"/>
         </w:rPr>
       </w:pPr>
-      <w:ins w:id="9312" w:author="Revisão" w:date="2026-09-28T12:00:00Z">
+      <w:ins w:id="9322" w:author="Revisão" w:date="2026-09-28T12:00:00Z">
         <w:r>
           <w:rPr>
             <w:rFonts w:ascii="Times New Roman" w:cs="Times New Roman" w:eastAsia="Times New Roman" w:hAnsi="Times New Roman"/>
@@ -37047,10 +37459,10 @@
         <w:spacing w:after="180" w:before="0" w:line="240"/>
         <w:jc w:val="left"/>
         <w:rPr>
-          <w:ins w:id="9313" w:author="Revisão" w:date="2026-09-28T12:00:00Z"/>
+          <w:ins w:id="9323" w:author="Revisão" w:date="2026-09-28T12:00:00Z"/>
         </w:rPr>
       </w:pPr>
-      <w:ins w:id="9314" w:author="Revisão" w:date="2026-09-28T12:00:00Z">
+      <w:ins w:id="9324" w:author="Revisão" w:date="2026-09-28T12:00:00Z">
         <w:r>
           <w:rPr>
             <w:rFonts w:ascii="Times New Roman" w:cs="Times New Roman" w:eastAsia="Times New Roman" w:hAnsi="Times New Roman"/>
@@ -37070,10 +37482,10 @@
         <w:spacing w:after="180" w:before="0" w:line="240"/>
         <w:jc w:val="left"/>
         <w:rPr>
-          <w:ins w:id="9315" w:author="Revisão" w:date="2026-09-28T12:00:00Z"/>
+          <w:ins w:id="9325" w:author="Revisão" w:date="2026-09-28T12:00:00Z"/>
         </w:rPr>
       </w:pPr>
-      <w:ins w:id="9316" w:author="Revisão" w:date="2026-09-28T12:00:00Z">
+      <w:ins w:id="9326" w:author="Revisão" w:date="2026-09-28T12:00:00Z">
         <w:r>
           <w:rPr>
             <w:rFonts w:ascii="Times New Roman" w:cs="Times New Roman" w:eastAsia="Times New Roman" w:hAnsi="Times New Roman"/>
@@ -37129,10 +37541,10 @@
         <w:spacing w:after="180" w:before="0" w:line="240"/>
         <w:jc w:val="left"/>
         <w:rPr>
-          <w:ins w:id="9317" w:author="Revisão" w:date="2026-09-28T12:00:00Z"/>
+          <w:ins w:id="9327" w:author="Revisão" w:date="2026-09-28T12:00:00Z"/>
         </w:rPr>
       </w:pPr>
-      <w:ins w:id="9318" w:author="Revisão" w:date="2026-09-28T12:00:00Z">
+      <w:ins w:id="9328" w:author="Revisão" w:date="2026-09-28T12:00:00Z">
         <w:r>
           <w:rPr>
             <w:rFonts w:ascii="Times New Roman" w:cs="Times New Roman" w:eastAsia="Times New Roman" w:hAnsi="Times New Roman"/>
@@ -37170,10 +37582,33 @@
         <w:spacing w:after="180" w:before="0" w:line="240"/>
         <w:jc w:val="left"/>
         <w:rPr>
-          <w:ins w:id="9319" w:author="Revisão" w:date="2026-09-28T12:00:00Z"/>
+          <w:ins w:id="9339" w:author="Revisão" w:date="2026-09-28T12:00:00Z"/>
         </w:rPr>
       </w:pPr>
-      <w:ins w:id="9320" w:author="Revisão" w:date="2026-09-28T12:00:00Z">
+      <w:ins w:id="9340" w:author="Revisão" w:date="2026-09-28T12:00:00Z">
+        <w:r>
+          <w:rPr>
+            <w:rFonts w:ascii="Times New Roman" w:cs="Times New Roman" w:eastAsia="Times New Roman" w:hAnsi="Times New Roman"/>
+            <w:b w:val="false"/>
+            <w:bCs w:val="false"/>
+            <w:i w:val="false"/>
+            <w:iCs w:val="false"/>
+            <w:sz w:val="24"/>
+            <w:szCs w:val="24"/>
+          </w:rPr>
+          <w:t xml:space="preserve">JONES, S.; JOHNSTONE, D.; WILSON, R. Predicting corporate bankruptcy: an evaluation of alternative statistical frameworks. Journal of Business Finance &amp; Accounting, v. 44, n. 1-2, p. 3-34, 2017.</w:t>
+        </w:r>
+      </w:ins>
+    </w:p>
+    <w:p>
+      <w:pPr>
+        <w:spacing w:after="180" w:before="0" w:line="240"/>
+        <w:jc w:val="left"/>
+        <w:rPr>
+          <w:ins w:id="9329" w:author="Revisão" w:date="2026-09-28T12:00:00Z"/>
+        </w:rPr>
+      </w:pPr>
+      <w:ins w:id="9330" w:author="Revisão" w:date="2026-09-28T12:00:00Z">
         <w:r>
           <w:rPr>
             <w:rFonts w:ascii="Times New Roman" w:cs="Times New Roman" w:eastAsia="Times New Roman" w:hAnsi="Times New Roman"/>
@@ -37355,10 +37790,10 @@
         <w:spacing w:after="180" w:before="0" w:line="240"/>
         <w:jc w:val="left"/>
         <w:rPr>
-          <w:ins w:id="9321" w:author="Revisão" w:date="2026-09-28T12:00:00Z"/>
+          <w:ins w:id="9331" w:author="Revisão" w:date="2026-09-28T12:00:00Z"/>
         </w:rPr>
       </w:pPr>
-      <w:ins w:id="9322" w:author="Revisão" w:date="2026-09-28T12:00:00Z">
+      <w:ins w:id="9332" w:author="Revisão" w:date="2026-09-28T12:00:00Z">
         <w:r>
           <w:rPr>
             <w:rFonts w:ascii="Times New Roman" w:cs="Times New Roman" w:eastAsia="Times New Roman" w:hAnsi="Times New Roman"/>
@@ -37414,10 +37849,10 @@
         <w:spacing w:after="180" w:before="0" w:line="240"/>
         <w:jc w:val="left"/>
         <w:rPr>
-          <w:ins w:id="9323" w:author="Revisão" w:date="2026-09-28T12:00:00Z"/>
+          <w:ins w:id="9333" w:author="Revisão" w:date="2026-09-28T12:00:00Z"/>
         </w:rPr>
       </w:pPr>
-      <w:ins w:id="9324" w:author="Revisão" w:date="2026-09-28T12:00:00Z">
+      <w:ins w:id="9334" w:author="Revisão" w:date="2026-09-28T12:00:00Z">
         <w:r>
           <w:rPr>
             <w:rFonts w:ascii="Times New Roman" w:cs="Times New Roman" w:eastAsia="Times New Roman" w:hAnsi="Times New Roman"/>
@@ -37437,10 +37872,10 @@
         <w:spacing w:after="180" w:before="0" w:line="240"/>
         <w:jc w:val="left"/>
         <w:rPr>
-          <w:ins w:id="9325" w:author="Revisão" w:date="2026-09-28T12:00:00Z"/>
+          <w:ins w:id="9335" w:author="Revisão" w:date="2026-09-28T12:00:00Z"/>
         </w:rPr>
       </w:pPr>
-      <w:ins w:id="9326" w:author="Revisão" w:date="2026-09-28T12:00:00Z">
+      <w:ins w:id="9336" w:author="Revisão" w:date="2026-09-28T12:00:00Z">
         <w:r>
           <w:rPr>
             <w:rFonts w:ascii="Times New Roman" w:cs="Times New Roman" w:eastAsia="Times New Roman" w:hAnsi="Times New Roman"/>
@@ -37472,6 +37907,29 @@
         </w:rPr>
         <w:t xml:space="preserve">SCALZER, R. S.; RODRIGUES, A.; MACEDO, M. A. S. Insolvência empresarial: um estudo sobre as distribuidoras de energia elétrica brasileiras. Revista Contemporânea de Contabilidade, v. 12, n. 27, p. 27-60, 2015.</w:t>
       </w:r>
+    </w:p>
+    <w:p>
+      <w:pPr>
+        <w:spacing w:after="180" w:before="0" w:line="240"/>
+        <w:jc w:val="left"/>
+        <w:rPr>
+          <w:ins w:id="9341" w:author="Revisão" w:date="2026-09-28T12:00:00Z"/>
+        </w:rPr>
+      </w:pPr>
+      <w:ins w:id="9342" w:author="Revisão" w:date="2026-09-28T12:00:00Z">
+        <w:r>
+          <w:rPr>
+            <w:rFonts w:ascii="Times New Roman" w:cs="Times New Roman" w:eastAsia="Times New Roman" w:hAnsi="Times New Roman"/>
+            <w:b w:val="false"/>
+            <w:bCs w:val="false"/>
+            <w:i w:val="false"/>
+            <w:iCs w:val="false"/>
+            <w:sz w:val="24"/>
+            <w:szCs w:val="24"/>
+          </w:rPr>
+          <w:t xml:space="preserve">TIAN, S.; YU, Y.; GUO, H. Variable selection and corporate bankruptcy forecasts. Journal of Banking &amp; Finance, v. 52, p. 89-100, 2015.</w:t>
+        </w:r>
+      </w:ins>
     </w:p>
     <w:p>
       <w:pPr>
@@ -37532,10 +37990,10 @@
         <w:spacing w:after="180" w:before="0" w:line="240"/>
         <w:jc w:val="left"/>
         <w:rPr>
-          <w:ins w:id="9327" w:author="Revisão" w:date="2026-09-28T12:00:00Z"/>
+          <w:ins w:id="9337" w:author="Revisão" w:date="2026-09-28T12:00:00Z"/>
         </w:rPr>
       </w:pPr>
-      <w:ins w:id="9328" w:author="Revisão" w:date="2026-09-28T12:00:00Z">
+      <w:ins w:id="9338" w:author="Revisão" w:date="2026-09-28T12:00:00Z">
         <w:r>
           <w:rPr>
             <w:rFonts w:ascii="Times New Roman" w:cs="Times New Roman" w:eastAsia="Times New Roman" w:hAnsi="Times New Roman"/>
@@ -37555,10 +38013,33 @@
         <w:spacing w:after="180" w:before="0" w:line="240"/>
         <w:jc w:val="left"/>
         <w:rPr>
-          <w:ins w:id="9329" w:author="Revisão" w:date="2026-09-28T12:00:00Z"/>
+          <w:ins w:id="9345" w:author="Revisão" w:date="2026-09-28T12:00:00Z"/>
         </w:rPr>
       </w:pPr>
-      <w:ins w:id="9330" w:author="Revisão" w:date="2026-09-28T12:00:00Z">
+      <w:ins w:id="9346" w:author="Revisão" w:date="2026-09-28T12:00:00Z">
+        <w:r>
+          <w:rPr>
+            <w:rFonts w:ascii="Times New Roman" w:cs="Times New Roman" w:eastAsia="Times New Roman" w:hAnsi="Times New Roman"/>
+            <w:b w:val="false"/>
+            <w:bCs w:val="false"/>
+            <w:i w:val="false"/>
+            <w:iCs w:val="false"/>
+            <w:sz w:val="24"/>
+            <w:szCs w:val="24"/>
+          </w:rPr>
+          <w:t xml:space="preserve">VEGANZONES, D.; SÉVERIN, E. An investigation of bankruptcy prediction in imbalanced datasets. Decision Support Systems, v. 112, p. 111-124, 2018.</w:t>
+        </w:r>
+      </w:ins>
+    </w:p>
+    <w:p>
+      <w:pPr>
+        <w:spacing w:after="180" w:before="0" w:line="240"/>
+        <w:jc w:val="left"/>
+        <w:rPr>
+          <w:ins w:id="9343" w:author="Revisão" w:date="2026-09-28T12:00:00Z"/>
+        </w:rPr>
+      </w:pPr>
+      <w:ins w:id="9344" w:author="Revisão" w:date="2026-09-28T12:00:00Z">
         <w:r>
           <w:rPr>
             <w:rFonts w:ascii="Times New Roman" w:cs="Times New Roman" w:eastAsia="Times New Roman" w:hAnsi="Times New Roman"/>

</xml_diff>

<commit_message>
Estrutura final: Apendice A, renumeracao das tabelas e Tabela 17 completa
- montar_apendice.py: move as tabelas 8, 9, 11, 18, 19 e 20 para o Apendice A
  e renumera as mencoes no artigo (45) e na nota (11); a versao com
  alteracoes controladas mantem a numeracao original
- Tabelas antes nao citadas (validacao minskyana e metricas) passam a ser
- Tabela 17: colunas de especificidade e decisao liquida 10:1; VPN na nota
- tracked.insert_column herda o formato de runs dentro de w:ins/w:del
- verificador aceita o docx como argumento: 596 celulas, 0 divergencias
- planilha com aba Numeracao_final; carta, LEIAME e ESCRUTINIO (secao 13)

Co-Authored-By: Claude Opus 5.5 <noreply@anthropic.com>
Claude-Session: https://claude.ai/code/session_01V4LwoZDLWB9PeJtPghPCix
</commit_message>
<xml_diff>
--- a/projeto/artigo/Artigo_Fragilidade_Financeira_revisado.docx
+++ b/projeto/artigo/Artigo_Fragilidade_Financeira_revisado.docx
@@ -30817,12 +30817,14 @@
         </w:tblBorders>
       </w:tblPr>
       <w:tblGrid>
-        <w:gridCol w:w="2271"/>
-        <w:gridCol w:w="1300"/>
-        <w:gridCol w:w="1300"/>
-        <w:gridCol w:w="1400"/>
-        <w:gridCol w:w="1400"/>
-        <w:gridCol w:w="1400"/>
+        <w:gridCol w:w="1421"/>
+        <w:gridCol w:w="1100"/>
+        <w:gridCol w:w="800"/>
+        <w:gridCol w:w="1150"/>
+        <w:gridCol w:w="1150"/>
+        <w:gridCol w:w="750"/>
+        <w:gridCol w:w="1500"/>
+        <w:gridCol w:w="1200"/>
       </w:tblGrid>
       <w:tr>
         <w:trPr>
@@ -30830,7 +30832,7 @@
         </w:trPr>
         <w:tc>
           <w:tcPr>
-            <w:tcW w:type="dxa" w:w="2271"/>
+            <w:tcW w:type="dxa" w:w="1421"/>
             <w:shd w:fill="F2F2F2" w:val="clear"/>
             <w:tcMar>
               <w:top w:type="dxa" w:w="60"/>
@@ -30860,7 +30862,7 @@
         </w:tc>
         <w:tc>
           <w:tcPr>
-            <w:tcW w:type="dxa" w:w="1300"/>
+            <w:tcW w:type="dxa" w:w="1100"/>
             <w:shd w:fill="F2F2F2" w:val="clear"/>
             <w:tcMar>
               <w:top w:type="dxa" w:w="60"/>
@@ -30890,7 +30892,7 @@
         </w:tc>
         <w:tc>
           <w:tcPr>
-            <w:tcW w:type="dxa" w:w="1300"/>
+            <w:tcW w:type="dxa" w:w="800"/>
             <w:shd w:fill="F2F2F2" w:val="clear"/>
             <w:tcMar>
               <w:top w:type="dxa" w:w="60"/>
@@ -30920,7 +30922,7 @@
         </w:tc>
         <w:tc>
           <w:tcPr>
-            <w:tcW w:type="dxa" w:w="1400"/>
+            <w:tcW w:type="dxa" w:w="1150"/>
             <w:shd w:fill="F2F2F2" w:val="clear"/>
             <w:tcMar>
               <w:top w:type="dxa" w:w="60"/>
@@ -30950,7 +30952,7 @@
         </w:tc>
         <w:tc>
           <w:tcPr>
-            <w:tcW w:type="dxa" w:w="1400"/>
+            <w:tcW w:type="dxa" w:w="1150"/>
             <w:shd w:fill="F2F2F2" w:val="clear"/>
             <w:tcMar>
               <w:top w:type="dxa" w:w="60"/>
@@ -30996,7 +30998,7 @@
         </w:tc>
         <w:tc>
           <w:tcPr>
-            <w:tcW w:type="dxa" w:w="1400"/>
+            <w:tcW w:type="dxa" w:w="750"/>
             <w:shd w:fill="F2F2F2" w:val="clear"/>
             <w:tcMar>
               <w:top w:type="dxa" w:w="60"/>
@@ -31022,6 +31024,72 @@
               </w:rPr>
               <w:t xml:space="preserve">VPP</w:t>
             </w:r>
+          </w:p>
+        </w:tc>
+        <w:tc>
+          <w:tcPr>
+            <w:tcW w:type="dxa" w:w="1500"/>
+            <w:shd w:fill="F2F2F2" w:val="clear"/>
+            <w:tcMar>
+              <w:top w:type="dxa" w:w="60"/>
+              <w:left w:type="dxa" w:w="80"/>
+              <w:bottom w:type="dxa" w:w="60"/>
+              <w:right w:type="dxa" w:w="80"/>
+            </w:tcMar>
+            <w:cellIns w:id="9385" w:author="Revisão" w:date="2026-09-28T12:00:00Z"/>
+          </w:tcPr>
+          <w:p>
+            <w:pPr>
+              <w:spacing w:after="0" w:before="0" w:line="240"/>
+              <w:jc w:val="center"/>
+            </w:pPr>
+            <w:ins w:id="9386" w:author="Revisão" w:date="2026-09-28T12:00:00Z">
+              <w:r>
+                <w:rPr>
+                  <w:rFonts w:ascii="Times New Roman" w:cs="Times New Roman" w:eastAsia="Times New Roman" w:hAnsi="Times New Roman"/>
+                  <w:b/>
+                  <w:bCs/>
+                  <w:i w:val="false"/>
+                  <w:iCs w:val="false"/>
+                  <w:sz w:val="20"/>
+                  <w:szCs w:val="20"/>
+                </w:rPr>
+                <w:t xml:space="preserve">Especificidade</w:t>
+              </w:r>
+            </w:ins>
+          </w:p>
+        </w:tc>
+        <w:tc>
+          <w:tcPr>
+            <w:tcW w:type="dxa" w:w="1200"/>
+            <w:shd w:fill="F2F2F2" w:val="clear"/>
+            <w:tcMar>
+              <w:top w:type="dxa" w:w="60"/>
+              <w:left w:type="dxa" w:w="80"/>
+              <w:bottom w:type="dxa" w:w="60"/>
+              <w:right w:type="dxa" w:w="80"/>
+            </w:tcMar>
+            <w:cellIns w:id="9369" w:author="Revisão" w:date="2026-09-28T12:00:00Z"/>
+          </w:tcPr>
+          <w:p>
+            <w:pPr>
+              <w:spacing w:after="0" w:before="0" w:line="240"/>
+              <w:jc w:val="center"/>
+            </w:pPr>
+            <w:ins w:id="9370" w:author="Revisão" w:date="2026-09-28T12:00:00Z">
+              <w:r>
+                <w:rPr>
+                  <w:rFonts w:ascii="Times New Roman" w:cs="Times New Roman" w:eastAsia="Times New Roman" w:hAnsi="Times New Roman"/>
+                  <w:b/>
+                  <w:bCs/>
+                  <w:i w:val="false"/>
+                  <w:iCs w:val="false"/>
+                  <w:sz w:val="20"/>
+                  <w:szCs w:val="20"/>
+                </w:rPr>
+                <w:t xml:space="preserve">Decisão líquida 10:1</w:t>
+              </w:r>
+            </w:ins>
           </w:p>
         </w:tc>
       </w:tr>
@@ -31031,7 +31099,7 @@
         </w:trPr>
         <w:tc>
           <w:tcPr>
-            <w:tcW w:type="dxa" w:w="2271"/>
+            <w:tcW w:type="dxa" w:w="1421"/>
             <w:tcMar>
               <w:top w:type="dxa" w:w="60"/>
               <w:left w:type="dxa" w:w="80"/>
@@ -31060,7 +31128,7 @@
         </w:tc>
         <w:tc>
           <w:tcPr>
-            <w:tcW w:type="dxa" w:w="1300"/>
+            <w:tcW w:type="dxa" w:w="1100"/>
             <w:tcMar>
               <w:top w:type="dxa" w:w="60"/>
               <w:left w:type="dxa" w:w="80"/>
@@ -31105,7 +31173,7 @@
         </w:tc>
         <w:tc>
           <w:tcPr>
-            <w:tcW w:type="dxa" w:w="1300"/>
+            <w:tcW w:type="dxa" w:w="800"/>
             <w:tcMar>
               <w:top w:type="dxa" w:w="60"/>
               <w:left w:type="dxa" w:w="80"/>
@@ -31150,7 +31218,7 @@
         </w:tc>
         <w:tc>
           <w:tcPr>
-            <w:tcW w:type="dxa" w:w="1400"/>
+            <w:tcW w:type="dxa" w:w="1150"/>
             <w:tcMar>
               <w:top w:type="dxa" w:w="60"/>
               <w:left w:type="dxa" w:w="80"/>
@@ -31195,7 +31263,7 @@
         </w:tc>
         <w:tc>
           <w:tcPr>
-            <w:tcW w:type="dxa" w:w="1400"/>
+            <w:tcW w:type="dxa" w:w="1150"/>
             <w:tcMar>
               <w:top w:type="dxa" w:w="60"/>
               <w:left w:type="dxa" w:w="80"/>
@@ -31224,7 +31292,7 @@
         </w:tc>
         <w:tc>
           <w:tcPr>
-            <w:tcW w:type="dxa" w:w="1400"/>
+            <w:tcW w:type="dxa" w:w="750"/>
             <w:tcMar>
               <w:top w:type="dxa" w:w="60"/>
               <w:left w:type="dxa" w:w="80"/>
@@ -31267,6 +31335,70 @@
             </w:ins>
           </w:p>
         </w:tc>
+        <w:tc>
+          <w:tcPr>
+            <w:tcW w:type="dxa" w:w="1500"/>
+            <w:tcMar>
+              <w:top w:type="dxa" w:w="60"/>
+              <w:left w:type="dxa" w:w="80"/>
+              <w:bottom w:type="dxa" w:w="60"/>
+              <w:right w:type="dxa" w:w="80"/>
+            </w:tcMar>
+            <w:cellIns w:id="9387" w:author="Revisão" w:date="2026-09-28T12:00:00Z"/>
+          </w:tcPr>
+          <w:p>
+            <w:pPr>
+              <w:spacing w:after="0" w:before="0" w:line="240"/>
+              <w:jc w:val="center"/>
+            </w:pPr>
+            <w:ins w:id="9388" w:author="Revisão" w:date="2026-09-28T12:00:00Z">
+              <w:r>
+                <w:rPr>
+                  <w:rFonts w:ascii="Times New Roman" w:cs="Times New Roman" w:eastAsia="Times New Roman" w:hAnsi="Times New Roman"/>
+                  <w:b w:val="false"/>
+                  <w:bCs w:val="false"/>
+                  <w:i w:val="false"/>
+                  <w:iCs w:val="false"/>
+                  <w:sz w:val="20"/>
+                  <w:szCs w:val="20"/>
+                </w:rPr>
+                <w:t xml:space="preserve">0,846</w:t>
+              </w:r>
+            </w:ins>
+          </w:p>
+        </w:tc>
+        <w:tc>
+          <w:tcPr>
+            <w:tcW w:type="dxa" w:w="1200"/>
+            <w:tcMar>
+              <w:top w:type="dxa" w:w="60"/>
+              <w:left w:type="dxa" w:w="80"/>
+              <w:bottom w:type="dxa" w:w="60"/>
+              <w:right w:type="dxa" w:w="80"/>
+            </w:tcMar>
+            <w:cellIns w:id="9371" w:author="Revisão" w:date="2026-09-28T12:00:00Z"/>
+          </w:tcPr>
+          <w:p>
+            <w:pPr>
+              <w:spacing w:after="0" w:before="0" w:line="240"/>
+              <w:jc w:val="center"/>
+            </w:pPr>
+            <w:ins w:id="9372" w:author="Revisão" w:date="2026-09-28T12:00:00Z">
+              <w:r>
+                <w:rPr>
+                  <w:rFonts w:ascii="Times New Roman" w:cs="Times New Roman" w:eastAsia="Times New Roman" w:hAnsi="Times New Roman"/>
+                  <w:b w:val="false"/>
+                  <w:bCs w:val="false"/>
+                  <w:i w:val="false"/>
+                  <w:iCs w:val="false"/>
+                  <w:sz w:val="20"/>
+                  <w:szCs w:val="20"/>
+                </w:rPr>
+                <w:t xml:space="preserve">0,011</w:t>
+              </w:r>
+            </w:ins>
+          </w:p>
+        </w:tc>
       </w:tr>
       <w:tr>
         <w:trPr>
@@ -31274,7 +31406,7 @@
         </w:trPr>
         <w:tc>
           <w:tcPr>
-            <w:tcW w:type="dxa" w:w="2271"/>
+            <w:tcW w:type="dxa" w:w="1421"/>
             <w:tcMar>
               <w:top w:type="dxa" w:w="60"/>
               <w:left w:type="dxa" w:w="80"/>
@@ -31303,7 +31435,7 @@
         </w:tc>
         <w:tc>
           <w:tcPr>
-            <w:tcW w:type="dxa" w:w="1300"/>
+            <w:tcW w:type="dxa" w:w="1100"/>
             <w:tcMar>
               <w:top w:type="dxa" w:w="60"/>
               <w:left w:type="dxa" w:w="80"/>
@@ -31348,7 +31480,7 @@
         </w:tc>
         <w:tc>
           <w:tcPr>
-            <w:tcW w:type="dxa" w:w="1300"/>
+            <w:tcW w:type="dxa" w:w="800"/>
             <w:tcMar>
               <w:top w:type="dxa" w:w="60"/>
               <w:left w:type="dxa" w:w="80"/>
@@ -31393,7 +31525,7 @@
         </w:tc>
         <w:tc>
           <w:tcPr>
-            <w:tcW w:type="dxa" w:w="1400"/>
+            <w:tcW w:type="dxa" w:w="1150"/>
             <w:tcMar>
               <w:top w:type="dxa" w:w="60"/>
               <w:left w:type="dxa" w:w="80"/>
@@ -31438,7 +31570,7 @@
         </w:tc>
         <w:tc>
           <w:tcPr>
-            <w:tcW w:type="dxa" w:w="1400"/>
+            <w:tcW w:type="dxa" w:w="1150"/>
             <w:tcMar>
               <w:top w:type="dxa" w:w="60"/>
               <w:left w:type="dxa" w:w="80"/>
@@ -31467,7 +31599,7 @@
         </w:tc>
         <w:tc>
           <w:tcPr>
-            <w:tcW w:type="dxa" w:w="1400"/>
+            <w:tcW w:type="dxa" w:w="750"/>
             <w:tcMar>
               <w:top w:type="dxa" w:w="60"/>
               <w:left w:type="dxa" w:w="80"/>
@@ -31492,6 +31624,70 @@
               </w:rPr>
               <w:t xml:space="preserve">0,124</w:t>
             </w:r>
+          </w:p>
+        </w:tc>
+        <w:tc>
+          <w:tcPr>
+            <w:tcW w:type="dxa" w:w="1500"/>
+            <w:tcMar>
+              <w:top w:type="dxa" w:w="60"/>
+              <w:left w:type="dxa" w:w="80"/>
+              <w:bottom w:type="dxa" w:w="60"/>
+              <w:right w:type="dxa" w:w="80"/>
+            </w:tcMar>
+            <w:cellIns w:id="9389" w:author="Revisão" w:date="2026-09-28T12:00:00Z"/>
+          </w:tcPr>
+          <w:p>
+            <w:pPr>
+              <w:spacing w:after="0" w:before="0" w:line="240"/>
+              <w:jc w:val="center"/>
+            </w:pPr>
+            <w:ins w:id="9390" w:author="Revisão" w:date="2026-09-28T12:00:00Z">
+              <w:r>
+                <w:rPr>
+                  <w:rFonts w:ascii="Times New Roman" w:cs="Times New Roman" w:eastAsia="Times New Roman" w:hAnsi="Times New Roman"/>
+                  <w:b w:val="false"/>
+                  <w:bCs w:val="false"/>
+                  <w:i w:val="false"/>
+                  <w:iCs w:val="false"/>
+                  <w:sz w:val="20"/>
+                  <w:szCs w:val="20"/>
+                </w:rPr>
+                <w:t xml:space="preserve">0,831</w:t>
+              </w:r>
+            </w:ins>
+          </w:p>
+        </w:tc>
+        <w:tc>
+          <w:tcPr>
+            <w:tcW w:type="dxa" w:w="1200"/>
+            <w:tcMar>
+              <w:top w:type="dxa" w:w="60"/>
+              <w:left w:type="dxa" w:w="80"/>
+              <w:bottom w:type="dxa" w:w="60"/>
+              <w:right w:type="dxa" w:w="80"/>
+            </w:tcMar>
+            <w:cellIns w:id="9373" w:author="Revisão" w:date="2026-09-28T12:00:00Z"/>
+          </w:tcPr>
+          <w:p>
+            <w:pPr>
+              <w:spacing w:after="0" w:before="0" w:line="240"/>
+              <w:jc w:val="center"/>
+            </w:pPr>
+            <w:ins w:id="9374" w:author="Revisão" w:date="2026-09-28T12:00:00Z">
+              <w:r>
+                <w:rPr>
+                  <w:rFonts w:ascii="Times New Roman" w:cs="Times New Roman" w:eastAsia="Times New Roman" w:hAnsi="Times New Roman"/>
+                  <w:b w:val="false"/>
+                  <w:bCs w:val="false"/>
+                  <w:i w:val="false"/>
+                  <w:iCs w:val="false"/>
+                  <w:sz w:val="20"/>
+                  <w:szCs w:val="20"/>
+                </w:rPr>
+                <w:t xml:space="preserve">0,009</w:t>
+              </w:r>
+            </w:ins>
           </w:p>
         </w:tc>
       </w:tr>
@@ -31501,7 +31697,7 @@
         </w:trPr>
         <w:tc>
           <w:tcPr>
-            <w:tcW w:type="dxa" w:w="2271"/>
+            <w:tcW w:type="dxa" w:w="1421"/>
             <w:tcMar>
               <w:top w:type="dxa" w:w="60"/>
               <w:left w:type="dxa" w:w="80"/>
@@ -31530,7 +31726,7 @@
         </w:tc>
         <w:tc>
           <w:tcPr>
-            <w:tcW w:type="dxa" w:w="1300"/>
+            <w:tcW w:type="dxa" w:w="1100"/>
             <w:tcMar>
               <w:top w:type="dxa" w:w="60"/>
               <w:left w:type="dxa" w:w="80"/>
@@ -31559,7 +31755,7 @@
         </w:tc>
         <w:tc>
           <w:tcPr>
-            <w:tcW w:type="dxa" w:w="1300"/>
+            <w:tcW w:type="dxa" w:w="800"/>
             <w:tcMar>
               <w:top w:type="dxa" w:w="60"/>
               <w:left w:type="dxa" w:w="80"/>
@@ -31604,7 +31800,7 @@
         </w:tc>
         <w:tc>
           <w:tcPr>
-            <w:tcW w:type="dxa" w:w="1400"/>
+            <w:tcW w:type="dxa" w:w="1150"/>
             <w:tcMar>
               <w:top w:type="dxa" w:w="60"/>
               <w:left w:type="dxa" w:w="80"/>
@@ -31649,7 +31845,7 @@
         </w:tc>
         <w:tc>
           <w:tcPr>
-            <w:tcW w:type="dxa" w:w="1400"/>
+            <w:tcW w:type="dxa" w:w="1150"/>
             <w:tcMar>
               <w:top w:type="dxa" w:w="60"/>
               <w:left w:type="dxa" w:w="80"/>
@@ -31678,7 +31874,7 @@
         </w:tc>
         <w:tc>
           <w:tcPr>
-            <w:tcW w:type="dxa" w:w="1400"/>
+            <w:tcW w:type="dxa" w:w="750"/>
             <w:tcMar>
               <w:top w:type="dxa" w:w="60"/>
               <w:left w:type="dxa" w:w="80"/>
@@ -31703,6 +31899,70 @@
               </w:rPr>
               <w:t xml:space="preserve">0,113</w:t>
             </w:r>
+          </w:p>
+        </w:tc>
+        <w:tc>
+          <w:tcPr>
+            <w:tcW w:type="dxa" w:w="1500"/>
+            <w:tcMar>
+              <w:top w:type="dxa" w:w="60"/>
+              <w:left w:type="dxa" w:w="80"/>
+              <w:bottom w:type="dxa" w:w="60"/>
+              <w:right w:type="dxa" w:w="80"/>
+            </w:tcMar>
+            <w:cellIns w:id="9391" w:author="Revisão" w:date="2026-09-28T12:00:00Z"/>
+          </w:tcPr>
+          <w:p>
+            <w:pPr>
+              <w:spacing w:after="0" w:before="0" w:line="240"/>
+              <w:jc w:val="center"/>
+            </w:pPr>
+            <w:ins w:id="9392" w:author="Revisão" w:date="2026-09-28T12:00:00Z">
+              <w:r>
+                <w:rPr>
+                  <w:rFonts w:ascii="Times New Roman" w:cs="Times New Roman" w:eastAsia="Times New Roman" w:hAnsi="Times New Roman"/>
+                  <w:b w:val="false"/>
+                  <w:bCs w:val="false"/>
+                  <w:i w:val="false"/>
+                  <w:iCs w:val="false"/>
+                  <w:sz w:val="20"/>
+                  <w:szCs w:val="20"/>
+                </w:rPr>
+                <w:t xml:space="preserve">0,810</w:t>
+              </w:r>
+            </w:ins>
+          </w:p>
+        </w:tc>
+        <w:tc>
+          <w:tcPr>
+            <w:tcW w:type="dxa" w:w="1200"/>
+            <w:tcMar>
+              <w:top w:type="dxa" w:w="60"/>
+              <w:left w:type="dxa" w:w="80"/>
+              <w:bottom w:type="dxa" w:w="60"/>
+              <w:right w:type="dxa" w:w="80"/>
+            </w:tcMar>
+            <w:cellIns w:id="9375" w:author="Revisão" w:date="2026-09-28T12:00:00Z"/>
+          </w:tcPr>
+          <w:p>
+            <w:pPr>
+              <w:spacing w:after="0" w:before="0" w:line="240"/>
+              <w:jc w:val="center"/>
+            </w:pPr>
+            <w:ins w:id="9376" w:author="Revisão" w:date="2026-09-28T12:00:00Z">
+              <w:r>
+                <w:rPr>
+                  <w:rFonts w:ascii="Times New Roman" w:cs="Times New Roman" w:eastAsia="Times New Roman" w:hAnsi="Times New Roman"/>
+                  <w:b w:val="false"/>
+                  <w:bCs w:val="false"/>
+                  <w:i w:val="false"/>
+                  <w:iCs w:val="false"/>
+                  <w:sz w:val="20"/>
+                  <w:szCs w:val="20"/>
+                </w:rPr>
+                <w:t xml:space="preserve">0,008</w:t>
+              </w:r>
+            </w:ins>
           </w:p>
         </w:tc>
       </w:tr>
@@ -31712,7 +31972,7 @@
         </w:trPr>
         <w:tc>
           <w:tcPr>
-            <w:tcW w:type="dxa" w:w="2271"/>
+            <w:tcW w:type="dxa" w:w="1421"/>
             <w:tcMar>
               <w:top w:type="dxa" w:w="60"/>
               <w:left w:type="dxa" w:w="80"/>
@@ -31741,7 +32001,7 @@
         </w:tc>
         <w:tc>
           <w:tcPr>
-            <w:tcW w:type="dxa" w:w="1300"/>
+            <w:tcW w:type="dxa" w:w="1100"/>
             <w:tcMar>
               <w:top w:type="dxa" w:w="60"/>
               <w:left w:type="dxa" w:w="80"/>
@@ -31786,7 +32046,7 @@
         </w:tc>
         <w:tc>
           <w:tcPr>
-            <w:tcW w:type="dxa" w:w="1300"/>
+            <w:tcW w:type="dxa" w:w="800"/>
             <w:tcMar>
               <w:top w:type="dxa" w:w="60"/>
               <w:left w:type="dxa" w:w="80"/>
@@ -31831,7 +32091,7 @@
         </w:tc>
         <w:tc>
           <w:tcPr>
-            <w:tcW w:type="dxa" w:w="1400"/>
+            <w:tcW w:type="dxa" w:w="1150"/>
             <w:tcMar>
               <w:top w:type="dxa" w:w="60"/>
               <w:left w:type="dxa" w:w="80"/>
@@ -31876,7 +32136,7 @@
         </w:tc>
         <w:tc>
           <w:tcPr>
-            <w:tcW w:type="dxa" w:w="1400"/>
+            <w:tcW w:type="dxa" w:w="1150"/>
             <w:tcMar>
               <w:top w:type="dxa" w:w="60"/>
               <w:left w:type="dxa" w:w="80"/>
@@ -31905,7 +32165,7 @@
         </w:tc>
         <w:tc>
           <w:tcPr>
-            <w:tcW w:type="dxa" w:w="1400"/>
+            <w:tcW w:type="dxa" w:w="750"/>
             <w:tcMar>
               <w:top w:type="dxa" w:w="60"/>
               <w:left w:type="dxa" w:w="80"/>
@@ -31930,6 +32190,70 @@
               </w:rPr>
               <w:t xml:space="preserve">0,133</w:t>
             </w:r>
+          </w:p>
+        </w:tc>
+        <w:tc>
+          <w:tcPr>
+            <w:tcW w:type="dxa" w:w="1500"/>
+            <w:tcMar>
+              <w:top w:type="dxa" w:w="60"/>
+              <w:left w:type="dxa" w:w="80"/>
+              <w:bottom w:type="dxa" w:w="60"/>
+              <w:right w:type="dxa" w:w="80"/>
+            </w:tcMar>
+            <w:cellIns w:id="9393" w:author="Revisão" w:date="2026-09-28T12:00:00Z"/>
+          </w:tcPr>
+          <w:p>
+            <w:pPr>
+              <w:spacing w:after="0" w:before="0" w:line="240"/>
+              <w:jc w:val="center"/>
+            </w:pPr>
+            <w:ins w:id="9394" w:author="Revisão" w:date="2026-09-28T12:00:00Z">
+              <w:r>
+                <w:rPr>
+                  <w:rFonts w:ascii="Times New Roman" w:cs="Times New Roman" w:eastAsia="Times New Roman" w:hAnsi="Times New Roman"/>
+                  <w:b w:val="false"/>
+                  <w:bCs w:val="false"/>
+                  <w:i w:val="false"/>
+                  <w:iCs w:val="false"/>
+                  <w:sz w:val="20"/>
+                  <w:szCs w:val="20"/>
+                </w:rPr>
+                <w:t xml:space="preserve">0,843</w:t>
+              </w:r>
+            </w:ins>
+          </w:p>
+        </w:tc>
+        <w:tc>
+          <w:tcPr>
+            <w:tcW w:type="dxa" w:w="1200"/>
+            <w:tcMar>
+              <w:top w:type="dxa" w:w="60"/>
+              <w:left w:type="dxa" w:w="80"/>
+              <w:bottom w:type="dxa" w:w="60"/>
+              <w:right w:type="dxa" w:w="80"/>
+            </w:tcMar>
+            <w:cellIns w:id="9377" w:author="Revisão" w:date="2026-09-28T12:00:00Z"/>
+          </w:tcPr>
+          <w:p>
+            <w:pPr>
+              <w:spacing w:after="0" w:before="0" w:line="240"/>
+              <w:jc w:val="center"/>
+            </w:pPr>
+            <w:ins w:id="9378" w:author="Revisão" w:date="2026-09-28T12:00:00Z">
+              <w:r>
+                <w:rPr>
+                  <w:rFonts w:ascii="Times New Roman" w:cs="Times New Roman" w:eastAsia="Times New Roman" w:hAnsi="Times New Roman"/>
+                  <w:b w:val="false"/>
+                  <w:bCs w:val="false"/>
+                  <w:i w:val="false"/>
+                  <w:iCs w:val="false"/>
+                  <w:sz w:val="20"/>
+                  <w:szCs w:val="20"/>
+                </w:rPr>
+                <w:t xml:space="preserve">0,009</w:t>
+              </w:r>
+            </w:ins>
           </w:p>
         </w:tc>
       </w:tr>
@@ -31939,7 +32263,7 @@
         </w:trPr>
         <w:tc>
           <w:tcPr>
-            <w:tcW w:type="dxa" w:w="2271"/>
+            <w:tcW w:type="dxa" w:w="1421"/>
             <w:tcMar>
               <w:top w:type="dxa" w:w="60"/>
               <w:left w:type="dxa" w:w="80"/>
@@ -31968,7 +32292,7 @@
         </w:tc>
         <w:tc>
           <w:tcPr>
-            <w:tcW w:type="dxa" w:w="1300"/>
+            <w:tcW w:type="dxa" w:w="1100"/>
             <w:tcMar>
               <w:top w:type="dxa" w:w="60"/>
               <w:left w:type="dxa" w:w="80"/>
@@ -32013,7 +32337,7 @@
         </w:tc>
         <w:tc>
           <w:tcPr>
-            <w:tcW w:type="dxa" w:w="1300"/>
+            <w:tcW w:type="dxa" w:w="800"/>
             <w:tcMar>
               <w:top w:type="dxa" w:w="60"/>
               <w:left w:type="dxa" w:w="80"/>
@@ -32058,7 +32382,7 @@
         </w:tc>
         <w:tc>
           <w:tcPr>
-            <w:tcW w:type="dxa" w:w="1400"/>
+            <w:tcW w:type="dxa" w:w="1150"/>
             <w:tcMar>
               <w:top w:type="dxa" w:w="60"/>
               <w:left w:type="dxa" w:w="80"/>
@@ -32103,7 +32427,7 @@
         </w:tc>
         <w:tc>
           <w:tcPr>
-            <w:tcW w:type="dxa" w:w="1400"/>
+            <w:tcW w:type="dxa" w:w="1150"/>
             <w:tcMar>
               <w:top w:type="dxa" w:w="60"/>
               <w:left w:type="dxa" w:w="80"/>
@@ -32132,7 +32456,7 @@
         </w:tc>
         <w:tc>
           <w:tcPr>
-            <w:tcW w:type="dxa" w:w="1400"/>
+            <w:tcW w:type="dxa" w:w="750"/>
             <w:tcMar>
               <w:top w:type="dxa" w:w="60"/>
               <w:left w:type="dxa" w:w="80"/>
@@ -32157,6 +32481,70 @@
               </w:rPr>
               <w:t xml:space="preserve">0,053</w:t>
             </w:r>
+          </w:p>
+        </w:tc>
+        <w:tc>
+          <w:tcPr>
+            <w:tcW w:type="dxa" w:w="1500"/>
+            <w:tcMar>
+              <w:top w:type="dxa" w:w="60"/>
+              <w:left w:type="dxa" w:w="80"/>
+              <w:bottom w:type="dxa" w:w="60"/>
+              <w:right w:type="dxa" w:w="80"/>
+            </w:tcMar>
+            <w:cellIns w:id="9395" w:author="Revisão" w:date="2026-09-28T12:00:00Z"/>
+          </w:tcPr>
+          <w:p>
+            <w:pPr>
+              <w:spacing w:after="0" w:before="0" w:line="240"/>
+              <w:jc w:val="center"/>
+            </w:pPr>
+            <w:ins w:id="9396" w:author="Revisão" w:date="2026-09-28T12:00:00Z">
+              <w:r>
+                <w:rPr>
+                  <w:rFonts w:ascii="Times New Roman" w:cs="Times New Roman" w:eastAsia="Times New Roman" w:hAnsi="Times New Roman"/>
+                  <w:b w:val="false"/>
+                  <w:bCs w:val="false"/>
+                  <w:i w:val="false"/>
+                  <w:iCs w:val="false"/>
+                  <w:sz w:val="20"/>
+                  <w:szCs w:val="20"/>
+                </w:rPr>
+                <w:t xml:space="preserve">0,570</w:t>
+              </w:r>
+            </w:ins>
+          </w:p>
+        </w:tc>
+        <w:tc>
+          <w:tcPr>
+            <w:tcW w:type="dxa" w:w="1200"/>
+            <w:tcMar>
+              <w:top w:type="dxa" w:w="60"/>
+              <w:left w:type="dxa" w:w="80"/>
+              <w:bottom w:type="dxa" w:w="60"/>
+              <w:right w:type="dxa" w:w="80"/>
+            </w:tcMar>
+            <w:cellIns w:id="9379" w:author="Revisão" w:date="2026-09-28T12:00:00Z"/>
+          </w:tcPr>
+          <w:p>
+            <w:pPr>
+              <w:spacing w:after="0" w:before="0" w:line="240"/>
+              <w:jc w:val="center"/>
+            </w:pPr>
+            <w:ins w:id="9380" w:author="Revisão" w:date="2026-09-28T12:00:00Z">
+              <w:r>
+                <w:rPr>
+                  <w:rFonts w:ascii="Times New Roman" w:cs="Times New Roman" w:eastAsia="Times New Roman" w:hAnsi="Times New Roman"/>
+                  <w:b w:val="false"/>
+                  <w:bCs w:val="false"/>
+                  <w:i w:val="false"/>
+                  <w:iCs w:val="false"/>
+                  <w:sz w:val="20"/>
+                  <w:szCs w:val="20"/>
+                </w:rPr>
+                <w:t xml:space="preserve">0,003</w:t>
+              </w:r>
+            </w:ins>
           </w:p>
         </w:tc>
       </w:tr>
@@ -32166,7 +32554,7 @@
         </w:trPr>
         <w:tc>
           <w:tcPr>
-            <w:tcW w:type="dxa" w:w="2271"/>
+            <w:tcW w:type="dxa" w:w="1421"/>
             <w:tcMar>
               <w:top w:type="dxa" w:w="60"/>
               <w:left w:type="dxa" w:w="80"/>
@@ -32195,7 +32583,7 @@
         </w:tc>
         <w:tc>
           <w:tcPr>
-            <w:tcW w:type="dxa" w:w="1300"/>
+            <w:tcW w:type="dxa" w:w="1100"/>
             <w:tcMar>
               <w:top w:type="dxa" w:w="60"/>
               <w:left w:type="dxa" w:w="80"/>
@@ -32240,7 +32628,7 @@
         </w:tc>
         <w:tc>
           <w:tcPr>
-            <w:tcW w:type="dxa" w:w="1300"/>
+            <w:tcW w:type="dxa" w:w="800"/>
             <w:tcMar>
               <w:top w:type="dxa" w:w="60"/>
               <w:left w:type="dxa" w:w="80"/>
@@ -32285,7 +32673,7 @@
         </w:tc>
         <w:tc>
           <w:tcPr>
-            <w:tcW w:type="dxa" w:w="1400"/>
+            <w:tcW w:type="dxa" w:w="1150"/>
             <w:tcMar>
               <w:top w:type="dxa" w:w="60"/>
               <w:left w:type="dxa" w:w="80"/>
@@ -32330,7 +32718,7 @@
         </w:tc>
         <w:tc>
           <w:tcPr>
-            <w:tcW w:type="dxa" w:w="1400"/>
+            <w:tcW w:type="dxa" w:w="1150"/>
             <w:tcMar>
               <w:top w:type="dxa" w:w="60"/>
               <w:left w:type="dxa" w:w="80"/>
@@ -32375,7 +32763,7 @@
         </w:tc>
         <w:tc>
           <w:tcPr>
-            <w:tcW w:type="dxa" w:w="1400"/>
+            <w:tcW w:type="dxa" w:w="750"/>
             <w:tcMar>
               <w:top w:type="dxa" w:w="60"/>
               <w:left w:type="dxa" w:w="80"/>
@@ -32400,6 +32788,70 @@
               </w:rPr>
               <w:t xml:space="preserve">0,044</w:t>
             </w:r>
+          </w:p>
+        </w:tc>
+        <w:tc>
+          <w:tcPr>
+            <w:tcW w:type="dxa" w:w="1500"/>
+            <w:tcMar>
+              <w:top w:type="dxa" w:w="60"/>
+              <w:left w:type="dxa" w:w="80"/>
+              <w:bottom w:type="dxa" w:w="60"/>
+              <w:right w:type="dxa" w:w="80"/>
+            </w:tcMar>
+            <w:cellIns w:id="9397" w:author="Revisão" w:date="2026-09-28T12:00:00Z"/>
+          </w:tcPr>
+          <w:p>
+            <w:pPr>
+              <w:spacing w:after="0" w:before="0" w:line="240"/>
+              <w:jc w:val="center"/>
+            </w:pPr>
+            <w:ins w:id="9398" w:author="Revisão" w:date="2026-09-28T12:00:00Z">
+              <w:r>
+                <w:rPr>
+                  <w:rFonts w:ascii="Times New Roman" w:cs="Times New Roman" w:eastAsia="Times New Roman" w:hAnsi="Times New Roman"/>
+                  <w:b w:val="false"/>
+                  <w:bCs w:val="false"/>
+                  <w:i w:val="false"/>
+                  <w:iCs w:val="false"/>
+                  <w:sz w:val="20"/>
+                  <w:szCs w:val="20"/>
+                </w:rPr>
+                <w:t xml:space="preserve">0,462</w:t>
+              </w:r>
+            </w:ins>
+          </w:p>
+        </w:tc>
+        <w:tc>
+          <w:tcPr>
+            <w:tcW w:type="dxa" w:w="1200"/>
+            <w:tcMar>
+              <w:top w:type="dxa" w:w="60"/>
+              <w:left w:type="dxa" w:w="80"/>
+              <w:bottom w:type="dxa" w:w="60"/>
+              <w:right w:type="dxa" w:w="80"/>
+            </w:tcMar>
+            <w:cellIns w:id="9381" w:author="Revisão" w:date="2026-09-28T12:00:00Z"/>
+          </w:tcPr>
+          <w:p>
+            <w:pPr>
+              <w:spacing w:after="0" w:before="0" w:line="240"/>
+              <w:jc w:val="center"/>
+            </w:pPr>
+            <w:ins w:id="9382" w:author="Revisão" w:date="2026-09-28T12:00:00Z">
+              <w:r>
+                <w:rPr>
+                  <w:rFonts w:ascii="Times New Roman" w:cs="Times New Roman" w:eastAsia="Times New Roman" w:hAnsi="Times New Roman"/>
+                  <w:b w:val="false"/>
+                  <w:bCs w:val="false"/>
+                  <w:i w:val="false"/>
+                  <w:iCs w:val="false"/>
+                  <w:sz w:val="20"/>
+                  <w:szCs w:val="20"/>
+                </w:rPr>
+                <w:t xml:space="preserve">0,001</w:t>
+              </w:r>
+            </w:ins>
           </w:p>
         </w:tc>
       </w:tr>
@@ -32409,7 +32861,7 @@
         </w:trPr>
         <w:tc>
           <w:tcPr>
-            <w:tcW w:type="dxa" w:w="2271"/>
+            <w:tcW w:type="dxa" w:w="1421"/>
             <w:tcMar>
               <w:top w:type="dxa" w:w="60"/>
               <w:left w:type="dxa" w:w="80"/>
@@ -32438,7 +32890,7 @@
         </w:tc>
         <w:tc>
           <w:tcPr>
-            <w:tcW w:type="dxa" w:w="1300"/>
+            <w:tcW w:type="dxa" w:w="1100"/>
             <w:tcMar>
               <w:top w:type="dxa" w:w="60"/>
               <w:left w:type="dxa" w:w="80"/>
@@ -32467,7 +32919,7 @@
         </w:tc>
         <w:tc>
           <w:tcPr>
-            <w:tcW w:type="dxa" w:w="1300"/>
+            <w:tcW w:type="dxa" w:w="800"/>
             <w:tcMar>
               <w:top w:type="dxa" w:w="60"/>
               <w:left w:type="dxa" w:w="80"/>
@@ -32496,7 +32948,7 @@
         </w:tc>
         <w:tc>
           <w:tcPr>
-            <w:tcW w:type="dxa" w:w="1400"/>
+            <w:tcW w:type="dxa" w:w="1150"/>
             <w:tcMar>
               <w:top w:type="dxa" w:w="60"/>
               <w:left w:type="dxa" w:w="80"/>
@@ -32525,7 +32977,7 @@
         </w:tc>
         <w:tc>
           <w:tcPr>
-            <w:tcW w:type="dxa" w:w="1400"/>
+            <w:tcW w:type="dxa" w:w="1150"/>
             <w:tcMar>
               <w:top w:type="dxa" w:w="60"/>
               <w:left w:type="dxa" w:w="80"/>
@@ -32554,7 +33006,7 @@
         </w:tc>
         <w:tc>
           <w:tcPr>
-            <w:tcW w:type="dxa" w:w="1400"/>
+            <w:tcW w:type="dxa" w:w="750"/>
             <w:tcMar>
               <w:top w:type="dxa" w:w="60"/>
               <w:left w:type="dxa" w:w="80"/>
@@ -32579,6 +33031,70 @@
               </w:rPr>
               <w:t xml:space="preserve">—</w:t>
             </w:r>
+          </w:p>
+        </w:tc>
+        <w:tc>
+          <w:tcPr>
+            <w:tcW w:type="dxa" w:w="1500"/>
+            <w:tcMar>
+              <w:top w:type="dxa" w:w="60"/>
+              <w:left w:type="dxa" w:w="80"/>
+              <w:bottom w:type="dxa" w:w="60"/>
+              <w:right w:type="dxa" w:w="80"/>
+            </w:tcMar>
+            <w:cellIns w:id="9399" w:author="Revisão" w:date="2026-09-28T12:00:00Z"/>
+          </w:tcPr>
+          <w:p>
+            <w:pPr>
+              <w:spacing w:after="0" w:before="0" w:line="240"/>
+              <w:jc w:val="center"/>
+            </w:pPr>
+            <w:ins w:id="9400" w:author="Revisão" w:date="2026-09-28T12:00:00Z">
+              <w:r>
+                <w:rPr>
+                  <w:rFonts w:ascii="Times New Roman" w:cs="Times New Roman" w:eastAsia="Times New Roman" w:hAnsi="Times New Roman"/>
+                  <w:b w:val="false"/>
+                  <w:bCs w:val="false"/>
+                  <w:i w:val="false"/>
+                  <w:iCs w:val="false"/>
+                  <w:sz w:val="20"/>
+                  <w:szCs w:val="20"/>
+                </w:rPr>
+                <w:t xml:space="preserve">—</w:t>
+              </w:r>
+            </w:ins>
+          </w:p>
+        </w:tc>
+        <w:tc>
+          <w:tcPr>
+            <w:tcW w:type="dxa" w:w="1200"/>
+            <w:tcMar>
+              <w:top w:type="dxa" w:w="60"/>
+              <w:left w:type="dxa" w:w="80"/>
+              <w:bottom w:type="dxa" w:w="60"/>
+              <w:right w:type="dxa" w:w="80"/>
+            </w:tcMar>
+            <w:cellIns w:id="9383" w:author="Revisão" w:date="2026-09-28T12:00:00Z"/>
+          </w:tcPr>
+          <w:p>
+            <w:pPr>
+              <w:spacing w:after="0" w:before="0" w:line="240"/>
+              <w:jc w:val="center"/>
+            </w:pPr>
+            <w:ins w:id="9384" w:author="Revisão" w:date="2026-09-28T12:00:00Z">
+              <w:r>
+                <w:rPr>
+                  <w:rFonts w:ascii="Times New Roman" w:cs="Times New Roman" w:eastAsia="Times New Roman" w:hAnsi="Times New Roman"/>
+                  <w:b w:val="false"/>
+                  <w:bCs w:val="false"/>
+                  <w:i w:val="false"/>
+                  <w:iCs w:val="false"/>
+                  <w:sz w:val="20"/>
+                  <w:szCs w:val="20"/>
+                </w:rPr>
+                <w:t xml:space="preserve">—</w:t>
+              </w:r>
+            </w:ins>
           </w:p>
         </w:tc>
       </w:tr>
@@ -32625,7 +33141,7 @@
             <w:sz w:val="20"/>
             <w:szCs w:val="20"/>
           </w:rPr>
-          <w:t xml:space="preserve">Firma-anos sinalizados e valor preditivo positivo referem-se</w:t>
+          <w:t xml:space="preserve">Firma-anos sinalizados, valor preditivo positivo e especificidade referem-se</w:t>
         </w:r>
       </w:ins>
       <w:r>
@@ -32665,7 +33181,7 @@
             <w:sz w:val="20"/>
             <w:szCs w:val="20"/>
           </w:rPr>
-          <w:t xml:space="preserve">Inclinação de calibração com valor ideal unitário. Probabilidades obtidas por regressão logística sobre o posto do escore na distribuição do treino. Modelos na ordem da área sob a curva ROC da Tabela 10.</w:t>
+          <w:t xml:space="preserve">Inclinação de calibração com valor ideal unitário. Probabilidades obtidas por regressão logística sobre o posto do escore na distribuição do treino. Decisão líquida por firma-ano, sob razão de custo de dez para um; a de não sinalizar ninguém é zero. No mesmo limiar, o valor preditivo negativo fica entre 0,988 e 0,993 em todos os modelos. Modelos na ordem da área sob a curva ROC da Tabela 10.</w:t>
         </w:r>
       </w:ins>
     </w:p>
@@ -32675,18 +33191,6 @@
         <w:ind w:firstLine="708"/>
         <w:jc w:val="both"/>
       </w:pPr>
-      <w:r>
-        <w:rPr>
-          <w:rFonts w:ascii="Times New Roman" w:cs="Times New Roman" w:eastAsia="Times New Roman" w:hAnsi="Times New Roman"/>
-          <w:b w:val="false"/>
-          <w:bCs w:val="false"/>
-          <w:i w:val="false"/>
-          <w:iCs w:val="false"/>
-          <w:sz w:val="24"/>
-          <w:szCs w:val="24"/>
-        </w:rPr>
-        <w:t xml:space="preserve">A ordenação em precisão e revocação reproduz a da área sob a curva ROC, e </w:t>
-      </w:r>
       <w:del w:id="9073" w:author="Revisão" w:date="2026-09-28T12:00:00Z">
         <w:r>
           <w:rPr>
@@ -32698,7 +33202,7 @@
             <w:sz w:val="24"/>
             <w:szCs w:val="24"/>
           </w:rPr>
-          <w:delText xml:space="preserve">a calibração é adequada em todos os modelos, com inclinações entre 0,968 e 1,016, à exceção do modelo de Brito e Assaf Neto, com 0,738.</w:delText>
+          <w:delText xml:space="preserve">A ordenação em precisão e revocação reproduz a da área sob a curva ROC, e a calibração é adequada em todos os modelos, com inclinações entre 0,968 e 1,016, à exceção do modelo de Brito e Assaf Neto, com 0,738.</w:delText>
         </w:r>
       </w:del>
       <w:ins w:id="9074" w:author="Revisão" w:date="2026-09-28T12:00:00Z">
@@ -32712,7 +33216,7 @@
             <w:sz w:val="24"/>
             <w:szCs w:val="24"/>
           </w:rPr>
-          <w:t xml:space="preserve">a calibração é adequada em todos os modelos, com inclinações entre 0,988 e 1,087 e interceptos próximos de zero, e todos superam a previsão constante no escore de Brier. A conversão é feita sobre o posto do escore, e não sobre o seu valor bruto, porque a regressão logística aplicada a indicadores de caudas longas, como o retorno sobre ativos e a cobertura de juros, atribui probabilidades extremas a poucas observações e degrada o escore de Brier: sobre os valores brutos, três dos seis modelos têm escore de Brier pior que o da previsão constante.</w:t>
+          <w:t xml:space="preserve">Na Tabela 17, a ordenação em precisão e revocação reproduz a da área sob a curva ROC, e a calibração é adequada em todos os modelos, com inclinações entre 0,988 e 1,087 e interceptos próximos de zero, e todos superam a previsão constante no escore de Brier. A conversão é feita sobre o posto do escore, e não sobre o seu valor bruto, porque a regressão logística aplicada a indicadores de caudas longas, como o retorno sobre ativos e a cobertura de juros, atribui probabilidades extremas a poucas observações e degrada o escore de Brier: sobre os valores brutos, três dos seis modelos têm escore de Brier pior que o da previsão constante.</w:t>
         </w:r>
       </w:ins>
       <w:r>

</xml_diff>

<commit_message>
Releitura pelos comentarios do orientador: saida como censura informativa em 2.4, moderacao sobre isolamento, extensao agregada nao obrigatoria na nota
Co-Authored-By: Claude Opus 5.5 <noreply@anthropic.com>
Claude-Session: https://claude.ai/code/session_01V4LwoZDLWB9PeJtPghPCix
</commit_message>
<xml_diff>
--- a/projeto/artigo/Artigo_Fragilidade_Financeira_revisado.docx
+++ b/projeto/artigo/Artigo_Fragilidade_Financeira_revisado.docx
@@ -73,7 +73,7 @@
         </w:rPr>
         <w:t xml:space="preserve">Examina-se se a agregação de indicadores contábeis em um escore sintético de fragilidade financeira se justifica frente aos seus melhores componentes isolados, em painel de 7.419 observações firma-ano de 730 companhias abertas não financeiras brasileiras entre 2010 e 2025. Sobre o agregado dos eventos a agregação não se justifica: a área sob a curva ROC do escore é de 0,764, contra 0,894 da cobertura de juros e 0,874 do retorno sobre ativos, em conclusão que se mantém sob validação cruzada agrupada por firma e sob avaliação temporal. </w:t>
       </w:r>
-      <w:del w:id="9287" w:author="Revisão" w:date="2026-09-28T12:00:00Z">
+      <w:del w:id="9291" w:author="Revisão" w:date="2026-09-28T12:00:00Z">
         <w:r>
           <w:rPr>
             <w:rFonts w:ascii="Times New Roman" w:cs="Times New Roman" w:eastAsia="Times New Roman" w:hAnsi="Times New Roman"/>
@@ -87,7 +87,7 @@
           <w:delText xml:space="preserve">Uma análise diagnóstica posterior decompõe o evento pelo critério que o define</w:delText>
         </w:r>
       </w:del>
-      <w:ins w:id="9288" w:author="Revisão" w:date="2026-09-28T12:00:00Z">
+      <w:ins w:id="9292" w:author="Revisão" w:date="2026-09-28T12:00:00Z">
         <w:r>
           <w:rPr>
             <w:rFonts w:ascii="Times New Roman" w:cs="Times New Roman" w:eastAsia="Times New Roman" w:hAnsi="Times New Roman"/>
@@ -229,10 +229,10 @@
         <w:spacing w:after="240" w:before="180" w:line="360"/>
         <w:jc w:val="both"/>
         <w:rPr>
-          <w:ins w:id="9358" w:author="Revisão" w:date="2026-09-28T12:00:00Z"/>
+          <w:ins w:id="9362" w:author="Revisão" w:date="2026-09-28T12:00:00Z"/>
         </w:rPr>
       </w:pPr>
-      <w:ins w:id="9359" w:author="Revisão" w:date="2026-09-28T12:00:00Z">
+      <w:ins w:id="9363" w:author="Revisão" w:date="2026-09-28T12:00:00Z">
         <w:r>
           <w:rPr>
             <w:rFonts w:ascii="Times New Roman" w:cs="Times New Roman" w:eastAsia="Times New Roman" w:hAnsi="Times New Roman"/>
@@ -246,7 +246,7 @@
           <w:t xml:space="preserve">Classificação JEL: </w:t>
         </w:r>
       </w:ins>
-      <w:ins w:id="9360" w:author="Revisão" w:date="2026-09-28T12:00:00Z">
+      <w:ins w:id="9364" w:author="Revisão" w:date="2026-09-28T12:00:00Z">
         <w:r>
           <w:rPr>
             <w:rFonts w:ascii="Times New Roman" w:cs="Times New Roman" w:eastAsia="Times New Roman" w:hAnsi="Times New Roman"/>
@@ -266,10 +266,10 @@
         <w:spacing w:after="120" w:before="0" w:line="360"/>
         <w:jc w:val="left"/>
         <w:rPr>
-          <w:ins w:id="9356" w:author="Revisão" w:date="2026-09-28T12:00:00Z"/>
+          <w:ins w:id="9360" w:author="Revisão" w:date="2026-09-28T12:00:00Z"/>
         </w:rPr>
       </w:pPr>
-      <w:ins w:id="9357" w:author="Revisão" w:date="2026-09-28T12:00:00Z">
+      <w:ins w:id="9361" w:author="Revisão" w:date="2026-09-28T12:00:00Z">
         <w:r>
           <w:rPr>
             <w:rFonts w:ascii="Times New Roman" w:cs="Times New Roman" w:eastAsia="Times New Roman" w:hAnsi="Times New Roman"/>
@@ -289,10 +289,10 @@
         <w:spacing w:after="0" w:before="0" w:line="360"/>
         <w:jc w:val="both"/>
         <w:rPr>
-          <w:ins w:id="9354" w:author="Revisão" w:date="2026-09-28T12:00:00Z"/>
+          <w:ins w:id="9358" w:author="Revisão" w:date="2026-09-28T12:00:00Z"/>
         </w:rPr>
       </w:pPr>
-      <w:ins w:id="9355" w:author="Revisão" w:date="2026-09-28T12:00:00Z">
+      <w:ins w:id="9359" w:author="Revisão" w:date="2026-09-28T12:00:00Z">
         <w:r>
           <w:rPr>
             <w:rFonts w:ascii="Times New Roman" w:cs="Times New Roman" w:eastAsia="Times New Roman" w:hAnsi="Times New Roman"/>
@@ -312,10 +312,10 @@
         <w:spacing w:after="240" w:before="180" w:line="360"/>
         <w:jc w:val="both"/>
         <w:rPr>
-          <w:ins w:id="9351" w:author="Revisão" w:date="2026-09-28T12:00:00Z"/>
+          <w:ins w:id="9355" w:author="Revisão" w:date="2026-09-28T12:00:00Z"/>
         </w:rPr>
       </w:pPr>
-      <w:ins w:id="9352" w:author="Revisão" w:date="2026-09-28T12:00:00Z">
+      <w:ins w:id="9356" w:author="Revisão" w:date="2026-09-28T12:00:00Z">
         <w:r>
           <w:rPr>
             <w:rFonts w:ascii="Times New Roman" w:cs="Times New Roman" w:eastAsia="Times New Roman" w:hAnsi="Times New Roman"/>
@@ -329,7 +329,7 @@
           <w:t xml:space="preserve">Keywords: </w:t>
         </w:r>
       </w:ins>
-      <w:ins w:id="9353" w:author="Revisão" w:date="2026-09-28T12:00:00Z">
+      <w:ins w:id="9357" w:author="Revisão" w:date="2026-09-28T12:00:00Z">
         <w:r>
           <w:rPr>
             <w:rFonts w:ascii="Times New Roman" w:cs="Times New Roman" w:eastAsia="Times New Roman" w:hAnsi="Times New Roman"/>
@@ -556,7 +556,7 @@
         </w:rPr>
         <w:t xml:space="preserve"> o indicador que define essa posição; e conteúdo preditivo, </w:t>
       </w:r>
-      <w:del w:id="9289" w:author="Revisão" w:date="2026-09-28T12:00:00Z">
+      <w:del w:id="9293" w:author="Revisão" w:date="2026-09-28T12:00:00Z">
         <w:r>
           <w:rPr>
             <w:rFonts w:ascii="Times New Roman" w:cs="Times New Roman" w:eastAsia="Times New Roman" w:hAnsi="Times New Roman"/>
@@ -570,7 +570,7 @@
           <w:delText xml:space="preserve">antecipando a entrada com significância inferior a um por mil.</w:delText>
         </w:r>
       </w:del>
-      <w:ins w:id="9290" w:author="Revisão" w:date="2026-09-28T12:00:00Z">
+      <w:ins w:id="9294" w:author="Revisão" w:date="2026-09-28T12:00:00Z">
         <w:r>
           <w:rPr>
             <w:rFonts w:ascii="Times New Roman" w:cs="Times New Roman" w:eastAsia="Times New Roman" w:hAnsi="Times New Roman"/>
@@ -1398,7 +1398,7 @@
         </w:rPr>
         <w:t xml:space="preserve">, </w:t>
       </w:r>
-      <w:del w:id="9349" w:author="Revisão" w:date="2026-09-28T12:00:00Z">
+      <w:del w:id="9353" w:author="Revisão" w:date="2026-09-28T12:00:00Z">
         <w:r>
           <w:rPr>
             <w:rFonts w:ascii="Times New Roman" w:cs="Times New Roman" w:eastAsia="Times New Roman" w:hAnsi="Times New Roman"/>
@@ -1412,7 +1412,7 @@
           <w:delText xml:space="preserve">e Mai et al. (2019) incorporam informação textual das divulgações corporativas.</w:delText>
         </w:r>
       </w:del>
-      <w:ins w:id="9350" w:author="Revisão" w:date="2026-09-28T12:00:00Z">
+      <w:ins w:id="9354" w:author="Revisão" w:date="2026-09-28T12:00:00Z">
         <w:r>
           <w:rPr>
             <w:rFonts w:ascii="Times New Roman" w:cs="Times New Roman" w:eastAsia="Times New Roman" w:hAnsi="Times New Roman"/>
@@ -1620,10 +1620,10 @@
         <w:ind w:firstLine="708"/>
         <w:jc w:val="both"/>
         <w:rPr>
-          <w:del w:id="9366" w:author="Revisão" w:date="2026-09-28T12:00:00Z"/>
+          <w:del w:id="9370" w:author="Revisão" w:date="2026-09-28T12:00:00Z"/>
         </w:rPr>
       </w:pPr>
-      <w:del w:id="9365" w:author="Revisão" w:date="2026-09-28T12:00:00Z">
+      <w:del w:id="9369" w:author="Revisão" w:date="2026-09-28T12:00:00Z">
         <w:r>
           <w:rPr>
             <w:rFonts w:ascii="Times New Roman" w:cs="Times New Roman" w:eastAsia="Times New Roman" w:hAnsi="Times New Roman"/>
@@ -1694,7 +1694,47 @@
           <w:sz w:val="24"/>
           <w:szCs w:val="24"/>
         </w:rPr>
-        <w:t xml:space="preserve">. Trata-se explicitamente o viés de sobrevivência, mantendo no painel as firmas que o deixam antes do fim do período. E testa-se a superioridade contra benchmarks pré-especificados, </w:t>
+        <w:t xml:space="preserve">. </w:t>
+      </w:r>
+      <w:del w:id="9285" w:author="Revisão" w:date="2026-09-28T12:00:00Z">
+        <w:r>
+          <w:rPr>
+            <w:rFonts w:ascii="Times New Roman" w:cs="Times New Roman" w:eastAsia="Times New Roman" w:hAnsi="Times New Roman"/>
+            <w:b w:val="false"/>
+            <w:bCs w:val="false"/>
+            <w:i w:val="false"/>
+            <w:iCs w:val="false"/>
+            <w:sz w:val="24"/>
+            <w:szCs w:val="24"/>
+          </w:rPr>
+          <w:delText xml:space="preserve">Trata-se explicitamente o viés de sobrevivência, mantendo no painel as firmas que o deixam antes do fim do período.</w:delText>
+        </w:r>
+      </w:del>
+      <w:ins w:id="9286" w:author="Revisão" w:date="2026-09-28T12:00:00Z">
+        <w:r>
+          <w:rPr>
+            <w:rFonts w:ascii="Times New Roman" w:cs="Times New Roman" w:eastAsia="Times New Roman" w:hAnsi="Times New Roman"/>
+            <w:b w:val="false"/>
+            <w:bCs w:val="false"/>
+            <w:i w:val="false"/>
+            <w:iCs w:val="false"/>
+            <w:sz w:val="24"/>
+            <w:szCs w:val="24"/>
+          </w:rPr>
+          <w:t xml:space="preserve">Trata-se explicitamente a saída do painel, que constitui censura informativa e risco competitivo, e não apenas viés de sobrevivência: as firmas que deixam o painel são mantidas até a última observação, e as saídas por dificuldade financeira são testadas como evento.</w:t>
+        </w:r>
+      </w:ins>
+      <w:r>
+        <w:rPr>
+          <w:rFonts w:ascii="Times New Roman" w:cs="Times New Roman" w:eastAsia="Times New Roman" w:hAnsi="Times New Roman"/>
+          <w:b w:val="false"/>
+          <w:bCs w:val="false"/>
+          <w:i w:val="false"/>
+          <w:iCs w:val="false"/>
+          <w:sz w:val="24"/>
+          <w:szCs w:val="24"/>
+        </w:rPr>
+        <w:t xml:space="preserve"> E testa-se a superioridade contra benchmarks pré-especificados, </w:t>
       </w:r>
       <w:del w:id="9021" w:author="Revisão" w:date="2026-09-28T12:00:00Z">
         <w:r>
@@ -1753,7 +1793,47 @@
           <w:sz w:val="24"/>
           <w:szCs w:val="24"/>
         </w:rPr>
-        <w:t xml:space="preserve">A sexta dimensão é a que organiza a contribuição. As duas tradições revisadas nunca foram confrontadas sob condições controladas. A literatura minskyana constrói medidas multidimensionais não supervisionadas e as emprega para caracterizar regimes financeiros, sem submetê-las a avaliação preditiva formal contra razões contábeis isoladas. A literatura de predição avalia rigorosamente o poder preditivo, mas parte de pesos estimados sobre o desfecho e, por isso, não testa a premissa de fator latente comum. Avaliar as duas rotas sobre a mesma amostra, com o mesmo conjunto de variáveis, o mesmo modelo preditivo e o mesmo critério de desempenho isola o efeito do método de agregação. É esse o desenho adotado a partir da próxima seção.</w:t>
+        <w:t xml:space="preserve">A sexta dimensão é a que organiza a contribuição. As duas tradições revisadas nunca foram confrontadas sob condições controladas. A literatura minskyana constrói medidas multidimensionais não supervisionadas e as emprega para caracterizar regimes financeiros, sem submetê-las a avaliação preditiva formal contra razões contábeis isoladas. A literatura de predição avalia rigorosamente o poder preditivo, mas parte de pesos estimados sobre o desfecho e, por isso, não testa a premissa de fator latente comum. Avaliar as duas rotas sobre a mesma amostra, com o mesmo conjunto de variáveis, o mesmo modelo preditivo e o mesmo critério de desempenho </w:t>
+      </w:r>
+      <w:del w:id="9287" w:author="Revisão" w:date="2026-09-28T12:00:00Z">
+        <w:r>
+          <w:rPr>
+            <w:rFonts w:ascii="Times New Roman" w:cs="Times New Roman" w:eastAsia="Times New Roman" w:hAnsi="Times New Roman"/>
+            <w:b w:val="false"/>
+            <w:bCs w:val="false"/>
+            <w:i w:val="false"/>
+            <w:iCs w:val="false"/>
+            <w:sz w:val="24"/>
+            <w:szCs w:val="24"/>
+          </w:rPr>
+          <w:delText xml:space="preserve">isola o efeito do método de agregação.</w:delText>
+        </w:r>
+      </w:del>
+      <w:ins w:id="9288" w:author="Revisão" w:date="2026-09-28T12:00:00Z">
+        <w:r>
+          <w:rPr>
+            <w:rFonts w:ascii="Times New Roman" w:cs="Times New Roman" w:eastAsia="Times New Roman" w:hAnsi="Times New Roman"/>
+            <w:b w:val="false"/>
+            <w:bCs w:val="false"/>
+            <w:i w:val="false"/>
+            <w:iCs w:val="false"/>
+            <w:sz w:val="24"/>
+            <w:szCs w:val="24"/>
+          </w:rPr>
+          <w:t xml:space="preserve">mantém constantes os demais elementos e concentra a comparação no método de agregação.</w:t>
+        </w:r>
+      </w:ins>
+      <w:r>
+        <w:rPr>
+          <w:rFonts w:ascii="Times New Roman" w:cs="Times New Roman" w:eastAsia="Times New Roman" w:hAnsi="Times New Roman"/>
+          <w:b w:val="false"/>
+          <w:bCs w:val="false"/>
+          <w:i w:val="false"/>
+          <w:iCs w:val="false"/>
+          <w:sz w:val="24"/>
+          <w:szCs w:val="24"/>
+        </w:rPr>
+        <w:t xml:space="preserve"> É esse o desenho adotado a partir da próxima seção.</w:t>
       </w:r>
     </w:p>
     <w:p>
@@ -1762,10 +1842,10 @@
         <w:ind w:firstLine="708"/>
         <w:jc w:val="both"/>
         <w:rPr>
-          <w:ins w:id="9367" w:author="Revisão" w:date="2026-09-28T12:00:00Z"/>
+          <w:ins w:id="9371" w:author="Revisão" w:date="2026-09-28T12:00:00Z"/>
         </w:rPr>
       </w:pPr>
-      <w:ins w:id="9368" w:author="Revisão" w:date="2026-09-28T12:00:00Z">
+      <w:ins w:id="9372" w:author="Revisão" w:date="2026-09-28T12:00:00Z">
         <w:r>
           <w:rPr>
             <w:rFonts w:ascii="Times New Roman" w:cs="Times New Roman" w:eastAsia="Times New Roman" w:hAnsi="Times New Roman"/>
@@ -4016,7 +4096,7 @@
         </w:rPr>
         <w:t xml:space="preserve">A proporção de 15,0% refere-se à presença no estado de vulnerabilidade, e não à incidência de entradas. </w:t>
       </w:r>
-      <w:del w:id="9295" w:author="Revisão" w:date="2026-09-28T12:00:00Z">
+      <w:del w:id="9299" w:author="Revisão" w:date="2026-09-28T12:00:00Z">
         <w:r>
           <w:rPr>
             <w:rFonts w:ascii="Times New Roman" w:cs="Times New Roman" w:eastAsia="Times New Roman" w:hAnsi="Times New Roman"/>
@@ -4030,7 +4110,7 @@
           <w:delText xml:space="preserve">A conversão de uma medida na outra é tratada na subseção 4.3, onde se apresenta a decomposição dos eventos e a construção da amostra de risco.</w:delText>
         </w:r>
       </w:del>
-      <w:ins w:id="9296" w:author="Revisão" w:date="2026-09-28T12:00:00Z">
+      <w:ins w:id="9300" w:author="Revisão" w:date="2026-09-28T12:00:00Z">
         <w:r>
           <w:rPr>
             <w:rFonts w:ascii="Times New Roman" w:cs="Times New Roman" w:eastAsia="Times New Roman" w:hAnsi="Times New Roman"/>
@@ -4234,7 +4314,7 @@
         </w:rPr>
         <w:t xml:space="preserve">O desempenho preditivo é medido pela área sob a curva ROC </w:t>
       </w:r>
-      <w:del w:id="9313" w:author="Revisão" w:date="2026-09-28T12:00:00Z">
+      <w:del w:id="9317" w:author="Revisão" w:date="2026-09-28T12:00:00Z">
         <w:r>
           <w:rPr>
             <w:rFonts w:ascii="Times New Roman" w:cs="Times New Roman" w:eastAsia="Times New Roman" w:hAnsi="Times New Roman"/>
@@ -4248,7 +4328,7 @@
           <w:delText xml:space="preserve">(HANLEY; MCNEIL, 1982)</w:delText>
         </w:r>
       </w:del>
-      <w:ins w:id="9314" w:author="Revisão" w:date="2026-09-28T12:00:00Z">
+      <w:ins w:id="9318" w:author="Revisão" w:date="2026-09-28T12:00:00Z">
         <w:r>
           <w:rPr>
             <w:rFonts w:ascii="Times New Roman" w:cs="Times New Roman" w:eastAsia="Times New Roman" w:hAnsi="Times New Roman"/>
@@ -4314,7 +4394,7 @@
         </w:rPr>
         <w:t xml:space="preserve">, a área sob a curva é complementada na subseção 5.7 por métricas sensíveis à prevalência e à qualidade das probabilidades: </w:t>
       </w:r>
-      <w:del w:id="9301" w:author="Revisão" w:date="2026-09-28T12:00:00Z">
+      <w:del w:id="9305" w:author="Revisão" w:date="2026-09-28T12:00:00Z">
         <w:r>
           <w:rPr>
             <w:rFonts w:ascii="Times New Roman" w:cs="Times New Roman" w:eastAsia="Times New Roman" w:hAnsi="Times New Roman"/>
@@ -4328,7 +4408,7 @@
           <w:delText xml:space="preserve">a área sob a curva de precisão e revocação, o escore de Brier, a inclinação e o intercepto de calibração</w:delText>
         </w:r>
       </w:del>
-      <w:ins w:id="9302" w:author="Revisão" w:date="2026-09-28T12:00:00Z">
+      <w:ins w:id="9306" w:author="Revisão" w:date="2026-09-28T12:00:00Z">
         <w:r>
           <w:rPr>
             <w:rFonts w:ascii="Times New Roman" w:cs="Times New Roman" w:eastAsia="Times New Roman" w:hAnsi="Times New Roman"/>
@@ -4354,7 +4434,7 @@
         </w:rPr>
         <w:t xml:space="preserve">, a sensibilidade, a especificidade e os valores preditivos em limiares fixados na amostra de treino, </w:t>
       </w:r>
-      <w:del w:id="9303" w:author="Revisão" w:date="2026-09-28T12:00:00Z">
+      <w:del w:id="9307" w:author="Revisão" w:date="2026-09-28T12:00:00Z">
         <w:r>
           <w:rPr>
             <w:rFonts w:ascii="Times New Roman" w:cs="Times New Roman" w:eastAsia="Times New Roman" w:hAnsi="Times New Roman"/>
@@ -4368,7 +4448,7 @@
           <w:delText xml:space="preserve">e a decisão líquida sob diferentes razões de custo</w:delText>
         </w:r>
       </w:del>
-      <w:ins w:id="9304" w:author="Revisão" w:date="2026-09-28T12:00:00Z">
+      <w:ins w:id="9308" w:author="Revisão" w:date="2026-09-28T12:00:00Z">
         <w:r>
           <w:rPr>
             <w:rFonts w:ascii="Times New Roman" w:cs="Times New Roman" w:eastAsia="Times New Roman" w:hAnsi="Times New Roman"/>
@@ -4413,7 +4493,7 @@
         </w:rPr>
         <w:t xml:space="preserve">A inferência principal sobre as diferenças de área sob a curva </w:t>
       </w:r>
-      <w:del w:id="9305" w:author="Revisão" w:date="2026-09-28T12:00:00Z">
+      <w:del w:id="9309" w:author="Revisão" w:date="2026-09-28T12:00:00Z">
         <w:r>
           <w:rPr>
             <w:rFonts w:ascii="Times New Roman" w:cs="Times New Roman" w:eastAsia="Times New Roman" w:hAnsi="Times New Roman"/>
@@ -4427,7 +4507,7 @@
           <w:delText xml:space="preserve">é conduzida por bootstrap agrupado por firma, com 2.000 reamostragens</w:delText>
         </w:r>
       </w:del>
-      <w:ins w:id="9306" w:author="Revisão" w:date="2026-09-28T12:00:00Z">
+      <w:ins w:id="9310" w:author="Revisão" w:date="2026-09-28T12:00:00Z">
         <w:r>
           <w:rPr>
             <w:rFonts w:ascii="Times New Roman" w:cs="Times New Roman" w:eastAsia="Times New Roman" w:hAnsi="Times New Roman"/>
@@ -4453,7 +4533,7 @@
         </w:rPr>
         <w:t xml:space="preserve">: firmas inteiras são reamostradas com reposição, de modo que a dependência entre as observações de uma mesma companhia seja preservada em cada réplica. O teste de DeLong, DeLong e Clarke-Pearson (1988) pressupõe independência entre observações, hipótese não satisfeita quando cada firma contribui com diversos firma-anos, e é reportado apenas como análise convencional complementar. </w:t>
       </w:r>
-      <w:del w:id="9307" w:author="Revisão" w:date="2026-09-28T12:00:00Z">
+      <w:del w:id="9311" w:author="Revisão" w:date="2026-09-28T12:00:00Z">
         <w:r>
           <w:rPr>
             <w:rFonts w:ascii="Times New Roman" w:cs="Times New Roman" w:eastAsia="Times New Roman" w:hAnsi="Times New Roman"/>
@@ -4467,7 +4547,7 @@
           <w:delText xml:space="preserve">A correção de Bonferroni é aplicada</w:delText>
         </w:r>
       </w:del>
-      <w:ins w:id="9308" w:author="Revisão" w:date="2026-09-28T12:00:00Z">
+      <w:ins w:id="9312" w:author="Revisão" w:date="2026-09-28T12:00:00Z">
         <w:r>
           <w:rPr>
             <w:rFonts w:ascii="Times New Roman" w:cs="Times New Roman" w:eastAsia="Times New Roman" w:hAnsi="Times New Roman"/>
@@ -4630,7 +4710,7 @@
         </w:rPr>
         <w:t xml:space="preserve">A adoção da amostra de risco impõe restrição sobre a parcimônia da especificação probit com controles. Com 153 entradas na amostra de estimação no horizonte de um ano, </w:t>
       </w:r>
-      <w:del w:id="9309" w:author="Revisão" w:date="2026-09-28T12:00:00Z">
+      <w:del w:id="9313" w:author="Revisão" w:date="2026-09-28T12:00:00Z">
         <w:r>
           <w:rPr>
             <w:rFonts w:ascii="Times New Roman" w:cs="Times New Roman" w:eastAsia="Times New Roman" w:hAnsi="Times New Roman"/>
@@ -4644,7 +4724,7 @@
           <w:delText xml:space="preserve">a referência usual de ao menos dez eventos por parâmetro estimado</w:delText>
         </w:r>
       </w:del>
-      <w:ins w:id="9310" w:author="Revisão" w:date="2026-09-28T12:00:00Z">
+      <w:ins w:id="9314" w:author="Revisão" w:date="2026-09-28T12:00:00Z">
         <w:r>
           <w:rPr>
             <w:rFonts w:ascii="Times New Roman" w:cs="Times New Roman" w:eastAsia="Times New Roman" w:hAnsi="Times New Roman"/>
@@ -4824,7 +4904,7 @@
         </w:rPr>
         <w:t xml:space="preserve">A estratégia empírica envolve três hipóteses formuladas antes da estimação e uma análise diagnóstica posterior. A primeira hipótese (H1) postula a existência de um fator latente único de fragilidade e compreende duas afirmações distintas, avaliadas separadamente: a existência de um eixo comum interpretável, verificada pela coerência de sinal das cargas fatoriais após a pré-orientação, e a unidimensionalidade, verificada </w:t>
       </w:r>
-      <w:del w:id="9297" w:author="Revisão" w:date="2026-09-28T12:00:00Z">
+      <w:del w:id="9301" w:author="Revisão" w:date="2026-09-28T12:00:00Z">
         <w:r>
           <w:rPr>
             <w:rFonts w:ascii="Times New Roman" w:cs="Times New Roman" w:eastAsia="Times New Roman" w:hAnsi="Times New Roman"/>
@@ -4838,7 +4918,7 @@
           <w:delText xml:space="preserve">pelo número de componentes retidos pelo critério de Kaiser</w:delText>
         </w:r>
       </w:del>
-      <w:ins w:id="9298" w:author="Revisão" w:date="2026-09-28T12:00:00Z">
+      <w:ins w:id="9302" w:author="Revisão" w:date="2026-09-28T12:00:00Z">
         <w:r>
           <w:rPr>
             <w:rFonts w:ascii="Times New Roman" w:cs="Times New Roman" w:eastAsia="Times New Roman" w:hAnsi="Times New Roman"/>
@@ -4902,7 +4982,7 @@
         </w:rPr>
         <w:t xml:space="preserve">A quarta hipótese (H4) tem estatuto distinto das anteriores e assim deve ser lida. Ela não integrava o desenho original e foi formulada após a observação dos resultados de H1 e H2, como explicação para o desempenho inferior do escore. Trata-se, portanto, de investigação explicativa posterior ao resultado, avaliada em seguida fora da amostra, e não de hipótese confirmatória pré-especificada. Ela postula que a diferença de desempenho entre o escore não supervisionado e os melhores benchmarks decorre do critério de agregação, e não do conjunto informacional. A análise consiste em construir um segundo escore por mínimos quadrados parciais aplicados a resposta binária, mantendo constantes as oito variáveis, a amostra, o pré-processamento e o procedimento de avaliação, de modo que a diferença de desempenho reflita apenas a substituição do critério de agregação. O critério de avaliação, fixado antes da estimação do escore supervisionado, é que ele supere o não supervisionado fora da amostra. Acrescenta-se um terceiro escore, </w:t>
       </w:r>
-      <w:del w:id="9311" w:author="Revisão" w:date="2026-09-28T12:00:00Z">
+      <w:del w:id="9315" w:author="Revisão" w:date="2026-09-28T12:00:00Z">
         <w:r>
           <w:rPr>
             <w:rFonts w:ascii="Times New Roman" w:cs="Times New Roman" w:eastAsia="Times New Roman" w:hAnsi="Times New Roman"/>
@@ -4916,7 +4996,7 @@
           <w:delText xml:space="preserve">obtido por árvores impulsionadas com gradiente sobre as mesmas oito variáveis</w:delText>
         </w:r>
       </w:del>
-      <w:ins w:id="9312" w:author="Revisão" w:date="2026-09-28T12:00:00Z">
+      <w:ins w:id="9316" w:author="Revisão" w:date="2026-09-28T12:00:00Z">
         <w:r>
           <w:rPr>
             <w:rFonts w:ascii="Times New Roman" w:cs="Times New Roman" w:eastAsia="Times New Roman" w:hAnsi="Times New Roman"/>
@@ -12758,7 +12838,7 @@
         </w:rPr>
         <w:t xml:space="preserve">O primeiro componente responde por 26,92% da variância total, </w:t>
       </w:r>
-      <w:del w:id="9299" w:author="Revisão" w:date="2026-09-28T12:00:00Z">
+      <w:del w:id="9303" w:author="Revisão" w:date="2026-09-28T12:00:00Z">
         <w:r>
           <w:rPr>
             <w:rFonts w:ascii="Times New Roman" w:cs="Times New Roman" w:eastAsia="Times New Roman" w:hAnsi="Times New Roman"/>
@@ -12772,7 +12852,7 @@
           <w:delText xml:space="preserve">e o critério de Kaiser retém 3 componentes, que juntos explicam 56,80%.</w:delText>
         </w:r>
       </w:del>
-      <w:ins w:id="9300" w:author="Revisão" w:date="2026-09-28T12:00:00Z">
+      <w:ins w:id="9304" w:author="Revisão" w:date="2026-09-28T12:00:00Z">
         <w:r>
           <w:rPr>
             <w:rFonts w:ascii="Times New Roman" w:cs="Times New Roman" w:eastAsia="Times New Roman" w:hAnsi="Times New Roman"/>
@@ -22973,7 +23053,7 @@
         <w:ind w:firstLine="708"/>
         <w:jc w:val="both"/>
       </w:pPr>
-      <w:del w:id="9291" w:author="Revisão" w:date="2026-09-28T12:00:00Z">
+      <w:del w:id="9295" w:author="Revisão" w:date="2026-09-28T12:00:00Z">
         <w:r>
           <w:rPr>
             <w:rFonts w:ascii="Times New Roman" w:cs="Times New Roman" w:eastAsia="Times New Roman" w:hAnsi="Times New Roman"/>
@@ -22987,7 +23067,7 @@
           <w:delText xml:space="preserve">O coeficiente é positivo e significativo a menos de um por mil nos quatro modelos.</w:delText>
         </w:r>
       </w:del>
-      <w:ins w:id="9292" w:author="Revisão" w:date="2026-09-28T12:00:00Z">
+      <w:ins w:id="9296" w:author="Revisão" w:date="2026-09-28T12:00:00Z">
         <w:r>
           <w:rPr>
             <w:rFonts w:ascii="Times New Roman" w:cs="Times New Roman" w:eastAsia="Times New Roman" w:hAnsi="Times New Roman"/>
@@ -23051,7 +23131,7 @@
         </w:rPr>
         <w:t xml:space="preserve">A parcimônia da especificação merece registro. Com 153 entradas e 24 parâmetros, a especificação com efeitos fixos opera em 6,38 eventos por parâmetro, abaixo da referência usual de dez discutida na subseção 3.4. A verificação pertinente é se o resultado depende disso, e não depende: na especificação com controle apenas de porte, que opera em 51,00 eventos por parâmetro, o coeficiente é de 0,332; sem controles, em 76,50 eventos por parâmetro, é de 0,348; e na especificação completa, de 0,344. </w:t>
       </w:r>
-      <w:del w:id="9293" w:author="Revisão" w:date="2026-09-28T12:00:00Z">
+      <w:del w:id="9297" w:author="Revisão" w:date="2026-09-28T12:00:00Z">
         <w:r>
           <w:rPr>
             <w:rFonts w:ascii="Times New Roman" w:cs="Times New Roman" w:eastAsia="Times New Roman" w:hAnsi="Times New Roman"/>
@@ -23065,7 +23145,7 @@
           <w:delText xml:space="preserve">Os três são significativos a menos de um por mil,</w:delText>
         </w:r>
       </w:del>
-      <w:ins w:id="9294" w:author="Revisão" w:date="2026-09-28T12:00:00Z">
+      <w:ins w:id="9298" w:author="Revisão" w:date="2026-09-28T12:00:00Z">
         <w:r>
           <w:rPr>
             <w:rFonts w:ascii="Times New Roman" w:cs="Times New Roman" w:eastAsia="Times New Roman" w:hAnsi="Times New Roman"/>
@@ -31036,14 +31116,14 @@
               <w:bottom w:type="dxa" w:w="60"/>
               <w:right w:type="dxa" w:w="80"/>
             </w:tcMar>
-            <w:cellIns w:id="9385" w:author="Revisão" w:date="2026-09-28T12:00:00Z"/>
-          </w:tcPr>
-          <w:p>
-            <w:pPr>
-              <w:spacing w:after="0" w:before="0" w:line="240"/>
-              <w:jc w:val="center"/>
-            </w:pPr>
-            <w:ins w:id="9386" w:author="Revisão" w:date="2026-09-28T12:00:00Z">
+            <w:cellIns w:id="9389" w:author="Revisão" w:date="2026-09-28T12:00:00Z"/>
+          </w:tcPr>
+          <w:p>
+            <w:pPr>
+              <w:spacing w:after="0" w:before="0" w:line="240"/>
+              <w:jc w:val="center"/>
+            </w:pPr>
+            <w:ins w:id="9390" w:author="Revisão" w:date="2026-09-28T12:00:00Z">
               <w:r>
                 <w:rPr>
                   <w:rFonts w:ascii="Times New Roman" w:cs="Times New Roman" w:eastAsia="Times New Roman" w:hAnsi="Times New Roman"/>
@@ -31069,14 +31149,14 @@
               <w:bottom w:type="dxa" w:w="60"/>
               <w:right w:type="dxa" w:w="80"/>
             </w:tcMar>
-            <w:cellIns w:id="9369" w:author="Revisão" w:date="2026-09-28T12:00:00Z"/>
-          </w:tcPr>
-          <w:p>
-            <w:pPr>
-              <w:spacing w:after="0" w:before="0" w:line="240"/>
-              <w:jc w:val="center"/>
-            </w:pPr>
-            <w:ins w:id="9370" w:author="Revisão" w:date="2026-09-28T12:00:00Z">
+            <w:cellIns w:id="9373" w:author="Revisão" w:date="2026-09-28T12:00:00Z"/>
+          </w:tcPr>
+          <w:p>
+            <w:pPr>
+              <w:spacing w:after="0" w:before="0" w:line="240"/>
+              <w:jc w:val="center"/>
+            </w:pPr>
+            <w:ins w:id="9374" w:author="Revisão" w:date="2026-09-28T12:00:00Z">
               <w:r>
                 <w:rPr>
                   <w:rFonts w:ascii="Times New Roman" w:cs="Times New Roman" w:eastAsia="Times New Roman" w:hAnsi="Times New Roman"/>
@@ -31344,14 +31424,14 @@
               <w:bottom w:type="dxa" w:w="60"/>
               <w:right w:type="dxa" w:w="80"/>
             </w:tcMar>
-            <w:cellIns w:id="9387" w:author="Revisão" w:date="2026-09-28T12:00:00Z"/>
-          </w:tcPr>
-          <w:p>
-            <w:pPr>
-              <w:spacing w:after="0" w:before="0" w:line="240"/>
-              <w:jc w:val="center"/>
-            </w:pPr>
-            <w:ins w:id="9388" w:author="Revisão" w:date="2026-09-28T12:00:00Z">
+            <w:cellIns w:id="9391" w:author="Revisão" w:date="2026-09-28T12:00:00Z"/>
+          </w:tcPr>
+          <w:p>
+            <w:pPr>
+              <w:spacing w:after="0" w:before="0" w:line="240"/>
+              <w:jc w:val="center"/>
+            </w:pPr>
+            <w:ins w:id="9392" w:author="Revisão" w:date="2026-09-28T12:00:00Z">
               <w:r>
                 <w:rPr>
                   <w:rFonts w:ascii="Times New Roman" w:cs="Times New Roman" w:eastAsia="Times New Roman" w:hAnsi="Times New Roman"/>
@@ -31376,14 +31456,14 @@
               <w:bottom w:type="dxa" w:w="60"/>
               <w:right w:type="dxa" w:w="80"/>
             </w:tcMar>
-            <w:cellIns w:id="9371" w:author="Revisão" w:date="2026-09-28T12:00:00Z"/>
-          </w:tcPr>
-          <w:p>
-            <w:pPr>
-              <w:spacing w:after="0" w:before="0" w:line="240"/>
-              <w:jc w:val="center"/>
-            </w:pPr>
-            <w:ins w:id="9372" w:author="Revisão" w:date="2026-09-28T12:00:00Z">
+            <w:cellIns w:id="9375" w:author="Revisão" w:date="2026-09-28T12:00:00Z"/>
+          </w:tcPr>
+          <w:p>
+            <w:pPr>
+              <w:spacing w:after="0" w:before="0" w:line="240"/>
+              <w:jc w:val="center"/>
+            </w:pPr>
+            <w:ins w:id="9376" w:author="Revisão" w:date="2026-09-28T12:00:00Z">
               <w:r>
                 <w:rPr>
                   <w:rFonts w:ascii="Times New Roman" w:cs="Times New Roman" w:eastAsia="Times New Roman" w:hAnsi="Times New Roman"/>
@@ -31635,14 +31715,14 @@
               <w:bottom w:type="dxa" w:w="60"/>
               <w:right w:type="dxa" w:w="80"/>
             </w:tcMar>
-            <w:cellIns w:id="9389" w:author="Revisão" w:date="2026-09-28T12:00:00Z"/>
-          </w:tcPr>
-          <w:p>
-            <w:pPr>
-              <w:spacing w:after="0" w:before="0" w:line="240"/>
-              <w:jc w:val="center"/>
-            </w:pPr>
-            <w:ins w:id="9390" w:author="Revisão" w:date="2026-09-28T12:00:00Z">
+            <w:cellIns w:id="9393" w:author="Revisão" w:date="2026-09-28T12:00:00Z"/>
+          </w:tcPr>
+          <w:p>
+            <w:pPr>
+              <w:spacing w:after="0" w:before="0" w:line="240"/>
+              <w:jc w:val="center"/>
+            </w:pPr>
+            <w:ins w:id="9394" w:author="Revisão" w:date="2026-09-28T12:00:00Z">
               <w:r>
                 <w:rPr>
                   <w:rFonts w:ascii="Times New Roman" w:cs="Times New Roman" w:eastAsia="Times New Roman" w:hAnsi="Times New Roman"/>
@@ -31667,14 +31747,14 @@
               <w:bottom w:type="dxa" w:w="60"/>
               <w:right w:type="dxa" w:w="80"/>
             </w:tcMar>
-            <w:cellIns w:id="9373" w:author="Revisão" w:date="2026-09-28T12:00:00Z"/>
-          </w:tcPr>
-          <w:p>
-            <w:pPr>
-              <w:spacing w:after="0" w:before="0" w:line="240"/>
-              <w:jc w:val="center"/>
-            </w:pPr>
-            <w:ins w:id="9374" w:author="Revisão" w:date="2026-09-28T12:00:00Z">
+            <w:cellIns w:id="9377" w:author="Revisão" w:date="2026-09-28T12:00:00Z"/>
+          </w:tcPr>
+          <w:p>
+            <w:pPr>
+              <w:spacing w:after="0" w:before="0" w:line="240"/>
+              <w:jc w:val="center"/>
+            </w:pPr>
+            <w:ins w:id="9378" w:author="Revisão" w:date="2026-09-28T12:00:00Z">
               <w:r>
                 <w:rPr>
                   <w:rFonts w:ascii="Times New Roman" w:cs="Times New Roman" w:eastAsia="Times New Roman" w:hAnsi="Times New Roman"/>
@@ -31910,14 +31990,14 @@
               <w:bottom w:type="dxa" w:w="60"/>
               <w:right w:type="dxa" w:w="80"/>
             </w:tcMar>
-            <w:cellIns w:id="9391" w:author="Revisão" w:date="2026-09-28T12:00:00Z"/>
-          </w:tcPr>
-          <w:p>
-            <w:pPr>
-              <w:spacing w:after="0" w:before="0" w:line="240"/>
-              <w:jc w:val="center"/>
-            </w:pPr>
-            <w:ins w:id="9392" w:author="Revisão" w:date="2026-09-28T12:00:00Z">
+            <w:cellIns w:id="9395" w:author="Revisão" w:date="2026-09-28T12:00:00Z"/>
+          </w:tcPr>
+          <w:p>
+            <w:pPr>
+              <w:spacing w:after="0" w:before="0" w:line="240"/>
+              <w:jc w:val="center"/>
+            </w:pPr>
+            <w:ins w:id="9396" w:author="Revisão" w:date="2026-09-28T12:00:00Z">
               <w:r>
                 <w:rPr>
                   <w:rFonts w:ascii="Times New Roman" w:cs="Times New Roman" w:eastAsia="Times New Roman" w:hAnsi="Times New Roman"/>
@@ -31942,14 +32022,14 @@
               <w:bottom w:type="dxa" w:w="60"/>
               <w:right w:type="dxa" w:w="80"/>
             </w:tcMar>
-            <w:cellIns w:id="9375" w:author="Revisão" w:date="2026-09-28T12:00:00Z"/>
-          </w:tcPr>
-          <w:p>
-            <w:pPr>
-              <w:spacing w:after="0" w:before="0" w:line="240"/>
-              <w:jc w:val="center"/>
-            </w:pPr>
-            <w:ins w:id="9376" w:author="Revisão" w:date="2026-09-28T12:00:00Z">
+            <w:cellIns w:id="9379" w:author="Revisão" w:date="2026-09-28T12:00:00Z"/>
+          </w:tcPr>
+          <w:p>
+            <w:pPr>
+              <w:spacing w:after="0" w:before="0" w:line="240"/>
+              <w:jc w:val="center"/>
+            </w:pPr>
+            <w:ins w:id="9380" w:author="Revisão" w:date="2026-09-28T12:00:00Z">
               <w:r>
                 <w:rPr>
                   <w:rFonts w:ascii="Times New Roman" w:cs="Times New Roman" w:eastAsia="Times New Roman" w:hAnsi="Times New Roman"/>
@@ -32201,14 +32281,14 @@
               <w:bottom w:type="dxa" w:w="60"/>
               <w:right w:type="dxa" w:w="80"/>
             </w:tcMar>
-            <w:cellIns w:id="9393" w:author="Revisão" w:date="2026-09-28T12:00:00Z"/>
-          </w:tcPr>
-          <w:p>
-            <w:pPr>
-              <w:spacing w:after="0" w:before="0" w:line="240"/>
-              <w:jc w:val="center"/>
-            </w:pPr>
-            <w:ins w:id="9394" w:author="Revisão" w:date="2026-09-28T12:00:00Z">
+            <w:cellIns w:id="9397" w:author="Revisão" w:date="2026-09-28T12:00:00Z"/>
+          </w:tcPr>
+          <w:p>
+            <w:pPr>
+              <w:spacing w:after="0" w:before="0" w:line="240"/>
+              <w:jc w:val="center"/>
+            </w:pPr>
+            <w:ins w:id="9398" w:author="Revisão" w:date="2026-09-28T12:00:00Z">
               <w:r>
                 <w:rPr>
                   <w:rFonts w:ascii="Times New Roman" w:cs="Times New Roman" w:eastAsia="Times New Roman" w:hAnsi="Times New Roman"/>
@@ -32233,14 +32313,14 @@
               <w:bottom w:type="dxa" w:w="60"/>
               <w:right w:type="dxa" w:w="80"/>
             </w:tcMar>
-            <w:cellIns w:id="9377" w:author="Revisão" w:date="2026-09-28T12:00:00Z"/>
-          </w:tcPr>
-          <w:p>
-            <w:pPr>
-              <w:spacing w:after="0" w:before="0" w:line="240"/>
-              <w:jc w:val="center"/>
-            </w:pPr>
-            <w:ins w:id="9378" w:author="Revisão" w:date="2026-09-28T12:00:00Z">
+            <w:cellIns w:id="9381" w:author="Revisão" w:date="2026-09-28T12:00:00Z"/>
+          </w:tcPr>
+          <w:p>
+            <w:pPr>
+              <w:spacing w:after="0" w:before="0" w:line="240"/>
+              <w:jc w:val="center"/>
+            </w:pPr>
+            <w:ins w:id="9382" w:author="Revisão" w:date="2026-09-28T12:00:00Z">
               <w:r>
                 <w:rPr>
                   <w:rFonts w:ascii="Times New Roman" w:cs="Times New Roman" w:eastAsia="Times New Roman" w:hAnsi="Times New Roman"/>
@@ -32492,14 +32572,14 @@
               <w:bottom w:type="dxa" w:w="60"/>
               <w:right w:type="dxa" w:w="80"/>
             </w:tcMar>
-            <w:cellIns w:id="9395" w:author="Revisão" w:date="2026-09-28T12:00:00Z"/>
-          </w:tcPr>
-          <w:p>
-            <w:pPr>
-              <w:spacing w:after="0" w:before="0" w:line="240"/>
-              <w:jc w:val="center"/>
-            </w:pPr>
-            <w:ins w:id="9396" w:author="Revisão" w:date="2026-09-28T12:00:00Z">
+            <w:cellIns w:id="9399" w:author="Revisão" w:date="2026-09-28T12:00:00Z"/>
+          </w:tcPr>
+          <w:p>
+            <w:pPr>
+              <w:spacing w:after="0" w:before="0" w:line="240"/>
+              <w:jc w:val="center"/>
+            </w:pPr>
+            <w:ins w:id="9400" w:author="Revisão" w:date="2026-09-28T12:00:00Z">
               <w:r>
                 <w:rPr>
                   <w:rFonts w:ascii="Times New Roman" w:cs="Times New Roman" w:eastAsia="Times New Roman" w:hAnsi="Times New Roman"/>
@@ -32524,14 +32604,14 @@
               <w:bottom w:type="dxa" w:w="60"/>
               <w:right w:type="dxa" w:w="80"/>
             </w:tcMar>
-            <w:cellIns w:id="9379" w:author="Revisão" w:date="2026-09-28T12:00:00Z"/>
-          </w:tcPr>
-          <w:p>
-            <w:pPr>
-              <w:spacing w:after="0" w:before="0" w:line="240"/>
-              <w:jc w:val="center"/>
-            </w:pPr>
-            <w:ins w:id="9380" w:author="Revisão" w:date="2026-09-28T12:00:00Z">
+            <w:cellIns w:id="9383" w:author="Revisão" w:date="2026-09-28T12:00:00Z"/>
+          </w:tcPr>
+          <w:p>
+            <w:pPr>
+              <w:spacing w:after="0" w:before="0" w:line="240"/>
+              <w:jc w:val="center"/>
+            </w:pPr>
+            <w:ins w:id="9384" w:author="Revisão" w:date="2026-09-28T12:00:00Z">
               <w:r>
                 <w:rPr>
                   <w:rFonts w:ascii="Times New Roman" w:cs="Times New Roman" w:eastAsia="Times New Roman" w:hAnsi="Times New Roman"/>
@@ -32799,14 +32879,14 @@
               <w:bottom w:type="dxa" w:w="60"/>
               <w:right w:type="dxa" w:w="80"/>
             </w:tcMar>
-            <w:cellIns w:id="9397" w:author="Revisão" w:date="2026-09-28T12:00:00Z"/>
-          </w:tcPr>
-          <w:p>
-            <w:pPr>
-              <w:spacing w:after="0" w:before="0" w:line="240"/>
-              <w:jc w:val="center"/>
-            </w:pPr>
-            <w:ins w:id="9398" w:author="Revisão" w:date="2026-09-28T12:00:00Z">
+            <w:cellIns w:id="9401" w:author="Revisão" w:date="2026-09-28T12:00:00Z"/>
+          </w:tcPr>
+          <w:p>
+            <w:pPr>
+              <w:spacing w:after="0" w:before="0" w:line="240"/>
+              <w:jc w:val="center"/>
+            </w:pPr>
+            <w:ins w:id="9402" w:author="Revisão" w:date="2026-09-28T12:00:00Z">
               <w:r>
                 <w:rPr>
                   <w:rFonts w:ascii="Times New Roman" w:cs="Times New Roman" w:eastAsia="Times New Roman" w:hAnsi="Times New Roman"/>
@@ -32831,14 +32911,14 @@
               <w:bottom w:type="dxa" w:w="60"/>
               <w:right w:type="dxa" w:w="80"/>
             </w:tcMar>
-            <w:cellIns w:id="9381" w:author="Revisão" w:date="2026-09-28T12:00:00Z"/>
-          </w:tcPr>
-          <w:p>
-            <w:pPr>
-              <w:spacing w:after="0" w:before="0" w:line="240"/>
-              <w:jc w:val="center"/>
-            </w:pPr>
-            <w:ins w:id="9382" w:author="Revisão" w:date="2026-09-28T12:00:00Z">
+            <w:cellIns w:id="9385" w:author="Revisão" w:date="2026-09-28T12:00:00Z"/>
+          </w:tcPr>
+          <w:p>
+            <w:pPr>
+              <w:spacing w:after="0" w:before="0" w:line="240"/>
+              <w:jc w:val="center"/>
+            </w:pPr>
+            <w:ins w:id="9386" w:author="Revisão" w:date="2026-09-28T12:00:00Z">
               <w:r>
                 <w:rPr>
                   <w:rFonts w:ascii="Times New Roman" w:cs="Times New Roman" w:eastAsia="Times New Roman" w:hAnsi="Times New Roman"/>
@@ -33042,14 +33122,14 @@
               <w:bottom w:type="dxa" w:w="60"/>
               <w:right w:type="dxa" w:w="80"/>
             </w:tcMar>
-            <w:cellIns w:id="9399" w:author="Revisão" w:date="2026-09-28T12:00:00Z"/>
-          </w:tcPr>
-          <w:p>
-            <w:pPr>
-              <w:spacing w:after="0" w:before="0" w:line="240"/>
-              <w:jc w:val="center"/>
-            </w:pPr>
-            <w:ins w:id="9400" w:author="Revisão" w:date="2026-09-28T12:00:00Z">
+            <w:cellIns w:id="9403" w:author="Revisão" w:date="2026-09-28T12:00:00Z"/>
+          </w:tcPr>
+          <w:p>
+            <w:pPr>
+              <w:spacing w:after="0" w:before="0" w:line="240"/>
+              <w:jc w:val="center"/>
+            </w:pPr>
+            <w:ins w:id="9404" w:author="Revisão" w:date="2026-09-28T12:00:00Z">
               <w:r>
                 <w:rPr>
                   <w:rFonts w:ascii="Times New Roman" w:cs="Times New Roman" w:eastAsia="Times New Roman" w:hAnsi="Times New Roman"/>
@@ -33074,14 +33154,14 @@
               <w:bottom w:type="dxa" w:w="60"/>
               <w:right w:type="dxa" w:w="80"/>
             </w:tcMar>
-            <w:cellIns w:id="9383" w:author="Revisão" w:date="2026-09-28T12:00:00Z"/>
-          </w:tcPr>
-          <w:p>
-            <w:pPr>
-              <w:spacing w:after="0" w:before="0" w:line="240"/>
-              <w:jc w:val="center"/>
-            </w:pPr>
-            <w:ins w:id="9384" w:author="Revisão" w:date="2026-09-28T12:00:00Z">
+            <w:cellIns w:id="9387" w:author="Revisão" w:date="2026-09-28T12:00:00Z"/>
+          </w:tcPr>
+          <w:p>
+            <w:pPr>
+              <w:spacing w:after="0" w:before="0" w:line="240"/>
+              <w:jc w:val="center"/>
+            </w:pPr>
+            <w:ins w:id="9388" w:author="Revisão" w:date="2026-09-28T12:00:00Z">
               <w:r>
                 <w:rPr>
                   <w:rFonts w:ascii="Times New Roman" w:cs="Times New Roman" w:eastAsia="Times New Roman" w:hAnsi="Times New Roman"/>
@@ -37160,7 +37240,7 @@
         </w:rPr>
         <w:t xml:space="preserve">A contribuição está em mostrar que essa conclusão agregada é produzida por uma das rotas de deterioração. Decomposto o evento pelo critério que o define, o escore fica muito atrás apenas nas entradas por prejuízo operacional persistente, </w:t>
       </w:r>
-      <w:del w:id="9347" w:author="Revisão" w:date="2026-09-28T12:00:00Z">
+      <w:del w:id="9351" w:author="Revisão" w:date="2026-09-28T12:00:00Z">
         <w:r>
           <w:rPr>
             <w:rFonts w:ascii="Times New Roman" w:cs="Times New Roman" w:eastAsia="Times New Roman" w:hAnsi="Times New Roman"/>
@@ -37174,7 +37254,7 @@
           <w:delText xml:space="preserve">com 0,649 contra 0,973 da cobertura de juros.</w:delText>
         </w:r>
       </w:del>
-      <w:ins w:id="9348" w:author="Revisão" w:date="2026-09-28T12:00:00Z">
+      <w:ins w:id="9352" w:author="Revisão" w:date="2026-09-28T12:00:00Z">
         <w:r>
           <w:rPr>
             <w:rFonts w:ascii="Times New Roman" w:cs="Times New Roman" w:eastAsia="Times New Roman" w:hAnsi="Times New Roman"/>
@@ -37549,7 +37629,7 @@
         </w:rPr>
         <w:t xml:space="preserve">A agregação do escore em índice setorial ou macroeconômico, com avaliação de seu conteúdo preditivo sobre investimento e condições de crédito, é extensão natural da leitura minskyana e depende de frequência superior à anual. O levantamento de cobertura das informações trimestrais indica que essa via é praticável no universo aqui estudado, </w:t>
       </w:r>
-      <w:del w:id="9285" w:author="Revisão" w:date="2026-09-28T12:00:00Z">
+      <w:del w:id="9289" w:author="Revisão" w:date="2026-09-28T12:00:00Z">
         <w:r>
           <w:rPr>
             <w:rFonts w:ascii="Times New Roman" w:cs="Times New Roman" w:eastAsia="Times New Roman" w:hAnsi="Times New Roman"/>
@@ -37563,7 +37643,7 @@
           <w:delText xml:space="preserve">o que a qualifica como extensão viável, e não apenas desejável.</w:delText>
         </w:r>
       </w:del>
-      <w:ins w:id="9286" w:author="Revisão" w:date="2026-09-28T12:00:00Z">
+      <w:ins w:id="9290" w:author="Revisão" w:date="2026-09-28T12:00:00Z">
         <w:r>
           <w:rPr>
             <w:rFonts w:ascii="Times New Roman" w:cs="Times New Roman" w:eastAsia="Times New Roman" w:hAnsi="Times New Roman"/>
@@ -37584,10 +37664,10 @@
         <w:spacing w:after="180" w:before="360" w:line="360"/>
         <w:jc w:val="left"/>
         <w:rPr>
-          <w:ins w:id="9363" w:author="Revisão" w:date="2026-09-28T12:00:00Z"/>
+          <w:ins w:id="9367" w:author="Revisão" w:date="2026-09-28T12:00:00Z"/>
         </w:rPr>
       </w:pPr>
-      <w:ins w:id="9364" w:author="Revisão" w:date="2026-09-28T12:00:00Z">
+      <w:ins w:id="9368" w:author="Revisão" w:date="2026-09-28T12:00:00Z">
         <w:r>
           <w:rPr>
             <w:rFonts w:ascii="Times New Roman" w:cs="Times New Roman" w:eastAsia="Times New Roman" w:hAnsi="Times New Roman"/>
@@ -37608,10 +37688,10 @@
         <w:ind w:firstLine="708"/>
         <w:jc w:val="both"/>
         <w:rPr>
-          <w:ins w:id="9361" w:author="Revisão" w:date="2026-09-28T12:00:00Z"/>
+          <w:ins w:id="9365" w:author="Revisão" w:date="2026-09-28T12:00:00Z"/>
         </w:rPr>
       </w:pPr>
-      <w:ins w:id="9362" w:author="Revisão" w:date="2026-09-28T12:00:00Z">
+      <w:ins w:id="9366" w:author="Revisão" w:date="2026-09-28T12:00:00Z">
         <w:r>
           <w:rPr>
             <w:rFonts w:ascii="Times New Roman" w:cs="Times New Roman" w:eastAsia="Times New Roman" w:hAnsi="Times New Roman"/>
@@ -37770,7 +37850,7 @@
         </w:rPr>
         <w:t xml:space="preserve">BRASIL. Ministério da Fazenda. Secretaria do Tesouro Nacional. Portaria n. 882, de 18 de dezembro de 2018. Define os conceitos das variáveis utilizadas e os procedimentos a serem adotados na análise da capacidade de pagamento e na apuração da suficiência das contragarantias oferecidas. </w:t>
       </w:r>
-      <w:del w:id="9315" w:author="Revisão" w:date="2026-09-28T12:00:00Z">
+      <w:del w:id="9319" w:author="Revisão" w:date="2026-09-28T12:00:00Z">
         <w:r>
           <w:rPr>
             <w:rFonts w:ascii="Times New Roman" w:cs="Times New Roman" w:eastAsia="Times New Roman" w:hAnsi="Times New Roman"/>
@@ -37784,7 +37864,7 @@
           <w:delText xml:space="preserve">Diário Oficial da União, Brasília, DF, 20 dez. 2018.</w:delText>
         </w:r>
       </w:del>
-      <w:ins w:id="9316" w:author="Revisão" w:date="2026-09-28T12:00:00Z">
+      <w:ins w:id="9320" w:author="Revisão" w:date="2026-09-28T12:00:00Z">
         <w:r>
           <w:rPr>
             <w:rFonts w:ascii="Times New Roman" w:cs="Times New Roman" w:eastAsia="Times New Roman" w:hAnsi="Times New Roman"/>
@@ -37804,10 +37884,10 @@
         <w:spacing w:after="180" w:before="0" w:line="240"/>
         <w:jc w:val="left"/>
         <w:rPr>
-          <w:ins w:id="9317" w:author="Revisão" w:date="2026-09-28T12:00:00Z"/>
+          <w:ins w:id="9321" w:author="Revisão" w:date="2026-09-28T12:00:00Z"/>
         </w:rPr>
       </w:pPr>
-      <w:ins w:id="9318" w:author="Revisão" w:date="2026-09-28T12:00:00Z">
+      <w:ins w:id="9322" w:author="Revisão" w:date="2026-09-28T12:00:00Z">
         <w:r>
           <w:rPr>
             <w:rFonts w:ascii="Times New Roman" w:cs="Times New Roman" w:eastAsia="Times New Roman" w:hAnsi="Times New Roman"/>
@@ -37863,10 +37943,10 @@
         <w:spacing w:after="180" w:before="0" w:line="240"/>
         <w:jc w:val="left"/>
         <w:rPr>
-          <w:ins w:id="9319" w:author="Revisão" w:date="2026-09-28T12:00:00Z"/>
+          <w:ins w:id="9323" w:author="Revisão" w:date="2026-09-28T12:00:00Z"/>
         </w:rPr>
       </w:pPr>
-      <w:ins w:id="9320" w:author="Revisão" w:date="2026-09-28T12:00:00Z">
+      <w:ins w:id="9324" w:author="Revisão" w:date="2026-09-28T12:00:00Z">
         <w:r>
           <w:rPr>
             <w:rFonts w:ascii="Times New Roman" w:cs="Times New Roman" w:eastAsia="Times New Roman" w:hAnsi="Times New Roman"/>
@@ -37940,10 +38020,10 @@
         <w:spacing w:after="180" w:before="0" w:line="240"/>
         <w:jc w:val="left"/>
         <w:rPr>
-          <w:ins w:id="9321" w:author="Revisão" w:date="2026-09-28T12:00:00Z"/>
+          <w:ins w:id="9325" w:author="Revisão" w:date="2026-09-28T12:00:00Z"/>
         </w:rPr>
       </w:pPr>
-      <w:ins w:id="9322" w:author="Revisão" w:date="2026-09-28T12:00:00Z">
+      <w:ins w:id="9326" w:author="Revisão" w:date="2026-09-28T12:00:00Z">
         <w:r>
           <w:rPr>
             <w:rFonts w:ascii="Times New Roman" w:cs="Times New Roman" w:eastAsia="Times New Roman" w:hAnsi="Times New Roman"/>
@@ -37963,10 +38043,10 @@
         <w:spacing w:after="180" w:before="0" w:line="240"/>
         <w:jc w:val="left"/>
         <w:rPr>
-          <w:ins w:id="9323" w:author="Revisão" w:date="2026-09-28T12:00:00Z"/>
+          <w:ins w:id="9327" w:author="Revisão" w:date="2026-09-28T12:00:00Z"/>
         </w:rPr>
       </w:pPr>
-      <w:ins w:id="9324" w:author="Revisão" w:date="2026-09-28T12:00:00Z">
+      <w:ins w:id="9328" w:author="Revisão" w:date="2026-09-28T12:00:00Z">
         <w:r>
           <w:rPr>
             <w:rFonts w:ascii="Times New Roman" w:cs="Times New Roman" w:eastAsia="Times New Roman" w:hAnsi="Times New Roman"/>
@@ -37986,10 +38066,10 @@
         <w:spacing w:after="180" w:before="0" w:line="240"/>
         <w:jc w:val="left"/>
         <w:rPr>
-          <w:ins w:id="9325" w:author="Revisão" w:date="2026-09-28T12:00:00Z"/>
+          <w:ins w:id="9329" w:author="Revisão" w:date="2026-09-28T12:00:00Z"/>
         </w:rPr>
       </w:pPr>
-      <w:ins w:id="9326" w:author="Revisão" w:date="2026-09-28T12:00:00Z">
+      <w:ins w:id="9330" w:author="Revisão" w:date="2026-09-28T12:00:00Z">
         <w:r>
           <w:rPr>
             <w:rFonts w:ascii="Times New Roman" w:cs="Times New Roman" w:eastAsia="Times New Roman" w:hAnsi="Times New Roman"/>
@@ -38045,10 +38125,10 @@
         <w:spacing w:after="180" w:before="0" w:line="240"/>
         <w:jc w:val="left"/>
         <w:rPr>
-          <w:ins w:id="9327" w:author="Revisão" w:date="2026-09-28T12:00:00Z"/>
+          <w:ins w:id="9331" w:author="Revisão" w:date="2026-09-28T12:00:00Z"/>
         </w:rPr>
       </w:pPr>
-      <w:ins w:id="9328" w:author="Revisão" w:date="2026-09-28T12:00:00Z">
+      <w:ins w:id="9332" w:author="Revisão" w:date="2026-09-28T12:00:00Z">
         <w:r>
           <w:rPr>
             <w:rFonts w:ascii="Times New Roman" w:cs="Times New Roman" w:eastAsia="Times New Roman" w:hAnsi="Times New Roman"/>
@@ -38086,10 +38166,10 @@
         <w:spacing w:after="180" w:before="0" w:line="240"/>
         <w:jc w:val="left"/>
         <w:rPr>
-          <w:ins w:id="9339" w:author="Revisão" w:date="2026-09-28T12:00:00Z"/>
+          <w:ins w:id="9343" w:author="Revisão" w:date="2026-09-28T12:00:00Z"/>
         </w:rPr>
       </w:pPr>
-      <w:ins w:id="9340" w:author="Revisão" w:date="2026-09-28T12:00:00Z">
+      <w:ins w:id="9344" w:author="Revisão" w:date="2026-09-28T12:00:00Z">
         <w:r>
           <w:rPr>
             <w:rFonts w:ascii="Times New Roman" w:cs="Times New Roman" w:eastAsia="Times New Roman" w:hAnsi="Times New Roman"/>
@@ -38109,10 +38189,10 @@
         <w:spacing w:after="180" w:before="0" w:line="240"/>
         <w:jc w:val="left"/>
         <w:rPr>
-          <w:ins w:id="9329" w:author="Revisão" w:date="2026-09-28T12:00:00Z"/>
+          <w:ins w:id="9333" w:author="Revisão" w:date="2026-09-28T12:00:00Z"/>
         </w:rPr>
       </w:pPr>
-      <w:ins w:id="9330" w:author="Revisão" w:date="2026-09-28T12:00:00Z">
+      <w:ins w:id="9334" w:author="Revisão" w:date="2026-09-28T12:00:00Z">
         <w:r>
           <w:rPr>
             <w:rFonts w:ascii="Times New Roman" w:cs="Times New Roman" w:eastAsia="Times New Roman" w:hAnsi="Times New Roman"/>
@@ -38294,10 +38374,10 @@
         <w:spacing w:after="180" w:before="0" w:line="240"/>
         <w:jc w:val="left"/>
         <w:rPr>
-          <w:ins w:id="9331" w:author="Revisão" w:date="2026-09-28T12:00:00Z"/>
+          <w:ins w:id="9335" w:author="Revisão" w:date="2026-09-28T12:00:00Z"/>
         </w:rPr>
       </w:pPr>
-      <w:ins w:id="9332" w:author="Revisão" w:date="2026-09-28T12:00:00Z">
+      <w:ins w:id="9336" w:author="Revisão" w:date="2026-09-28T12:00:00Z">
         <w:r>
           <w:rPr>
             <w:rFonts w:ascii="Times New Roman" w:cs="Times New Roman" w:eastAsia="Times New Roman" w:hAnsi="Times New Roman"/>
@@ -38353,10 +38433,10 @@
         <w:spacing w:after="180" w:before="0" w:line="240"/>
         <w:jc w:val="left"/>
         <w:rPr>
-          <w:ins w:id="9333" w:author="Revisão" w:date="2026-09-28T12:00:00Z"/>
+          <w:ins w:id="9337" w:author="Revisão" w:date="2026-09-28T12:00:00Z"/>
         </w:rPr>
       </w:pPr>
-      <w:ins w:id="9334" w:author="Revisão" w:date="2026-09-28T12:00:00Z">
+      <w:ins w:id="9338" w:author="Revisão" w:date="2026-09-28T12:00:00Z">
         <w:r>
           <w:rPr>
             <w:rFonts w:ascii="Times New Roman" w:cs="Times New Roman" w:eastAsia="Times New Roman" w:hAnsi="Times New Roman"/>
@@ -38376,10 +38456,10 @@
         <w:spacing w:after="180" w:before="0" w:line="240"/>
         <w:jc w:val="left"/>
         <w:rPr>
-          <w:ins w:id="9335" w:author="Revisão" w:date="2026-09-28T12:00:00Z"/>
+          <w:ins w:id="9339" w:author="Revisão" w:date="2026-09-28T12:00:00Z"/>
         </w:rPr>
       </w:pPr>
-      <w:ins w:id="9336" w:author="Revisão" w:date="2026-09-28T12:00:00Z">
+      <w:ins w:id="9340" w:author="Revisão" w:date="2026-09-28T12:00:00Z">
         <w:r>
           <w:rPr>
             <w:rFonts w:ascii="Times New Roman" w:cs="Times New Roman" w:eastAsia="Times New Roman" w:hAnsi="Times New Roman"/>
@@ -38417,10 +38497,10 @@
         <w:spacing w:after="180" w:before="0" w:line="240"/>
         <w:jc w:val="left"/>
         <w:rPr>
-          <w:ins w:id="9341" w:author="Revisão" w:date="2026-09-28T12:00:00Z"/>
+          <w:ins w:id="9345" w:author="Revisão" w:date="2026-09-28T12:00:00Z"/>
         </w:rPr>
       </w:pPr>
-      <w:ins w:id="9342" w:author="Revisão" w:date="2026-09-28T12:00:00Z">
+      <w:ins w:id="9346" w:author="Revisão" w:date="2026-09-28T12:00:00Z">
         <w:r>
           <w:rPr>
             <w:rFonts w:ascii="Times New Roman" w:cs="Times New Roman" w:eastAsia="Times New Roman" w:hAnsi="Times New Roman"/>
@@ -38494,10 +38574,10 @@
         <w:spacing w:after="180" w:before="0" w:line="240"/>
         <w:jc w:val="left"/>
         <w:rPr>
-          <w:ins w:id="9337" w:author="Revisão" w:date="2026-09-28T12:00:00Z"/>
+          <w:ins w:id="9341" w:author="Revisão" w:date="2026-09-28T12:00:00Z"/>
         </w:rPr>
       </w:pPr>
-      <w:ins w:id="9338" w:author="Revisão" w:date="2026-09-28T12:00:00Z">
+      <w:ins w:id="9342" w:author="Revisão" w:date="2026-09-28T12:00:00Z">
         <w:r>
           <w:rPr>
             <w:rFonts w:ascii="Times New Roman" w:cs="Times New Roman" w:eastAsia="Times New Roman" w:hAnsi="Times New Roman"/>
@@ -38517,10 +38597,10 @@
         <w:spacing w:after="180" w:before="0" w:line="240"/>
         <w:jc w:val="left"/>
         <w:rPr>
-          <w:ins w:id="9345" w:author="Revisão" w:date="2026-09-28T12:00:00Z"/>
+          <w:ins w:id="9349" w:author="Revisão" w:date="2026-09-28T12:00:00Z"/>
         </w:rPr>
       </w:pPr>
-      <w:ins w:id="9346" w:author="Revisão" w:date="2026-09-28T12:00:00Z">
+      <w:ins w:id="9350" w:author="Revisão" w:date="2026-09-28T12:00:00Z">
         <w:r>
           <w:rPr>
             <w:rFonts w:ascii="Times New Roman" w:cs="Times New Roman" w:eastAsia="Times New Roman" w:hAnsi="Times New Roman"/>
@@ -38540,10 +38620,10 @@
         <w:spacing w:after="180" w:before="0" w:line="240"/>
         <w:jc w:val="left"/>
         <w:rPr>
-          <w:ins w:id="9343" w:author="Revisão" w:date="2026-09-28T12:00:00Z"/>
+          <w:ins w:id="9347" w:author="Revisão" w:date="2026-09-28T12:00:00Z"/>
         </w:rPr>
       </w:pPr>
-      <w:ins w:id="9344" w:author="Revisão" w:date="2026-09-28T12:00:00Z">
+      <w:ins w:id="9348" w:author="Revisão" w:date="2026-09-28T12:00:00Z">
         <w:r>
           <w:rPr>
             <w:rFonts w:ascii="Times New Roman" w:cs="Times New Roman" w:eastAsia="Times New Roman" w:hAnsi="Times New Roman"/>

</xml_diff>

<commit_message>
Esquema temporal: texto passa a dizer que reproduz o resultado central, e nao a ordenacao completa (Tabela A.3)
Co-Authored-By: Claude Opus 5.5 <noreply@anthropic.com>
Claude-Session: https://claude.ai/code/session_01V4LwoZDLWB9PeJtPghPCix
</commit_message>
<xml_diff>
--- a/projeto/artigo/Artigo_Fragilidade_Financeira_revisado.docx
+++ b/projeto/artigo/Artigo_Fragilidade_Financeira_revisado.docx
@@ -73,7 +73,7 @@
         </w:rPr>
         <w:t xml:space="preserve">Examina-se se a agregação de indicadores contábeis em um escore sintético de fragilidade financeira se justifica frente aos seus melhores componentes isolados, em painel de 7.419 observações firma-ano de 730 companhias abertas não financeiras brasileiras entre 2010 e 2025. Sobre o agregado dos eventos a agregação não se justifica: a área sob a curva ROC do escore é de 0,764, contra 0,894 da cobertura de juros e 0,874 do retorno sobre ativos, em conclusão que se mantém sob validação cruzada agrupada por firma e sob avaliação temporal. </w:t>
       </w:r>
-      <w:del w:id="9291" w:author="Revisão" w:date="2026-09-28T12:00:00Z">
+      <w:del w:id="9295" w:author="Revisão" w:date="2026-09-28T12:00:00Z">
         <w:r>
           <w:rPr>
             <w:rFonts w:ascii="Times New Roman" w:cs="Times New Roman" w:eastAsia="Times New Roman" w:hAnsi="Times New Roman"/>
@@ -87,7 +87,7 @@
           <w:delText xml:space="preserve">Uma análise diagnóstica posterior decompõe o evento pelo critério que o define</w:delText>
         </w:r>
       </w:del>
-      <w:ins w:id="9292" w:author="Revisão" w:date="2026-09-28T12:00:00Z">
+      <w:ins w:id="9296" w:author="Revisão" w:date="2026-09-28T12:00:00Z">
         <w:r>
           <w:rPr>
             <w:rFonts w:ascii="Times New Roman" w:cs="Times New Roman" w:eastAsia="Times New Roman" w:hAnsi="Times New Roman"/>
@@ -113,7 +113,7 @@
         </w:rPr>
         <w:t xml:space="preserve"> e mostra que o resultado agregado é produzido por uma das rotas de deterioração. </w:t>
       </w:r>
-      <w:del w:id="9145" w:author="Revisão" w:date="2026-09-28T12:00:00Z">
+      <w:del w:id="9149" w:author="Revisão" w:date="2026-09-28T12:00:00Z">
         <w:r>
           <w:rPr>
             <w:rFonts w:ascii="Times New Roman" w:cs="Times New Roman" w:eastAsia="Times New Roman" w:hAnsi="Times New Roman"/>
@@ -127,7 +127,7 @@
           <w:delText xml:space="preserve">Nas entradas por prejuízo operacional persistente o escore fica 0,32 ponto atrás da cobertura de juros;</w:delText>
         </w:r>
       </w:del>
-      <w:ins w:id="9146" w:author="Revisão" w:date="2026-09-28T12:00:00Z">
+      <w:ins w:id="9150" w:author="Revisão" w:date="2026-09-28T12:00:00Z">
         <w:r>
           <w:rPr>
             <w:rFonts w:ascii="Times New Roman" w:cs="Times New Roman" w:eastAsia="Times New Roman" w:hAnsi="Times New Roman"/>
@@ -153,7 +153,7 @@
         </w:rPr>
         <w:t xml:space="preserve"> nas entradas por patrimônio líquido negativo e por recuperação judicial as diferenças não são estatisticamente distinguíveis. </w:t>
       </w:r>
-      <w:del w:id="9143" w:author="Revisão" w:date="2026-09-28T12:00:00Z">
+      <w:del w:id="9147" w:author="Revisão" w:date="2026-09-28T12:00:00Z">
         <w:r>
           <w:rPr>
             <w:rFonts w:ascii="Times New Roman" w:cs="Times New Roman" w:eastAsia="Times New Roman" w:hAnsi="Times New Roman"/>
@@ -167,7 +167,7 @@
           <w:delText xml:space="preserve">A razão é de composição:</w:delText>
         </w:r>
       </w:del>
-      <w:ins w:id="9144" w:author="Revisão" w:date="2026-09-28T12:00:00Z">
+      <w:ins w:id="9148" w:author="Revisão" w:date="2026-09-28T12:00:00Z">
         <w:r>
           <w:rPr>
             <w:rFonts w:ascii="Times New Roman" w:cs="Times New Roman" w:eastAsia="Times New Roman" w:hAnsi="Times New Roman"/>
@@ -229,10 +229,10 @@
         <w:spacing w:after="240" w:before="180" w:line="360"/>
         <w:jc w:val="both"/>
         <w:rPr>
-          <w:ins w:id="9362" w:author="Revisão" w:date="2026-09-28T12:00:00Z"/>
+          <w:ins w:id="9366" w:author="Revisão" w:date="2026-09-28T12:00:00Z"/>
         </w:rPr>
       </w:pPr>
-      <w:ins w:id="9363" w:author="Revisão" w:date="2026-09-28T12:00:00Z">
+      <w:ins w:id="9367" w:author="Revisão" w:date="2026-09-28T12:00:00Z">
         <w:r>
           <w:rPr>
             <w:rFonts w:ascii="Times New Roman" w:cs="Times New Roman" w:eastAsia="Times New Roman" w:hAnsi="Times New Roman"/>
@@ -246,7 +246,7 @@
           <w:t xml:space="preserve">Classificação JEL: </w:t>
         </w:r>
       </w:ins>
-      <w:ins w:id="9364" w:author="Revisão" w:date="2026-09-28T12:00:00Z">
+      <w:ins w:id="9368" w:author="Revisão" w:date="2026-09-28T12:00:00Z">
         <w:r>
           <w:rPr>
             <w:rFonts w:ascii="Times New Roman" w:cs="Times New Roman" w:eastAsia="Times New Roman" w:hAnsi="Times New Roman"/>
@@ -266,10 +266,10 @@
         <w:spacing w:after="120" w:before="0" w:line="360"/>
         <w:jc w:val="left"/>
         <w:rPr>
-          <w:ins w:id="9360" w:author="Revisão" w:date="2026-09-28T12:00:00Z"/>
+          <w:ins w:id="9364" w:author="Revisão" w:date="2026-09-28T12:00:00Z"/>
         </w:rPr>
       </w:pPr>
-      <w:ins w:id="9361" w:author="Revisão" w:date="2026-09-28T12:00:00Z">
+      <w:ins w:id="9365" w:author="Revisão" w:date="2026-09-28T12:00:00Z">
         <w:r>
           <w:rPr>
             <w:rFonts w:ascii="Times New Roman" w:cs="Times New Roman" w:eastAsia="Times New Roman" w:hAnsi="Times New Roman"/>
@@ -289,10 +289,10 @@
         <w:spacing w:after="0" w:before="0" w:line="360"/>
         <w:jc w:val="both"/>
         <w:rPr>
-          <w:ins w:id="9358" w:author="Revisão" w:date="2026-09-28T12:00:00Z"/>
+          <w:ins w:id="9362" w:author="Revisão" w:date="2026-09-28T12:00:00Z"/>
         </w:rPr>
       </w:pPr>
-      <w:ins w:id="9359" w:author="Revisão" w:date="2026-09-28T12:00:00Z">
+      <w:ins w:id="9363" w:author="Revisão" w:date="2026-09-28T12:00:00Z">
         <w:r>
           <w:rPr>
             <w:rFonts w:ascii="Times New Roman" w:cs="Times New Roman" w:eastAsia="Times New Roman" w:hAnsi="Times New Roman"/>
@@ -312,10 +312,10 @@
         <w:spacing w:after="240" w:before="180" w:line="360"/>
         <w:jc w:val="both"/>
         <w:rPr>
-          <w:ins w:id="9355" w:author="Revisão" w:date="2026-09-28T12:00:00Z"/>
+          <w:ins w:id="9359" w:author="Revisão" w:date="2026-09-28T12:00:00Z"/>
         </w:rPr>
       </w:pPr>
-      <w:ins w:id="9356" w:author="Revisão" w:date="2026-09-28T12:00:00Z">
+      <w:ins w:id="9360" w:author="Revisão" w:date="2026-09-28T12:00:00Z">
         <w:r>
           <w:rPr>
             <w:rFonts w:ascii="Times New Roman" w:cs="Times New Roman" w:eastAsia="Times New Roman" w:hAnsi="Times New Roman"/>
@@ -329,7 +329,7 @@
           <w:t xml:space="preserve">Keywords: </w:t>
         </w:r>
       </w:ins>
-      <w:ins w:id="9357" w:author="Revisão" w:date="2026-09-28T12:00:00Z">
+      <w:ins w:id="9361" w:author="Revisão" w:date="2026-09-28T12:00:00Z">
         <w:r>
           <w:rPr>
             <w:rFonts w:ascii="Times New Roman" w:cs="Times New Roman" w:eastAsia="Times New Roman" w:hAnsi="Times New Roman"/>
@@ -514,9 +514,49 @@
           <w:sz w:val="24"/>
           <w:szCs w:val="24"/>
         </w:rPr>
-        <w:t xml:space="preserve">A resposta depende da rota de deterioração que se pretende antecipar, e é nessa dependência que está o interesse do resultado. Sobre o agregado das entradas, a agregação não se justifica: o escore alcança 0,764 fora da amostra, contra 0,894 da cobertura de juros e 0,874 do retorno sobre ativos, e a mesma ordenação aparece sob avaliação temporal. O escore, contudo, reúne as três propriedades que se esperariam de um bom indicador sintético: coerência teórica, com todas as cargas do primeiro componente no sentido esperado; estrutura interpretável, discriminando a posição financeira minskyana </w:t>
+        <w:t xml:space="preserve">A resposta depende da rota de deterioração que se pretende antecipar, e é nessa dependência que está o interesse do resultado. Sobre o agregado das entradas, a agregação não se justifica: o escore alcança 0,764 fora da amostra, contra 0,894 da cobertura de juros e 0,874 do retorno sobre ativos, </w:t>
       </w:r>
-      <w:del w:id="9191" w:author="Revisão" w:date="2026-09-28T12:00:00Z">
+      <w:del w:id="9145" w:author="Revisão" w:date="2026-09-28T12:00:00Z">
+        <w:r>
+          <w:rPr>
+            <w:rFonts w:ascii="Times New Roman" w:cs="Times New Roman" w:eastAsia="Times New Roman" w:hAnsi="Times New Roman"/>
+            <w:b w:val="false"/>
+            <w:bCs w:val="false"/>
+            <w:i w:val="false"/>
+            <w:iCs w:val="false"/>
+            <w:sz w:val="24"/>
+            <w:szCs w:val="24"/>
+          </w:rPr>
+          <w:delText xml:space="preserve">e a mesma ordenação aparece sob avaliação temporal.</w:delText>
+        </w:r>
+      </w:del>
+      <w:ins w:id="9146" w:author="Revisão" w:date="2026-09-28T12:00:00Z">
+        <w:r>
+          <w:rPr>
+            <w:rFonts w:ascii="Times New Roman" w:cs="Times New Roman" w:eastAsia="Times New Roman" w:hAnsi="Times New Roman"/>
+            <w:b w:val="false"/>
+            <w:bCs w:val="false"/>
+            <w:i w:val="false"/>
+            <w:iCs w:val="false"/>
+            <w:sz w:val="24"/>
+            <w:szCs w:val="24"/>
+          </w:rPr>
+          <w:t xml:space="preserve">e o escore também fica abaixo dessas duas métricas sob avaliação temporal.</w:t>
+        </w:r>
+      </w:ins>
+      <w:r>
+        <w:rPr>
+          <w:rFonts w:ascii="Times New Roman" w:cs="Times New Roman" w:eastAsia="Times New Roman" w:hAnsi="Times New Roman"/>
+          <w:b w:val="false"/>
+          <w:bCs w:val="false"/>
+          <w:i w:val="false"/>
+          <w:iCs w:val="false"/>
+          <w:sz w:val="24"/>
+          <w:szCs w:val="24"/>
+        </w:rPr>
+        <w:t xml:space="preserve"> O escore, contudo, reúne as três propriedades que se esperariam de um bom indicador sintético: coerência teórica, com todas as cargas do primeiro componente no sentido esperado; estrutura interpretável, discriminando a posição financeira minskyana </w:t>
+      </w:r>
+      <w:del w:id="9195" w:author="Revisão" w:date="2026-09-28T12:00:00Z">
         <w:r>
           <w:rPr>
             <w:rFonts w:ascii="Times New Roman" w:cs="Times New Roman" w:eastAsia="Times New Roman" w:hAnsi="Times New Roman"/>
@@ -530,7 +570,7 @@
           <w:delText xml:space="preserve">com área sob a curva de 0,783, ou 0,770 quando excluído</w:delText>
         </w:r>
       </w:del>
-      <w:ins w:id="9192" w:author="Revisão" w:date="2026-09-28T12:00:00Z">
+      <w:ins w:id="9196" w:author="Revisão" w:date="2026-09-28T12:00:00Z">
         <w:r>
           <w:rPr>
             <w:rFonts w:ascii="Times New Roman" w:cs="Times New Roman" w:eastAsia="Times New Roman" w:hAnsi="Times New Roman"/>
@@ -556,7 +596,7 @@
         </w:rPr>
         <w:t xml:space="preserve"> o indicador que define essa posição; e conteúdo preditivo, </w:t>
       </w:r>
-      <w:del w:id="9293" w:author="Revisão" w:date="2026-09-28T12:00:00Z">
+      <w:del w:id="9297" w:author="Revisão" w:date="2026-09-28T12:00:00Z">
         <w:r>
           <w:rPr>
             <w:rFonts w:ascii="Times New Roman" w:cs="Times New Roman" w:eastAsia="Times New Roman" w:hAnsi="Times New Roman"/>
@@ -570,7 +610,7 @@
           <w:delText xml:space="preserve">antecipando a entrada com significância inferior a um por mil.</w:delText>
         </w:r>
       </w:del>
-      <w:ins w:id="9294" w:author="Revisão" w:date="2026-09-28T12:00:00Z">
+      <w:ins w:id="9298" w:author="Revisão" w:date="2026-09-28T12:00:00Z">
         <w:r>
           <w:rPr>
             <w:rFonts w:ascii="Times New Roman" w:cs="Times New Roman" w:eastAsia="Times New Roman" w:hAnsi="Times New Roman"/>
@@ -603,7 +643,7 @@
         </w:rPr>
         <w:t xml:space="preserve">A contribuição está na decomposição desse resultado agregado. A definição de vulnerabilidade reúne três critérios, que correspondem a rotas distintas de deterioração. Separando as entradas por critério, </w:t>
       </w:r>
-      <w:del w:id="9163" w:author="Revisão" w:date="2026-09-28T12:00:00Z">
+      <w:del w:id="9167" w:author="Revisão" w:date="2026-09-28T12:00:00Z">
         <w:r>
           <w:rPr>
             <w:rFonts w:ascii="Times New Roman" w:cs="Times New Roman" w:eastAsia="Times New Roman" w:hAnsi="Times New Roman"/>
@@ -617,7 +657,7 @@
           <w:delText xml:space="preserve">a desvantagem do escore concentra-se inteiramente naquelas definidas por prejuízo operacional persistente: ali o escore alcança 0,649 contra 0,973 da cobertura de juros, diferença de 0,324 ponto</w:delText>
         </w:r>
       </w:del>
-      <w:ins w:id="9164" w:author="Revisão" w:date="2026-09-28T12:00:00Z">
+      <w:ins w:id="9168" w:author="Revisão" w:date="2026-09-28T12:00:00Z">
         <w:r>
           <w:rPr>
             <w:rFonts w:ascii="Times New Roman" w:cs="Times New Roman" w:eastAsia="Times New Roman" w:hAnsi="Times New Roman"/>
@@ -643,7 +683,7 @@
         </w:rPr>
         <w:t xml:space="preserve">. Nas entradas por patrimônio líquido negativo e nas entradas por recuperação judicial, nenhuma diferença contra as razões isoladas é estatisticamente distinguível. </w:t>
       </w:r>
-      <w:del w:id="9147" w:author="Revisão" w:date="2026-09-28T12:00:00Z">
+      <w:del w:id="9151" w:author="Revisão" w:date="2026-09-28T12:00:00Z">
         <w:r>
           <w:rPr>
             <w:rFonts w:ascii="Times New Roman" w:cs="Times New Roman" w:eastAsia="Times New Roman" w:hAnsi="Times New Roman"/>
@@ -657,7 +697,7 @@
           <w:delText xml:space="preserve">O escore não é, portanto, uniformemente inferior: ele é cego a uma das rotas.</w:delText>
         </w:r>
       </w:del>
-      <w:ins w:id="9148" w:author="Revisão" w:date="2026-09-28T12:00:00Z">
+      <w:ins w:id="9152" w:author="Revisão" w:date="2026-09-28T12:00:00Z">
         <w:r>
           <w:rPr>
             <w:rFonts w:ascii="Times New Roman" w:cs="Times New Roman" w:eastAsia="Times New Roman" w:hAnsi="Times New Roman"/>
@@ -678,7 +718,7 @@
         <w:ind w:firstLine="708"/>
         <w:jc w:val="both"/>
       </w:pPr>
-      <w:del w:id="9149" w:author="Revisão" w:date="2026-09-28T12:00:00Z">
+      <w:del w:id="9153" w:author="Revisão" w:date="2026-09-28T12:00:00Z">
         <w:r>
           <w:rPr>
             <w:rFonts w:ascii="Times New Roman" w:cs="Times New Roman" w:eastAsia="Times New Roman" w:hAnsi="Times New Roman"/>
@@ -692,7 +732,7 @@
           <w:delText xml:space="preserve">A razão dessa cegueira é de composição, e é verificável nos dados.</w:delText>
         </w:r>
       </w:del>
-      <w:ins w:id="9150" w:author="Revisão" w:date="2026-09-28T12:00:00Z">
+      <w:ins w:id="9154" w:author="Revisão" w:date="2026-09-28T12:00:00Z">
         <w:r>
           <w:rPr>
             <w:rFonts w:ascii="Times New Roman" w:cs="Times New Roman" w:eastAsia="Times New Roman" w:hAnsi="Times New Roman"/>
@@ -870,7 +910,7 @@
         </w:rPr>
         <w:t xml:space="preserve">A operacionalização empírica dessa taxonomia é relativamente recente. Tymoigne (2010, 2014) </w:t>
       </w:r>
-      <w:del w:id="9265" w:author="Revisão" w:date="2026-09-28T12:00:00Z">
+      <w:del w:id="9269" w:author="Revisão" w:date="2026-09-28T12:00:00Z">
         <w:r>
           <w:rPr>
             <w:rFonts w:ascii="Times New Roman" w:cs="Times New Roman" w:eastAsia="Times New Roman" w:hAnsi="Times New Roman"/>
@@ -884,7 +924,7 @@
           <w:delText xml:space="preserve">constrói indicadores de fragilidade a partir de razões de fluxo de caixa e endividamento, com finalidade macroprudencial, e encontra deterioração sistemática das posições no período que antecede a crise de 2008.</w:delText>
         </w:r>
       </w:del>
-      <w:ins w:id="9266" w:author="Revisão" w:date="2026-09-28T12:00:00Z">
+      <w:ins w:id="9270" w:author="Revisão" w:date="2026-09-28T12:00:00Z">
         <w:r>
           <w:rPr>
             <w:rFonts w:ascii="Times New Roman" w:cs="Times New Roman" w:eastAsia="Times New Roman" w:hAnsi="Times New Roman"/>
@@ -910,7 +950,7 @@
         </w:rPr>
         <w:t xml:space="preserve"> Mulligan (2013) </w:t>
       </w:r>
-      <w:del w:id="9267" w:author="Revisão" w:date="2026-09-28T12:00:00Z">
+      <w:del w:id="9271" w:author="Revisão" w:date="2026-09-28T12:00:00Z">
         <w:r>
           <w:rPr>
             <w:rFonts w:ascii="Times New Roman" w:cs="Times New Roman" w:eastAsia="Times New Roman" w:hAnsi="Times New Roman"/>
@@ -924,7 +964,7 @@
           <w:delText xml:space="preserve">aplica a classificação em nível setorial na economia norte-americana e reporta migração generalizada de posições hedge para especulativas ao longo das expansões.</w:delText>
         </w:r>
       </w:del>
-      <w:ins w:id="9268" w:author="Revisão" w:date="2026-09-28T12:00:00Z">
+      <w:ins w:id="9272" w:author="Revisão" w:date="2026-09-28T12:00:00Z">
         <w:r>
           <w:rPr>
             <w:rFonts w:ascii="Times New Roman" w:cs="Times New Roman" w:eastAsia="Times New Roman" w:hAnsi="Times New Roman"/>
@@ -950,7 +990,7 @@
         </w:rPr>
         <w:t xml:space="preserve"> Davis, De Souza e Hernandez (2019) constroem, para firmas não financeiras norte-americanas, uma classificação em regimes minskyanos com limiares absolutos sobre cobertura de juros e fluxo de caixa, </w:t>
       </w:r>
-      <w:del w:id="9269" w:author="Revisão" w:date="2026-09-28T12:00:00Z">
+      <w:del w:id="9273" w:author="Revisão" w:date="2026-09-28T12:00:00Z">
         <w:r>
           <w:rPr>
             <w:rFonts w:ascii="Times New Roman" w:cs="Times New Roman" w:eastAsia="Times New Roman" w:hAnsi="Times New Roman"/>
@@ -964,7 +1004,7 @@
           <w:delText xml:space="preserve">e mostram que a distribuição das firmas entre regimes varia sistematicamente ao longo do ciclo.</w:delText>
         </w:r>
       </w:del>
-      <w:ins w:id="9270" w:author="Revisão" w:date="2026-09-28T12:00:00Z">
+      <w:ins w:id="9274" w:author="Revisão" w:date="2026-09-28T12:00:00Z">
         <w:r>
           <w:rPr>
             <w:rFonts w:ascii="Times New Roman" w:cs="Times New Roman" w:eastAsia="Times New Roman" w:hAnsi="Times New Roman"/>
@@ -990,7 +1030,7 @@
         </w:rPr>
         <w:t xml:space="preserve"> </w:t>
       </w:r>
-      <w:del w:id="9271" w:author="Revisão" w:date="2026-09-28T12:00:00Z">
+      <w:del w:id="9275" w:author="Revisão" w:date="2026-09-28T12:00:00Z">
         <w:r>
           <w:rPr>
             <w:rFonts w:ascii="Times New Roman" w:cs="Times New Roman" w:eastAsia="Times New Roman" w:hAnsi="Times New Roman"/>
@@ -1004,7 +1044,7 @@
           <w:delText xml:space="preserve">Nishi (2019) obtém resultado análogo para setores não financeiros japoneses.</w:delText>
         </w:r>
       </w:del>
-      <w:ins w:id="9272" w:author="Revisão" w:date="2026-09-28T12:00:00Z">
+      <w:ins w:id="9276" w:author="Revisão" w:date="2026-09-28T12:00:00Z">
         <w:r>
           <w:rPr>
             <w:rFonts w:ascii="Times New Roman" w:cs="Times New Roman" w:eastAsia="Times New Roman" w:hAnsi="Times New Roman"/>
@@ -1037,7 +1077,7 @@
         </w:rPr>
         <w:t xml:space="preserve">No Brasil, Torres Filho, Martins e Miaguti (2019) aplicam o arcabouço às distribuidoras de energia elétrica entre 2007 e 2015, </w:t>
       </w:r>
-      <w:del w:id="9273" w:author="Revisão" w:date="2026-09-28T12:00:00Z">
+      <w:del w:id="9277" w:author="Revisão" w:date="2026-09-28T12:00:00Z">
         <w:r>
           <w:rPr>
             <w:rFonts w:ascii="Times New Roman" w:cs="Times New Roman" w:eastAsia="Times New Roman" w:hAnsi="Times New Roman"/>
@@ -1051,7 +1091,7 @@
           <w:delText xml:space="preserve">empregando limiares absolutos de cobertura de juros, e documentam deterioração acentuada das posições após 2013.</w:delText>
         </w:r>
       </w:del>
-      <w:ins w:id="9274" w:author="Revisão" w:date="2026-09-28T12:00:00Z">
+      <w:ins w:id="9278" w:author="Revisão" w:date="2026-09-28T12:00:00Z">
         <w:r>
           <w:rPr>
             <w:rFonts w:ascii="Times New Roman" w:cs="Times New Roman" w:eastAsia="Times New Roman" w:hAnsi="Times New Roman"/>
@@ -1077,7 +1117,7 @@
         </w:rPr>
         <w:t xml:space="preserve"> Mantoan, Centeno e Feijó (2021) </w:t>
       </w:r>
-      <w:del w:id="9275" w:author="Revisão" w:date="2026-09-28T12:00:00Z">
+      <w:del w:id="9279" w:author="Revisão" w:date="2026-09-28T12:00:00Z">
         <w:r>
           <w:rPr>
             <w:rFonts w:ascii="Times New Roman" w:cs="Times New Roman" w:eastAsia="Times New Roman" w:hAnsi="Times New Roman"/>
@@ -1091,7 +1131,7 @@
           <w:delText xml:space="preserve">investigam o comportamento financeiro das companhias não financeiras brasileiras na década de 2010 e associam a estagnação do investimento à fragilização das posições patrimoniais.</w:delText>
         </w:r>
       </w:del>
-      <w:ins w:id="9276" w:author="Revisão" w:date="2026-09-28T12:00:00Z">
+      <w:ins w:id="9280" w:author="Revisão" w:date="2026-09-28T12:00:00Z">
         <w:r>
           <w:rPr>
             <w:rFonts w:ascii="Times New Roman" w:cs="Times New Roman" w:eastAsia="Times New Roman" w:hAnsi="Times New Roman"/>
@@ -1155,7 +1195,7 @@
         </w:rPr>
         <w:t xml:space="preserve">A tradição de predição opera de forma oposta, estimando pesos por otimização de um critério de separação entre grupos observados. Altman (1968) aplica análise discriminante múltipla a cinco razões contábeis, sobre amostra pareada de 66 manufatureiras norte-americanas, e alcança acurácia de 95% na classificação um ano antes da falência, com deterioração acentuada em horizontes mais longos. Ohlson (1980) substitui a análise discriminante por regressão logística sobre 105 falidas e 2.058 não falidas, relaxando as hipóteses de normalidade e de igualdade de matrizes de covariância do modelo anterior, </w:t>
       </w:r>
-      <w:del w:id="9255" w:author="Revisão" w:date="2026-09-28T12:00:00Z">
+      <w:del w:id="9259" w:author="Revisão" w:date="2026-09-28T12:00:00Z">
         <w:r>
           <w:rPr>
             <w:rFonts w:ascii="Times New Roman" w:cs="Times New Roman" w:eastAsia="Times New Roman" w:hAnsi="Times New Roman"/>
@@ -1169,7 +1209,7 @@
           <w:delText xml:space="preserve">e reporta que o porte, a estrutura de capital e a liquidez concentram o poder preditivo.</w:delText>
         </w:r>
       </w:del>
-      <w:ins w:id="9256" w:author="Revisão" w:date="2026-09-28T12:00:00Z">
+      <w:ins w:id="9260" w:author="Revisão" w:date="2026-09-28T12:00:00Z">
         <w:r>
           <w:rPr>
             <w:rFonts w:ascii="Times New Roman" w:cs="Times New Roman" w:eastAsia="Times New Roman" w:hAnsi="Times New Roman"/>
@@ -1195,7 +1235,7 @@
         </w:rPr>
         <w:t xml:space="preserve"> Zmijewski (1984) emprega probit e, mais importante para o desenho aqui adotado, </w:t>
       </w:r>
-      <w:del w:id="9257" w:author="Revisão" w:date="2026-09-28T12:00:00Z">
+      <w:del w:id="9261" w:author="Revisão" w:date="2026-09-28T12:00:00Z">
         <w:r>
           <w:rPr>
             <w:rFonts w:ascii="Times New Roman" w:cs="Times New Roman" w:eastAsia="Times New Roman" w:hAnsi="Times New Roman"/>
@@ -1209,7 +1249,7 @@
           <w:delText xml:space="preserve">documenta que a amostragem por pareamento entre falidas e não falidas enviesa as estimativas, recomendando o uso de amostras que preservem a frequência populacional do evento.</w:delText>
         </w:r>
       </w:del>
-      <w:ins w:id="9258" w:author="Revisão" w:date="2026-09-28T12:00:00Z">
+      <w:ins w:id="9262" w:author="Revisão" w:date="2026-09-28T12:00:00Z">
         <w:r>
           <w:rPr>
             <w:rFonts w:ascii="Times New Roman" w:cs="Times New Roman" w:eastAsia="Times New Roman" w:hAnsi="Times New Roman"/>
@@ -1318,7 +1358,7 @@
         </w:rPr>
         <w:t xml:space="preserve">A literatura recente de aprendizado de máquina radicaliza a lógica supervisionada. Barboza, Kimura e Altman (2017) </w:t>
       </w:r>
-      <w:del w:id="9261" w:author="Revisão" w:date="2026-09-28T12:00:00Z">
+      <w:del w:id="9265" w:author="Revisão" w:date="2026-09-28T12:00:00Z">
         <w:r>
           <w:rPr>
             <w:rFonts w:ascii="Times New Roman" w:cs="Times New Roman" w:eastAsia="Times New Roman" w:hAnsi="Times New Roman"/>
@@ -1332,7 +1372,7 @@
           <w:delText xml:space="preserve">comparam florestas aleatórias e máquinas de vetores de suporte com o discriminante clássico em amostra norte-americana e reportam ganho de aproximadamente dez pontos percentuais de acurácia.</w:delText>
         </w:r>
       </w:del>
-      <w:ins w:id="9262" w:author="Revisão" w:date="2026-09-28T12:00:00Z">
+      <w:ins w:id="9266" w:author="Revisão" w:date="2026-09-28T12:00:00Z">
         <w:r>
           <w:rPr>
             <w:rFonts w:ascii="Times New Roman" w:cs="Times New Roman" w:eastAsia="Times New Roman" w:hAnsi="Times New Roman"/>
@@ -1358,7 +1398,7 @@
         </w:rPr>
         <w:t xml:space="preserve"> Zięba, Tomczak e Tomczak (2016) aplicam árvores impulsionadas com geração sintética de atributos a firmas polonesas, du Jardin (2016) </w:t>
       </w:r>
-      <w:del w:id="9263" w:author="Revisão" w:date="2026-09-28T12:00:00Z">
+      <w:del w:id="9267" w:author="Revisão" w:date="2026-09-28T12:00:00Z">
         <w:r>
           <w:rPr>
             <w:rFonts w:ascii="Times New Roman" w:cs="Times New Roman" w:eastAsia="Times New Roman" w:hAnsi="Times New Roman"/>
@@ -1372,7 +1412,7 @@
           <w:delText xml:space="preserve">propõe classificação em dois estágios que melhora o desempenho em horizontes longos</w:delText>
         </w:r>
       </w:del>
-      <w:ins w:id="9264" w:author="Revisão" w:date="2026-09-28T12:00:00Z">
+      <w:ins w:id="9268" w:author="Revisão" w:date="2026-09-28T12:00:00Z">
         <w:r>
           <w:rPr>
             <w:rFonts w:ascii="Times New Roman" w:cs="Times New Roman" w:eastAsia="Times New Roman" w:hAnsi="Times New Roman"/>
@@ -1398,7 +1438,7 @@
         </w:rPr>
         <w:t xml:space="preserve">, </w:t>
       </w:r>
-      <w:del w:id="9353" w:author="Revisão" w:date="2026-09-28T12:00:00Z">
+      <w:del w:id="9357" w:author="Revisão" w:date="2026-09-28T12:00:00Z">
         <w:r>
           <w:rPr>
             <w:rFonts w:ascii="Times New Roman" w:cs="Times New Roman" w:eastAsia="Times New Roman" w:hAnsi="Times New Roman"/>
@@ -1412,7 +1452,7 @@
           <w:delText xml:space="preserve">e Mai et al. (2019) incorporam informação textual das divulgações corporativas.</w:delText>
         </w:r>
       </w:del>
-      <w:ins w:id="9354" w:author="Revisão" w:date="2026-09-28T12:00:00Z">
+      <w:ins w:id="9358" w:author="Revisão" w:date="2026-09-28T12:00:00Z">
         <w:r>
           <w:rPr>
             <w:rFonts w:ascii="Times New Roman" w:cs="Times New Roman" w:eastAsia="Times New Roman" w:hAnsi="Times New Roman"/>
@@ -1476,7 +1516,7 @@
         </w:rPr>
         <w:t xml:space="preserve">Entre as duas tradições existe um conjunto de abordagens que constrói medidas agregadas sem consultar o desfecho. O modelo estrutural de Merton (1974) deriva uma distância até o default a partir do valor de mercado dos ativos, de sua volatilidade e do valor de face da dívida, com pesos vindos de uma estrutura teórica e não de falências observadas. A abordagem de forma reduzida, por contraste, modela a intensidade do processo de default diretamente sobre covariáveis, estimando parâmetros a partir de eventos realizados, e pertence à família supervisionada. A literatura de firmas zumbis utiliza limiares fixos de cobertura de juros combinados a critérios de idade, como em Adalet McGowan, Andrews e Millot (2018) para países da OCDE e em Banerjee e Hofmann (2018) em escala internacional, </w:t>
       </w:r>
-      <w:del w:id="9277" w:author="Revisão" w:date="2026-09-28T12:00:00Z">
+      <w:del w:id="9281" w:author="Revisão" w:date="2026-09-28T12:00:00Z">
         <w:r>
           <w:rPr>
             <w:rFonts w:ascii="Times New Roman" w:cs="Times New Roman" w:eastAsia="Times New Roman" w:hAnsi="Times New Roman"/>
@@ -1490,7 +1530,7 @@
           <w:delText xml:space="preserve">ambos documentando aumento da proporção de firmas assim classificadas após 2008.</w:delText>
         </w:r>
       </w:del>
-      <w:ins w:id="9278" w:author="Revisão" w:date="2026-09-28T12:00:00Z">
+      <w:ins w:id="9282" w:author="Revisão" w:date="2026-09-28T12:00:00Z">
         <w:r>
           <w:rPr>
             <w:rFonts w:ascii="Times New Roman" w:cs="Times New Roman" w:eastAsia="Times New Roman" w:hAnsi="Times New Roman"/>
@@ -1516,7 +1556,7 @@
         </w:rPr>
         <w:t xml:space="preserve"> No Brasil, a metodologia da Capacidade de Pagamento (BRASIL, 2018) </w:t>
       </w:r>
-      <w:del w:id="9279" w:author="Revisão" w:date="2026-09-28T12:00:00Z">
+      <w:del w:id="9283" w:author="Revisão" w:date="2026-09-28T12:00:00Z">
         <w:r>
           <w:rPr>
             <w:rFonts w:ascii="Times New Roman" w:cs="Times New Roman" w:eastAsia="Times New Roman" w:hAnsi="Times New Roman"/>
@@ -1530,7 +1570,7 @@
           <w:delText xml:space="preserve">agrega três indicadores fiscais com pesos fixados de forma exógena para classificar entes subnacionais</w:delText>
         </w:r>
       </w:del>
-      <w:ins w:id="9280" w:author="Revisão" w:date="2026-09-28T12:00:00Z">
+      <w:ins w:id="9284" w:author="Revisão" w:date="2026-09-28T12:00:00Z">
         <w:r>
           <w:rPr>
             <w:rFonts w:ascii="Times New Roman" w:cs="Times New Roman" w:eastAsia="Times New Roman" w:hAnsi="Times New Roman"/>
@@ -1620,10 +1660,10 @@
         <w:ind w:firstLine="708"/>
         <w:jc w:val="both"/>
         <w:rPr>
-          <w:del w:id="9370" w:author="Revisão" w:date="2026-09-28T12:00:00Z"/>
+          <w:del w:id="9374" w:author="Revisão" w:date="2026-09-28T12:00:00Z"/>
         </w:rPr>
       </w:pPr>
-      <w:del w:id="9369" w:author="Revisão" w:date="2026-09-28T12:00:00Z">
+      <w:del w:id="9373" w:author="Revisão" w:date="2026-09-28T12:00:00Z">
         <w:r>
           <w:rPr>
             <w:rFonts w:ascii="Times New Roman" w:cs="Times New Roman" w:eastAsia="Times New Roman" w:hAnsi="Times New Roman"/>
@@ -1656,7 +1696,7 @@
         </w:rPr>
         <w:t xml:space="preserve">As cinco primeiras dizem respeito ao desenho. Constrói-se um fator latente por redução de dimensionalidade, onde a literatura brasileira emprega indicadores isolados. Adota-se a vulnerabilidade como alvo, e não o default, o que desloca a predição para um estágio em que a intervenção ainda é possível. Utilizam-se as Demonstrações Financeiras Padronizadas como painel sistemático, em lugar de amostras pareadas de dezenas de firmas, o que responde diretamente à objeção de Zmijewski (1984) </w:t>
       </w:r>
-      <w:del w:id="9259" w:author="Revisão" w:date="2026-09-28T12:00:00Z">
+      <w:del w:id="9263" w:author="Revisão" w:date="2026-09-28T12:00:00Z">
         <w:r>
           <w:rPr>
             <w:rFonts w:ascii="Times New Roman" w:cs="Times New Roman" w:eastAsia="Times New Roman" w:hAnsi="Times New Roman"/>
@@ -1670,7 +1710,7 @@
           <w:delText xml:space="preserve">quanto ao viés de amostragem por pareamento</w:delText>
         </w:r>
       </w:del>
-      <w:ins w:id="9260" w:author="Revisão" w:date="2026-09-28T12:00:00Z">
+      <w:ins w:id="9264" w:author="Revisão" w:date="2026-09-28T12:00:00Z">
         <w:r>
           <w:rPr>
             <w:rFonts w:ascii="Times New Roman" w:cs="Times New Roman" w:eastAsia="Times New Roman" w:hAnsi="Times New Roman"/>
@@ -1696,7 +1736,7 @@
         </w:rPr>
         <w:t xml:space="preserve">. </w:t>
       </w:r>
-      <w:del w:id="9285" w:author="Revisão" w:date="2026-09-28T12:00:00Z">
+      <w:del w:id="9289" w:author="Revisão" w:date="2026-09-28T12:00:00Z">
         <w:r>
           <w:rPr>
             <w:rFonts w:ascii="Times New Roman" w:cs="Times New Roman" w:eastAsia="Times New Roman" w:hAnsi="Times New Roman"/>
@@ -1710,7 +1750,7 @@
           <w:delText xml:space="preserve">Trata-se explicitamente o viés de sobrevivência, mantendo no painel as firmas que o deixam antes do fim do período.</w:delText>
         </w:r>
       </w:del>
-      <w:ins w:id="9286" w:author="Revisão" w:date="2026-09-28T12:00:00Z">
+      <w:ins w:id="9290" w:author="Revisão" w:date="2026-09-28T12:00:00Z">
         <w:r>
           <w:rPr>
             <w:rFonts w:ascii="Times New Roman" w:cs="Times New Roman" w:eastAsia="Times New Roman" w:hAnsi="Times New Roman"/>
@@ -1795,7 +1835,7 @@
         </w:rPr>
         <w:t xml:space="preserve">A sexta dimensão é a que organiza a contribuição. As duas tradições revisadas nunca foram confrontadas sob condições controladas. A literatura minskyana constrói medidas multidimensionais não supervisionadas e as emprega para caracterizar regimes financeiros, sem submetê-las a avaliação preditiva formal contra razões contábeis isoladas. A literatura de predição avalia rigorosamente o poder preditivo, mas parte de pesos estimados sobre o desfecho e, por isso, não testa a premissa de fator latente comum. Avaliar as duas rotas sobre a mesma amostra, com o mesmo conjunto de variáveis, o mesmo modelo preditivo e o mesmo critério de desempenho </w:t>
       </w:r>
-      <w:del w:id="9287" w:author="Revisão" w:date="2026-09-28T12:00:00Z">
+      <w:del w:id="9291" w:author="Revisão" w:date="2026-09-28T12:00:00Z">
         <w:r>
           <w:rPr>
             <w:rFonts w:ascii="Times New Roman" w:cs="Times New Roman" w:eastAsia="Times New Roman" w:hAnsi="Times New Roman"/>
@@ -1809,7 +1849,7 @@
           <w:delText xml:space="preserve">isola o efeito do método de agregação.</w:delText>
         </w:r>
       </w:del>
-      <w:ins w:id="9288" w:author="Revisão" w:date="2026-09-28T12:00:00Z">
+      <w:ins w:id="9292" w:author="Revisão" w:date="2026-09-28T12:00:00Z">
         <w:r>
           <w:rPr>
             <w:rFonts w:ascii="Times New Roman" w:cs="Times New Roman" w:eastAsia="Times New Roman" w:hAnsi="Times New Roman"/>
@@ -1842,10 +1882,10 @@
         <w:ind w:firstLine="708"/>
         <w:jc w:val="both"/>
         <w:rPr>
-          <w:ins w:id="9371" w:author="Revisão" w:date="2026-09-28T12:00:00Z"/>
+          <w:ins w:id="9375" w:author="Revisão" w:date="2026-09-28T12:00:00Z"/>
         </w:rPr>
       </w:pPr>
-      <w:ins w:id="9372" w:author="Revisão" w:date="2026-09-28T12:00:00Z">
+      <w:ins w:id="9376" w:author="Revisão" w:date="2026-09-28T12:00:00Z">
         <w:r>
           <w:rPr>
             <w:rFonts w:ascii="Times New Roman" w:cs="Times New Roman" w:eastAsia="Times New Roman" w:hAnsi="Times New Roman"/>
@@ -4096,7 +4136,7 @@
         </w:rPr>
         <w:t xml:space="preserve">A proporção de 15,0% refere-se à presença no estado de vulnerabilidade, e não à incidência de entradas. </w:t>
       </w:r>
-      <w:del w:id="9299" w:author="Revisão" w:date="2026-09-28T12:00:00Z">
+      <w:del w:id="9303" w:author="Revisão" w:date="2026-09-28T12:00:00Z">
         <w:r>
           <w:rPr>
             <w:rFonts w:ascii="Times New Roman" w:cs="Times New Roman" w:eastAsia="Times New Roman" w:hAnsi="Times New Roman"/>
@@ -4110,7 +4150,7 @@
           <w:delText xml:space="preserve">A conversão de uma medida na outra é tratada na subseção 4.3, onde se apresenta a decomposição dos eventos e a construção da amostra de risco.</w:delText>
         </w:r>
       </w:del>
-      <w:ins w:id="9300" w:author="Revisão" w:date="2026-09-28T12:00:00Z">
+      <w:ins w:id="9304" w:author="Revisão" w:date="2026-09-28T12:00:00Z">
         <w:r>
           <w:rPr>
             <w:rFonts w:ascii="Times New Roman" w:cs="Times New Roman" w:eastAsia="Times New Roman" w:hAnsi="Times New Roman"/>
@@ -4162,7 +4202,7 @@
         </w:rPr>
         <w:t xml:space="preserve">Cabe distinguir esses critérios de um segundo conceito, empregado aqui com função diversa. A classificação minskyana de posturas financeiras identifica a firma na posição Ponzi quando sua cobertura de juros permanece inferior à unidade por dois exercícios consecutivos, </w:t>
       </w:r>
-      <w:del w:id="9281" w:author="Revisão" w:date="2026-09-28T12:00:00Z">
+      <w:del w:id="9285" w:author="Revisão" w:date="2026-09-28T12:00:00Z">
         <w:r>
           <w:rPr>
             <w:rFonts w:ascii="Times New Roman" w:cs="Times New Roman" w:eastAsia="Times New Roman" w:hAnsi="Times New Roman"/>
@@ -4176,7 +4216,7 @@
           <w:delText xml:space="preserve">seguindo o critério absoluto adotado por Torres Filho, Martins e Miaguti (2019) e pela literatura de firmas zumbis.</w:delText>
         </w:r>
       </w:del>
-      <w:ins w:id="9282" w:author="Revisão" w:date="2026-09-28T12:00:00Z">
+      <w:ins w:id="9286" w:author="Revisão" w:date="2026-09-28T12:00:00Z">
         <w:r>
           <w:rPr>
             <w:rFonts w:ascii="Times New Roman" w:cs="Times New Roman" w:eastAsia="Times New Roman" w:hAnsi="Times New Roman"/>
@@ -4314,7 +4354,7 @@
         </w:rPr>
         <w:t xml:space="preserve">O desempenho preditivo é medido pela área sob a curva ROC </w:t>
       </w:r>
-      <w:del w:id="9317" w:author="Revisão" w:date="2026-09-28T12:00:00Z">
+      <w:del w:id="9321" w:author="Revisão" w:date="2026-09-28T12:00:00Z">
         <w:r>
           <w:rPr>
             <w:rFonts w:ascii="Times New Roman" w:cs="Times New Roman" w:eastAsia="Times New Roman" w:hAnsi="Times New Roman"/>
@@ -4328,7 +4368,7 @@
           <w:delText xml:space="preserve">(HANLEY; MCNEIL, 1982)</w:delText>
         </w:r>
       </w:del>
-      <w:ins w:id="9318" w:author="Revisão" w:date="2026-09-28T12:00:00Z">
+      <w:ins w:id="9322" w:author="Revisão" w:date="2026-09-28T12:00:00Z">
         <w:r>
           <w:rPr>
             <w:rFonts w:ascii="Times New Roman" w:cs="Times New Roman" w:eastAsia="Times New Roman" w:hAnsi="Times New Roman"/>
@@ -4394,7 +4434,7 @@
         </w:rPr>
         <w:t xml:space="preserve">, a área sob a curva é complementada na subseção 5.7 por métricas sensíveis à prevalência e à qualidade das probabilidades: </w:t>
       </w:r>
-      <w:del w:id="9305" w:author="Revisão" w:date="2026-09-28T12:00:00Z">
+      <w:del w:id="9309" w:author="Revisão" w:date="2026-09-28T12:00:00Z">
         <w:r>
           <w:rPr>
             <w:rFonts w:ascii="Times New Roman" w:cs="Times New Roman" w:eastAsia="Times New Roman" w:hAnsi="Times New Roman"/>
@@ -4408,7 +4448,7 @@
           <w:delText xml:space="preserve">a área sob a curva de precisão e revocação, o escore de Brier, a inclinação e o intercepto de calibração</w:delText>
         </w:r>
       </w:del>
-      <w:ins w:id="9306" w:author="Revisão" w:date="2026-09-28T12:00:00Z">
+      <w:ins w:id="9310" w:author="Revisão" w:date="2026-09-28T12:00:00Z">
         <w:r>
           <w:rPr>
             <w:rFonts w:ascii="Times New Roman" w:cs="Times New Roman" w:eastAsia="Times New Roman" w:hAnsi="Times New Roman"/>
@@ -4434,7 +4474,7 @@
         </w:rPr>
         <w:t xml:space="preserve">, a sensibilidade, a especificidade e os valores preditivos em limiares fixados na amostra de treino, </w:t>
       </w:r>
-      <w:del w:id="9307" w:author="Revisão" w:date="2026-09-28T12:00:00Z">
+      <w:del w:id="9311" w:author="Revisão" w:date="2026-09-28T12:00:00Z">
         <w:r>
           <w:rPr>
             <w:rFonts w:ascii="Times New Roman" w:cs="Times New Roman" w:eastAsia="Times New Roman" w:hAnsi="Times New Roman"/>
@@ -4448,7 +4488,7 @@
           <w:delText xml:space="preserve">e a decisão líquida sob diferentes razões de custo</w:delText>
         </w:r>
       </w:del>
-      <w:ins w:id="9308" w:author="Revisão" w:date="2026-09-28T12:00:00Z">
+      <w:ins w:id="9312" w:author="Revisão" w:date="2026-09-28T12:00:00Z">
         <w:r>
           <w:rPr>
             <w:rFonts w:ascii="Times New Roman" w:cs="Times New Roman" w:eastAsia="Times New Roman" w:hAnsi="Times New Roman"/>
@@ -4493,7 +4533,7 @@
         </w:rPr>
         <w:t xml:space="preserve">A inferência principal sobre as diferenças de área sob a curva </w:t>
       </w:r>
-      <w:del w:id="9309" w:author="Revisão" w:date="2026-09-28T12:00:00Z">
+      <w:del w:id="9313" w:author="Revisão" w:date="2026-09-28T12:00:00Z">
         <w:r>
           <w:rPr>
             <w:rFonts w:ascii="Times New Roman" w:cs="Times New Roman" w:eastAsia="Times New Roman" w:hAnsi="Times New Roman"/>
@@ -4507,7 +4547,7 @@
           <w:delText xml:space="preserve">é conduzida por bootstrap agrupado por firma, com 2.000 reamostragens</w:delText>
         </w:r>
       </w:del>
-      <w:ins w:id="9310" w:author="Revisão" w:date="2026-09-28T12:00:00Z">
+      <w:ins w:id="9314" w:author="Revisão" w:date="2026-09-28T12:00:00Z">
         <w:r>
           <w:rPr>
             <w:rFonts w:ascii="Times New Roman" w:cs="Times New Roman" w:eastAsia="Times New Roman" w:hAnsi="Times New Roman"/>
@@ -4533,7 +4573,7 @@
         </w:rPr>
         <w:t xml:space="preserve">: firmas inteiras são reamostradas com reposição, de modo que a dependência entre as observações de uma mesma companhia seja preservada em cada réplica. O teste de DeLong, DeLong e Clarke-Pearson (1988) pressupõe independência entre observações, hipótese não satisfeita quando cada firma contribui com diversos firma-anos, e é reportado apenas como análise convencional complementar. </w:t>
       </w:r>
-      <w:del w:id="9311" w:author="Revisão" w:date="2026-09-28T12:00:00Z">
+      <w:del w:id="9315" w:author="Revisão" w:date="2026-09-28T12:00:00Z">
         <w:r>
           <w:rPr>
             <w:rFonts w:ascii="Times New Roman" w:cs="Times New Roman" w:eastAsia="Times New Roman" w:hAnsi="Times New Roman"/>
@@ -4547,7 +4587,7 @@
           <w:delText xml:space="preserve">A correção de Bonferroni é aplicada</w:delText>
         </w:r>
       </w:del>
-      <w:ins w:id="9312" w:author="Revisão" w:date="2026-09-28T12:00:00Z">
+      <w:ins w:id="9316" w:author="Revisão" w:date="2026-09-28T12:00:00Z">
         <w:r>
           <w:rPr>
             <w:rFonts w:ascii="Times New Roman" w:cs="Times New Roman" w:eastAsia="Times New Roman" w:hAnsi="Times New Roman"/>
@@ -4651,7 +4691,7 @@
         </w:rPr>
         <w:t xml:space="preserve">Acrescenta-se a esses um quinto benchmark, o modelo de Brito e Assaf Neto (2008), reestimado sobre a presente amostra. Ele emprega quatro variáveis: lucros retidos sobre ativo total, endividamento financeiro, capital de giro líquido e saldo de tesouraria sobre vendas, </w:t>
       </w:r>
-      <w:del w:id="9283" w:author="Revisão" w:date="2026-09-28T12:00:00Z">
+      <w:del w:id="9287" w:author="Revisão" w:date="2026-09-28T12:00:00Z">
         <w:r>
           <w:rPr>
             <w:rFonts w:ascii="Times New Roman" w:cs="Times New Roman" w:eastAsia="Times New Roman" w:hAnsi="Times New Roman"/>
@@ -4665,7 +4705,7 @@
           <w:delText xml:space="preserve">as duas últimas winsorizadas por ano nos percentis 1 e 99, conforme a implementação original, com os quantis estimados exclusivamente nas firmas de treino.</w:delText>
         </w:r>
       </w:del>
-      <w:ins w:id="9284" w:author="Revisão" w:date="2026-09-28T12:00:00Z">
+      <w:ins w:id="9288" w:author="Revisão" w:date="2026-09-28T12:00:00Z">
         <w:r>
           <w:rPr>
             <w:rFonts w:ascii="Times New Roman" w:cs="Times New Roman" w:eastAsia="Times New Roman" w:hAnsi="Times New Roman"/>
@@ -4710,7 +4750,7 @@
         </w:rPr>
         <w:t xml:space="preserve">A adoção da amostra de risco impõe restrição sobre a parcimônia da especificação probit com controles. Com 153 entradas na amostra de estimação no horizonte de um ano, </w:t>
       </w:r>
-      <w:del w:id="9313" w:author="Revisão" w:date="2026-09-28T12:00:00Z">
+      <w:del w:id="9317" w:author="Revisão" w:date="2026-09-28T12:00:00Z">
         <w:r>
           <w:rPr>
             <w:rFonts w:ascii="Times New Roman" w:cs="Times New Roman" w:eastAsia="Times New Roman" w:hAnsi="Times New Roman"/>
@@ -4724,7 +4764,7 @@
           <w:delText xml:space="preserve">a referência usual de ao menos dez eventos por parâmetro estimado</w:delText>
         </w:r>
       </w:del>
-      <w:ins w:id="9314" w:author="Revisão" w:date="2026-09-28T12:00:00Z">
+      <w:ins w:id="9318" w:author="Revisão" w:date="2026-09-28T12:00:00Z">
         <w:r>
           <w:rPr>
             <w:rFonts w:ascii="Times New Roman" w:cs="Times New Roman" w:eastAsia="Times New Roman" w:hAnsi="Times New Roman"/>
@@ -4826,7 +4866,7 @@
         </w:rPr>
         <w:t xml:space="preserve">Os resultados principais referem-se a uma atribuição de referência de firmas a partições, documentada no código de reprodução, e todos os valores de área sob a curva, diferenças e intervalos de confiança reportados nas tabelas e no texto derivam dessa mesma atribuição, o que assegura sua coerência interna. A sensibilidade à atribuição é avaliada repetindo o procedimento sob dez atribuições aleatórias distintas, </w:t>
       </w:r>
-      <w:del w:id="9229" w:author="Revisão" w:date="2026-09-28T12:00:00Z">
+      <w:del w:id="9233" w:author="Revisão" w:date="2026-09-28T12:00:00Z">
         <w:r>
           <w:rPr>
             <w:rFonts w:ascii="Times New Roman" w:cs="Times New Roman" w:eastAsia="Times New Roman" w:hAnsi="Times New Roman"/>
@@ -4840,7 +4880,7 @@
           <w:delText xml:space="preserve">cujas médias e desvios-padrão são reportados na subseção 5.6</w:delText>
         </w:r>
       </w:del>
-      <w:ins w:id="9230" w:author="Revisão" w:date="2026-09-28T12:00:00Z">
+      <w:ins w:id="9234" w:author="Revisão" w:date="2026-09-28T12:00:00Z">
         <w:r>
           <w:rPr>
             <w:rFonts w:ascii="Times New Roman" w:cs="Times New Roman" w:eastAsia="Times New Roman" w:hAnsi="Times New Roman"/>
@@ -4904,7 +4944,7 @@
         </w:rPr>
         <w:t xml:space="preserve">A estratégia empírica envolve três hipóteses formuladas antes da estimação e uma análise diagnóstica posterior. A primeira hipótese (H1) postula a existência de um fator latente único de fragilidade e compreende duas afirmações distintas, avaliadas separadamente: a existência de um eixo comum interpretável, verificada pela coerência de sinal das cargas fatoriais após a pré-orientação, e a unidimensionalidade, verificada </w:t>
       </w:r>
-      <w:del w:id="9301" w:author="Revisão" w:date="2026-09-28T12:00:00Z">
+      <w:del w:id="9305" w:author="Revisão" w:date="2026-09-28T12:00:00Z">
         <w:r>
           <w:rPr>
             <w:rFonts w:ascii="Times New Roman" w:cs="Times New Roman" w:eastAsia="Times New Roman" w:hAnsi="Times New Roman"/>
@@ -4918,7 +4958,7 @@
           <w:delText xml:space="preserve">pelo número de componentes retidos pelo critério de Kaiser</w:delText>
         </w:r>
       </w:del>
-      <w:ins w:id="9302" w:author="Revisão" w:date="2026-09-28T12:00:00Z">
+      <w:ins w:id="9306" w:author="Revisão" w:date="2026-09-28T12:00:00Z">
         <w:r>
           <w:rPr>
             <w:rFonts w:ascii="Times New Roman" w:cs="Times New Roman" w:eastAsia="Times New Roman" w:hAnsi="Times New Roman"/>
@@ -4982,7 +5022,7 @@
         </w:rPr>
         <w:t xml:space="preserve">A quarta hipótese (H4) tem estatuto distinto das anteriores e assim deve ser lida. Ela não integrava o desenho original e foi formulada após a observação dos resultados de H1 e H2, como explicação para o desempenho inferior do escore. Trata-se, portanto, de investigação explicativa posterior ao resultado, avaliada em seguida fora da amostra, e não de hipótese confirmatória pré-especificada. Ela postula que a diferença de desempenho entre o escore não supervisionado e os melhores benchmarks decorre do critério de agregação, e não do conjunto informacional. A análise consiste em construir um segundo escore por mínimos quadrados parciais aplicados a resposta binária, mantendo constantes as oito variáveis, a amostra, o pré-processamento e o procedimento de avaliação, de modo que a diferença de desempenho reflita apenas a substituição do critério de agregação. O critério de avaliação, fixado antes da estimação do escore supervisionado, é que ele supere o não supervisionado fora da amostra. Acrescenta-se um terceiro escore, </w:t>
       </w:r>
-      <w:del w:id="9315" w:author="Revisão" w:date="2026-09-28T12:00:00Z">
+      <w:del w:id="9319" w:author="Revisão" w:date="2026-09-28T12:00:00Z">
         <w:r>
           <w:rPr>
             <w:rFonts w:ascii="Times New Roman" w:cs="Times New Roman" w:eastAsia="Times New Roman" w:hAnsi="Times New Roman"/>
@@ -4996,7 +5036,7 @@
           <w:delText xml:space="preserve">obtido por árvores impulsionadas com gradiente sobre as mesmas oito variáveis</w:delText>
         </w:r>
       </w:del>
-      <w:ins w:id="9316" w:author="Revisão" w:date="2026-09-28T12:00:00Z">
+      <w:ins w:id="9320" w:author="Revisão" w:date="2026-09-28T12:00:00Z">
         <w:r>
           <w:rPr>
             <w:rFonts w:ascii="Times New Roman" w:cs="Times New Roman" w:eastAsia="Times New Roman" w:hAnsi="Times New Roman"/>
@@ -12838,7 +12878,7 @@
         </w:rPr>
         <w:t xml:space="preserve">O primeiro componente responde por 26,92% da variância total, </w:t>
       </w:r>
-      <w:del w:id="9303" w:author="Revisão" w:date="2026-09-28T12:00:00Z">
+      <w:del w:id="9307" w:author="Revisão" w:date="2026-09-28T12:00:00Z">
         <w:r>
           <w:rPr>
             <w:rFonts w:ascii="Times New Roman" w:cs="Times New Roman" w:eastAsia="Times New Roman" w:hAnsi="Times New Roman"/>
@@ -12852,7 +12892,7 @@
           <w:delText xml:space="preserve">e o critério de Kaiser retém 3 componentes, que juntos explicam 56,80%.</w:delText>
         </w:r>
       </w:del>
-      <w:ins w:id="9304" w:author="Revisão" w:date="2026-09-28T12:00:00Z">
+      <w:ins w:id="9308" w:author="Revisão" w:date="2026-09-28T12:00:00Z">
         <w:r>
           <w:rPr>
             <w:rFonts w:ascii="Times New Roman" w:cs="Times New Roman" w:eastAsia="Times New Roman" w:hAnsi="Times New Roman"/>
@@ -14065,7 +14105,7 @@
         </w:rPr>
         <w:t xml:space="preserve">A evidência sobre H1 deve ser separada em suas duas afirmações. A existência de um eixo comum interpretável é sustentada. A unidimensionalidade não é: o primeiro componente responde por 26,92% da variância e são necessários 3 componentes para resumir pouco mais da metade do sistema. O que o primeiro componente capta não é a fragilidade em sua totalidade, e sim uma de suas dimensões. H1 é, portanto, parcialmente sustentada quanto à coerência do eixo e rejeitada quanto à unidimensionalidade. A subseção 5.5 mostra a que rota de deterioração essa dimensão corresponde, </w:t>
       </w:r>
-      <w:del w:id="9165" w:author="Revisão" w:date="2026-09-28T12:00:00Z">
+      <w:del w:id="9169" w:author="Revisão" w:date="2026-09-28T12:00:00Z">
         <w:r>
           <w:rPr>
             <w:rFonts w:ascii="Times New Roman" w:cs="Times New Roman" w:eastAsia="Times New Roman" w:hAnsi="Times New Roman"/>
@@ -14079,7 +14119,7 @@
           <w:delText xml:space="preserve">e a qual delas o escore é cego</w:delText>
         </w:r>
       </w:del>
-      <w:ins w:id="9166" w:author="Revisão" w:date="2026-09-28T12:00:00Z">
+      <w:ins w:id="9170" w:author="Revisão" w:date="2026-09-28T12:00:00Z">
         <w:r>
           <w:rPr>
             <w:rFonts w:ascii="Times New Roman" w:cs="Times New Roman" w:eastAsia="Times New Roman" w:hAnsi="Times New Roman"/>
@@ -14382,7 +14422,7 @@
               <w:spacing w:after="0" w:before="0" w:line="240"/>
               <w:jc w:val="center"/>
             </w:pPr>
-            <w:del w:id="9171" w:author="Revisão" w:date="2026-09-28T12:00:00Z">
+            <w:del w:id="9175" w:author="Revisão" w:date="2026-09-28T12:00:00Z">
               <w:r>
                 <w:rPr>
                   <w:rFonts w:ascii="Times New Roman" w:cs="Times New Roman" w:eastAsia="Times New Roman" w:hAnsi="Times New Roman"/>
@@ -14396,7 +14436,7 @@
                 <w:delText xml:space="preserve">0,909</w:delText>
               </w:r>
             </w:del>
-            <w:ins w:id="9172" w:author="Revisão" w:date="2026-09-28T12:00:00Z">
+            <w:ins w:id="9176" w:author="Revisão" w:date="2026-09-28T12:00:00Z">
               <w:r>
                 <w:rPr>
                   <w:rFonts w:ascii="Times New Roman" w:cs="Times New Roman" w:eastAsia="Times New Roman" w:hAnsi="Times New Roman"/>
@@ -14427,7 +14467,7 @@
               <w:spacing w:after="0" w:before="0" w:line="240"/>
               <w:jc w:val="center"/>
             </w:pPr>
-            <w:del w:id="9173" w:author="Revisão" w:date="2026-09-28T12:00:00Z">
+            <w:del w:id="9177" w:author="Revisão" w:date="2026-09-28T12:00:00Z">
               <w:r>
                 <w:rPr>
                   <w:rFonts w:ascii="Times New Roman" w:cs="Times New Roman" w:eastAsia="Times New Roman" w:hAnsi="Times New Roman"/>
@@ -14441,7 +14481,7 @@
                 <w:delText xml:space="preserve">0,874</w:delText>
               </w:r>
             </w:del>
-            <w:ins w:id="9174" w:author="Revisão" w:date="2026-09-28T12:00:00Z">
+            <w:ins w:id="9178" w:author="Revisão" w:date="2026-09-28T12:00:00Z">
               <w:r>
                 <w:rPr>
                   <w:rFonts w:ascii="Times New Roman" w:cs="Times New Roman" w:eastAsia="Times New Roman" w:hAnsi="Times New Roman"/>
@@ -14506,7 +14546,7 @@
               <w:spacing w:after="0" w:before="0" w:line="240"/>
               <w:jc w:val="center"/>
             </w:pPr>
-            <w:del w:id="9175" w:author="Revisão" w:date="2026-09-28T12:00:00Z">
+            <w:del w:id="9179" w:author="Revisão" w:date="2026-09-28T12:00:00Z">
               <w:r>
                 <w:rPr>
                   <w:rFonts w:ascii="Times New Roman" w:cs="Times New Roman" w:eastAsia="Times New Roman" w:hAnsi="Times New Roman"/>
@@ -14520,7 +14560,7 @@
                 <w:delText xml:space="preserve">−0,400</w:delText>
               </w:r>
             </w:del>
-            <w:ins w:id="9176" w:author="Revisão" w:date="2026-09-28T12:00:00Z">
+            <w:ins w:id="9180" w:author="Revisão" w:date="2026-09-28T12:00:00Z">
               <w:r>
                 <w:rPr>
                   <w:rFonts w:ascii="Times New Roman" w:cs="Times New Roman" w:eastAsia="Times New Roman" w:hAnsi="Times New Roman"/>
@@ -14551,7 +14591,7 @@
               <w:spacing w:after="0" w:before="0" w:line="240"/>
               <w:jc w:val="center"/>
             </w:pPr>
-            <w:del w:id="9177" w:author="Revisão" w:date="2026-09-28T12:00:00Z">
+            <w:del w:id="9181" w:author="Revisão" w:date="2026-09-28T12:00:00Z">
               <w:r>
                 <w:rPr>
                   <w:rFonts w:ascii="Times New Roman" w:cs="Times New Roman" w:eastAsia="Times New Roman" w:hAnsi="Times New Roman"/>
@@ -14565,7 +14605,7 @@
                 <w:delText xml:space="preserve">−0,384</w:delText>
               </w:r>
             </w:del>
-            <w:ins w:id="9178" w:author="Revisão" w:date="2026-09-28T12:00:00Z">
+            <w:ins w:id="9182" w:author="Revisão" w:date="2026-09-28T12:00:00Z">
               <w:r>
                 <w:rPr>
                   <w:rFonts w:ascii="Times New Roman" w:cs="Times New Roman" w:eastAsia="Times New Roman" w:hAnsi="Times New Roman"/>
@@ -14630,7 +14670,7 @@
               <w:spacing w:after="0" w:before="0" w:line="240"/>
               <w:jc w:val="center"/>
             </w:pPr>
-            <w:del w:id="9179" w:author="Revisão" w:date="2026-09-28T12:00:00Z">
+            <w:del w:id="9183" w:author="Revisão" w:date="2026-09-28T12:00:00Z">
               <w:r>
                 <w:rPr>
                   <w:rFonts w:ascii="Times New Roman" w:cs="Times New Roman" w:eastAsia="Times New Roman" w:hAnsi="Times New Roman"/>
@@ -14644,7 +14684,7 @@
                 <w:delText xml:space="preserve">0,434</w:delText>
               </w:r>
             </w:del>
-            <w:ins w:id="9180" w:author="Revisão" w:date="2026-09-28T12:00:00Z">
+            <w:ins w:id="9184" w:author="Revisão" w:date="2026-09-28T12:00:00Z">
               <w:r>
                 <w:rPr>
                   <w:rFonts w:ascii="Times New Roman" w:cs="Times New Roman" w:eastAsia="Times New Roman" w:hAnsi="Times New Roman"/>
@@ -14675,7 +14715,7 @@
               <w:spacing w:after="0" w:before="0" w:line="240"/>
               <w:jc w:val="center"/>
             </w:pPr>
-            <w:del w:id="9181" w:author="Revisão" w:date="2026-09-28T12:00:00Z">
+            <w:del w:id="9185" w:author="Revisão" w:date="2026-09-28T12:00:00Z">
               <w:r>
                 <w:rPr>
                   <w:rFonts w:ascii="Times New Roman" w:cs="Times New Roman" w:eastAsia="Times New Roman" w:hAnsi="Times New Roman"/>
@@ -14689,7 +14729,7 @@
                 <w:delText xml:space="preserve">0,416</w:delText>
               </w:r>
             </w:del>
-            <w:ins w:id="9182" w:author="Revisão" w:date="2026-09-28T12:00:00Z">
+            <w:ins w:id="9186" w:author="Revisão" w:date="2026-09-28T12:00:00Z">
               <w:r>
                 <w:rPr>
                   <w:rFonts w:ascii="Times New Roman" w:cs="Times New Roman" w:eastAsia="Times New Roman" w:hAnsi="Times New Roman"/>
@@ -14754,7 +14794,7 @@
               <w:spacing w:after="0" w:before="0" w:line="240"/>
               <w:jc w:val="center"/>
             </w:pPr>
-            <w:del w:id="9183" w:author="Revisão" w:date="2026-09-28T12:00:00Z">
+            <w:del w:id="9187" w:author="Revisão" w:date="2026-09-28T12:00:00Z">
               <w:r>
                 <w:rPr>
                   <w:rFonts w:ascii="Times New Roman" w:cs="Times New Roman" w:eastAsia="Times New Roman" w:hAnsi="Times New Roman"/>
@@ -14768,7 +14808,7 @@
                 <w:delText xml:space="preserve">0,783</w:delText>
               </w:r>
             </w:del>
-            <w:ins w:id="9184" w:author="Revisão" w:date="2026-09-28T12:00:00Z">
+            <w:ins w:id="9188" w:author="Revisão" w:date="2026-09-28T12:00:00Z">
               <w:r>
                 <w:rPr>
                   <w:rFonts w:ascii="Times New Roman" w:cs="Times New Roman" w:eastAsia="Times New Roman" w:hAnsi="Times New Roman"/>
@@ -14799,7 +14839,7 @@
               <w:spacing w:after="0" w:before="0" w:line="240"/>
               <w:jc w:val="center"/>
             </w:pPr>
-            <w:del w:id="9185" w:author="Revisão" w:date="2026-09-28T12:00:00Z">
+            <w:del w:id="9189" w:author="Revisão" w:date="2026-09-28T12:00:00Z">
               <w:r>
                 <w:rPr>
                   <w:rFonts w:ascii="Times New Roman" w:cs="Times New Roman" w:eastAsia="Times New Roman" w:hAnsi="Times New Roman"/>
@@ -14813,7 +14853,7 @@
                 <w:delText xml:space="preserve">0,770</w:delText>
               </w:r>
             </w:del>
-            <w:ins w:id="9186" w:author="Revisão" w:date="2026-09-28T12:00:00Z">
+            <w:ins w:id="9190" w:author="Revisão" w:date="2026-09-28T12:00:00Z">
               <w:r>
                 <w:rPr>
                   <w:rFonts w:ascii="Times New Roman" w:cs="Times New Roman" w:eastAsia="Times New Roman" w:hAnsi="Times New Roman"/>
@@ -14848,7 +14888,7 @@
         </w:rPr>
         <w:t xml:space="preserve">Fonte: elaboração própria. Posição Ponzi definida como cobertura de juros inferior à unidade por dois exercícios consecutivos, </w:t>
       </w:r>
-      <w:del w:id="9187" w:author="Revisão" w:date="2026-09-28T12:00:00Z">
+      <w:del w:id="9191" w:author="Revisão" w:date="2026-09-28T12:00:00Z">
         <w:r>
           <w:rPr>
             <w:rFonts w:ascii="Times New Roman" w:cs="Times New Roman" w:eastAsia="Times New Roman" w:hAnsi="Times New Roman"/>
@@ -14862,7 +14902,7 @@
           <w:delText xml:space="preserve">abrangendo 2.265 firma-anos, ou 30,5% do painel</w:delText>
         </w:r>
       </w:del>
-      <w:ins w:id="9188" w:author="Revisão" w:date="2026-09-28T12:00:00Z">
+      <w:ins w:id="9192" w:author="Revisão" w:date="2026-09-28T12:00:00Z">
         <w:r>
           <w:rPr>
             <w:rFonts w:ascii="Times New Roman" w:cs="Times New Roman" w:eastAsia="Times New Roman" w:hAnsi="Times New Roman"/>
@@ -14895,7 +14935,7 @@
         <w:ind w:firstLine="708"/>
         <w:jc w:val="both"/>
       </w:pPr>
-      <w:del w:id="9189" w:author="Revisão" w:date="2026-09-28T12:00:00Z">
+      <w:del w:id="9193" w:author="Revisão" w:date="2026-09-28T12:00:00Z">
         <w:r>
           <w:rPr>
             <w:rFonts w:ascii="Times New Roman" w:cs="Times New Roman" w:eastAsia="Times New Roman" w:hAnsi="Times New Roman"/>
@@ -14909,7 +14949,7 @@
           <w:delText xml:space="preserve">O escore médio das observações em posição Ponzi é de 0,909, contra −0,400 para as demais, e a área sob a curva para discriminar essa posição é de 0,783. Excluída a cobertura de juros, ela passa a 0,770.</w:delText>
         </w:r>
       </w:del>
-      <w:ins w:id="9190" w:author="Revisão" w:date="2026-09-28T12:00:00Z">
+      <w:ins w:id="9194" w:author="Revisão" w:date="2026-09-28T12:00:00Z">
         <w:r>
           <w:rPr>
             <w:rFonts w:ascii="Times New Roman" w:cs="Times New Roman" w:eastAsia="Times New Roman" w:hAnsi="Times New Roman"/>
@@ -16702,7 +16742,7 @@
               <w:spacing w:after="0" w:before="0" w:line="240"/>
               <w:jc w:val="center"/>
             </w:pPr>
-            <w:del w:id="9193" w:author="Revisão" w:date="2026-09-28T12:00:00Z">
+            <w:del w:id="9197" w:author="Revisão" w:date="2026-09-28T12:00:00Z">
               <w:r>
                 <w:rPr>
                   <w:rFonts w:ascii="Times New Roman" w:cs="Times New Roman" w:eastAsia="Times New Roman" w:hAnsi="Times New Roman"/>
@@ -16716,7 +16756,7 @@
                 <w:delText xml:space="preserve">0,900</w:delText>
               </w:r>
             </w:del>
-            <w:ins w:id="9194" w:author="Revisão" w:date="2026-09-28T12:00:00Z">
+            <w:ins w:id="9198" w:author="Revisão" w:date="2026-09-28T12:00:00Z">
               <w:r>
                 <w:rPr>
                   <w:rFonts w:ascii="Times New Roman" w:cs="Times New Roman" w:eastAsia="Times New Roman" w:hAnsi="Times New Roman"/>
@@ -16747,7 +16787,7 @@
               <w:spacing w:after="0" w:before="0" w:line="240"/>
               <w:jc w:val="center"/>
             </w:pPr>
-            <w:del w:id="9195" w:author="Revisão" w:date="2026-09-28T12:00:00Z">
+            <w:del w:id="9199" w:author="Revisão" w:date="2026-09-28T12:00:00Z">
               <w:r>
                 <w:rPr>
                   <w:rFonts w:ascii="Times New Roman" w:cs="Times New Roman" w:eastAsia="Times New Roman" w:hAnsi="Times New Roman"/>
@@ -16761,7 +16801,7 @@
                 <w:delText xml:space="preserve">+0,136</w:delText>
               </w:r>
             </w:del>
-            <w:ins w:id="9196" w:author="Revisão" w:date="2026-09-28T12:00:00Z">
+            <w:ins w:id="9200" w:author="Revisão" w:date="2026-09-28T12:00:00Z">
               <w:r>
                 <w:rPr>
                   <w:rFonts w:ascii="Times New Roman" w:cs="Times New Roman" w:eastAsia="Times New Roman" w:hAnsi="Times New Roman"/>
@@ -16792,7 +16832,7 @@
               <w:spacing w:after="0" w:before="0" w:line="240"/>
               <w:jc w:val="center"/>
             </w:pPr>
-            <w:del w:id="9197" w:author="Revisão" w:date="2026-09-28T12:00:00Z">
+            <w:del w:id="9201" w:author="Revisão" w:date="2026-09-28T12:00:00Z">
               <w:r>
                 <w:rPr>
                   <w:rFonts w:ascii="Times New Roman" w:cs="Times New Roman" w:eastAsia="Times New Roman" w:hAnsi="Times New Roman"/>
@@ -16806,7 +16846,7 @@
                 <w:delText xml:space="preserve">[+0,090; +0,184]</w:delText>
               </w:r>
             </w:del>
-            <w:ins w:id="9198" w:author="Revisão" w:date="2026-09-28T12:00:00Z">
+            <w:ins w:id="9202" w:author="Revisão" w:date="2026-09-28T12:00:00Z">
               <w:r>
                 <w:rPr>
                   <w:rFonts w:ascii="Times New Roman" w:cs="Times New Roman" w:eastAsia="Times New Roman" w:hAnsi="Times New Roman"/>
@@ -18638,7 +18678,7 @@
               <w:spacing w:after="0" w:before="0" w:line="240"/>
               <w:jc w:val="center"/>
             </w:pPr>
-            <w:del w:id="9199" w:author="Revisão" w:date="2026-09-28T12:00:00Z">
+            <w:del w:id="9203" w:author="Revisão" w:date="2026-09-28T12:00:00Z">
               <w:r>
                 <w:rPr>
                   <w:rFonts w:ascii="Times New Roman" w:cs="Times New Roman" w:eastAsia="Times New Roman" w:hAnsi="Times New Roman"/>
@@ -18652,7 +18692,7 @@
                 <w:delText xml:space="preserve">0,752</w:delText>
               </w:r>
             </w:del>
-            <w:ins w:id="9200" w:author="Revisão" w:date="2026-09-28T12:00:00Z">
+            <w:ins w:id="9204" w:author="Revisão" w:date="2026-09-28T12:00:00Z">
               <w:r>
                 <w:rPr>
                   <w:rFonts w:ascii="Times New Roman" w:cs="Times New Roman" w:eastAsia="Times New Roman" w:hAnsi="Times New Roman"/>
@@ -18683,7 +18723,7 @@
               <w:spacing w:after="0" w:before="0" w:line="240"/>
               <w:jc w:val="center"/>
             </w:pPr>
-            <w:del w:id="9201" w:author="Revisão" w:date="2026-09-28T12:00:00Z">
+            <w:del w:id="9205" w:author="Revisão" w:date="2026-09-28T12:00:00Z">
               <w:r>
                 <w:rPr>
                   <w:rFonts w:ascii="Times New Roman" w:cs="Times New Roman" w:eastAsia="Times New Roman" w:hAnsi="Times New Roman"/>
@@ -18697,7 +18737,7 @@
                 <w:delText xml:space="preserve">+0,125</w:delText>
               </w:r>
             </w:del>
-            <w:ins w:id="9202" w:author="Revisão" w:date="2026-09-28T12:00:00Z">
+            <w:ins w:id="9206" w:author="Revisão" w:date="2026-09-28T12:00:00Z">
               <w:r>
                 <w:rPr>
                   <w:rFonts w:ascii="Times New Roman" w:cs="Times New Roman" w:eastAsia="Times New Roman" w:hAnsi="Times New Roman"/>
@@ -18728,7 +18768,7 @@
               <w:spacing w:after="0" w:before="0" w:line="240"/>
               <w:jc w:val="center"/>
             </w:pPr>
-            <w:del w:id="9203" w:author="Revisão" w:date="2026-09-28T12:00:00Z">
+            <w:del w:id="9207" w:author="Revisão" w:date="2026-09-28T12:00:00Z">
               <w:r>
                 <w:rPr>
                   <w:rFonts w:ascii="Times New Roman" w:cs="Times New Roman" w:eastAsia="Times New Roman" w:hAnsi="Times New Roman"/>
@@ -18742,7 +18782,7 @@
                 <w:delText xml:space="preserve">[+0,060; +0,191]</w:delText>
               </w:r>
             </w:del>
-            <w:ins w:id="9204" w:author="Revisão" w:date="2026-09-28T12:00:00Z">
+            <w:ins w:id="9208" w:author="Revisão" w:date="2026-09-28T12:00:00Z">
               <w:r>
                 <w:rPr>
                   <w:rFonts w:ascii="Times New Roman" w:cs="Times New Roman" w:eastAsia="Times New Roman" w:hAnsi="Times New Roman"/>
@@ -20302,7 +20342,7 @@
         </w:rPr>
         <w:t xml:space="preserve">No horizonte de um ano, o escore sintético alcança 0,764, contra 0,894 da cobertura de juros, </w:t>
       </w:r>
-      <w:del w:id="9223" w:author="Revisão" w:date="2026-09-28T12:00:00Z">
+      <w:del w:id="9227" w:author="Revisão" w:date="2026-09-28T12:00:00Z">
         <w:r>
           <w:rPr>
             <w:rFonts w:ascii="Times New Roman" w:cs="Times New Roman" w:eastAsia="Times New Roman" w:hAnsi="Times New Roman"/>
@@ -20316,7 +20356,7 @@
           <w:delText xml:space="preserve">0,874 do retorno sobre ativos e 0,900 da referência não linear</w:delText>
         </w:r>
       </w:del>
-      <w:ins w:id="9224" w:author="Revisão" w:date="2026-09-28T12:00:00Z">
+      <w:ins w:id="9228" w:author="Revisão" w:date="2026-09-28T12:00:00Z">
         <w:r>
           <w:rPr>
             <w:rFonts w:ascii="Times New Roman" w:cs="Times New Roman" w:eastAsia="Times New Roman" w:hAnsi="Times New Roman"/>
@@ -20342,7 +20382,7 @@
         </w:rPr>
         <w:t xml:space="preserve">. Todas essas diferenças resistem à correção de Bonferroni. Como H2 exige superioridade sobre todos os benchmarks, H2 é rejeitada sobre o agregado dos eventos. A subseção 5.5 mostra que essa rejeição é produzida por uma das rotas de deterioração e não vale para as demais, o que qualifica a leitura do resultado sem alterar o veredito da hipótese, que foi formulada em termos agregados. O único benchmark que o escore não perde é o modelo de Brito e Assaf Neto, </w:t>
       </w:r>
-      <w:del w:id="9231" w:author="Revisão" w:date="2026-09-28T12:00:00Z">
+      <w:del w:id="9235" w:author="Revisão" w:date="2026-09-28T12:00:00Z">
         <w:r>
           <w:rPr>
             <w:rFonts w:ascii="Times New Roman" w:cs="Times New Roman" w:eastAsia="Times New Roman" w:hAnsi="Times New Roman"/>
@@ -20356,7 +20396,7 @@
           <w:delText xml:space="preserve">que ele supera por 0,030 ponto sem significância estatística.</w:delText>
         </w:r>
       </w:del>
-      <w:ins w:id="9232" w:author="Revisão" w:date="2026-09-28T12:00:00Z">
+      <w:ins w:id="9236" w:author="Revisão" w:date="2026-09-28T12:00:00Z">
         <w:r>
           <w:rPr>
             <w:rFonts w:ascii="Times New Roman" w:cs="Times New Roman" w:eastAsia="Times New Roman" w:hAnsi="Times New Roman"/>
@@ -20781,7 +20821,7 @@
               <w:spacing w:after="0" w:before="0" w:line="240"/>
               <w:jc w:val="center"/>
             </w:pPr>
-            <w:del w:id="9205" w:author="Revisão" w:date="2026-09-28T12:00:00Z">
+            <w:del w:id="9209" w:author="Revisão" w:date="2026-09-28T12:00:00Z">
               <w:r>
                 <w:rPr>
                   <w:rFonts w:ascii="Times New Roman" w:cs="Times New Roman" w:eastAsia="Times New Roman" w:hAnsi="Times New Roman"/>
@@ -20795,7 +20835,7 @@
                 <w:delText xml:space="preserve">0,910</w:delText>
               </w:r>
             </w:del>
-            <w:ins w:id="9206" w:author="Revisão" w:date="2026-09-28T12:00:00Z">
+            <w:ins w:id="9210" w:author="Revisão" w:date="2026-09-28T12:00:00Z">
               <w:r>
                 <w:rPr>
                   <w:rFonts w:ascii="Times New Roman" w:cs="Times New Roman" w:eastAsia="Times New Roman" w:hAnsi="Times New Roman"/>
@@ -20826,7 +20866,7 @@
               <w:spacing w:after="0" w:before="0" w:line="240"/>
               <w:jc w:val="center"/>
             </w:pPr>
-            <w:del w:id="9207" w:author="Revisão" w:date="2026-09-28T12:00:00Z">
+            <w:del w:id="9211" w:author="Revisão" w:date="2026-09-28T12:00:00Z">
               <w:r>
                 <w:rPr>
                   <w:rFonts w:ascii="Times New Roman" w:cs="Times New Roman" w:eastAsia="Times New Roman" w:hAnsi="Times New Roman"/>
@@ -20840,7 +20880,7 @@
                 <w:delText xml:space="preserve">+0,166</w:delText>
               </w:r>
             </w:del>
-            <w:ins w:id="9208" w:author="Revisão" w:date="2026-09-28T12:00:00Z">
+            <w:ins w:id="9212" w:author="Revisão" w:date="2026-09-28T12:00:00Z">
               <w:r>
                 <w:rPr>
                   <w:rFonts w:ascii="Times New Roman" w:cs="Times New Roman" w:eastAsia="Times New Roman" w:hAnsi="Times New Roman"/>
@@ -20900,7 +20940,7 @@
               <w:spacing w:after="0" w:before="0" w:line="240"/>
               <w:jc w:val="center"/>
             </w:pPr>
-            <w:del w:id="9209" w:author="Revisão" w:date="2026-09-28T12:00:00Z">
+            <w:del w:id="9213" w:author="Revisão" w:date="2026-09-28T12:00:00Z">
               <w:r>
                 <w:rPr>
                   <w:rFonts w:ascii="Times New Roman" w:cs="Times New Roman" w:eastAsia="Times New Roman" w:hAnsi="Times New Roman"/>
@@ -20914,7 +20954,7 @@
                 <w:delText xml:space="preserve">0,713</w:delText>
               </w:r>
             </w:del>
-            <w:ins w:id="9210" w:author="Revisão" w:date="2026-09-28T12:00:00Z">
+            <w:ins w:id="9214" w:author="Revisão" w:date="2026-09-28T12:00:00Z">
               <w:r>
                 <w:rPr>
                   <w:rFonts w:ascii="Times New Roman" w:cs="Times New Roman" w:eastAsia="Times New Roman" w:hAnsi="Times New Roman"/>
@@ -21556,6 +21596,34 @@
         <w:ind w:firstLine="708"/>
         <w:jc w:val="both"/>
       </w:pPr>
+      <w:del w:id="9143" w:author="Revisão" w:date="2026-09-28T12:00:00Z">
+        <w:r>
+          <w:rPr>
+            <w:rFonts w:ascii="Times New Roman" w:cs="Times New Roman" w:eastAsia="Times New Roman" w:hAnsi="Times New Roman"/>
+            <w:b w:val="false"/>
+            <w:bCs w:val="false"/>
+            <w:i w:val="false"/>
+            <w:iCs w:val="false"/>
+            <w:sz w:val="24"/>
+            <w:szCs w:val="24"/>
+          </w:rPr>
+          <w:delText xml:space="preserve">O esquema temporal reproduz a ordenação da validação cruzada no horizonte de um ano, com 40 entradas no período de teste e todas as diferenças significativas.</w:delText>
+        </w:r>
+      </w:del>
+      <w:ins w:id="9144" w:author="Revisão" w:date="2026-09-28T12:00:00Z">
+        <w:r>
+          <w:rPr>
+            <w:rFonts w:ascii="Times New Roman" w:cs="Times New Roman" w:eastAsia="Times New Roman" w:hAnsi="Times New Roman"/>
+            <w:b w:val="false"/>
+            <w:bCs w:val="false"/>
+            <w:i w:val="false"/>
+            <w:iCs w:val="false"/>
+            <w:sz w:val="24"/>
+            <w:szCs w:val="24"/>
+          </w:rPr>
+          <w:t xml:space="preserve">O esquema temporal reproduz o resultado central da validação cruzada no horizonte de um ano: com 40 entradas no período de teste, o escore sintético fica abaixo da cobertura de juros, do retorno sobre ativos, do escore supervisionado e das árvores impulsionadas, com todas as diferenças significativas.</w:t>
+        </w:r>
+      </w:ins>
       <w:r>
         <w:rPr>
           <w:rFonts w:ascii="Times New Roman" w:cs="Times New Roman" w:eastAsia="Times New Roman" w:hAnsi="Times New Roman"/>
@@ -21566,7 +21634,7 @@
           <w:sz w:val="24"/>
           <w:szCs w:val="24"/>
         </w:rPr>
-        <w:t xml:space="preserve">O esquema temporal reproduz a ordenação da validação cruzada no horizonte de um ano, com 40 entradas no período de teste e todas as diferenças significativas. A conclusão sobre H2, portanto, não depende do esquema de avaliação. </w:t>
+        <w:t xml:space="preserve"> A conclusão sobre H2, portanto, não depende do esquema de avaliação. </w:t>
       </w:r>
       <w:del w:id="9141" w:author="Revisão" w:date="2026-09-28T12:00:00Z">
         <w:r>
@@ -21593,7 +21661,7 @@
             <w:sz w:val="24"/>
             <w:szCs w:val="24"/>
           </w:rPr>
-          <w:t xml:space="preserve">No horizonte de dois anos, com 34 entradas, nenhuma diferença alcança significância, e o esquema temporal é informativo apenas quanto à direção. A exceção à ordenação é o modelo de Brito e Assaf Neto, que no esquema temporal supera o escore sintético, com 0,787 contra 0,744, ao contrário do que ocorre na validação cruzada.</w:t>
+          <w:t xml:space="preserve">No horizonte de dois anos, com 34 entradas, nenhuma diferença alcança significância, e o esquema temporal é informativo apenas quanto à direção. A ordem entre os quatro modelos que superam o escore muda em relação à validação cruzada, com no máximo 0,020 ponto entre eles, e o modelo de Brito e Assaf Neto, abaixo do escore sintético na validação cruzada, o supera no esquema temporal, com 0,787 contra 0,744.</w:t>
         </w:r>
       </w:ins>
     </w:p>
@@ -23053,7 +23121,7 @@
         <w:ind w:firstLine="708"/>
         <w:jc w:val="both"/>
       </w:pPr>
-      <w:del w:id="9295" w:author="Revisão" w:date="2026-09-28T12:00:00Z">
+      <w:del w:id="9299" w:author="Revisão" w:date="2026-09-28T12:00:00Z">
         <w:r>
           <w:rPr>
             <w:rFonts w:ascii="Times New Roman" w:cs="Times New Roman" w:eastAsia="Times New Roman" w:hAnsi="Times New Roman"/>
@@ -23067,7 +23135,7 @@
           <w:delText xml:space="preserve">O coeficiente é positivo e significativo a menos de um por mil nos quatro modelos.</w:delText>
         </w:r>
       </w:del>
-      <w:ins w:id="9296" w:author="Revisão" w:date="2026-09-28T12:00:00Z">
+      <w:ins w:id="9300" w:author="Revisão" w:date="2026-09-28T12:00:00Z">
         <w:r>
           <w:rPr>
             <w:rFonts w:ascii="Times New Roman" w:cs="Times New Roman" w:eastAsia="Times New Roman" w:hAnsi="Times New Roman"/>
@@ -23131,7 +23199,7 @@
         </w:rPr>
         <w:t xml:space="preserve">A parcimônia da especificação merece registro. Com 153 entradas e 24 parâmetros, a especificação com efeitos fixos opera em 6,38 eventos por parâmetro, abaixo da referência usual de dez discutida na subseção 3.4. A verificação pertinente é se o resultado depende disso, e não depende: na especificação com controle apenas de porte, que opera em 51,00 eventos por parâmetro, o coeficiente é de 0,332; sem controles, em 76,50 eventos por parâmetro, é de 0,348; e na especificação completa, de 0,344. </w:t>
       </w:r>
-      <w:del w:id="9297" w:author="Revisão" w:date="2026-09-28T12:00:00Z">
+      <w:del w:id="9301" w:author="Revisão" w:date="2026-09-28T12:00:00Z">
         <w:r>
           <w:rPr>
             <w:rFonts w:ascii="Times New Roman" w:cs="Times New Roman" w:eastAsia="Times New Roman" w:hAnsi="Times New Roman"/>
@@ -23145,7 +23213,7 @@
           <w:delText xml:space="preserve">Os três são significativos a menos de um por mil,</w:delText>
         </w:r>
       </w:del>
-      <w:ins w:id="9298" w:author="Revisão" w:date="2026-09-28T12:00:00Z">
+      <w:ins w:id="9302" w:author="Revisão" w:date="2026-09-28T12:00:00Z">
         <w:r>
           <w:rPr>
             <w:rFonts w:ascii="Times New Roman" w:cs="Times New Roman" w:eastAsia="Times New Roman" w:hAnsi="Times New Roman"/>
@@ -23494,14 +23562,14 @@
               <w:bottom w:type="dxa" w:w="60"/>
               <w:right w:type="dxa" w:w="80"/>
             </w:tcMar>
-            <w:cellIns w:id="9233" w:author="Revisão" w:date="2026-09-28T12:00:00Z"/>
-          </w:tcPr>
-          <w:p>
-            <w:pPr>
-              <w:spacing w:after="0" w:before="0" w:line="240"/>
-              <w:jc w:val="center"/>
-            </w:pPr>
-            <w:ins w:id="9234" w:author="Revisão" w:date="2026-09-28T12:00:00Z">
+            <w:cellIns w:id="9237" w:author="Revisão" w:date="2026-09-28T12:00:00Z"/>
+          </w:tcPr>
+          <w:p>
+            <w:pPr>
+              <w:spacing w:after="0" w:before="0" w:line="240"/>
+              <w:jc w:val="center"/>
+            </w:pPr>
+            <w:ins w:id="9238" w:author="Revisão" w:date="2026-09-28T12:00:00Z">
               <w:r>
                 <w:rPr>
                   <w:rFonts w:ascii="Times New Roman" w:cs="Times New Roman" w:eastAsia="Times New Roman" w:hAnsi="Times New Roman"/>
@@ -23734,7 +23802,7 @@
               <w:bottom w:type="dxa" w:w="60"/>
               <w:right w:type="dxa" w:w="80"/>
             </w:tcMar>
-            <w:cellIns w:id="9235" w:author="Revisão" w:date="2026-09-28T12:00:00Z"/>
+            <w:cellIns w:id="9239" w:author="Revisão" w:date="2026-09-28T12:00:00Z"/>
           </w:tcPr>
           <w:p>
             <w:pPr>
@@ -23960,14 +24028,14 @@
               <w:bottom w:type="dxa" w:w="60"/>
               <w:right w:type="dxa" w:w="80"/>
             </w:tcMar>
-            <w:cellIns w:id="9236" w:author="Revisão" w:date="2026-09-28T12:00:00Z"/>
-          </w:tcPr>
-          <w:p>
-            <w:pPr>
-              <w:spacing w:after="0" w:before="0" w:line="240"/>
-              <w:jc w:val="center"/>
-            </w:pPr>
-            <w:ins w:id="9237" w:author="Revisão" w:date="2026-09-28T12:00:00Z">
+            <w:cellIns w:id="9240" w:author="Revisão" w:date="2026-09-28T12:00:00Z"/>
+          </w:tcPr>
+          <w:p>
+            <w:pPr>
+              <w:spacing w:after="0" w:before="0" w:line="240"/>
+              <w:jc w:val="center"/>
+            </w:pPr>
+            <w:ins w:id="9241" w:author="Revisão" w:date="2026-09-28T12:00:00Z">
               <w:r>
                 <w:rPr>
                   <w:rFonts w:ascii="Times New Roman" w:cs="Times New Roman" w:eastAsia="Times New Roman" w:hAnsi="Times New Roman"/>
@@ -24200,14 +24268,14 @@
               <w:bottom w:type="dxa" w:w="60"/>
               <w:right w:type="dxa" w:w="80"/>
             </w:tcMar>
-            <w:cellIns w:id="9238" w:author="Revisão" w:date="2026-09-28T12:00:00Z"/>
-          </w:tcPr>
-          <w:p>
-            <w:pPr>
-              <w:spacing w:after="0" w:before="0" w:line="240"/>
-              <w:jc w:val="center"/>
-            </w:pPr>
-            <w:ins w:id="9239" w:author="Revisão" w:date="2026-09-28T12:00:00Z">
+            <w:cellIns w:id="9242" w:author="Revisão" w:date="2026-09-28T12:00:00Z"/>
+          </w:tcPr>
+          <w:p>
+            <w:pPr>
+              <w:spacing w:after="0" w:before="0" w:line="240"/>
+              <w:jc w:val="center"/>
+            </w:pPr>
+            <w:ins w:id="9243" w:author="Revisão" w:date="2026-09-28T12:00:00Z">
               <w:r>
                 <w:rPr>
                   <w:rFonts w:ascii="Times New Roman" w:cs="Times New Roman" w:eastAsia="Times New Roman" w:hAnsi="Times New Roman"/>
@@ -24440,14 +24508,14 @@
               <w:bottom w:type="dxa" w:w="60"/>
               <w:right w:type="dxa" w:w="80"/>
             </w:tcMar>
-            <w:cellIns w:id="9240" w:author="Revisão" w:date="2026-09-28T12:00:00Z"/>
-          </w:tcPr>
-          <w:p>
-            <w:pPr>
-              <w:spacing w:after="0" w:before="0" w:line="240"/>
-              <w:jc w:val="center"/>
-            </w:pPr>
-            <w:ins w:id="9241" w:author="Revisão" w:date="2026-09-28T12:00:00Z">
+            <w:cellIns w:id="9244" w:author="Revisão" w:date="2026-09-28T12:00:00Z"/>
+          </w:tcPr>
+          <w:p>
+            <w:pPr>
+              <w:spacing w:after="0" w:before="0" w:line="240"/>
+              <w:jc w:val="center"/>
+            </w:pPr>
+            <w:ins w:id="9245" w:author="Revisão" w:date="2026-09-28T12:00:00Z">
               <w:r>
                 <w:rPr>
                   <w:rFonts w:ascii="Times New Roman" w:cs="Times New Roman" w:eastAsia="Times New Roman" w:hAnsi="Times New Roman"/>
@@ -24680,14 +24748,14 @@
               <w:bottom w:type="dxa" w:w="60"/>
               <w:right w:type="dxa" w:w="80"/>
             </w:tcMar>
-            <w:cellIns w:id="9242" w:author="Revisão" w:date="2026-09-28T12:00:00Z"/>
-          </w:tcPr>
-          <w:p>
-            <w:pPr>
-              <w:spacing w:after="0" w:before="0" w:line="240"/>
-              <w:jc w:val="center"/>
-            </w:pPr>
-            <w:ins w:id="9243" w:author="Revisão" w:date="2026-09-28T12:00:00Z">
+            <w:cellIns w:id="9246" w:author="Revisão" w:date="2026-09-28T12:00:00Z"/>
+          </w:tcPr>
+          <w:p>
+            <w:pPr>
+              <w:spacing w:after="0" w:before="0" w:line="240"/>
+              <w:jc w:val="center"/>
+            </w:pPr>
+            <w:ins w:id="9247" w:author="Revisão" w:date="2026-09-28T12:00:00Z">
               <w:r>
                 <w:rPr>
                   <w:rFonts w:ascii="Times New Roman" w:cs="Times New Roman" w:eastAsia="Times New Roman" w:hAnsi="Times New Roman"/>
@@ -24920,7 +24988,7 @@
               <w:bottom w:type="dxa" w:w="60"/>
               <w:right w:type="dxa" w:w="80"/>
             </w:tcMar>
-            <w:cellIns w:id="9244" w:author="Revisão" w:date="2026-09-28T12:00:00Z"/>
+            <w:cellIns w:id="9248" w:author="Revisão" w:date="2026-09-28T12:00:00Z"/>
           </w:tcPr>
           <w:p>
             <w:pPr>
@@ -25036,7 +25104,7 @@
               <w:spacing w:after="0" w:before="0" w:line="240"/>
               <w:jc w:val="center"/>
             </w:pPr>
-            <w:del w:id="9211" w:author="Revisão" w:date="2026-09-28T12:00:00Z">
+            <w:del w:id="9215" w:author="Revisão" w:date="2026-09-28T12:00:00Z">
               <w:r>
                 <w:rPr>
                   <w:rFonts w:ascii="Times New Roman" w:cs="Times New Roman" w:eastAsia="Times New Roman" w:hAnsi="Times New Roman"/>
@@ -25050,7 +25118,7 @@
                 <w:delText xml:space="preserve">0,723</w:delText>
               </w:r>
             </w:del>
-            <w:ins w:id="9212" w:author="Revisão" w:date="2026-09-28T12:00:00Z">
+            <w:ins w:id="9216" w:author="Revisão" w:date="2026-09-28T12:00:00Z">
               <w:r>
                 <w:rPr>
                   <w:rFonts w:ascii="Times New Roman" w:cs="Times New Roman" w:eastAsia="Times New Roman" w:hAnsi="Times New Roman"/>
@@ -25162,14 +25230,14 @@
               <w:bottom w:type="dxa" w:w="60"/>
               <w:right w:type="dxa" w:w="80"/>
             </w:tcMar>
-            <w:cellIns w:id="9245" w:author="Revisão" w:date="2026-09-28T12:00:00Z"/>
-          </w:tcPr>
-          <w:p>
-            <w:pPr>
-              <w:spacing w:after="0" w:before="0" w:line="240"/>
-              <w:jc w:val="center"/>
-            </w:pPr>
-            <w:ins w:id="9246" w:author="Revisão" w:date="2026-09-28T12:00:00Z">
+            <w:cellIns w:id="9249" w:author="Revisão" w:date="2026-09-28T12:00:00Z"/>
+          </w:tcPr>
+          <w:p>
+            <w:pPr>
+              <w:spacing w:after="0" w:before="0" w:line="240"/>
+              <w:jc w:val="center"/>
+            </w:pPr>
+            <w:ins w:id="9250" w:author="Revisão" w:date="2026-09-28T12:00:00Z">
               <w:r>
                 <w:rPr>
                   <w:rFonts w:ascii="Times New Roman" w:cs="Times New Roman" w:eastAsia="Times New Roman" w:hAnsi="Times New Roman"/>
@@ -25292,7 +25360,7 @@
               <w:spacing w:after="0" w:before="0" w:line="240"/>
               <w:jc w:val="center"/>
             </w:pPr>
-            <w:del w:id="9213" w:author="Revisão" w:date="2026-09-28T12:00:00Z">
+            <w:del w:id="9217" w:author="Revisão" w:date="2026-09-28T12:00:00Z">
               <w:r>
                 <w:rPr>
                   <w:rFonts w:ascii="Times New Roman" w:cs="Times New Roman" w:eastAsia="Times New Roman" w:hAnsi="Times New Roman"/>
@@ -25306,7 +25374,7 @@
                 <w:delText xml:space="preserve">0,772</w:delText>
               </w:r>
             </w:del>
-            <w:ins w:id="9214" w:author="Revisão" w:date="2026-09-28T12:00:00Z">
+            <w:ins w:id="9218" w:author="Revisão" w:date="2026-09-28T12:00:00Z">
               <w:r>
                 <w:rPr>
                   <w:rFonts w:ascii="Times New Roman" w:cs="Times New Roman" w:eastAsia="Times New Roman" w:hAnsi="Times New Roman"/>
@@ -25418,14 +25486,14 @@
               <w:bottom w:type="dxa" w:w="60"/>
               <w:right w:type="dxa" w:w="80"/>
             </w:tcMar>
-            <w:cellIns w:id="9247" w:author="Revisão" w:date="2026-09-28T12:00:00Z"/>
-          </w:tcPr>
-          <w:p>
-            <w:pPr>
-              <w:spacing w:after="0" w:before="0" w:line="240"/>
-              <w:jc w:val="center"/>
-            </w:pPr>
-            <w:ins w:id="9248" w:author="Revisão" w:date="2026-09-28T12:00:00Z">
+            <w:cellIns w:id="9251" w:author="Revisão" w:date="2026-09-28T12:00:00Z"/>
+          </w:tcPr>
+          <w:p>
+            <w:pPr>
+              <w:spacing w:after="0" w:before="0" w:line="240"/>
+              <w:jc w:val="center"/>
+            </w:pPr>
+            <w:ins w:id="9252" w:author="Revisão" w:date="2026-09-28T12:00:00Z">
               <w:r>
                 <w:rPr>
                   <w:rFonts w:ascii="Times New Roman" w:cs="Times New Roman" w:eastAsia="Times New Roman" w:hAnsi="Times New Roman"/>
@@ -25548,7 +25616,7 @@
               <w:spacing w:after="0" w:before="0" w:line="240"/>
               <w:jc w:val="center"/>
             </w:pPr>
-            <w:del w:id="9215" w:author="Revisão" w:date="2026-09-28T12:00:00Z">
+            <w:del w:id="9219" w:author="Revisão" w:date="2026-09-28T12:00:00Z">
               <w:r>
                 <w:rPr>
                   <w:rFonts w:ascii="Times New Roman" w:cs="Times New Roman" w:eastAsia="Times New Roman" w:hAnsi="Times New Roman"/>
@@ -25562,7 +25630,7 @@
                 <w:delText xml:space="preserve">0,849</w:delText>
               </w:r>
             </w:del>
-            <w:ins w:id="9216" w:author="Revisão" w:date="2026-09-28T12:00:00Z">
+            <w:ins w:id="9220" w:author="Revisão" w:date="2026-09-28T12:00:00Z">
               <w:r>
                 <w:rPr>
                   <w:rFonts w:ascii="Times New Roman" w:cs="Times New Roman" w:eastAsia="Times New Roman" w:hAnsi="Times New Roman"/>
@@ -25674,14 +25742,14 @@
               <w:bottom w:type="dxa" w:w="60"/>
               <w:right w:type="dxa" w:w="80"/>
             </w:tcMar>
-            <w:cellIns w:id="9249" w:author="Revisão" w:date="2026-09-28T12:00:00Z"/>
-          </w:tcPr>
-          <w:p>
-            <w:pPr>
-              <w:spacing w:after="0" w:before="0" w:line="240"/>
-              <w:jc w:val="center"/>
-            </w:pPr>
-            <w:ins w:id="9250" w:author="Revisão" w:date="2026-09-28T12:00:00Z">
+            <w:cellIns w:id="9253" w:author="Revisão" w:date="2026-09-28T12:00:00Z"/>
+          </w:tcPr>
+          <w:p>
+            <w:pPr>
+              <w:spacing w:after="0" w:before="0" w:line="240"/>
+              <w:jc w:val="center"/>
+            </w:pPr>
+            <w:ins w:id="9254" w:author="Revisão" w:date="2026-09-28T12:00:00Z">
               <w:r>
                 <w:rPr>
                   <w:rFonts w:ascii="Times New Roman" w:cs="Times New Roman" w:eastAsia="Times New Roman" w:hAnsi="Times New Roman"/>
@@ -25804,7 +25872,7 @@
               <w:spacing w:after="0" w:before="0" w:line="240"/>
               <w:jc w:val="center"/>
             </w:pPr>
-            <w:del w:id="9217" w:author="Revisão" w:date="2026-09-28T12:00:00Z">
+            <w:del w:id="9221" w:author="Revisão" w:date="2026-09-28T12:00:00Z">
               <w:r>
                 <w:rPr>
                   <w:rFonts w:ascii="Times New Roman" w:cs="Times New Roman" w:eastAsia="Times New Roman" w:hAnsi="Times New Roman"/>
@@ -25818,7 +25886,7 @@
                 <w:delText xml:space="preserve">0,757</w:delText>
               </w:r>
             </w:del>
-            <w:ins w:id="9218" w:author="Revisão" w:date="2026-09-28T12:00:00Z">
+            <w:ins w:id="9222" w:author="Revisão" w:date="2026-09-28T12:00:00Z">
               <w:r>
                 <w:rPr>
                   <w:rFonts w:ascii="Times New Roman" w:cs="Times New Roman" w:eastAsia="Times New Roman" w:hAnsi="Times New Roman"/>
@@ -25930,14 +25998,14 @@
               <w:bottom w:type="dxa" w:w="60"/>
               <w:right w:type="dxa" w:w="80"/>
             </w:tcMar>
-            <w:cellIns w:id="9251" w:author="Revisão" w:date="2026-09-28T12:00:00Z"/>
-          </w:tcPr>
-          <w:p>
-            <w:pPr>
-              <w:spacing w:after="0" w:before="0" w:line="240"/>
-              <w:jc w:val="center"/>
-            </w:pPr>
-            <w:ins w:id="9252" w:author="Revisão" w:date="2026-09-28T12:00:00Z">
+            <w:cellIns w:id="9255" w:author="Revisão" w:date="2026-09-28T12:00:00Z"/>
+          </w:tcPr>
+          <w:p>
+            <w:pPr>
+              <w:spacing w:after="0" w:before="0" w:line="240"/>
+              <w:jc w:val="center"/>
+            </w:pPr>
+            <w:ins w:id="9256" w:author="Revisão" w:date="2026-09-28T12:00:00Z">
               <w:r>
                 <w:rPr>
                   <w:rFonts w:ascii="Times New Roman" w:cs="Times New Roman" w:eastAsia="Times New Roman" w:hAnsi="Times New Roman"/>
@@ -25972,7 +26040,7 @@
         </w:rPr>
         <w:t xml:space="preserve">Fonte: elaboração própria. Médias sobre dez atribuições de firmas a partições. Em cada linha, os não eventos são todos os da amostra e os eventos são apenas os do tipo indicado; as linhas de tipo não são mutuamente exclusivas, porque uma entrada pode satisfazer mais de um critério. A linha de todas as entradas corresponde à comparação agregada da Tabela 10, com a diferença de que os valores desta tabela são médias sobre dez atribuições, </w:t>
       </w:r>
-      <w:del w:id="9253" w:author="Revisão" w:date="2026-09-28T12:00:00Z">
+      <w:del w:id="9257" w:author="Revisão" w:date="2026-09-28T12:00:00Z">
         <w:r>
           <w:rPr>
             <w:rFonts w:ascii="Times New Roman" w:cs="Times New Roman" w:eastAsia="Times New Roman" w:hAnsi="Times New Roman"/>
@@ -25986,7 +26054,7 @@
           <w:delText xml:space="preserve">e não os da atribuição de referência.</w:delText>
         </w:r>
       </w:del>
-      <w:ins w:id="9254" w:author="Revisão" w:date="2026-09-28T12:00:00Z">
+      <w:ins w:id="9258" w:author="Revisão" w:date="2026-09-28T12:00:00Z">
         <w:r>
           <w:rPr>
             <w:rFonts w:ascii="Times New Roman" w:cs="Times New Roman" w:eastAsia="Times New Roman" w:hAnsi="Times New Roman"/>
@@ -27801,7 +27869,7 @@
         </w:rPr>
         <w:t xml:space="preserve">A reestimação sem as entradas por prejuízo operacional completa o quadro. Nas 83 entradas restantes, o escore sintético alcança 0,857, o escore supervisionado 0,856 </w:t>
       </w:r>
-      <w:del w:id="9225" w:author="Revisão" w:date="2026-09-28T12:00:00Z">
+      <w:del w:id="9229" w:author="Revisão" w:date="2026-09-28T12:00:00Z">
         <w:r>
           <w:rPr>
             <w:rFonts w:ascii="Times New Roman" w:cs="Times New Roman" w:eastAsia="Times New Roman" w:hAnsi="Times New Roman"/>
@@ -27815,7 +27883,7 @@
           <w:delText xml:space="preserve">e a referência não linear 0,858, sem diferença</w:delText>
         </w:r>
       </w:del>
-      <w:ins w:id="9226" w:author="Revisão" w:date="2026-09-28T12:00:00Z">
+      <w:ins w:id="9230" w:author="Revisão" w:date="2026-09-28T12:00:00Z">
         <w:r>
           <w:rPr>
             <w:rFonts w:ascii="Times New Roman" w:cs="Times New Roman" w:eastAsia="Times New Roman" w:hAnsi="Times New Roman"/>
@@ -27900,7 +27968,7 @@
         </w:rPr>
         <w:t xml:space="preserve">, em que essa condição se refere a exercícios posteriores ao da previsão, o escore alcança 0,377, valor abaixo de 0,500 que indica ordenação invertida. </w:t>
       </w:r>
-      <w:del w:id="9151" w:author="Revisão" w:date="2026-09-28T12:00:00Z">
+      <w:del w:id="9155" w:author="Revisão" w:date="2026-09-28T12:00:00Z">
         <w:r>
           <w:rPr>
             <w:rFonts w:ascii="Times New Roman" w:cs="Times New Roman" w:eastAsia="Times New Roman" w:hAnsi="Times New Roman"/>
@@ -27914,7 +27982,7 @@
           <w:delText xml:space="preserve">A segunda explicação é de composição, e é a que os dados sustentam:</w:delText>
         </w:r>
       </w:del>
-      <w:ins w:id="9152" w:author="Revisão" w:date="2026-09-28T12:00:00Z">
+      <w:ins w:id="9156" w:author="Revisão" w:date="2026-09-28T12:00:00Z">
         <w:r>
           <w:rPr>
             <w:rFonts w:ascii="Times New Roman" w:cs="Times New Roman" w:eastAsia="Times New Roman" w:hAnsi="Times New Roman"/>
@@ -29136,7 +29204,7 @@
         </w:rPr>
         <w:t xml:space="preserve">As firmas que caminham para o prejuízo operacional persistente apresentam, no momento da previsão, alavancagem mediana de 0,213 contra 0,326 das que não entram, liquidez corrente de 1,998 contra 1,430 e capital de giro superior. São menores e apresentam rentabilidade mais baixa, mas seu balanço é, nas dimensões de estrutura, melhor que o da firma mediana. Como o primeiro componente carrega sobretudo capital de giro, com 0,532, alavancagem, com 0,415, e liquidez corrente, com 0,373, o escore lê essas firmas como robustas. As que entram por patrimônio líquido negativo apresentam o perfil oposto, com alavancagem de 0,425 e liquidez de 0,944, e ali o escore acompanha as melhores alternativas. </w:t>
       </w:r>
-      <w:del w:id="9153" w:author="Revisão" w:date="2026-09-28T12:00:00Z">
+      <w:del w:id="9157" w:author="Revisão" w:date="2026-09-28T12:00:00Z">
         <w:r>
           <w:rPr>
             <w:rFonts w:ascii="Times New Roman" w:cs="Times New Roman" w:eastAsia="Times New Roman" w:hAnsi="Times New Roman"/>
@@ -29150,7 +29218,7 @@
           <w:delText xml:space="preserve">A limitação não é de agregação em geral, e sim da composição deste escore: ele mede deterioração patrimonial e é cego à rota que começa no resultado operacional de firmas pouco endividadas.</w:delText>
         </w:r>
       </w:del>
-      <w:ins w:id="9154" w:author="Revisão" w:date="2026-09-28T12:00:00Z">
+      <w:ins w:id="9158" w:author="Revisão" w:date="2026-09-28T12:00:00Z">
         <w:r>
           <w:rPr>
             <w:rFonts w:ascii="Times New Roman" w:cs="Times New Roman" w:eastAsia="Times New Roman" w:hAnsi="Times New Roman"/>
@@ -30687,7 +30755,7 @@
         </w:rPr>
         <w:t xml:space="preserve">Para avaliar H4, construiu-se um segundo escore alterando exclusivamente o critério de agregação, por mínimos quadrados parciais aplicados a resposta binária (WOLD; SJÖSTRÖM; ERIKSSON, 2001; BARKER; RAYENS, 2003), mantidos o conjunto de variáveis, o pré-processamento, a amostra e o procedimento de avaliação. Sobre o agregado, a substituição eleva a área sob a curva de 0,764 para 0,875, e a análise diagnóstica fornece evidência consistente com H4. As duas leituras não se contradizem, e convém explicitar como se articulam: H4 procura explicar a diferença entre o escore não supervisionado e os melhores benchmarks, e a decomposição mostra que essa diferença existe em uma única rota de deterioração. A supervisão recupera desempenho onde há diferença a recuperar, e nada onde não há. A decomposição qualifica, portanto, o alcance de H4 sem invalidá-la: </w:t>
       </w:r>
-      <w:del w:id="9155" w:author="Revisão" w:date="2026-09-28T12:00:00Z">
+      <w:del w:id="9159" w:author="Revisão" w:date="2026-09-28T12:00:00Z">
         <w:r>
           <w:rPr>
             <w:rFonts w:ascii="Times New Roman" w:cs="Times New Roman" w:eastAsia="Times New Roman" w:hAnsi="Times New Roman"/>
@@ -30701,7 +30769,7 @@
           <w:delText xml:space="preserve">o ganho concentra-se inteiramente nas entradas pelo critério de EBITDA e desaparece quando os modelos são reestimados sem elas</w:delText>
         </w:r>
       </w:del>
-      <w:ins w:id="9156" w:author="Revisão" w:date="2026-09-28T12:00:00Z">
+      <w:ins w:id="9160" w:author="Revisão" w:date="2026-09-28T12:00:00Z">
         <w:r>
           <w:rPr>
             <w:rFonts w:ascii="Times New Roman" w:cs="Times New Roman" w:eastAsia="Times New Roman" w:hAnsi="Times New Roman"/>
@@ -30746,7 +30814,7 @@
         </w:rPr>
         <w:t xml:space="preserve">A referência não linear delimita o alcance por cima. Sobre as mesmas oito variáveis, </w:t>
       </w:r>
-      <w:del w:id="9227" w:author="Revisão" w:date="2026-09-28T12:00:00Z">
+      <w:del w:id="9231" w:author="Revisão" w:date="2026-09-28T12:00:00Z">
         <w:r>
           <w:rPr>
             <w:rFonts w:ascii="Times New Roman" w:cs="Times New Roman" w:eastAsia="Times New Roman" w:hAnsi="Times New Roman"/>
@@ -30760,7 +30828,7 @@
           <w:delText xml:space="preserve">as árvores impulsionadas alcançam 0,900, e a diferença para a cobertura de juros isolada, de 0,006 ponto,</w:delText>
         </w:r>
       </w:del>
-      <w:ins w:id="9228" w:author="Revisão" w:date="2026-09-28T12:00:00Z">
+      <w:ins w:id="9232" w:author="Revisão" w:date="2026-09-28T12:00:00Z">
         <w:r>
           <w:rPr>
             <w:rFonts w:ascii="Times New Roman" w:cs="Times New Roman" w:eastAsia="Times New Roman" w:hAnsi="Times New Roman"/>
@@ -31116,14 +31184,14 @@
               <w:bottom w:type="dxa" w:w="60"/>
               <w:right w:type="dxa" w:w="80"/>
             </w:tcMar>
-            <w:cellIns w:id="9389" w:author="Revisão" w:date="2026-09-28T12:00:00Z"/>
-          </w:tcPr>
-          <w:p>
-            <w:pPr>
-              <w:spacing w:after="0" w:before="0" w:line="240"/>
-              <w:jc w:val="center"/>
-            </w:pPr>
-            <w:ins w:id="9390" w:author="Revisão" w:date="2026-09-28T12:00:00Z">
+            <w:cellIns w:id="9393" w:author="Revisão" w:date="2026-09-28T12:00:00Z"/>
+          </w:tcPr>
+          <w:p>
+            <w:pPr>
+              <w:spacing w:after="0" w:before="0" w:line="240"/>
+              <w:jc w:val="center"/>
+            </w:pPr>
+            <w:ins w:id="9394" w:author="Revisão" w:date="2026-09-28T12:00:00Z">
               <w:r>
                 <w:rPr>
                   <w:rFonts w:ascii="Times New Roman" w:cs="Times New Roman" w:eastAsia="Times New Roman" w:hAnsi="Times New Roman"/>
@@ -31149,14 +31217,14 @@
               <w:bottom w:type="dxa" w:w="60"/>
               <w:right w:type="dxa" w:w="80"/>
             </w:tcMar>
-            <w:cellIns w:id="9373" w:author="Revisão" w:date="2026-09-28T12:00:00Z"/>
-          </w:tcPr>
-          <w:p>
-            <w:pPr>
-              <w:spacing w:after="0" w:before="0" w:line="240"/>
-              <w:jc w:val="center"/>
-            </w:pPr>
-            <w:ins w:id="9374" w:author="Revisão" w:date="2026-09-28T12:00:00Z">
+            <w:cellIns w:id="9377" w:author="Revisão" w:date="2026-09-28T12:00:00Z"/>
+          </w:tcPr>
+          <w:p>
+            <w:pPr>
+              <w:spacing w:after="0" w:before="0" w:line="240"/>
+              <w:jc w:val="center"/>
+            </w:pPr>
+            <w:ins w:id="9378" w:author="Revisão" w:date="2026-09-28T12:00:00Z">
               <w:r>
                 <w:rPr>
                   <w:rFonts w:ascii="Times New Roman" w:cs="Times New Roman" w:eastAsia="Times New Roman" w:hAnsi="Times New Roman"/>
@@ -31424,14 +31492,14 @@
               <w:bottom w:type="dxa" w:w="60"/>
               <w:right w:type="dxa" w:w="80"/>
             </w:tcMar>
-            <w:cellIns w:id="9391" w:author="Revisão" w:date="2026-09-28T12:00:00Z"/>
-          </w:tcPr>
-          <w:p>
-            <w:pPr>
-              <w:spacing w:after="0" w:before="0" w:line="240"/>
-              <w:jc w:val="center"/>
-            </w:pPr>
-            <w:ins w:id="9392" w:author="Revisão" w:date="2026-09-28T12:00:00Z">
+            <w:cellIns w:id="9395" w:author="Revisão" w:date="2026-09-28T12:00:00Z"/>
+          </w:tcPr>
+          <w:p>
+            <w:pPr>
+              <w:spacing w:after="0" w:before="0" w:line="240"/>
+              <w:jc w:val="center"/>
+            </w:pPr>
+            <w:ins w:id="9396" w:author="Revisão" w:date="2026-09-28T12:00:00Z">
               <w:r>
                 <w:rPr>
                   <w:rFonts w:ascii="Times New Roman" w:cs="Times New Roman" w:eastAsia="Times New Roman" w:hAnsi="Times New Roman"/>
@@ -31456,14 +31524,14 @@
               <w:bottom w:type="dxa" w:w="60"/>
               <w:right w:type="dxa" w:w="80"/>
             </w:tcMar>
-            <w:cellIns w:id="9375" w:author="Revisão" w:date="2026-09-28T12:00:00Z"/>
-          </w:tcPr>
-          <w:p>
-            <w:pPr>
-              <w:spacing w:after="0" w:before="0" w:line="240"/>
-              <w:jc w:val="center"/>
-            </w:pPr>
-            <w:ins w:id="9376" w:author="Revisão" w:date="2026-09-28T12:00:00Z">
+            <w:cellIns w:id="9379" w:author="Revisão" w:date="2026-09-28T12:00:00Z"/>
+          </w:tcPr>
+          <w:p>
+            <w:pPr>
+              <w:spacing w:after="0" w:before="0" w:line="240"/>
+              <w:jc w:val="center"/>
+            </w:pPr>
+            <w:ins w:id="9380" w:author="Revisão" w:date="2026-09-28T12:00:00Z">
               <w:r>
                 <w:rPr>
                   <w:rFonts w:ascii="Times New Roman" w:cs="Times New Roman" w:eastAsia="Times New Roman" w:hAnsi="Times New Roman"/>
@@ -31715,14 +31783,14 @@
               <w:bottom w:type="dxa" w:w="60"/>
               <w:right w:type="dxa" w:w="80"/>
             </w:tcMar>
-            <w:cellIns w:id="9393" w:author="Revisão" w:date="2026-09-28T12:00:00Z"/>
-          </w:tcPr>
-          <w:p>
-            <w:pPr>
-              <w:spacing w:after="0" w:before="0" w:line="240"/>
-              <w:jc w:val="center"/>
-            </w:pPr>
-            <w:ins w:id="9394" w:author="Revisão" w:date="2026-09-28T12:00:00Z">
+            <w:cellIns w:id="9397" w:author="Revisão" w:date="2026-09-28T12:00:00Z"/>
+          </w:tcPr>
+          <w:p>
+            <w:pPr>
+              <w:spacing w:after="0" w:before="0" w:line="240"/>
+              <w:jc w:val="center"/>
+            </w:pPr>
+            <w:ins w:id="9398" w:author="Revisão" w:date="2026-09-28T12:00:00Z">
               <w:r>
                 <w:rPr>
                   <w:rFonts w:ascii="Times New Roman" w:cs="Times New Roman" w:eastAsia="Times New Roman" w:hAnsi="Times New Roman"/>
@@ -31747,14 +31815,14 @@
               <w:bottom w:type="dxa" w:w="60"/>
               <w:right w:type="dxa" w:w="80"/>
             </w:tcMar>
-            <w:cellIns w:id="9377" w:author="Revisão" w:date="2026-09-28T12:00:00Z"/>
-          </w:tcPr>
-          <w:p>
-            <w:pPr>
-              <w:spacing w:after="0" w:before="0" w:line="240"/>
-              <w:jc w:val="center"/>
-            </w:pPr>
-            <w:ins w:id="9378" w:author="Revisão" w:date="2026-09-28T12:00:00Z">
+            <w:cellIns w:id="9381" w:author="Revisão" w:date="2026-09-28T12:00:00Z"/>
+          </w:tcPr>
+          <w:p>
+            <w:pPr>
+              <w:spacing w:after="0" w:before="0" w:line="240"/>
+              <w:jc w:val="center"/>
+            </w:pPr>
+            <w:ins w:id="9382" w:author="Revisão" w:date="2026-09-28T12:00:00Z">
               <w:r>
                 <w:rPr>
                   <w:rFonts w:ascii="Times New Roman" w:cs="Times New Roman" w:eastAsia="Times New Roman" w:hAnsi="Times New Roman"/>
@@ -31990,14 +32058,14 @@
               <w:bottom w:type="dxa" w:w="60"/>
               <w:right w:type="dxa" w:w="80"/>
             </w:tcMar>
-            <w:cellIns w:id="9395" w:author="Revisão" w:date="2026-09-28T12:00:00Z"/>
-          </w:tcPr>
-          <w:p>
-            <w:pPr>
-              <w:spacing w:after="0" w:before="0" w:line="240"/>
-              <w:jc w:val="center"/>
-            </w:pPr>
-            <w:ins w:id="9396" w:author="Revisão" w:date="2026-09-28T12:00:00Z">
+            <w:cellIns w:id="9399" w:author="Revisão" w:date="2026-09-28T12:00:00Z"/>
+          </w:tcPr>
+          <w:p>
+            <w:pPr>
+              <w:spacing w:after="0" w:before="0" w:line="240"/>
+              <w:jc w:val="center"/>
+            </w:pPr>
+            <w:ins w:id="9400" w:author="Revisão" w:date="2026-09-28T12:00:00Z">
               <w:r>
                 <w:rPr>
                   <w:rFonts w:ascii="Times New Roman" w:cs="Times New Roman" w:eastAsia="Times New Roman" w:hAnsi="Times New Roman"/>
@@ -32022,14 +32090,14 @@
               <w:bottom w:type="dxa" w:w="60"/>
               <w:right w:type="dxa" w:w="80"/>
             </w:tcMar>
-            <w:cellIns w:id="9379" w:author="Revisão" w:date="2026-09-28T12:00:00Z"/>
-          </w:tcPr>
-          <w:p>
-            <w:pPr>
-              <w:spacing w:after="0" w:before="0" w:line="240"/>
-              <w:jc w:val="center"/>
-            </w:pPr>
-            <w:ins w:id="9380" w:author="Revisão" w:date="2026-09-28T12:00:00Z">
+            <w:cellIns w:id="9383" w:author="Revisão" w:date="2026-09-28T12:00:00Z"/>
+          </w:tcPr>
+          <w:p>
+            <w:pPr>
+              <w:spacing w:after="0" w:before="0" w:line="240"/>
+              <w:jc w:val="center"/>
+            </w:pPr>
+            <w:ins w:id="9384" w:author="Revisão" w:date="2026-09-28T12:00:00Z">
               <w:r>
                 <w:rPr>
                   <w:rFonts w:ascii="Times New Roman" w:cs="Times New Roman" w:eastAsia="Times New Roman" w:hAnsi="Times New Roman"/>
@@ -32281,14 +32349,14 @@
               <w:bottom w:type="dxa" w:w="60"/>
               <w:right w:type="dxa" w:w="80"/>
             </w:tcMar>
-            <w:cellIns w:id="9397" w:author="Revisão" w:date="2026-09-28T12:00:00Z"/>
-          </w:tcPr>
-          <w:p>
-            <w:pPr>
-              <w:spacing w:after="0" w:before="0" w:line="240"/>
-              <w:jc w:val="center"/>
-            </w:pPr>
-            <w:ins w:id="9398" w:author="Revisão" w:date="2026-09-28T12:00:00Z">
+            <w:cellIns w:id="9401" w:author="Revisão" w:date="2026-09-28T12:00:00Z"/>
+          </w:tcPr>
+          <w:p>
+            <w:pPr>
+              <w:spacing w:after="0" w:before="0" w:line="240"/>
+              <w:jc w:val="center"/>
+            </w:pPr>
+            <w:ins w:id="9402" w:author="Revisão" w:date="2026-09-28T12:00:00Z">
               <w:r>
                 <w:rPr>
                   <w:rFonts w:ascii="Times New Roman" w:cs="Times New Roman" w:eastAsia="Times New Roman" w:hAnsi="Times New Roman"/>
@@ -32313,14 +32381,14 @@
               <w:bottom w:type="dxa" w:w="60"/>
               <w:right w:type="dxa" w:w="80"/>
             </w:tcMar>
-            <w:cellIns w:id="9381" w:author="Revisão" w:date="2026-09-28T12:00:00Z"/>
-          </w:tcPr>
-          <w:p>
-            <w:pPr>
-              <w:spacing w:after="0" w:before="0" w:line="240"/>
-              <w:jc w:val="center"/>
-            </w:pPr>
-            <w:ins w:id="9382" w:author="Revisão" w:date="2026-09-28T12:00:00Z">
+            <w:cellIns w:id="9385" w:author="Revisão" w:date="2026-09-28T12:00:00Z"/>
+          </w:tcPr>
+          <w:p>
+            <w:pPr>
+              <w:spacing w:after="0" w:before="0" w:line="240"/>
+              <w:jc w:val="center"/>
+            </w:pPr>
+            <w:ins w:id="9386" w:author="Revisão" w:date="2026-09-28T12:00:00Z">
               <w:r>
                 <w:rPr>
                   <w:rFonts w:ascii="Times New Roman" w:cs="Times New Roman" w:eastAsia="Times New Roman" w:hAnsi="Times New Roman"/>
@@ -32572,14 +32640,14 @@
               <w:bottom w:type="dxa" w:w="60"/>
               <w:right w:type="dxa" w:w="80"/>
             </w:tcMar>
-            <w:cellIns w:id="9399" w:author="Revisão" w:date="2026-09-28T12:00:00Z"/>
-          </w:tcPr>
-          <w:p>
-            <w:pPr>
-              <w:spacing w:after="0" w:before="0" w:line="240"/>
-              <w:jc w:val="center"/>
-            </w:pPr>
-            <w:ins w:id="9400" w:author="Revisão" w:date="2026-09-28T12:00:00Z">
+            <w:cellIns w:id="9403" w:author="Revisão" w:date="2026-09-28T12:00:00Z"/>
+          </w:tcPr>
+          <w:p>
+            <w:pPr>
+              <w:spacing w:after="0" w:before="0" w:line="240"/>
+              <w:jc w:val="center"/>
+            </w:pPr>
+            <w:ins w:id="9404" w:author="Revisão" w:date="2026-09-28T12:00:00Z">
               <w:r>
                 <w:rPr>
                   <w:rFonts w:ascii="Times New Roman" w:cs="Times New Roman" w:eastAsia="Times New Roman" w:hAnsi="Times New Roman"/>
@@ -32604,14 +32672,14 @@
               <w:bottom w:type="dxa" w:w="60"/>
               <w:right w:type="dxa" w:w="80"/>
             </w:tcMar>
-            <w:cellIns w:id="9383" w:author="Revisão" w:date="2026-09-28T12:00:00Z"/>
-          </w:tcPr>
-          <w:p>
-            <w:pPr>
-              <w:spacing w:after="0" w:before="0" w:line="240"/>
-              <w:jc w:val="center"/>
-            </w:pPr>
-            <w:ins w:id="9384" w:author="Revisão" w:date="2026-09-28T12:00:00Z">
+            <w:cellIns w:id="9387" w:author="Revisão" w:date="2026-09-28T12:00:00Z"/>
+          </w:tcPr>
+          <w:p>
+            <w:pPr>
+              <w:spacing w:after="0" w:before="0" w:line="240"/>
+              <w:jc w:val="center"/>
+            </w:pPr>
+            <w:ins w:id="9388" w:author="Revisão" w:date="2026-09-28T12:00:00Z">
               <w:r>
                 <w:rPr>
                   <w:rFonts w:ascii="Times New Roman" w:cs="Times New Roman" w:eastAsia="Times New Roman" w:hAnsi="Times New Roman"/>
@@ -32879,14 +32947,14 @@
               <w:bottom w:type="dxa" w:w="60"/>
               <w:right w:type="dxa" w:w="80"/>
             </w:tcMar>
-            <w:cellIns w:id="9401" w:author="Revisão" w:date="2026-09-28T12:00:00Z"/>
-          </w:tcPr>
-          <w:p>
-            <w:pPr>
-              <w:spacing w:after="0" w:before="0" w:line="240"/>
-              <w:jc w:val="center"/>
-            </w:pPr>
-            <w:ins w:id="9402" w:author="Revisão" w:date="2026-09-28T12:00:00Z">
+            <w:cellIns w:id="9405" w:author="Revisão" w:date="2026-09-28T12:00:00Z"/>
+          </w:tcPr>
+          <w:p>
+            <w:pPr>
+              <w:spacing w:after="0" w:before="0" w:line="240"/>
+              <w:jc w:val="center"/>
+            </w:pPr>
+            <w:ins w:id="9406" w:author="Revisão" w:date="2026-09-28T12:00:00Z">
               <w:r>
                 <w:rPr>
                   <w:rFonts w:ascii="Times New Roman" w:cs="Times New Roman" w:eastAsia="Times New Roman" w:hAnsi="Times New Roman"/>
@@ -32911,14 +32979,14 @@
               <w:bottom w:type="dxa" w:w="60"/>
               <w:right w:type="dxa" w:w="80"/>
             </w:tcMar>
-            <w:cellIns w:id="9385" w:author="Revisão" w:date="2026-09-28T12:00:00Z"/>
-          </w:tcPr>
-          <w:p>
-            <w:pPr>
-              <w:spacing w:after="0" w:before="0" w:line="240"/>
-              <w:jc w:val="center"/>
-            </w:pPr>
-            <w:ins w:id="9386" w:author="Revisão" w:date="2026-09-28T12:00:00Z">
+            <w:cellIns w:id="9389" w:author="Revisão" w:date="2026-09-28T12:00:00Z"/>
+          </w:tcPr>
+          <w:p>
+            <w:pPr>
+              <w:spacing w:after="0" w:before="0" w:line="240"/>
+              <w:jc w:val="center"/>
+            </w:pPr>
+            <w:ins w:id="9390" w:author="Revisão" w:date="2026-09-28T12:00:00Z">
               <w:r>
                 <w:rPr>
                   <w:rFonts w:ascii="Times New Roman" w:cs="Times New Roman" w:eastAsia="Times New Roman" w:hAnsi="Times New Roman"/>
@@ -33122,14 +33190,14 @@
               <w:bottom w:type="dxa" w:w="60"/>
               <w:right w:type="dxa" w:w="80"/>
             </w:tcMar>
-            <w:cellIns w:id="9403" w:author="Revisão" w:date="2026-09-28T12:00:00Z"/>
-          </w:tcPr>
-          <w:p>
-            <w:pPr>
-              <w:spacing w:after="0" w:before="0" w:line="240"/>
-              <w:jc w:val="center"/>
-            </w:pPr>
-            <w:ins w:id="9404" w:author="Revisão" w:date="2026-09-28T12:00:00Z">
+            <w:cellIns w:id="9407" w:author="Revisão" w:date="2026-09-28T12:00:00Z"/>
+          </w:tcPr>
+          <w:p>
+            <w:pPr>
+              <w:spacing w:after="0" w:before="0" w:line="240"/>
+              <w:jc w:val="center"/>
+            </w:pPr>
+            <w:ins w:id="9408" w:author="Revisão" w:date="2026-09-28T12:00:00Z">
               <w:r>
                 <w:rPr>
                   <w:rFonts w:ascii="Times New Roman" w:cs="Times New Roman" w:eastAsia="Times New Roman" w:hAnsi="Times New Roman"/>
@@ -33154,14 +33222,14 @@
               <w:bottom w:type="dxa" w:w="60"/>
               <w:right w:type="dxa" w:w="80"/>
             </w:tcMar>
-            <w:cellIns w:id="9387" w:author="Revisão" w:date="2026-09-28T12:00:00Z"/>
-          </w:tcPr>
-          <w:p>
-            <w:pPr>
-              <w:spacing w:after="0" w:before="0" w:line="240"/>
-              <w:jc w:val="center"/>
-            </w:pPr>
-            <w:ins w:id="9388" w:author="Revisão" w:date="2026-09-28T12:00:00Z">
+            <w:cellIns w:id="9391" w:author="Revisão" w:date="2026-09-28T12:00:00Z"/>
+          </w:tcPr>
+          <w:p>
+            <w:pPr>
+              <w:spacing w:after="0" w:before="0" w:line="240"/>
+              <w:jc w:val="center"/>
+            </w:pPr>
+            <w:ins w:id="9392" w:author="Revisão" w:date="2026-09-28T12:00:00Z">
               <w:r>
                 <w:rPr>
                   <w:rFonts w:ascii="Times New Roman" w:cs="Times New Roman" w:eastAsia="Times New Roman" w:hAnsi="Times New Roman"/>
@@ -34016,7 +34084,7 @@
               <w:spacing w:after="0" w:before="0" w:line="240"/>
               <w:jc w:val="center"/>
             </w:pPr>
-            <w:del w:id="9219" w:author="Revisão" w:date="2026-09-28T12:00:00Z">
+            <w:del w:id="9223" w:author="Revisão" w:date="2026-09-28T12:00:00Z">
               <w:r>
                 <w:rPr>
                   <w:rFonts w:ascii="Times New Roman" w:cs="Times New Roman" w:eastAsia="Times New Roman" w:hAnsi="Times New Roman"/>
@@ -34030,7 +34098,7 @@
                 <w:delText xml:space="preserve">0,858</w:delText>
               </w:r>
             </w:del>
-            <w:ins w:id="9220" w:author="Revisão" w:date="2026-09-28T12:00:00Z">
+            <w:ins w:id="9224" w:author="Revisão" w:date="2026-09-28T12:00:00Z">
               <w:r>
                 <w:rPr>
                   <w:rFonts w:ascii="Times New Roman" w:cs="Times New Roman" w:eastAsia="Times New Roman" w:hAnsi="Times New Roman"/>
@@ -34240,7 +34308,7 @@
               <w:spacing w:after="0" w:before="0" w:line="240"/>
               <w:jc w:val="center"/>
             </w:pPr>
-            <w:del w:id="9221" w:author="Revisão" w:date="2026-09-28T12:00:00Z">
+            <w:del w:id="9225" w:author="Revisão" w:date="2026-09-28T12:00:00Z">
               <w:r>
                 <w:rPr>
                   <w:rFonts w:ascii="Times New Roman" w:cs="Times New Roman" w:eastAsia="Times New Roman" w:hAnsi="Times New Roman"/>
@@ -34254,7 +34322,7 @@
                 <w:delText xml:space="preserve">0,955</w:delText>
               </w:r>
             </w:del>
-            <w:ins w:id="9222" w:author="Revisão" w:date="2026-09-28T12:00:00Z">
+            <w:ins w:id="9226" w:author="Revisão" w:date="2026-09-28T12:00:00Z">
               <w:r>
                 <w:rPr>
                   <w:rFonts w:ascii="Times New Roman" w:cs="Times New Roman" w:eastAsia="Times New Roman" w:hAnsi="Times New Roman"/>
@@ -37240,7 +37308,7 @@
         </w:rPr>
         <w:t xml:space="preserve">A contribuição está em mostrar que essa conclusão agregada é produzida por uma das rotas de deterioração. Decomposto o evento pelo critério que o define, o escore fica muito atrás apenas nas entradas por prejuízo operacional persistente, </w:t>
       </w:r>
-      <w:del w:id="9351" w:author="Revisão" w:date="2026-09-28T12:00:00Z">
+      <w:del w:id="9355" w:author="Revisão" w:date="2026-09-28T12:00:00Z">
         <w:r>
           <w:rPr>
             <w:rFonts w:ascii="Times New Roman" w:cs="Times New Roman" w:eastAsia="Times New Roman" w:hAnsi="Times New Roman"/>
@@ -37254,7 +37322,7 @@
           <w:delText xml:space="preserve">com 0,649 contra 0,973 da cobertura de juros.</w:delText>
         </w:r>
       </w:del>
-      <w:ins w:id="9352" w:author="Revisão" w:date="2026-09-28T12:00:00Z">
+      <w:ins w:id="9356" w:author="Revisão" w:date="2026-09-28T12:00:00Z">
         <w:r>
           <w:rPr>
             <w:rFonts w:ascii="Times New Roman" w:cs="Times New Roman" w:eastAsia="Times New Roman" w:hAnsi="Times New Roman"/>
@@ -37320,7 +37388,7 @@
         </w:rPr>
         <w:t xml:space="preserve"> No caso da recuperação judicial, com onze entradas puras, essa ausência de diferença reflete também a baixa precisão da comparação, e não sustenta afirmação forte em nenhuma direção. </w:t>
       </w:r>
-      <w:del w:id="9157" w:author="Revisão" w:date="2026-09-28T12:00:00Z">
+      <w:del w:id="9161" w:author="Revisão" w:date="2026-09-28T12:00:00Z">
         <w:r>
           <w:rPr>
             <w:rFonts w:ascii="Times New Roman" w:cs="Times New Roman" w:eastAsia="Times New Roman" w:hAnsi="Times New Roman"/>
@@ -37334,7 +37402,7 @@
           <w:delText xml:space="preserve">Retiradas as entradas por prejuízo operacional, a vantagem da agregação supervisionada desaparece por completo.</w:delText>
         </w:r>
       </w:del>
-      <w:ins w:id="9158" w:author="Revisão" w:date="2026-09-28T12:00:00Z">
+      <w:ins w:id="9162" w:author="Revisão" w:date="2026-09-28T12:00:00Z">
         <w:r>
           <w:rPr>
             <w:rFonts w:ascii="Times New Roman" w:cs="Times New Roman" w:eastAsia="Times New Roman" w:hAnsi="Times New Roman"/>
@@ -37355,7 +37423,7 @@
         <w:ind w:firstLine="708"/>
         <w:jc w:val="both"/>
       </w:pPr>
-      <w:del w:id="9159" w:author="Revisão" w:date="2026-09-28T12:00:00Z">
+      <w:del w:id="9163" w:author="Revisão" w:date="2026-09-28T12:00:00Z">
         <w:r>
           <w:rPr>
             <w:rFonts w:ascii="Times New Roman" w:cs="Times New Roman" w:eastAsia="Times New Roman" w:hAnsi="Times New Roman"/>
@@ -37369,7 +37437,7 @@
           <w:delText xml:space="preserve">A explicação é de composição e está nos dados.</w:delText>
         </w:r>
       </w:del>
-      <w:ins w:id="9160" w:author="Revisão" w:date="2026-09-28T12:00:00Z">
+      <w:ins w:id="9164" w:author="Revisão" w:date="2026-09-28T12:00:00Z">
         <w:r>
           <w:rPr>
             <w:rFonts w:ascii="Times New Roman" w:cs="Times New Roman" w:eastAsia="Times New Roman" w:hAnsi="Times New Roman"/>
@@ -37395,7 +37463,7 @@
         </w:rPr>
         <w:t xml:space="preserve"> As firmas que caminham para o prejuízo operacional apresentam, no momento da previsão, alavancagem mediana de 0,213 contra 0,326 das que não entram e liquidez corrente de 1,998 contra 1,430: seu balanço é, nas dimensões de estrutura, melhor que o da firma mediana. Um escore cujas maiores cargas são capital de giro, alavancagem e liquidez as classifica como robustas, a ponto de a ordenação se inverter no horizonte de dois anos. </w:t>
       </w:r>
-      <w:del w:id="9161" w:author="Revisão" w:date="2026-09-28T12:00:00Z">
+      <w:del w:id="9165" w:author="Revisão" w:date="2026-09-28T12:00:00Z">
         <w:r>
           <w:rPr>
             <w:rFonts w:ascii="Times New Roman" w:cs="Times New Roman" w:eastAsia="Times New Roman" w:hAnsi="Times New Roman"/>
@@ -37409,7 +37477,7 @@
           <w:delText xml:space="preserve">A limitação não é da agregação em geral, e sim da composição deste escore, que mede deterioração patrimonial e é cego à rota que começa no resultado operacional de firmas pouco endividadas.</w:delText>
         </w:r>
       </w:del>
-      <w:ins w:id="9162" w:author="Revisão" w:date="2026-09-28T12:00:00Z">
+      <w:ins w:id="9166" w:author="Revisão" w:date="2026-09-28T12:00:00Z">
         <w:r>
           <w:rPr>
             <w:rFonts w:ascii="Times New Roman" w:cs="Times New Roman" w:eastAsia="Times New Roman" w:hAnsi="Times New Roman"/>
@@ -37435,7 +37503,7 @@
         </w:rPr>
         <w:t xml:space="preserve"> A multidimensionalidade documentada na avaliação de H1 e o desempenho agregado inferior documentado na de H2 </w:t>
       </w:r>
-      <w:del w:id="9169" w:author="Revisão" w:date="2026-09-28T12:00:00Z">
+      <w:del w:id="9173" w:author="Revisão" w:date="2026-09-28T12:00:00Z">
         <w:r>
           <w:rPr>
             <w:rFonts w:ascii="Times New Roman" w:cs="Times New Roman" w:eastAsia="Times New Roman" w:hAnsi="Times New Roman"/>
@@ -37449,7 +37517,7 @@
           <w:delText xml:space="preserve">são, assim, o mesmo fato observado de dois ângulos</w:delText>
         </w:r>
       </w:del>
-      <w:ins w:id="9170" w:author="Revisão" w:date="2026-09-28T12:00:00Z">
+      <w:ins w:id="9174" w:author="Revisão" w:date="2026-09-28T12:00:00Z">
         <w:r>
           <w:rPr>
             <w:rFonts w:ascii="Times New Roman" w:cs="Times New Roman" w:eastAsia="Times New Roman" w:hAnsi="Times New Roman"/>
@@ -37494,7 +37562,7 @@
         </w:rPr>
         <w:t xml:space="preserve">O achado tem implicação metodológica que excede o indicador avaliado. Medidas sintéticas de risco são avaliadas contra eventos definidos por critérios heterogêneos, que correspondem a rotas distintas de deterioração, e o desempenho é reportado sobre o agregado. A decomposição por critério é barata e </w:t>
       </w:r>
-      <w:del w:id="9167" w:author="Revisão" w:date="2026-09-28T12:00:00Z">
+      <w:del w:id="9171" w:author="Revisão" w:date="2026-09-28T12:00:00Z">
         <w:r>
           <w:rPr>
             <w:rFonts w:ascii="Times New Roman" w:cs="Times New Roman" w:eastAsia="Times New Roman" w:hAnsi="Times New Roman"/>
@@ -37508,7 +37576,7 @@
           <w:delText xml:space="preserve">revela se o indicador é uniformemente inferior ou apenas cego a uma das rotas</w:delText>
         </w:r>
       </w:del>
-      <w:ins w:id="9168" w:author="Revisão" w:date="2026-09-28T12:00:00Z">
+      <w:ins w:id="9172" w:author="Revisão" w:date="2026-09-28T12:00:00Z">
         <w:r>
           <w:rPr>
             <w:rFonts w:ascii="Times New Roman" w:cs="Times New Roman" w:eastAsia="Times New Roman" w:hAnsi="Times New Roman"/>
@@ -37629,7 +37697,7 @@
         </w:rPr>
         <w:t xml:space="preserve">A agregação do escore em índice setorial ou macroeconômico, com avaliação de seu conteúdo preditivo sobre investimento e condições de crédito, é extensão natural da leitura minskyana e depende de frequência superior à anual. O levantamento de cobertura das informações trimestrais indica que essa via é praticável no universo aqui estudado, </w:t>
       </w:r>
-      <w:del w:id="9289" w:author="Revisão" w:date="2026-09-28T12:00:00Z">
+      <w:del w:id="9293" w:author="Revisão" w:date="2026-09-28T12:00:00Z">
         <w:r>
           <w:rPr>
             <w:rFonts w:ascii="Times New Roman" w:cs="Times New Roman" w:eastAsia="Times New Roman" w:hAnsi="Times New Roman"/>
@@ -37643,7 +37711,7 @@
           <w:delText xml:space="preserve">o que a qualifica como extensão viável, e não apenas desejável.</w:delText>
         </w:r>
       </w:del>
-      <w:ins w:id="9290" w:author="Revisão" w:date="2026-09-28T12:00:00Z">
+      <w:ins w:id="9294" w:author="Revisão" w:date="2026-09-28T12:00:00Z">
         <w:r>
           <w:rPr>
             <w:rFonts w:ascii="Times New Roman" w:cs="Times New Roman" w:eastAsia="Times New Roman" w:hAnsi="Times New Roman"/>
@@ -37664,10 +37732,10 @@
         <w:spacing w:after="180" w:before="360" w:line="360"/>
         <w:jc w:val="left"/>
         <w:rPr>
-          <w:ins w:id="9367" w:author="Revisão" w:date="2026-09-28T12:00:00Z"/>
+          <w:ins w:id="9371" w:author="Revisão" w:date="2026-09-28T12:00:00Z"/>
         </w:rPr>
       </w:pPr>
-      <w:ins w:id="9368" w:author="Revisão" w:date="2026-09-28T12:00:00Z">
+      <w:ins w:id="9372" w:author="Revisão" w:date="2026-09-28T12:00:00Z">
         <w:r>
           <w:rPr>
             <w:rFonts w:ascii="Times New Roman" w:cs="Times New Roman" w:eastAsia="Times New Roman" w:hAnsi="Times New Roman"/>
@@ -37688,10 +37756,10 @@
         <w:ind w:firstLine="708"/>
         <w:jc w:val="both"/>
         <w:rPr>
-          <w:ins w:id="9365" w:author="Revisão" w:date="2026-09-28T12:00:00Z"/>
+          <w:ins w:id="9369" w:author="Revisão" w:date="2026-09-28T12:00:00Z"/>
         </w:rPr>
       </w:pPr>
-      <w:ins w:id="9366" w:author="Revisão" w:date="2026-09-28T12:00:00Z">
+      <w:ins w:id="9370" w:author="Revisão" w:date="2026-09-28T12:00:00Z">
         <w:r>
           <w:rPr>
             <w:rFonts w:ascii="Times New Roman" w:cs="Times New Roman" w:eastAsia="Times New Roman" w:hAnsi="Times New Roman"/>
@@ -37850,7 +37918,7 @@
         </w:rPr>
         <w:t xml:space="preserve">BRASIL. Ministério da Fazenda. Secretaria do Tesouro Nacional. Portaria n. 882, de 18 de dezembro de 2018. Define os conceitos das variáveis utilizadas e os procedimentos a serem adotados na análise da capacidade de pagamento e na apuração da suficiência das contragarantias oferecidas. </w:t>
       </w:r>
-      <w:del w:id="9319" w:author="Revisão" w:date="2026-09-28T12:00:00Z">
+      <w:del w:id="9323" w:author="Revisão" w:date="2026-09-28T12:00:00Z">
         <w:r>
           <w:rPr>
             <w:rFonts w:ascii="Times New Roman" w:cs="Times New Roman" w:eastAsia="Times New Roman" w:hAnsi="Times New Roman"/>
@@ -37864,7 +37932,7 @@
           <w:delText xml:space="preserve">Diário Oficial da União, Brasília, DF, 20 dez. 2018.</w:delText>
         </w:r>
       </w:del>
-      <w:ins w:id="9320" w:author="Revisão" w:date="2026-09-28T12:00:00Z">
+      <w:ins w:id="9324" w:author="Revisão" w:date="2026-09-28T12:00:00Z">
         <w:r>
           <w:rPr>
             <w:rFonts w:ascii="Times New Roman" w:cs="Times New Roman" w:eastAsia="Times New Roman" w:hAnsi="Times New Roman"/>
@@ -37884,10 +37952,10 @@
         <w:spacing w:after="180" w:before="0" w:line="240"/>
         <w:jc w:val="left"/>
         <w:rPr>
-          <w:ins w:id="9321" w:author="Revisão" w:date="2026-09-28T12:00:00Z"/>
+          <w:ins w:id="9325" w:author="Revisão" w:date="2026-09-28T12:00:00Z"/>
         </w:rPr>
       </w:pPr>
-      <w:ins w:id="9322" w:author="Revisão" w:date="2026-09-28T12:00:00Z">
+      <w:ins w:id="9326" w:author="Revisão" w:date="2026-09-28T12:00:00Z">
         <w:r>
           <w:rPr>
             <w:rFonts w:ascii="Times New Roman" w:cs="Times New Roman" w:eastAsia="Times New Roman" w:hAnsi="Times New Roman"/>
@@ -37943,10 +38011,10 @@
         <w:spacing w:after="180" w:before="0" w:line="240"/>
         <w:jc w:val="left"/>
         <w:rPr>
-          <w:ins w:id="9323" w:author="Revisão" w:date="2026-09-28T12:00:00Z"/>
+          <w:ins w:id="9327" w:author="Revisão" w:date="2026-09-28T12:00:00Z"/>
         </w:rPr>
       </w:pPr>
-      <w:ins w:id="9324" w:author="Revisão" w:date="2026-09-28T12:00:00Z">
+      <w:ins w:id="9328" w:author="Revisão" w:date="2026-09-28T12:00:00Z">
         <w:r>
           <w:rPr>
             <w:rFonts w:ascii="Times New Roman" w:cs="Times New Roman" w:eastAsia="Times New Roman" w:hAnsi="Times New Roman"/>
@@ -38020,10 +38088,10 @@
         <w:spacing w:after="180" w:before="0" w:line="240"/>
         <w:jc w:val="left"/>
         <w:rPr>
-          <w:ins w:id="9325" w:author="Revisão" w:date="2026-09-28T12:00:00Z"/>
+          <w:ins w:id="9329" w:author="Revisão" w:date="2026-09-28T12:00:00Z"/>
         </w:rPr>
       </w:pPr>
-      <w:ins w:id="9326" w:author="Revisão" w:date="2026-09-28T12:00:00Z">
+      <w:ins w:id="9330" w:author="Revisão" w:date="2026-09-28T12:00:00Z">
         <w:r>
           <w:rPr>
             <w:rFonts w:ascii="Times New Roman" w:cs="Times New Roman" w:eastAsia="Times New Roman" w:hAnsi="Times New Roman"/>
@@ -38043,10 +38111,10 @@
         <w:spacing w:after="180" w:before="0" w:line="240"/>
         <w:jc w:val="left"/>
         <w:rPr>
-          <w:ins w:id="9327" w:author="Revisão" w:date="2026-09-28T12:00:00Z"/>
+          <w:ins w:id="9331" w:author="Revisão" w:date="2026-09-28T12:00:00Z"/>
         </w:rPr>
       </w:pPr>
-      <w:ins w:id="9328" w:author="Revisão" w:date="2026-09-28T12:00:00Z">
+      <w:ins w:id="9332" w:author="Revisão" w:date="2026-09-28T12:00:00Z">
         <w:r>
           <w:rPr>
             <w:rFonts w:ascii="Times New Roman" w:cs="Times New Roman" w:eastAsia="Times New Roman" w:hAnsi="Times New Roman"/>
@@ -38066,10 +38134,10 @@
         <w:spacing w:after="180" w:before="0" w:line="240"/>
         <w:jc w:val="left"/>
         <w:rPr>
-          <w:ins w:id="9329" w:author="Revisão" w:date="2026-09-28T12:00:00Z"/>
+          <w:ins w:id="9333" w:author="Revisão" w:date="2026-09-28T12:00:00Z"/>
         </w:rPr>
       </w:pPr>
-      <w:ins w:id="9330" w:author="Revisão" w:date="2026-09-28T12:00:00Z">
+      <w:ins w:id="9334" w:author="Revisão" w:date="2026-09-28T12:00:00Z">
         <w:r>
           <w:rPr>
             <w:rFonts w:ascii="Times New Roman" w:cs="Times New Roman" w:eastAsia="Times New Roman" w:hAnsi="Times New Roman"/>
@@ -38125,10 +38193,10 @@
         <w:spacing w:after="180" w:before="0" w:line="240"/>
         <w:jc w:val="left"/>
         <w:rPr>
-          <w:ins w:id="9331" w:author="Revisão" w:date="2026-09-28T12:00:00Z"/>
+          <w:ins w:id="9335" w:author="Revisão" w:date="2026-09-28T12:00:00Z"/>
         </w:rPr>
       </w:pPr>
-      <w:ins w:id="9332" w:author="Revisão" w:date="2026-09-28T12:00:00Z">
+      <w:ins w:id="9336" w:author="Revisão" w:date="2026-09-28T12:00:00Z">
         <w:r>
           <w:rPr>
             <w:rFonts w:ascii="Times New Roman" w:cs="Times New Roman" w:eastAsia="Times New Roman" w:hAnsi="Times New Roman"/>
@@ -38166,10 +38234,10 @@
         <w:spacing w:after="180" w:before="0" w:line="240"/>
         <w:jc w:val="left"/>
         <w:rPr>
-          <w:ins w:id="9343" w:author="Revisão" w:date="2026-09-28T12:00:00Z"/>
+          <w:ins w:id="9347" w:author="Revisão" w:date="2026-09-28T12:00:00Z"/>
         </w:rPr>
       </w:pPr>
-      <w:ins w:id="9344" w:author="Revisão" w:date="2026-09-28T12:00:00Z">
+      <w:ins w:id="9348" w:author="Revisão" w:date="2026-09-28T12:00:00Z">
         <w:r>
           <w:rPr>
             <w:rFonts w:ascii="Times New Roman" w:cs="Times New Roman" w:eastAsia="Times New Roman" w:hAnsi="Times New Roman"/>
@@ -38189,10 +38257,10 @@
         <w:spacing w:after="180" w:before="0" w:line="240"/>
         <w:jc w:val="left"/>
         <w:rPr>
-          <w:ins w:id="9333" w:author="Revisão" w:date="2026-09-28T12:00:00Z"/>
+          <w:ins w:id="9337" w:author="Revisão" w:date="2026-09-28T12:00:00Z"/>
         </w:rPr>
       </w:pPr>
-      <w:ins w:id="9334" w:author="Revisão" w:date="2026-09-28T12:00:00Z">
+      <w:ins w:id="9338" w:author="Revisão" w:date="2026-09-28T12:00:00Z">
         <w:r>
           <w:rPr>
             <w:rFonts w:ascii="Times New Roman" w:cs="Times New Roman" w:eastAsia="Times New Roman" w:hAnsi="Times New Roman"/>
@@ -38374,10 +38442,10 @@
         <w:spacing w:after="180" w:before="0" w:line="240"/>
         <w:jc w:val="left"/>
         <w:rPr>
-          <w:ins w:id="9335" w:author="Revisão" w:date="2026-09-28T12:00:00Z"/>
+          <w:ins w:id="9339" w:author="Revisão" w:date="2026-09-28T12:00:00Z"/>
         </w:rPr>
       </w:pPr>
-      <w:ins w:id="9336" w:author="Revisão" w:date="2026-09-28T12:00:00Z">
+      <w:ins w:id="9340" w:author="Revisão" w:date="2026-09-28T12:00:00Z">
         <w:r>
           <w:rPr>
             <w:rFonts w:ascii="Times New Roman" w:cs="Times New Roman" w:eastAsia="Times New Roman" w:hAnsi="Times New Roman"/>
@@ -38433,10 +38501,10 @@
         <w:spacing w:after="180" w:before="0" w:line="240"/>
         <w:jc w:val="left"/>
         <w:rPr>
-          <w:ins w:id="9337" w:author="Revisão" w:date="2026-09-28T12:00:00Z"/>
+          <w:ins w:id="9341" w:author="Revisão" w:date="2026-09-28T12:00:00Z"/>
         </w:rPr>
       </w:pPr>
-      <w:ins w:id="9338" w:author="Revisão" w:date="2026-09-28T12:00:00Z">
+      <w:ins w:id="9342" w:author="Revisão" w:date="2026-09-28T12:00:00Z">
         <w:r>
           <w:rPr>
             <w:rFonts w:ascii="Times New Roman" w:cs="Times New Roman" w:eastAsia="Times New Roman" w:hAnsi="Times New Roman"/>
@@ -38456,10 +38524,10 @@
         <w:spacing w:after="180" w:before="0" w:line="240"/>
         <w:jc w:val="left"/>
         <w:rPr>
-          <w:ins w:id="9339" w:author="Revisão" w:date="2026-09-28T12:00:00Z"/>
+          <w:ins w:id="9343" w:author="Revisão" w:date="2026-09-28T12:00:00Z"/>
         </w:rPr>
       </w:pPr>
-      <w:ins w:id="9340" w:author="Revisão" w:date="2026-09-28T12:00:00Z">
+      <w:ins w:id="9344" w:author="Revisão" w:date="2026-09-28T12:00:00Z">
         <w:r>
           <w:rPr>
             <w:rFonts w:ascii="Times New Roman" w:cs="Times New Roman" w:eastAsia="Times New Roman" w:hAnsi="Times New Roman"/>
@@ -38497,10 +38565,10 @@
         <w:spacing w:after="180" w:before="0" w:line="240"/>
         <w:jc w:val="left"/>
         <w:rPr>
-          <w:ins w:id="9345" w:author="Revisão" w:date="2026-09-28T12:00:00Z"/>
+          <w:ins w:id="9349" w:author="Revisão" w:date="2026-09-28T12:00:00Z"/>
         </w:rPr>
       </w:pPr>
-      <w:ins w:id="9346" w:author="Revisão" w:date="2026-09-28T12:00:00Z">
+      <w:ins w:id="9350" w:author="Revisão" w:date="2026-09-28T12:00:00Z">
         <w:r>
           <w:rPr>
             <w:rFonts w:ascii="Times New Roman" w:cs="Times New Roman" w:eastAsia="Times New Roman" w:hAnsi="Times New Roman"/>
@@ -38574,10 +38642,10 @@
         <w:spacing w:after="180" w:before="0" w:line="240"/>
         <w:jc w:val="left"/>
         <w:rPr>
-          <w:ins w:id="9341" w:author="Revisão" w:date="2026-09-28T12:00:00Z"/>
+          <w:ins w:id="9345" w:author="Revisão" w:date="2026-09-28T12:00:00Z"/>
         </w:rPr>
       </w:pPr>
-      <w:ins w:id="9342" w:author="Revisão" w:date="2026-09-28T12:00:00Z">
+      <w:ins w:id="9346" w:author="Revisão" w:date="2026-09-28T12:00:00Z">
         <w:r>
           <w:rPr>
             <w:rFonts w:ascii="Times New Roman" w:cs="Times New Roman" w:eastAsia="Times New Roman" w:hAnsi="Times New Roman"/>
@@ -38597,10 +38665,10 @@
         <w:spacing w:after="180" w:before="0" w:line="240"/>
         <w:jc w:val="left"/>
         <w:rPr>
-          <w:ins w:id="9349" w:author="Revisão" w:date="2026-09-28T12:00:00Z"/>
+          <w:ins w:id="9353" w:author="Revisão" w:date="2026-09-28T12:00:00Z"/>
         </w:rPr>
       </w:pPr>
-      <w:ins w:id="9350" w:author="Revisão" w:date="2026-09-28T12:00:00Z">
+      <w:ins w:id="9354" w:author="Revisão" w:date="2026-09-28T12:00:00Z">
         <w:r>
           <w:rPr>
             <w:rFonts w:ascii="Times New Roman" w:cs="Times New Roman" w:eastAsia="Times New Roman" w:hAnsi="Times New Roman"/>
@@ -38620,10 +38688,10 @@
         <w:spacing w:after="180" w:before="0" w:line="240"/>
         <w:jc w:val="left"/>
         <w:rPr>
-          <w:ins w:id="9347" w:author="Revisão" w:date="2026-09-28T12:00:00Z"/>
+          <w:ins w:id="9351" w:author="Revisão" w:date="2026-09-28T12:00:00Z"/>
         </w:rPr>
       </w:pPr>
-      <w:ins w:id="9348" w:author="Revisão" w:date="2026-09-28T12:00:00Z">
+      <w:ins w:id="9352" w:author="Revisão" w:date="2026-09-28T12:00:00Z">
         <w:r>
           <w:rPr>
             <w:rFonts w:ascii="Times New Roman" w:cs="Times New Roman" w:eastAsia="Times New Roman" w:hAnsi="Times New Roman"/>

</xml_diff>

<commit_message>
Escore com os tres indicadores de maior poder discriminante (script 16), texto na 5.6, 3.5 e conclusao; proposta de tecnicas de avaliacao no e-mail ao coorientador
Co-Authored-By: Claude Opus 5.5 <noreply@anthropic.com>
Claude-Session: https://claude.ai/code/session_01V4LwoZDLWB9PeJtPghPCix
</commit_message>
<xml_diff>
--- a/projeto/artigo/Artigo_Fragilidade_Financeira_revisado.docx
+++ b/projeto/artigo/Artigo_Fragilidade_Financeira_revisado.docx
@@ -73,7 +73,7 @@
         </w:rPr>
         <w:t xml:space="preserve">Examina-se se a agregação de indicadores contábeis em um escore sintético de fragilidade financeira se justifica frente aos seus melhores componentes isolados, em painel de 7.419 observações firma-ano de 730 companhias abertas não financeiras brasileiras entre 2010 e 2025. Sobre o agregado dos eventos a agregação não se justifica: a área sob a curva ROC do escore é de 0,764, contra 0,894 da cobertura de juros e 0,874 do retorno sobre ativos, em conclusão que se mantém sob validação cruzada agrupada por firma e sob avaliação temporal. </w:t>
       </w:r>
-      <w:del w:id="9295" w:author="Revisão" w:date="2026-09-28T12:00:00Z">
+      <w:del w:id="9301" w:author="Revisão" w:date="2026-09-28T12:00:00Z">
         <w:r>
           <w:rPr>
             <w:rFonts w:ascii="Times New Roman" w:cs="Times New Roman" w:eastAsia="Times New Roman" w:hAnsi="Times New Roman"/>
@@ -87,7 +87,7 @@
           <w:delText xml:space="preserve">Uma análise diagnóstica posterior decompõe o evento pelo critério que o define</w:delText>
         </w:r>
       </w:del>
-      <w:ins w:id="9296" w:author="Revisão" w:date="2026-09-28T12:00:00Z">
+      <w:ins w:id="9302" w:author="Revisão" w:date="2026-09-28T12:00:00Z">
         <w:r>
           <w:rPr>
             <w:rFonts w:ascii="Times New Roman" w:cs="Times New Roman" w:eastAsia="Times New Roman" w:hAnsi="Times New Roman"/>
@@ -229,10 +229,10 @@
         <w:spacing w:after="240" w:before="180" w:line="360"/>
         <w:jc w:val="both"/>
         <w:rPr>
-          <w:ins w:id="9366" w:author="Revisão" w:date="2026-09-28T12:00:00Z"/>
+          <w:ins w:id="9372" w:author="Revisão" w:date="2026-09-28T12:00:00Z"/>
         </w:rPr>
       </w:pPr>
-      <w:ins w:id="9367" w:author="Revisão" w:date="2026-09-28T12:00:00Z">
+      <w:ins w:id="9373" w:author="Revisão" w:date="2026-09-28T12:00:00Z">
         <w:r>
           <w:rPr>
             <w:rFonts w:ascii="Times New Roman" w:cs="Times New Roman" w:eastAsia="Times New Roman" w:hAnsi="Times New Roman"/>
@@ -246,7 +246,7 @@
           <w:t xml:space="preserve">Classificação JEL: </w:t>
         </w:r>
       </w:ins>
-      <w:ins w:id="9368" w:author="Revisão" w:date="2026-09-28T12:00:00Z">
+      <w:ins w:id="9374" w:author="Revisão" w:date="2026-09-28T12:00:00Z">
         <w:r>
           <w:rPr>
             <w:rFonts w:ascii="Times New Roman" w:cs="Times New Roman" w:eastAsia="Times New Roman" w:hAnsi="Times New Roman"/>
@@ -266,10 +266,10 @@
         <w:spacing w:after="120" w:before="0" w:line="360"/>
         <w:jc w:val="left"/>
         <w:rPr>
-          <w:ins w:id="9364" w:author="Revisão" w:date="2026-09-28T12:00:00Z"/>
+          <w:ins w:id="9370" w:author="Revisão" w:date="2026-09-28T12:00:00Z"/>
         </w:rPr>
       </w:pPr>
-      <w:ins w:id="9365" w:author="Revisão" w:date="2026-09-28T12:00:00Z">
+      <w:ins w:id="9371" w:author="Revisão" w:date="2026-09-28T12:00:00Z">
         <w:r>
           <w:rPr>
             <w:rFonts w:ascii="Times New Roman" w:cs="Times New Roman" w:eastAsia="Times New Roman" w:hAnsi="Times New Roman"/>
@@ -289,10 +289,10 @@
         <w:spacing w:after="0" w:before="0" w:line="360"/>
         <w:jc w:val="both"/>
         <w:rPr>
-          <w:ins w:id="9362" w:author="Revisão" w:date="2026-09-28T12:00:00Z"/>
+          <w:ins w:id="9368" w:author="Revisão" w:date="2026-09-28T12:00:00Z"/>
         </w:rPr>
       </w:pPr>
-      <w:ins w:id="9363" w:author="Revisão" w:date="2026-09-28T12:00:00Z">
+      <w:ins w:id="9369" w:author="Revisão" w:date="2026-09-28T12:00:00Z">
         <w:r>
           <w:rPr>
             <w:rFonts w:ascii="Times New Roman" w:cs="Times New Roman" w:eastAsia="Times New Roman" w:hAnsi="Times New Roman"/>
@@ -312,10 +312,10 @@
         <w:spacing w:after="240" w:before="180" w:line="360"/>
         <w:jc w:val="both"/>
         <w:rPr>
-          <w:ins w:id="9359" w:author="Revisão" w:date="2026-09-28T12:00:00Z"/>
+          <w:ins w:id="9365" w:author="Revisão" w:date="2026-09-28T12:00:00Z"/>
         </w:rPr>
       </w:pPr>
-      <w:ins w:id="9360" w:author="Revisão" w:date="2026-09-28T12:00:00Z">
+      <w:ins w:id="9366" w:author="Revisão" w:date="2026-09-28T12:00:00Z">
         <w:r>
           <w:rPr>
             <w:rFonts w:ascii="Times New Roman" w:cs="Times New Roman" w:eastAsia="Times New Roman" w:hAnsi="Times New Roman"/>
@@ -329,7 +329,7 @@
           <w:t xml:space="preserve">Keywords: </w:t>
         </w:r>
       </w:ins>
-      <w:ins w:id="9361" w:author="Revisão" w:date="2026-09-28T12:00:00Z">
+      <w:ins w:id="9367" w:author="Revisão" w:date="2026-09-28T12:00:00Z">
         <w:r>
           <w:rPr>
             <w:rFonts w:ascii="Times New Roman" w:cs="Times New Roman" w:eastAsia="Times New Roman" w:hAnsi="Times New Roman"/>
@@ -596,7 +596,7 @@
         </w:rPr>
         <w:t xml:space="preserve"> o indicador que define essa posição; e conteúdo preditivo, </w:t>
       </w:r>
-      <w:del w:id="9297" w:author="Revisão" w:date="2026-09-28T12:00:00Z">
+      <w:del w:id="9303" w:author="Revisão" w:date="2026-09-28T12:00:00Z">
         <w:r>
           <w:rPr>
             <w:rFonts w:ascii="Times New Roman" w:cs="Times New Roman" w:eastAsia="Times New Roman" w:hAnsi="Times New Roman"/>
@@ -610,7 +610,7 @@
           <w:delText xml:space="preserve">antecipando a entrada com significância inferior a um por mil.</w:delText>
         </w:r>
       </w:del>
-      <w:ins w:id="9298" w:author="Revisão" w:date="2026-09-28T12:00:00Z">
+      <w:ins w:id="9304" w:author="Revisão" w:date="2026-09-28T12:00:00Z">
         <w:r>
           <w:rPr>
             <w:rFonts w:ascii="Times New Roman" w:cs="Times New Roman" w:eastAsia="Times New Roman" w:hAnsi="Times New Roman"/>
@@ -1438,7 +1438,7 @@
         </w:rPr>
         <w:t xml:space="preserve">, </w:t>
       </w:r>
-      <w:del w:id="9357" w:author="Revisão" w:date="2026-09-28T12:00:00Z">
+      <w:del w:id="9363" w:author="Revisão" w:date="2026-09-28T12:00:00Z">
         <w:r>
           <w:rPr>
             <w:rFonts w:ascii="Times New Roman" w:cs="Times New Roman" w:eastAsia="Times New Roman" w:hAnsi="Times New Roman"/>
@@ -1452,7 +1452,7 @@
           <w:delText xml:space="preserve">e Mai et al. (2019) incorporam informação textual das divulgações corporativas.</w:delText>
         </w:r>
       </w:del>
-      <w:ins w:id="9358" w:author="Revisão" w:date="2026-09-28T12:00:00Z">
+      <w:ins w:id="9364" w:author="Revisão" w:date="2026-09-28T12:00:00Z">
         <w:r>
           <w:rPr>
             <w:rFonts w:ascii="Times New Roman" w:cs="Times New Roman" w:eastAsia="Times New Roman" w:hAnsi="Times New Roman"/>
@@ -1660,10 +1660,10 @@
         <w:ind w:firstLine="708"/>
         <w:jc w:val="both"/>
         <w:rPr>
-          <w:del w:id="9374" w:author="Revisão" w:date="2026-09-28T12:00:00Z"/>
+          <w:del w:id="9380" w:author="Revisão" w:date="2026-09-28T12:00:00Z"/>
         </w:rPr>
       </w:pPr>
-      <w:del w:id="9373" w:author="Revisão" w:date="2026-09-28T12:00:00Z">
+      <w:del w:id="9379" w:author="Revisão" w:date="2026-09-28T12:00:00Z">
         <w:r>
           <w:rPr>
             <w:rFonts w:ascii="Times New Roman" w:cs="Times New Roman" w:eastAsia="Times New Roman" w:hAnsi="Times New Roman"/>
@@ -1736,7 +1736,7 @@
         </w:rPr>
         <w:t xml:space="preserve">. </w:t>
       </w:r>
-      <w:del w:id="9289" w:author="Revisão" w:date="2026-09-28T12:00:00Z">
+      <w:del w:id="9295" w:author="Revisão" w:date="2026-09-28T12:00:00Z">
         <w:r>
           <w:rPr>
             <w:rFonts w:ascii="Times New Roman" w:cs="Times New Roman" w:eastAsia="Times New Roman" w:hAnsi="Times New Roman"/>
@@ -1750,7 +1750,7 @@
           <w:delText xml:space="preserve">Trata-se explicitamente o viés de sobrevivência, mantendo no painel as firmas que o deixam antes do fim do período.</w:delText>
         </w:r>
       </w:del>
-      <w:ins w:id="9290" w:author="Revisão" w:date="2026-09-28T12:00:00Z">
+      <w:ins w:id="9296" w:author="Revisão" w:date="2026-09-28T12:00:00Z">
         <w:r>
           <w:rPr>
             <w:rFonts w:ascii="Times New Roman" w:cs="Times New Roman" w:eastAsia="Times New Roman" w:hAnsi="Times New Roman"/>
@@ -1835,7 +1835,7 @@
         </w:rPr>
         <w:t xml:space="preserve">A sexta dimensão é a que organiza a contribuição. As duas tradições revisadas nunca foram confrontadas sob condições controladas. A literatura minskyana constrói medidas multidimensionais não supervisionadas e as emprega para caracterizar regimes financeiros, sem submetê-las a avaliação preditiva formal contra razões contábeis isoladas. A literatura de predição avalia rigorosamente o poder preditivo, mas parte de pesos estimados sobre o desfecho e, por isso, não testa a premissa de fator latente comum. Avaliar as duas rotas sobre a mesma amostra, com o mesmo conjunto de variáveis, o mesmo modelo preditivo e o mesmo critério de desempenho </w:t>
       </w:r>
-      <w:del w:id="9291" w:author="Revisão" w:date="2026-09-28T12:00:00Z">
+      <w:del w:id="9297" w:author="Revisão" w:date="2026-09-28T12:00:00Z">
         <w:r>
           <w:rPr>
             <w:rFonts w:ascii="Times New Roman" w:cs="Times New Roman" w:eastAsia="Times New Roman" w:hAnsi="Times New Roman"/>
@@ -1849,7 +1849,7 @@
           <w:delText xml:space="preserve">isola o efeito do método de agregação.</w:delText>
         </w:r>
       </w:del>
-      <w:ins w:id="9292" w:author="Revisão" w:date="2026-09-28T12:00:00Z">
+      <w:ins w:id="9298" w:author="Revisão" w:date="2026-09-28T12:00:00Z">
         <w:r>
           <w:rPr>
             <w:rFonts w:ascii="Times New Roman" w:cs="Times New Roman" w:eastAsia="Times New Roman" w:hAnsi="Times New Roman"/>
@@ -1882,10 +1882,10 @@
         <w:ind w:firstLine="708"/>
         <w:jc w:val="both"/>
         <w:rPr>
-          <w:ins w:id="9375" w:author="Revisão" w:date="2026-09-28T12:00:00Z"/>
+          <w:ins w:id="9381" w:author="Revisão" w:date="2026-09-28T12:00:00Z"/>
         </w:rPr>
       </w:pPr>
-      <w:ins w:id="9376" w:author="Revisão" w:date="2026-09-28T12:00:00Z">
+      <w:ins w:id="9382" w:author="Revisão" w:date="2026-09-28T12:00:00Z">
         <w:r>
           <w:rPr>
             <w:rFonts w:ascii="Times New Roman" w:cs="Times New Roman" w:eastAsia="Times New Roman" w:hAnsi="Times New Roman"/>
@@ -4136,7 +4136,7 @@
         </w:rPr>
         <w:t xml:space="preserve">A proporção de 15,0% refere-se à presença no estado de vulnerabilidade, e não à incidência de entradas. </w:t>
       </w:r>
-      <w:del w:id="9303" w:author="Revisão" w:date="2026-09-28T12:00:00Z">
+      <w:del w:id="9309" w:author="Revisão" w:date="2026-09-28T12:00:00Z">
         <w:r>
           <w:rPr>
             <w:rFonts w:ascii="Times New Roman" w:cs="Times New Roman" w:eastAsia="Times New Roman" w:hAnsi="Times New Roman"/>
@@ -4150,7 +4150,7 @@
           <w:delText xml:space="preserve">A conversão de uma medida na outra é tratada na subseção 4.3, onde se apresenta a decomposição dos eventos e a construção da amostra de risco.</w:delText>
         </w:r>
       </w:del>
-      <w:ins w:id="9304" w:author="Revisão" w:date="2026-09-28T12:00:00Z">
+      <w:ins w:id="9310" w:author="Revisão" w:date="2026-09-28T12:00:00Z">
         <w:r>
           <w:rPr>
             <w:rFonts w:ascii="Times New Roman" w:cs="Times New Roman" w:eastAsia="Times New Roman" w:hAnsi="Times New Roman"/>
@@ -4354,7 +4354,7 @@
         </w:rPr>
         <w:t xml:space="preserve">O desempenho preditivo é medido pela área sob a curva ROC </w:t>
       </w:r>
-      <w:del w:id="9321" w:author="Revisão" w:date="2026-09-28T12:00:00Z">
+      <w:del w:id="9327" w:author="Revisão" w:date="2026-09-28T12:00:00Z">
         <w:r>
           <w:rPr>
             <w:rFonts w:ascii="Times New Roman" w:cs="Times New Roman" w:eastAsia="Times New Roman" w:hAnsi="Times New Roman"/>
@@ -4368,7 +4368,7 @@
           <w:delText xml:space="preserve">(HANLEY; MCNEIL, 1982)</w:delText>
         </w:r>
       </w:del>
-      <w:ins w:id="9322" w:author="Revisão" w:date="2026-09-28T12:00:00Z">
+      <w:ins w:id="9328" w:author="Revisão" w:date="2026-09-28T12:00:00Z">
         <w:r>
           <w:rPr>
             <w:rFonts w:ascii="Times New Roman" w:cs="Times New Roman" w:eastAsia="Times New Roman" w:hAnsi="Times New Roman"/>
@@ -4434,7 +4434,7 @@
         </w:rPr>
         <w:t xml:space="preserve">, a área sob a curva é complementada na subseção 5.7 por métricas sensíveis à prevalência e à qualidade das probabilidades: </w:t>
       </w:r>
-      <w:del w:id="9309" w:author="Revisão" w:date="2026-09-28T12:00:00Z">
+      <w:del w:id="9315" w:author="Revisão" w:date="2026-09-28T12:00:00Z">
         <w:r>
           <w:rPr>
             <w:rFonts w:ascii="Times New Roman" w:cs="Times New Roman" w:eastAsia="Times New Roman" w:hAnsi="Times New Roman"/>
@@ -4448,7 +4448,7 @@
           <w:delText xml:space="preserve">a área sob a curva de precisão e revocação, o escore de Brier, a inclinação e o intercepto de calibração</w:delText>
         </w:r>
       </w:del>
-      <w:ins w:id="9310" w:author="Revisão" w:date="2026-09-28T12:00:00Z">
+      <w:ins w:id="9316" w:author="Revisão" w:date="2026-09-28T12:00:00Z">
         <w:r>
           <w:rPr>
             <w:rFonts w:ascii="Times New Roman" w:cs="Times New Roman" w:eastAsia="Times New Roman" w:hAnsi="Times New Roman"/>
@@ -4474,7 +4474,7 @@
         </w:rPr>
         <w:t xml:space="preserve">, a sensibilidade, a especificidade e os valores preditivos em limiares fixados na amostra de treino, </w:t>
       </w:r>
-      <w:del w:id="9311" w:author="Revisão" w:date="2026-09-28T12:00:00Z">
+      <w:del w:id="9317" w:author="Revisão" w:date="2026-09-28T12:00:00Z">
         <w:r>
           <w:rPr>
             <w:rFonts w:ascii="Times New Roman" w:cs="Times New Roman" w:eastAsia="Times New Roman" w:hAnsi="Times New Roman"/>
@@ -4488,7 +4488,7 @@
           <w:delText xml:space="preserve">e a decisão líquida sob diferentes razões de custo</w:delText>
         </w:r>
       </w:del>
-      <w:ins w:id="9312" w:author="Revisão" w:date="2026-09-28T12:00:00Z">
+      <w:ins w:id="9318" w:author="Revisão" w:date="2026-09-28T12:00:00Z">
         <w:r>
           <w:rPr>
             <w:rFonts w:ascii="Times New Roman" w:cs="Times New Roman" w:eastAsia="Times New Roman" w:hAnsi="Times New Roman"/>
@@ -4533,7 +4533,7 @@
         </w:rPr>
         <w:t xml:space="preserve">A inferência principal sobre as diferenças de área sob a curva </w:t>
       </w:r>
-      <w:del w:id="9313" w:author="Revisão" w:date="2026-09-28T12:00:00Z">
+      <w:del w:id="9319" w:author="Revisão" w:date="2026-09-28T12:00:00Z">
         <w:r>
           <w:rPr>
             <w:rFonts w:ascii="Times New Roman" w:cs="Times New Roman" w:eastAsia="Times New Roman" w:hAnsi="Times New Roman"/>
@@ -4547,7 +4547,7 @@
           <w:delText xml:space="preserve">é conduzida por bootstrap agrupado por firma, com 2.000 reamostragens</w:delText>
         </w:r>
       </w:del>
-      <w:ins w:id="9314" w:author="Revisão" w:date="2026-09-28T12:00:00Z">
+      <w:ins w:id="9320" w:author="Revisão" w:date="2026-09-28T12:00:00Z">
         <w:r>
           <w:rPr>
             <w:rFonts w:ascii="Times New Roman" w:cs="Times New Roman" w:eastAsia="Times New Roman" w:hAnsi="Times New Roman"/>
@@ -4573,7 +4573,7 @@
         </w:rPr>
         <w:t xml:space="preserve">: firmas inteiras são reamostradas com reposição, de modo que a dependência entre as observações de uma mesma companhia seja preservada em cada réplica. O teste de DeLong, DeLong e Clarke-Pearson (1988) pressupõe independência entre observações, hipótese não satisfeita quando cada firma contribui com diversos firma-anos, e é reportado apenas como análise convencional complementar. </w:t>
       </w:r>
-      <w:del w:id="9315" w:author="Revisão" w:date="2026-09-28T12:00:00Z">
+      <w:del w:id="9321" w:author="Revisão" w:date="2026-09-28T12:00:00Z">
         <w:r>
           <w:rPr>
             <w:rFonts w:ascii="Times New Roman" w:cs="Times New Roman" w:eastAsia="Times New Roman" w:hAnsi="Times New Roman"/>
@@ -4587,7 +4587,7 @@
           <w:delText xml:space="preserve">A correção de Bonferroni é aplicada</w:delText>
         </w:r>
       </w:del>
-      <w:ins w:id="9316" w:author="Revisão" w:date="2026-09-28T12:00:00Z">
+      <w:ins w:id="9322" w:author="Revisão" w:date="2026-09-28T12:00:00Z">
         <w:r>
           <w:rPr>
             <w:rFonts w:ascii="Times New Roman" w:cs="Times New Roman" w:eastAsia="Times New Roman" w:hAnsi="Times New Roman"/>
@@ -4750,7 +4750,7 @@
         </w:rPr>
         <w:t xml:space="preserve">A adoção da amostra de risco impõe restrição sobre a parcimônia da especificação probit com controles. Com 153 entradas na amostra de estimação no horizonte de um ano, </w:t>
       </w:r>
-      <w:del w:id="9317" w:author="Revisão" w:date="2026-09-28T12:00:00Z">
+      <w:del w:id="9323" w:author="Revisão" w:date="2026-09-28T12:00:00Z">
         <w:r>
           <w:rPr>
             <w:rFonts w:ascii="Times New Roman" w:cs="Times New Roman" w:eastAsia="Times New Roman" w:hAnsi="Times New Roman"/>
@@ -4764,7 +4764,7 @@
           <w:delText xml:space="preserve">a referência usual de ao menos dez eventos por parâmetro estimado</w:delText>
         </w:r>
       </w:del>
-      <w:ins w:id="9318" w:author="Revisão" w:date="2026-09-28T12:00:00Z">
+      <w:ins w:id="9324" w:author="Revisão" w:date="2026-09-28T12:00:00Z">
         <w:r>
           <w:rPr>
             <w:rFonts w:ascii="Times New Roman" w:cs="Times New Roman" w:eastAsia="Times New Roman" w:hAnsi="Times New Roman"/>
@@ -4944,7 +4944,7 @@
         </w:rPr>
         <w:t xml:space="preserve">A estratégia empírica envolve três hipóteses formuladas antes da estimação e uma análise diagnóstica posterior. A primeira hipótese (H1) postula a existência de um fator latente único de fragilidade e compreende duas afirmações distintas, avaliadas separadamente: a existência de um eixo comum interpretável, verificada pela coerência de sinal das cargas fatoriais após a pré-orientação, e a unidimensionalidade, verificada </w:t>
       </w:r>
-      <w:del w:id="9305" w:author="Revisão" w:date="2026-09-28T12:00:00Z">
+      <w:del w:id="9311" w:author="Revisão" w:date="2026-09-28T12:00:00Z">
         <w:r>
           <w:rPr>
             <w:rFonts w:ascii="Times New Roman" w:cs="Times New Roman" w:eastAsia="Times New Roman" w:hAnsi="Times New Roman"/>
@@ -4958,7 +4958,7 @@
           <w:delText xml:space="preserve">pelo número de componentes retidos pelo critério de Kaiser</w:delText>
         </w:r>
       </w:del>
-      <w:ins w:id="9306" w:author="Revisão" w:date="2026-09-28T12:00:00Z">
+      <w:ins w:id="9312" w:author="Revisão" w:date="2026-09-28T12:00:00Z">
         <w:r>
           <w:rPr>
             <w:rFonts w:ascii="Times New Roman" w:cs="Times New Roman" w:eastAsia="Times New Roman" w:hAnsi="Times New Roman"/>
@@ -5022,7 +5022,7 @@
         </w:rPr>
         <w:t xml:space="preserve">A quarta hipótese (H4) tem estatuto distinto das anteriores e assim deve ser lida. Ela não integrava o desenho original e foi formulada após a observação dos resultados de H1 e H2, como explicação para o desempenho inferior do escore. Trata-se, portanto, de investigação explicativa posterior ao resultado, avaliada em seguida fora da amostra, e não de hipótese confirmatória pré-especificada. Ela postula que a diferença de desempenho entre o escore não supervisionado e os melhores benchmarks decorre do critério de agregação, e não do conjunto informacional. A análise consiste em construir um segundo escore por mínimos quadrados parciais aplicados a resposta binária, mantendo constantes as oito variáveis, a amostra, o pré-processamento e o procedimento de avaliação, de modo que a diferença de desempenho reflita apenas a substituição do critério de agregação. O critério de avaliação, fixado antes da estimação do escore supervisionado, é que ele supere o não supervisionado fora da amostra. Acrescenta-se um terceiro escore, </w:t>
       </w:r>
-      <w:del w:id="9319" w:author="Revisão" w:date="2026-09-28T12:00:00Z">
+      <w:del w:id="9325" w:author="Revisão" w:date="2026-09-28T12:00:00Z">
         <w:r>
           <w:rPr>
             <w:rFonts w:ascii="Times New Roman" w:cs="Times New Roman" w:eastAsia="Times New Roman" w:hAnsi="Times New Roman"/>
@@ -5036,7 +5036,7 @@
           <w:delText xml:space="preserve">obtido por árvores impulsionadas com gradiente sobre as mesmas oito variáveis</w:delText>
         </w:r>
       </w:del>
-      <w:ins w:id="9320" w:author="Revisão" w:date="2026-09-28T12:00:00Z">
+      <w:ins w:id="9326" w:author="Revisão" w:date="2026-09-28T12:00:00Z">
         <w:r>
           <w:rPr>
             <w:rFonts w:ascii="Times New Roman" w:cs="Times New Roman" w:eastAsia="Times New Roman" w:hAnsi="Times New Roman"/>
@@ -5079,8 +5079,36 @@
           <w:sz w:val="24"/>
           <w:szCs w:val="24"/>
         </w:rPr>
-        <w:t xml:space="preserve">A mesma ressalva vale para a decomposição por rota de deterioração apresentada na subseção 5.5. Ela não integrava o desenho original e foi motivada por observação recebida após os primeiros resultados, quanto à dependência entre os critérios que definem o evento e os indicadores que servem de preditores. Trata-se, portanto, de análise diagnóstica posterior, de natureza descritiva, e assim deve ser lida. Seu procedimento é fixado de modo a não admitir escolha conveniente: todos os tipos de entrada são reportados, com os mesmos modelos e as mesmas predições fora da amostra, nos dois horizontes, e nenhum subconjunto é selecionado por seu resultado. Os intervalos reportados nessa subseção não recebem correção por multiplicidade, coerentemente com seu caráter descritivo, e não sustentam decisão sobre as hipóteses.</w:t>
+        <w:t xml:space="preserve">A mesma ressalva vale para a decomposição por rota de deterioração apresentada na subseção 5.5. Ela não integrava o desenho original e foi motivada por observação recebida após os primeiros resultados, quanto à dependência entre os critérios que definem o evento e os indicadores que servem de preditores. Trata-se, portanto, de análise diagnóstica posterior, de natureza descritiva, e assim deve ser lida. Seu procedimento é fixado de modo a não admitir escolha conveniente: todos os tipos de entrada são reportados, com os mesmos modelos e as mesmas predições fora da amostra, nos dois horizontes, e nenhum subconjunto é selecionado por seu resultado. Os intervalos reportados nessa subseção não recebem correção por multiplicidade, coerentemente com seu caráter descritivo, </w:t>
       </w:r>
+      <w:del w:id="9289" w:author="Revisão" w:date="2026-09-28T12:00:00Z">
+        <w:r>
+          <w:rPr>
+            <w:rFonts w:ascii="Times New Roman" w:cs="Times New Roman" w:eastAsia="Times New Roman" w:hAnsi="Times New Roman"/>
+            <w:b w:val="false"/>
+            <w:bCs w:val="false"/>
+            <w:i w:val="false"/>
+            <w:iCs w:val="false"/>
+            <w:sz w:val="24"/>
+            <w:szCs w:val="24"/>
+          </w:rPr>
+          <w:delText xml:space="preserve">e não sustentam decisão sobre as hipóteses.</w:delText>
+        </w:r>
+      </w:del>
+      <w:ins w:id="9290" w:author="Revisão" w:date="2026-09-28T12:00:00Z">
+        <w:r>
+          <w:rPr>
+            <w:rFonts w:ascii="Times New Roman" w:cs="Times New Roman" w:eastAsia="Times New Roman" w:hAnsi="Times New Roman"/>
+            <w:b w:val="false"/>
+            <w:bCs w:val="false"/>
+            <w:i w:val="false"/>
+            <w:iCs w:val="false"/>
+            <w:sz w:val="24"/>
+            <w:szCs w:val="24"/>
+          </w:rPr>
+          <w:t xml:space="preserve">e não sustentam decisão sobre as hipóteses. O mesmo estatuto tem o escore restrito aos três indicadores de maior poder discriminante, apresentado ao fim da subseção 5.6, construído depois de observados os resultados.</w:t>
+        </w:r>
+      </w:ins>
     </w:p>
     <w:p>
       <w:pPr>
@@ -12878,7 +12906,7 @@
         </w:rPr>
         <w:t xml:space="preserve">O primeiro componente responde por 26,92% da variância total, </w:t>
       </w:r>
-      <w:del w:id="9307" w:author="Revisão" w:date="2026-09-28T12:00:00Z">
+      <w:del w:id="9313" w:author="Revisão" w:date="2026-09-28T12:00:00Z">
         <w:r>
           <w:rPr>
             <w:rFonts w:ascii="Times New Roman" w:cs="Times New Roman" w:eastAsia="Times New Roman" w:hAnsi="Times New Roman"/>
@@ -12892,7 +12920,7 @@
           <w:delText xml:space="preserve">e o critério de Kaiser retém 3 componentes, que juntos explicam 56,80%.</w:delText>
         </w:r>
       </w:del>
-      <w:ins w:id="9308" w:author="Revisão" w:date="2026-09-28T12:00:00Z">
+      <w:ins w:id="9314" w:author="Revisão" w:date="2026-09-28T12:00:00Z">
         <w:r>
           <w:rPr>
             <w:rFonts w:ascii="Times New Roman" w:cs="Times New Roman" w:eastAsia="Times New Roman" w:hAnsi="Times New Roman"/>
@@ -23121,7 +23149,7 @@
         <w:ind w:firstLine="708"/>
         <w:jc w:val="both"/>
       </w:pPr>
-      <w:del w:id="9299" w:author="Revisão" w:date="2026-09-28T12:00:00Z">
+      <w:del w:id="9305" w:author="Revisão" w:date="2026-09-28T12:00:00Z">
         <w:r>
           <w:rPr>
             <w:rFonts w:ascii="Times New Roman" w:cs="Times New Roman" w:eastAsia="Times New Roman" w:hAnsi="Times New Roman"/>
@@ -23135,7 +23163,7 @@
           <w:delText xml:space="preserve">O coeficiente é positivo e significativo a menos de um por mil nos quatro modelos.</w:delText>
         </w:r>
       </w:del>
-      <w:ins w:id="9300" w:author="Revisão" w:date="2026-09-28T12:00:00Z">
+      <w:ins w:id="9306" w:author="Revisão" w:date="2026-09-28T12:00:00Z">
         <w:r>
           <w:rPr>
             <w:rFonts w:ascii="Times New Roman" w:cs="Times New Roman" w:eastAsia="Times New Roman" w:hAnsi="Times New Roman"/>
@@ -23199,7 +23227,7 @@
         </w:rPr>
         <w:t xml:space="preserve">A parcimônia da especificação merece registro. Com 153 entradas e 24 parâmetros, a especificação com efeitos fixos opera em 6,38 eventos por parâmetro, abaixo da referência usual de dez discutida na subseção 3.4. A verificação pertinente é se o resultado depende disso, e não depende: na especificação com controle apenas de porte, que opera em 51,00 eventos por parâmetro, o coeficiente é de 0,332; sem controles, em 76,50 eventos por parâmetro, é de 0,348; e na especificação completa, de 0,344. </w:t>
       </w:r>
-      <w:del w:id="9301" w:author="Revisão" w:date="2026-09-28T12:00:00Z">
+      <w:del w:id="9307" w:author="Revisão" w:date="2026-09-28T12:00:00Z">
         <w:r>
           <w:rPr>
             <w:rFonts w:ascii="Times New Roman" w:cs="Times New Roman" w:eastAsia="Times New Roman" w:hAnsi="Times New Roman"/>
@@ -23213,7 +23241,7 @@
           <w:delText xml:space="preserve">Os três são significativos a menos de um por mil,</w:delText>
         </w:r>
       </w:del>
-      <w:ins w:id="9302" w:author="Revisão" w:date="2026-09-28T12:00:00Z">
+      <w:ins w:id="9308" w:author="Revisão" w:date="2026-09-28T12:00:00Z">
         <w:r>
           <w:rPr>
             <w:rFonts w:ascii="Times New Roman" w:cs="Times New Roman" w:eastAsia="Times New Roman" w:hAnsi="Times New Roman"/>
@@ -30857,6 +30885,30 @@
     </w:p>
     <w:p>
       <w:pPr>
+        <w:spacing w:after="0" w:before="0" w:line="360"/>
+        <w:ind w:firstLine="708"/>
+        <w:jc w:val="both"/>
+        <w:rPr>
+          <w:ins w:id="9291" w:author="Revisão" w:date="2026-09-28T12:00:00Z"/>
+        </w:rPr>
+      </w:pPr>
+      <w:ins w:id="9292" w:author="Revisão" w:date="2026-09-28T12:00:00Z">
+        <w:r>
+          <w:rPr>
+            <w:rFonts w:ascii="Times New Roman" w:cs="Times New Roman" w:eastAsia="Times New Roman" w:hAnsi="Times New Roman"/>
+            <w:b w:val="false"/>
+            <w:bCs w:val="false"/>
+            <w:i w:val="false"/>
+            <w:iCs w:val="false"/>
+            <w:sz w:val="24"/>
+            <w:szCs w:val="24"/>
+          </w:rPr>
+          <w:t xml:space="preserve">Uma última verificação separa o critério de agregação da escolha do que se agrega. Restrito aos três indicadores de maior poder discriminante da Tabela 16, o retorno sobre ativos, a cobertura de juros e a margem EBITDA, o mesmo procedimento não supervisionado, com componentes principais estimados apenas nas firmas de treino, produz no horizonte de um ano escore com área sob a curva de 0,895, contra 0,764 do escore sobre os oito indicadores e 0,894 da cobertura de juros, sem diferença distinguível desta (cobertura menos escore restrito: −0,001, com intervalo de −0,015 a +0,015), e supera o retorno sobre ativos e o escore supervisionado sobre os oito indicadores por 0,021 e 0,019 ponto. No horizonte de dois anos, alcança 0,722 e supera a cobertura de juros, com 0,681, por 0,040 ponto (intervalo de +0,018 a +0,062), sem diferença distinguível do retorno sobre ativos (0,731) nem do escore supervisionado (0,725). A média simples dos três indicadores padronizados difere do componente principal em no máximo 0,001 ponto, e a seleção refeita pelos três maiores poderes discriminantes dentro de cada partição de treino escolhe o mesmo conjunto em 98 das 100 partições, de modo que o resultado não decorre de a escolha ter sido feita sobre a amostra completa. Agregados apenas os melhores componentes, a agregação não supervisionada acompanha o melhor indicador isolado nos dois horizontes, a cobertura de juros em um ano e o retorno sobre ativos em dois, sem superá-lo. O resultado é consistente com a leitura de que o desempenho do escore sobre os oito indicadores reflete sobretudo a composição do conjunto agregado. No horizonte de um ano, contudo, a margem EBITDA reintroduz a sobreposição mecânica discutida na subseção 5.5, e a decomposição por rota deve ser lida com essa ressalva: o escore restrito alcança 0,958 nas 66 entradas por prejuízo operacional, 0,784 nas 51 por patrimônio líquido negativo e 0,888 nas 11 por recuperação judicial; em dois anos, 0,576, 0,801 e 0,798, com 52, 46 e 9 entradas.</w:t>
+        </w:r>
+      </w:ins>
+    </w:p>
+    <w:p>
+      <w:pPr>
         <w:keepNext/>
         <w:spacing w:after="120" w:before="240" w:line="360"/>
         <w:jc w:val="left"/>
@@ -31184,14 +31236,14 @@
               <w:bottom w:type="dxa" w:w="60"/>
               <w:right w:type="dxa" w:w="80"/>
             </w:tcMar>
-            <w:cellIns w:id="9393" w:author="Revisão" w:date="2026-09-28T12:00:00Z"/>
-          </w:tcPr>
-          <w:p>
-            <w:pPr>
-              <w:spacing w:after="0" w:before="0" w:line="240"/>
-              <w:jc w:val="center"/>
-            </w:pPr>
-            <w:ins w:id="9394" w:author="Revisão" w:date="2026-09-28T12:00:00Z">
+            <w:cellIns w:id="9399" w:author="Revisão" w:date="2026-09-28T12:00:00Z"/>
+          </w:tcPr>
+          <w:p>
+            <w:pPr>
+              <w:spacing w:after="0" w:before="0" w:line="240"/>
+              <w:jc w:val="center"/>
+            </w:pPr>
+            <w:ins w:id="9400" w:author="Revisão" w:date="2026-09-28T12:00:00Z">
               <w:r>
                 <w:rPr>
                   <w:rFonts w:ascii="Times New Roman" w:cs="Times New Roman" w:eastAsia="Times New Roman" w:hAnsi="Times New Roman"/>
@@ -31217,14 +31269,14 @@
               <w:bottom w:type="dxa" w:w="60"/>
               <w:right w:type="dxa" w:w="80"/>
             </w:tcMar>
-            <w:cellIns w:id="9377" w:author="Revisão" w:date="2026-09-28T12:00:00Z"/>
-          </w:tcPr>
-          <w:p>
-            <w:pPr>
-              <w:spacing w:after="0" w:before="0" w:line="240"/>
-              <w:jc w:val="center"/>
-            </w:pPr>
-            <w:ins w:id="9378" w:author="Revisão" w:date="2026-09-28T12:00:00Z">
+            <w:cellIns w:id="9383" w:author="Revisão" w:date="2026-09-28T12:00:00Z"/>
+          </w:tcPr>
+          <w:p>
+            <w:pPr>
+              <w:spacing w:after="0" w:before="0" w:line="240"/>
+              <w:jc w:val="center"/>
+            </w:pPr>
+            <w:ins w:id="9384" w:author="Revisão" w:date="2026-09-28T12:00:00Z">
               <w:r>
                 <w:rPr>
                   <w:rFonts w:ascii="Times New Roman" w:cs="Times New Roman" w:eastAsia="Times New Roman" w:hAnsi="Times New Roman"/>
@@ -31492,14 +31544,14 @@
               <w:bottom w:type="dxa" w:w="60"/>
               <w:right w:type="dxa" w:w="80"/>
             </w:tcMar>
-            <w:cellIns w:id="9395" w:author="Revisão" w:date="2026-09-28T12:00:00Z"/>
-          </w:tcPr>
-          <w:p>
-            <w:pPr>
-              <w:spacing w:after="0" w:before="0" w:line="240"/>
-              <w:jc w:val="center"/>
-            </w:pPr>
-            <w:ins w:id="9396" w:author="Revisão" w:date="2026-09-28T12:00:00Z">
+            <w:cellIns w:id="9401" w:author="Revisão" w:date="2026-09-28T12:00:00Z"/>
+          </w:tcPr>
+          <w:p>
+            <w:pPr>
+              <w:spacing w:after="0" w:before="0" w:line="240"/>
+              <w:jc w:val="center"/>
+            </w:pPr>
+            <w:ins w:id="9402" w:author="Revisão" w:date="2026-09-28T12:00:00Z">
               <w:r>
                 <w:rPr>
                   <w:rFonts w:ascii="Times New Roman" w:cs="Times New Roman" w:eastAsia="Times New Roman" w:hAnsi="Times New Roman"/>
@@ -31524,14 +31576,14 @@
               <w:bottom w:type="dxa" w:w="60"/>
               <w:right w:type="dxa" w:w="80"/>
             </w:tcMar>
-            <w:cellIns w:id="9379" w:author="Revisão" w:date="2026-09-28T12:00:00Z"/>
-          </w:tcPr>
-          <w:p>
-            <w:pPr>
-              <w:spacing w:after="0" w:before="0" w:line="240"/>
-              <w:jc w:val="center"/>
-            </w:pPr>
-            <w:ins w:id="9380" w:author="Revisão" w:date="2026-09-28T12:00:00Z">
+            <w:cellIns w:id="9385" w:author="Revisão" w:date="2026-09-28T12:00:00Z"/>
+          </w:tcPr>
+          <w:p>
+            <w:pPr>
+              <w:spacing w:after="0" w:before="0" w:line="240"/>
+              <w:jc w:val="center"/>
+            </w:pPr>
+            <w:ins w:id="9386" w:author="Revisão" w:date="2026-09-28T12:00:00Z">
               <w:r>
                 <w:rPr>
                   <w:rFonts w:ascii="Times New Roman" w:cs="Times New Roman" w:eastAsia="Times New Roman" w:hAnsi="Times New Roman"/>
@@ -31783,14 +31835,14 @@
               <w:bottom w:type="dxa" w:w="60"/>
               <w:right w:type="dxa" w:w="80"/>
             </w:tcMar>
-            <w:cellIns w:id="9397" w:author="Revisão" w:date="2026-09-28T12:00:00Z"/>
-          </w:tcPr>
-          <w:p>
-            <w:pPr>
-              <w:spacing w:after="0" w:before="0" w:line="240"/>
-              <w:jc w:val="center"/>
-            </w:pPr>
-            <w:ins w:id="9398" w:author="Revisão" w:date="2026-09-28T12:00:00Z">
+            <w:cellIns w:id="9403" w:author="Revisão" w:date="2026-09-28T12:00:00Z"/>
+          </w:tcPr>
+          <w:p>
+            <w:pPr>
+              <w:spacing w:after="0" w:before="0" w:line="240"/>
+              <w:jc w:val="center"/>
+            </w:pPr>
+            <w:ins w:id="9404" w:author="Revisão" w:date="2026-09-28T12:00:00Z">
               <w:r>
                 <w:rPr>
                   <w:rFonts w:ascii="Times New Roman" w:cs="Times New Roman" w:eastAsia="Times New Roman" w:hAnsi="Times New Roman"/>
@@ -31815,14 +31867,14 @@
               <w:bottom w:type="dxa" w:w="60"/>
               <w:right w:type="dxa" w:w="80"/>
             </w:tcMar>
-            <w:cellIns w:id="9381" w:author="Revisão" w:date="2026-09-28T12:00:00Z"/>
-          </w:tcPr>
-          <w:p>
-            <w:pPr>
-              <w:spacing w:after="0" w:before="0" w:line="240"/>
-              <w:jc w:val="center"/>
-            </w:pPr>
-            <w:ins w:id="9382" w:author="Revisão" w:date="2026-09-28T12:00:00Z">
+            <w:cellIns w:id="9387" w:author="Revisão" w:date="2026-09-28T12:00:00Z"/>
+          </w:tcPr>
+          <w:p>
+            <w:pPr>
+              <w:spacing w:after="0" w:before="0" w:line="240"/>
+              <w:jc w:val="center"/>
+            </w:pPr>
+            <w:ins w:id="9388" w:author="Revisão" w:date="2026-09-28T12:00:00Z">
               <w:r>
                 <w:rPr>
                   <w:rFonts w:ascii="Times New Roman" w:cs="Times New Roman" w:eastAsia="Times New Roman" w:hAnsi="Times New Roman"/>
@@ -32058,14 +32110,14 @@
               <w:bottom w:type="dxa" w:w="60"/>
               <w:right w:type="dxa" w:w="80"/>
             </w:tcMar>
-            <w:cellIns w:id="9399" w:author="Revisão" w:date="2026-09-28T12:00:00Z"/>
-          </w:tcPr>
-          <w:p>
-            <w:pPr>
-              <w:spacing w:after="0" w:before="0" w:line="240"/>
-              <w:jc w:val="center"/>
-            </w:pPr>
-            <w:ins w:id="9400" w:author="Revisão" w:date="2026-09-28T12:00:00Z">
+            <w:cellIns w:id="9405" w:author="Revisão" w:date="2026-09-28T12:00:00Z"/>
+          </w:tcPr>
+          <w:p>
+            <w:pPr>
+              <w:spacing w:after="0" w:before="0" w:line="240"/>
+              <w:jc w:val="center"/>
+            </w:pPr>
+            <w:ins w:id="9406" w:author="Revisão" w:date="2026-09-28T12:00:00Z">
               <w:r>
                 <w:rPr>
                   <w:rFonts w:ascii="Times New Roman" w:cs="Times New Roman" w:eastAsia="Times New Roman" w:hAnsi="Times New Roman"/>
@@ -32090,14 +32142,14 @@
               <w:bottom w:type="dxa" w:w="60"/>
               <w:right w:type="dxa" w:w="80"/>
             </w:tcMar>
-            <w:cellIns w:id="9383" w:author="Revisão" w:date="2026-09-28T12:00:00Z"/>
-          </w:tcPr>
-          <w:p>
-            <w:pPr>
-              <w:spacing w:after="0" w:before="0" w:line="240"/>
-              <w:jc w:val="center"/>
-            </w:pPr>
-            <w:ins w:id="9384" w:author="Revisão" w:date="2026-09-28T12:00:00Z">
+            <w:cellIns w:id="9389" w:author="Revisão" w:date="2026-09-28T12:00:00Z"/>
+          </w:tcPr>
+          <w:p>
+            <w:pPr>
+              <w:spacing w:after="0" w:before="0" w:line="240"/>
+              <w:jc w:val="center"/>
+            </w:pPr>
+            <w:ins w:id="9390" w:author="Revisão" w:date="2026-09-28T12:00:00Z">
               <w:r>
                 <w:rPr>
                   <w:rFonts w:ascii="Times New Roman" w:cs="Times New Roman" w:eastAsia="Times New Roman" w:hAnsi="Times New Roman"/>
@@ -32349,14 +32401,14 @@
               <w:bottom w:type="dxa" w:w="60"/>
               <w:right w:type="dxa" w:w="80"/>
             </w:tcMar>
-            <w:cellIns w:id="9401" w:author="Revisão" w:date="2026-09-28T12:00:00Z"/>
-          </w:tcPr>
-          <w:p>
-            <w:pPr>
-              <w:spacing w:after="0" w:before="0" w:line="240"/>
-              <w:jc w:val="center"/>
-            </w:pPr>
-            <w:ins w:id="9402" w:author="Revisão" w:date="2026-09-28T12:00:00Z">
+            <w:cellIns w:id="9407" w:author="Revisão" w:date="2026-09-28T12:00:00Z"/>
+          </w:tcPr>
+          <w:p>
+            <w:pPr>
+              <w:spacing w:after="0" w:before="0" w:line="240"/>
+              <w:jc w:val="center"/>
+            </w:pPr>
+            <w:ins w:id="9408" w:author="Revisão" w:date="2026-09-28T12:00:00Z">
               <w:r>
                 <w:rPr>
                   <w:rFonts w:ascii="Times New Roman" w:cs="Times New Roman" w:eastAsia="Times New Roman" w:hAnsi="Times New Roman"/>
@@ -32381,14 +32433,14 @@
               <w:bottom w:type="dxa" w:w="60"/>
               <w:right w:type="dxa" w:w="80"/>
             </w:tcMar>
-            <w:cellIns w:id="9385" w:author="Revisão" w:date="2026-09-28T12:00:00Z"/>
-          </w:tcPr>
-          <w:p>
-            <w:pPr>
-              <w:spacing w:after="0" w:before="0" w:line="240"/>
-              <w:jc w:val="center"/>
-            </w:pPr>
-            <w:ins w:id="9386" w:author="Revisão" w:date="2026-09-28T12:00:00Z">
+            <w:cellIns w:id="9391" w:author="Revisão" w:date="2026-09-28T12:00:00Z"/>
+          </w:tcPr>
+          <w:p>
+            <w:pPr>
+              <w:spacing w:after="0" w:before="0" w:line="240"/>
+              <w:jc w:val="center"/>
+            </w:pPr>
+            <w:ins w:id="9392" w:author="Revisão" w:date="2026-09-28T12:00:00Z">
               <w:r>
                 <w:rPr>
                   <w:rFonts w:ascii="Times New Roman" w:cs="Times New Roman" w:eastAsia="Times New Roman" w:hAnsi="Times New Roman"/>
@@ -32640,14 +32692,14 @@
               <w:bottom w:type="dxa" w:w="60"/>
               <w:right w:type="dxa" w:w="80"/>
             </w:tcMar>
-            <w:cellIns w:id="9403" w:author="Revisão" w:date="2026-09-28T12:00:00Z"/>
-          </w:tcPr>
-          <w:p>
-            <w:pPr>
-              <w:spacing w:after="0" w:before="0" w:line="240"/>
-              <w:jc w:val="center"/>
-            </w:pPr>
-            <w:ins w:id="9404" w:author="Revisão" w:date="2026-09-28T12:00:00Z">
+            <w:cellIns w:id="9409" w:author="Revisão" w:date="2026-09-28T12:00:00Z"/>
+          </w:tcPr>
+          <w:p>
+            <w:pPr>
+              <w:spacing w:after="0" w:before="0" w:line="240"/>
+              <w:jc w:val="center"/>
+            </w:pPr>
+            <w:ins w:id="9410" w:author="Revisão" w:date="2026-09-28T12:00:00Z">
               <w:r>
                 <w:rPr>
                   <w:rFonts w:ascii="Times New Roman" w:cs="Times New Roman" w:eastAsia="Times New Roman" w:hAnsi="Times New Roman"/>
@@ -32672,14 +32724,14 @@
               <w:bottom w:type="dxa" w:w="60"/>
               <w:right w:type="dxa" w:w="80"/>
             </w:tcMar>
-            <w:cellIns w:id="9387" w:author="Revisão" w:date="2026-09-28T12:00:00Z"/>
-          </w:tcPr>
-          <w:p>
-            <w:pPr>
-              <w:spacing w:after="0" w:before="0" w:line="240"/>
-              <w:jc w:val="center"/>
-            </w:pPr>
-            <w:ins w:id="9388" w:author="Revisão" w:date="2026-09-28T12:00:00Z">
+            <w:cellIns w:id="9393" w:author="Revisão" w:date="2026-09-28T12:00:00Z"/>
+          </w:tcPr>
+          <w:p>
+            <w:pPr>
+              <w:spacing w:after="0" w:before="0" w:line="240"/>
+              <w:jc w:val="center"/>
+            </w:pPr>
+            <w:ins w:id="9394" w:author="Revisão" w:date="2026-09-28T12:00:00Z">
               <w:r>
                 <w:rPr>
                   <w:rFonts w:ascii="Times New Roman" w:cs="Times New Roman" w:eastAsia="Times New Roman" w:hAnsi="Times New Roman"/>
@@ -32947,14 +32999,14 @@
               <w:bottom w:type="dxa" w:w="60"/>
               <w:right w:type="dxa" w:w="80"/>
             </w:tcMar>
-            <w:cellIns w:id="9405" w:author="Revisão" w:date="2026-09-28T12:00:00Z"/>
-          </w:tcPr>
-          <w:p>
-            <w:pPr>
-              <w:spacing w:after="0" w:before="0" w:line="240"/>
-              <w:jc w:val="center"/>
-            </w:pPr>
-            <w:ins w:id="9406" w:author="Revisão" w:date="2026-09-28T12:00:00Z">
+            <w:cellIns w:id="9411" w:author="Revisão" w:date="2026-09-28T12:00:00Z"/>
+          </w:tcPr>
+          <w:p>
+            <w:pPr>
+              <w:spacing w:after="0" w:before="0" w:line="240"/>
+              <w:jc w:val="center"/>
+            </w:pPr>
+            <w:ins w:id="9412" w:author="Revisão" w:date="2026-09-28T12:00:00Z">
               <w:r>
                 <w:rPr>
                   <w:rFonts w:ascii="Times New Roman" w:cs="Times New Roman" w:eastAsia="Times New Roman" w:hAnsi="Times New Roman"/>
@@ -32979,14 +33031,14 @@
               <w:bottom w:type="dxa" w:w="60"/>
               <w:right w:type="dxa" w:w="80"/>
             </w:tcMar>
-            <w:cellIns w:id="9389" w:author="Revisão" w:date="2026-09-28T12:00:00Z"/>
-          </w:tcPr>
-          <w:p>
-            <w:pPr>
-              <w:spacing w:after="0" w:before="0" w:line="240"/>
-              <w:jc w:val="center"/>
-            </w:pPr>
-            <w:ins w:id="9390" w:author="Revisão" w:date="2026-09-28T12:00:00Z">
+            <w:cellIns w:id="9395" w:author="Revisão" w:date="2026-09-28T12:00:00Z"/>
+          </w:tcPr>
+          <w:p>
+            <w:pPr>
+              <w:spacing w:after="0" w:before="0" w:line="240"/>
+              <w:jc w:val="center"/>
+            </w:pPr>
+            <w:ins w:id="9396" w:author="Revisão" w:date="2026-09-28T12:00:00Z">
               <w:r>
                 <w:rPr>
                   <w:rFonts w:ascii="Times New Roman" w:cs="Times New Roman" w:eastAsia="Times New Roman" w:hAnsi="Times New Roman"/>
@@ -33190,14 +33242,14 @@
               <w:bottom w:type="dxa" w:w="60"/>
               <w:right w:type="dxa" w:w="80"/>
             </w:tcMar>
-            <w:cellIns w:id="9407" w:author="Revisão" w:date="2026-09-28T12:00:00Z"/>
-          </w:tcPr>
-          <w:p>
-            <w:pPr>
-              <w:spacing w:after="0" w:before="0" w:line="240"/>
-              <w:jc w:val="center"/>
-            </w:pPr>
-            <w:ins w:id="9408" w:author="Revisão" w:date="2026-09-28T12:00:00Z">
+            <w:cellIns w:id="9413" w:author="Revisão" w:date="2026-09-28T12:00:00Z"/>
+          </w:tcPr>
+          <w:p>
+            <w:pPr>
+              <w:spacing w:after="0" w:before="0" w:line="240"/>
+              <w:jc w:val="center"/>
+            </w:pPr>
+            <w:ins w:id="9414" w:author="Revisão" w:date="2026-09-28T12:00:00Z">
               <w:r>
                 <w:rPr>
                   <w:rFonts w:ascii="Times New Roman" w:cs="Times New Roman" w:eastAsia="Times New Roman" w:hAnsi="Times New Roman"/>
@@ -33222,14 +33274,14 @@
               <w:bottom w:type="dxa" w:w="60"/>
               <w:right w:type="dxa" w:w="80"/>
             </w:tcMar>
-            <w:cellIns w:id="9391" w:author="Revisão" w:date="2026-09-28T12:00:00Z"/>
-          </w:tcPr>
-          <w:p>
-            <w:pPr>
-              <w:spacing w:after="0" w:before="0" w:line="240"/>
-              <w:jc w:val="center"/>
-            </w:pPr>
-            <w:ins w:id="9392" w:author="Revisão" w:date="2026-09-28T12:00:00Z">
+            <w:cellIns w:id="9397" w:author="Revisão" w:date="2026-09-28T12:00:00Z"/>
+          </w:tcPr>
+          <w:p>
+            <w:pPr>
+              <w:spacing w:after="0" w:before="0" w:line="240"/>
+              <w:jc w:val="center"/>
+            </w:pPr>
+            <w:ins w:id="9398" w:author="Revisão" w:date="2026-09-28T12:00:00Z">
               <w:r>
                 <w:rPr>
                   <w:rFonts w:ascii="Times New Roman" w:cs="Times New Roman" w:eastAsia="Times New Roman" w:hAnsi="Times New Roman"/>
@@ -37308,7 +37360,7 @@
         </w:rPr>
         <w:t xml:space="preserve">A contribuição está em mostrar que essa conclusão agregada é produzida por uma das rotas de deterioração. Decomposto o evento pelo critério que o define, o escore fica muito atrás apenas nas entradas por prejuízo operacional persistente, </w:t>
       </w:r>
-      <w:del w:id="9355" w:author="Revisão" w:date="2026-09-28T12:00:00Z">
+      <w:del w:id="9361" w:author="Revisão" w:date="2026-09-28T12:00:00Z">
         <w:r>
           <w:rPr>
             <w:rFonts w:ascii="Times New Roman" w:cs="Times New Roman" w:eastAsia="Times New Roman" w:hAnsi="Times New Roman"/>
@@ -37322,7 +37374,7 @@
           <w:delText xml:space="preserve">com 0,649 contra 0,973 da cobertura de juros.</w:delText>
         </w:r>
       </w:del>
-      <w:ins w:id="9356" w:author="Revisão" w:date="2026-09-28T12:00:00Z">
+      <w:ins w:id="9362" w:author="Revisão" w:date="2026-09-28T12:00:00Z">
         <w:r>
           <w:rPr>
             <w:rFonts w:ascii="Times New Roman" w:cs="Times New Roman" w:eastAsia="Times New Roman" w:hAnsi="Times New Roman"/>
@@ -37501,7 +37553,47 @@
           <w:sz w:val="24"/>
           <w:szCs w:val="24"/>
         </w:rPr>
-        <w:t xml:space="preserve"> A multidimensionalidade documentada na avaliação de H1 e o desempenho agregado inferior documentado na de H2 </w:t>
+        <w:t xml:space="preserve"> </w:t>
+      </w:r>
+      <w:del w:id="9293" w:author="Revisão" w:date="2026-09-28T12:00:00Z">
+        <w:r>
+          <w:rPr>
+            <w:rFonts w:ascii="Times New Roman" w:cs="Times New Roman" w:eastAsia="Times New Roman" w:hAnsi="Times New Roman"/>
+            <w:b w:val="false"/>
+            <w:bCs w:val="false"/>
+            <w:i w:val="false"/>
+            <w:iCs w:val="false"/>
+            <w:sz w:val="24"/>
+            <w:szCs w:val="24"/>
+          </w:rPr>
+          <w:delText xml:space="preserve">A multidimensionalidade documentada na avaliação de H1</w:delText>
+        </w:r>
+      </w:del>
+      <w:ins w:id="9294" w:author="Revisão" w:date="2026-09-28T12:00:00Z">
+        <w:r>
+          <w:rPr>
+            <w:rFonts w:ascii="Times New Roman" w:cs="Times New Roman" w:eastAsia="Times New Roman" w:hAnsi="Times New Roman"/>
+            <w:b w:val="false"/>
+            <w:bCs w:val="false"/>
+            <w:i w:val="false"/>
+            <w:iCs w:val="false"/>
+            <w:sz w:val="24"/>
+            <w:szCs w:val="24"/>
+          </w:rPr>
+          <w:t xml:space="preserve">Restrito aos três indicadores de maior poder discriminante, o mesmo procedimento não supervisionado acompanha o melhor indicador isolado nos dois horizontes, sem superá-lo, o que reforça essa leitura. A multidimensionalidade documentada na avaliação de H1</w:t>
+        </w:r>
+      </w:ins>
+      <w:r>
+        <w:rPr>
+          <w:rFonts w:ascii="Times New Roman" w:cs="Times New Roman" w:eastAsia="Times New Roman" w:hAnsi="Times New Roman"/>
+          <w:b w:val="false"/>
+          <w:bCs w:val="false"/>
+          <w:i w:val="false"/>
+          <w:iCs w:val="false"/>
+          <w:sz w:val="24"/>
+          <w:szCs w:val="24"/>
+        </w:rPr>
+        <w:t xml:space="preserve"> e o desempenho agregado inferior documentado na de H2 </w:t>
       </w:r>
       <w:del w:id="9173" w:author="Revisão" w:date="2026-09-28T12:00:00Z">
         <w:r>
@@ -37697,7 +37789,7 @@
         </w:rPr>
         <w:t xml:space="preserve">A agregação do escore em índice setorial ou macroeconômico, com avaliação de seu conteúdo preditivo sobre investimento e condições de crédito, é extensão natural da leitura minskyana e depende de frequência superior à anual. O levantamento de cobertura das informações trimestrais indica que essa via é praticável no universo aqui estudado, </w:t>
       </w:r>
-      <w:del w:id="9293" w:author="Revisão" w:date="2026-09-28T12:00:00Z">
+      <w:del w:id="9299" w:author="Revisão" w:date="2026-09-28T12:00:00Z">
         <w:r>
           <w:rPr>
             <w:rFonts w:ascii="Times New Roman" w:cs="Times New Roman" w:eastAsia="Times New Roman" w:hAnsi="Times New Roman"/>
@@ -37711,7 +37803,7 @@
           <w:delText xml:space="preserve">o que a qualifica como extensão viável, e não apenas desejável.</w:delText>
         </w:r>
       </w:del>
-      <w:ins w:id="9294" w:author="Revisão" w:date="2026-09-28T12:00:00Z">
+      <w:ins w:id="9300" w:author="Revisão" w:date="2026-09-28T12:00:00Z">
         <w:r>
           <w:rPr>
             <w:rFonts w:ascii="Times New Roman" w:cs="Times New Roman" w:eastAsia="Times New Roman" w:hAnsi="Times New Roman"/>
@@ -37732,10 +37824,10 @@
         <w:spacing w:after="180" w:before="360" w:line="360"/>
         <w:jc w:val="left"/>
         <w:rPr>
-          <w:ins w:id="9371" w:author="Revisão" w:date="2026-09-28T12:00:00Z"/>
+          <w:ins w:id="9377" w:author="Revisão" w:date="2026-09-28T12:00:00Z"/>
         </w:rPr>
       </w:pPr>
-      <w:ins w:id="9372" w:author="Revisão" w:date="2026-09-28T12:00:00Z">
+      <w:ins w:id="9378" w:author="Revisão" w:date="2026-09-28T12:00:00Z">
         <w:r>
           <w:rPr>
             <w:rFonts w:ascii="Times New Roman" w:cs="Times New Roman" w:eastAsia="Times New Roman" w:hAnsi="Times New Roman"/>
@@ -37756,10 +37848,10 @@
         <w:ind w:firstLine="708"/>
         <w:jc w:val="both"/>
         <w:rPr>
-          <w:ins w:id="9369" w:author="Revisão" w:date="2026-09-28T12:00:00Z"/>
+          <w:ins w:id="9375" w:author="Revisão" w:date="2026-09-28T12:00:00Z"/>
         </w:rPr>
       </w:pPr>
-      <w:ins w:id="9370" w:author="Revisão" w:date="2026-09-28T12:00:00Z">
+      <w:ins w:id="9376" w:author="Revisão" w:date="2026-09-28T12:00:00Z">
         <w:r>
           <w:rPr>
             <w:rFonts w:ascii="Times New Roman" w:cs="Times New Roman" w:eastAsia="Times New Roman" w:hAnsi="Times New Roman"/>
@@ -37918,7 +38010,7 @@
         </w:rPr>
         <w:t xml:space="preserve">BRASIL. Ministério da Fazenda. Secretaria do Tesouro Nacional. Portaria n. 882, de 18 de dezembro de 2018. Define os conceitos das variáveis utilizadas e os procedimentos a serem adotados na análise da capacidade de pagamento e na apuração da suficiência das contragarantias oferecidas. </w:t>
       </w:r>
-      <w:del w:id="9323" w:author="Revisão" w:date="2026-09-28T12:00:00Z">
+      <w:del w:id="9329" w:author="Revisão" w:date="2026-09-28T12:00:00Z">
         <w:r>
           <w:rPr>
             <w:rFonts w:ascii="Times New Roman" w:cs="Times New Roman" w:eastAsia="Times New Roman" w:hAnsi="Times New Roman"/>
@@ -37932,7 +38024,7 @@
           <w:delText xml:space="preserve">Diário Oficial da União, Brasília, DF, 20 dez. 2018.</w:delText>
         </w:r>
       </w:del>
-      <w:ins w:id="9324" w:author="Revisão" w:date="2026-09-28T12:00:00Z">
+      <w:ins w:id="9330" w:author="Revisão" w:date="2026-09-28T12:00:00Z">
         <w:r>
           <w:rPr>
             <w:rFonts w:ascii="Times New Roman" w:cs="Times New Roman" w:eastAsia="Times New Roman" w:hAnsi="Times New Roman"/>
@@ -37952,10 +38044,10 @@
         <w:spacing w:after="180" w:before="0" w:line="240"/>
         <w:jc w:val="left"/>
         <w:rPr>
-          <w:ins w:id="9325" w:author="Revisão" w:date="2026-09-28T12:00:00Z"/>
+          <w:ins w:id="9331" w:author="Revisão" w:date="2026-09-28T12:00:00Z"/>
         </w:rPr>
       </w:pPr>
-      <w:ins w:id="9326" w:author="Revisão" w:date="2026-09-28T12:00:00Z">
+      <w:ins w:id="9332" w:author="Revisão" w:date="2026-09-28T12:00:00Z">
         <w:r>
           <w:rPr>
             <w:rFonts w:ascii="Times New Roman" w:cs="Times New Roman" w:eastAsia="Times New Roman" w:hAnsi="Times New Roman"/>
@@ -38011,10 +38103,10 @@
         <w:spacing w:after="180" w:before="0" w:line="240"/>
         <w:jc w:val="left"/>
         <w:rPr>
-          <w:ins w:id="9327" w:author="Revisão" w:date="2026-09-28T12:00:00Z"/>
+          <w:ins w:id="9333" w:author="Revisão" w:date="2026-09-28T12:00:00Z"/>
         </w:rPr>
       </w:pPr>
-      <w:ins w:id="9328" w:author="Revisão" w:date="2026-09-28T12:00:00Z">
+      <w:ins w:id="9334" w:author="Revisão" w:date="2026-09-28T12:00:00Z">
         <w:r>
           <w:rPr>
             <w:rFonts w:ascii="Times New Roman" w:cs="Times New Roman" w:eastAsia="Times New Roman" w:hAnsi="Times New Roman"/>
@@ -38088,10 +38180,10 @@
         <w:spacing w:after="180" w:before="0" w:line="240"/>
         <w:jc w:val="left"/>
         <w:rPr>
-          <w:ins w:id="9329" w:author="Revisão" w:date="2026-09-28T12:00:00Z"/>
+          <w:ins w:id="9335" w:author="Revisão" w:date="2026-09-28T12:00:00Z"/>
         </w:rPr>
       </w:pPr>
-      <w:ins w:id="9330" w:author="Revisão" w:date="2026-09-28T12:00:00Z">
+      <w:ins w:id="9336" w:author="Revisão" w:date="2026-09-28T12:00:00Z">
         <w:r>
           <w:rPr>
             <w:rFonts w:ascii="Times New Roman" w:cs="Times New Roman" w:eastAsia="Times New Roman" w:hAnsi="Times New Roman"/>
@@ -38111,10 +38203,10 @@
         <w:spacing w:after="180" w:before="0" w:line="240"/>
         <w:jc w:val="left"/>
         <w:rPr>
-          <w:ins w:id="9331" w:author="Revisão" w:date="2026-09-28T12:00:00Z"/>
+          <w:ins w:id="9337" w:author="Revisão" w:date="2026-09-28T12:00:00Z"/>
         </w:rPr>
       </w:pPr>
-      <w:ins w:id="9332" w:author="Revisão" w:date="2026-09-28T12:00:00Z">
+      <w:ins w:id="9338" w:author="Revisão" w:date="2026-09-28T12:00:00Z">
         <w:r>
           <w:rPr>
             <w:rFonts w:ascii="Times New Roman" w:cs="Times New Roman" w:eastAsia="Times New Roman" w:hAnsi="Times New Roman"/>
@@ -38134,10 +38226,10 @@
         <w:spacing w:after="180" w:before="0" w:line="240"/>
         <w:jc w:val="left"/>
         <w:rPr>
-          <w:ins w:id="9333" w:author="Revisão" w:date="2026-09-28T12:00:00Z"/>
+          <w:ins w:id="9339" w:author="Revisão" w:date="2026-09-28T12:00:00Z"/>
         </w:rPr>
       </w:pPr>
-      <w:ins w:id="9334" w:author="Revisão" w:date="2026-09-28T12:00:00Z">
+      <w:ins w:id="9340" w:author="Revisão" w:date="2026-09-28T12:00:00Z">
         <w:r>
           <w:rPr>
             <w:rFonts w:ascii="Times New Roman" w:cs="Times New Roman" w:eastAsia="Times New Roman" w:hAnsi="Times New Roman"/>
@@ -38193,10 +38285,10 @@
         <w:spacing w:after="180" w:before="0" w:line="240"/>
         <w:jc w:val="left"/>
         <w:rPr>
-          <w:ins w:id="9335" w:author="Revisão" w:date="2026-09-28T12:00:00Z"/>
+          <w:ins w:id="9341" w:author="Revisão" w:date="2026-09-28T12:00:00Z"/>
         </w:rPr>
       </w:pPr>
-      <w:ins w:id="9336" w:author="Revisão" w:date="2026-09-28T12:00:00Z">
+      <w:ins w:id="9342" w:author="Revisão" w:date="2026-09-28T12:00:00Z">
         <w:r>
           <w:rPr>
             <w:rFonts w:ascii="Times New Roman" w:cs="Times New Roman" w:eastAsia="Times New Roman" w:hAnsi="Times New Roman"/>
@@ -38234,10 +38326,10 @@
         <w:spacing w:after="180" w:before="0" w:line="240"/>
         <w:jc w:val="left"/>
         <w:rPr>
-          <w:ins w:id="9347" w:author="Revisão" w:date="2026-09-28T12:00:00Z"/>
+          <w:ins w:id="9353" w:author="Revisão" w:date="2026-09-28T12:00:00Z"/>
         </w:rPr>
       </w:pPr>
-      <w:ins w:id="9348" w:author="Revisão" w:date="2026-09-28T12:00:00Z">
+      <w:ins w:id="9354" w:author="Revisão" w:date="2026-09-28T12:00:00Z">
         <w:r>
           <w:rPr>
             <w:rFonts w:ascii="Times New Roman" w:cs="Times New Roman" w:eastAsia="Times New Roman" w:hAnsi="Times New Roman"/>
@@ -38257,10 +38349,10 @@
         <w:spacing w:after="180" w:before="0" w:line="240"/>
         <w:jc w:val="left"/>
         <w:rPr>
-          <w:ins w:id="9337" w:author="Revisão" w:date="2026-09-28T12:00:00Z"/>
+          <w:ins w:id="9343" w:author="Revisão" w:date="2026-09-28T12:00:00Z"/>
         </w:rPr>
       </w:pPr>
-      <w:ins w:id="9338" w:author="Revisão" w:date="2026-09-28T12:00:00Z">
+      <w:ins w:id="9344" w:author="Revisão" w:date="2026-09-28T12:00:00Z">
         <w:r>
           <w:rPr>
             <w:rFonts w:ascii="Times New Roman" w:cs="Times New Roman" w:eastAsia="Times New Roman" w:hAnsi="Times New Roman"/>
@@ -38442,10 +38534,10 @@
         <w:spacing w:after="180" w:before="0" w:line="240"/>
         <w:jc w:val="left"/>
         <w:rPr>
-          <w:ins w:id="9339" w:author="Revisão" w:date="2026-09-28T12:00:00Z"/>
+          <w:ins w:id="9345" w:author="Revisão" w:date="2026-09-28T12:00:00Z"/>
         </w:rPr>
       </w:pPr>
-      <w:ins w:id="9340" w:author="Revisão" w:date="2026-09-28T12:00:00Z">
+      <w:ins w:id="9346" w:author="Revisão" w:date="2026-09-28T12:00:00Z">
         <w:r>
           <w:rPr>
             <w:rFonts w:ascii="Times New Roman" w:cs="Times New Roman" w:eastAsia="Times New Roman" w:hAnsi="Times New Roman"/>
@@ -38501,10 +38593,10 @@
         <w:spacing w:after="180" w:before="0" w:line="240"/>
         <w:jc w:val="left"/>
         <w:rPr>
-          <w:ins w:id="9341" w:author="Revisão" w:date="2026-09-28T12:00:00Z"/>
+          <w:ins w:id="9347" w:author="Revisão" w:date="2026-09-28T12:00:00Z"/>
         </w:rPr>
       </w:pPr>
-      <w:ins w:id="9342" w:author="Revisão" w:date="2026-09-28T12:00:00Z">
+      <w:ins w:id="9348" w:author="Revisão" w:date="2026-09-28T12:00:00Z">
         <w:r>
           <w:rPr>
             <w:rFonts w:ascii="Times New Roman" w:cs="Times New Roman" w:eastAsia="Times New Roman" w:hAnsi="Times New Roman"/>
@@ -38524,10 +38616,10 @@
         <w:spacing w:after="180" w:before="0" w:line="240"/>
         <w:jc w:val="left"/>
         <w:rPr>
-          <w:ins w:id="9343" w:author="Revisão" w:date="2026-09-28T12:00:00Z"/>
+          <w:ins w:id="9349" w:author="Revisão" w:date="2026-09-28T12:00:00Z"/>
         </w:rPr>
       </w:pPr>
-      <w:ins w:id="9344" w:author="Revisão" w:date="2026-09-28T12:00:00Z">
+      <w:ins w:id="9350" w:author="Revisão" w:date="2026-09-28T12:00:00Z">
         <w:r>
           <w:rPr>
             <w:rFonts w:ascii="Times New Roman" w:cs="Times New Roman" w:eastAsia="Times New Roman" w:hAnsi="Times New Roman"/>
@@ -38565,10 +38657,10 @@
         <w:spacing w:after="180" w:before="0" w:line="240"/>
         <w:jc w:val="left"/>
         <w:rPr>
-          <w:ins w:id="9349" w:author="Revisão" w:date="2026-09-28T12:00:00Z"/>
+          <w:ins w:id="9355" w:author="Revisão" w:date="2026-09-28T12:00:00Z"/>
         </w:rPr>
       </w:pPr>
-      <w:ins w:id="9350" w:author="Revisão" w:date="2026-09-28T12:00:00Z">
+      <w:ins w:id="9356" w:author="Revisão" w:date="2026-09-28T12:00:00Z">
         <w:r>
           <w:rPr>
             <w:rFonts w:ascii="Times New Roman" w:cs="Times New Roman" w:eastAsia="Times New Roman" w:hAnsi="Times New Roman"/>
@@ -38642,10 +38734,10 @@
         <w:spacing w:after="180" w:before="0" w:line="240"/>
         <w:jc w:val="left"/>
         <w:rPr>
-          <w:ins w:id="9345" w:author="Revisão" w:date="2026-09-28T12:00:00Z"/>
+          <w:ins w:id="9351" w:author="Revisão" w:date="2026-09-28T12:00:00Z"/>
         </w:rPr>
       </w:pPr>
-      <w:ins w:id="9346" w:author="Revisão" w:date="2026-09-28T12:00:00Z">
+      <w:ins w:id="9352" w:author="Revisão" w:date="2026-09-28T12:00:00Z">
         <w:r>
           <w:rPr>
             <w:rFonts w:ascii="Times New Roman" w:cs="Times New Roman" w:eastAsia="Times New Roman" w:hAnsi="Times New Roman"/>
@@ -38665,10 +38757,10 @@
         <w:spacing w:after="180" w:before="0" w:line="240"/>
         <w:jc w:val="left"/>
         <w:rPr>
-          <w:ins w:id="9353" w:author="Revisão" w:date="2026-09-28T12:00:00Z"/>
+          <w:ins w:id="9359" w:author="Revisão" w:date="2026-09-28T12:00:00Z"/>
         </w:rPr>
       </w:pPr>
-      <w:ins w:id="9354" w:author="Revisão" w:date="2026-09-28T12:00:00Z">
+      <w:ins w:id="9360" w:author="Revisão" w:date="2026-09-28T12:00:00Z">
         <w:r>
           <w:rPr>
             <w:rFonts w:ascii="Times New Roman" w:cs="Times New Roman" w:eastAsia="Times New Roman" w:hAnsi="Times New Roman"/>
@@ -38688,10 +38780,10 @@
         <w:spacing w:after="180" w:before="0" w:line="240"/>
         <w:jc w:val="left"/>
         <w:rPr>
-          <w:ins w:id="9351" w:author="Revisão" w:date="2026-09-28T12:00:00Z"/>
+          <w:ins w:id="9357" w:author="Revisão" w:date="2026-09-28T12:00:00Z"/>
         </w:rPr>
       </w:pPr>
-      <w:ins w:id="9352" w:author="Revisão" w:date="2026-09-28T12:00:00Z">
+      <w:ins w:id="9358" w:author="Revisão" w:date="2026-09-28T12:00:00Z">
         <w:r>
           <w:rPr>
             <w:rFonts w:ascii="Times New Roman" w:cs="Times New Roman" w:eastAsia="Times New Roman" w:hAnsi="Times New Roman"/>

</xml_diff>